<commit_message>
Added data augmentation section to word.
</commit_message>
<xml_diff>
--- a/Word/omar_kurtovic_diplomski_rad.docx
+++ b/Word/omar_kurtovic_diplomski_rad.docx
@@ -9616,13 +9616,7 @@
         <w:t>Image Preprocessing</w:t>
       </w:r>
       <w:r>
-        <w:t xml:space="preserve">) i </w:t>
-      </w:r>
-      <w:r>
-        <w:t>a</w:t>
-      </w:r>
-      <w:r>
-        <w:t>ugmentacija</w:t>
+        <w:t>)</w:t>
       </w:r>
       <w:bookmarkEnd w:id="14"/>
     </w:p>
@@ -9654,7 +9648,7 @@
         <w:spacing w:after="160" w:line="259" w:lineRule="auto"/>
       </w:pPr>
       <w:r>
-        <w:t xml:space="preserve"> Skaliranje dimenzija (eng. </w:t>
+        <w:t xml:space="preserve">Skaliranje dimenzija (eng. </w:t>
       </w:r>
       <w:r>
         <w:rPr>
@@ -9747,26 +9741,461 @@
     </w:p>
     <w:p>
       <w:pPr>
+        <w:spacing w:line="276" w:lineRule="auto"/>
+      </w:pPr>
+    </w:p>
+    <w:p>
+      <w:pPr>
+        <w:spacing w:line="276" w:lineRule="auto"/>
+      </w:pPr>
+    </w:p>
+    <w:p>
+      <w:pPr>
+        <w:spacing w:line="276" w:lineRule="auto"/>
+      </w:pPr>
+    </w:p>
+    <w:p>
+      <w:pPr>
+        <w:spacing w:line="276" w:lineRule="auto"/>
+      </w:pPr>
+    </w:p>
+    <w:p>
+      <w:pPr>
+        <w:spacing w:line="276" w:lineRule="auto"/>
+      </w:pPr>
+    </w:p>
+    <w:p>
+      <w:pPr>
+        <w:spacing w:line="276" w:lineRule="auto"/>
+      </w:pPr>
+    </w:p>
+    <w:p>
+      <w:pPr>
+        <w:spacing w:line="276" w:lineRule="auto"/>
+      </w:pPr>
+    </w:p>
+    <w:p>
+      <w:pPr>
+        <w:pStyle w:val="Heading2"/>
+      </w:pPr>
+      <w:r>
+        <w:lastRenderedPageBreak/>
+        <w:t>Augmentacija podataka</w:t>
+      </w:r>
+    </w:p>
+    <w:p>
+      <w:pPr>
+        <w:spacing w:line="276" w:lineRule="auto"/>
+      </w:pPr>
+    </w:p>
+    <w:p>
+      <w:pPr>
+        <w:spacing w:line="276" w:lineRule="auto"/>
+      </w:pPr>
+      <w:r>
+        <w:t xml:space="preserve">Prilikom treniranja modela mašinskog učenja, specifično za analizu medicinskih slika, nailazimo na problem veličine skupa podataka. </w:t>
+      </w:r>
+      <w:r>
+        <w:t>Za treniranje dobrog modela koji uspješno generalizira, potreban je veliki broj primjera</w:t>
+      </w:r>
+      <w:r>
+        <w:t xml:space="preserve"> koji su raznoliki</w:t>
+      </w:r>
+      <w:r>
+        <w:t>,</w:t>
+      </w:r>
+      <w:r>
+        <w:t xml:space="preserve"> </w:t>
+      </w:r>
+      <w:r>
+        <w:t>odnosno obuhvataju sve moguće varijacije</w:t>
+      </w:r>
+      <w:r>
+        <w:t>.</w:t>
+      </w:r>
+      <w:r>
+        <w:t xml:space="preserve"> Sam </w:t>
+      </w:r>
+      <w:r>
+        <w:t>proces sakupljanja datih podataka je težak</w:t>
+      </w:r>
+      <w:r>
+        <w:t xml:space="preserve"> iz više razloga: </w:t>
+      </w:r>
+      <w:r>
+        <w:t xml:space="preserve">bolest može biti rijetka, </w:t>
+      </w:r>
+      <w:r>
+        <w:t xml:space="preserve">pacijenti </w:t>
+      </w:r>
+      <w:r>
+        <w:t xml:space="preserve">često nisu voljni </w:t>
+      </w:r>
+      <w:r>
+        <w:t>d</w:t>
+      </w:r>
+      <w:r>
+        <w:t>i</w:t>
+      </w:r>
+      <w:r>
+        <w:t>jel</w:t>
+      </w:r>
+      <w:r>
+        <w:t xml:space="preserve">iti </w:t>
+      </w:r>
+      <w:r>
+        <w:t xml:space="preserve">svoje </w:t>
+      </w:r>
+      <w:r>
+        <w:t>slike</w:t>
+      </w:r>
+      <w:r>
+        <w:t>, a u pojedinim sredinama nedostaje odgovarajuća oprema.</w:t>
+      </w:r>
+    </w:p>
+    <w:p>
+      <w:pPr>
+        <w:spacing w:line="276" w:lineRule="auto"/>
+      </w:pPr>
+      <w:r>
+        <w:t>Sta</w:t>
+      </w:r>
+      <w:r>
+        <w:t>n</w:t>
+      </w:r>
+      <w:r>
+        <w:t>dardno rješenje datog problema je a</w:t>
+      </w:r>
+      <w:r>
+        <w:t>ugmentacija podataka</w:t>
+      </w:r>
+      <w:r>
+        <w:t xml:space="preserve">, </w:t>
+      </w:r>
+      <w:r>
+        <w:t xml:space="preserve">metoda koja </w:t>
+      </w:r>
+      <w:r>
+        <w:t xml:space="preserve">umjetno povećava </w:t>
+      </w:r>
+      <w:r>
+        <w:t>broj primjera na kojim se mreža</w:t>
+      </w:r>
+      <w:r>
+        <w:t xml:space="preserve"> trenira</w:t>
+      </w:r>
+      <w:r>
+        <w:t>.</w:t>
+      </w:r>
+      <w:r>
+        <w:t xml:space="preserve"> </w:t>
+      </w:r>
+    </w:p>
+    <w:p>
+      <w:pPr>
+        <w:spacing w:line="276" w:lineRule="auto"/>
+      </w:pPr>
+      <w:r>
+        <w:t xml:space="preserve">U datom radu je korištena drugačija verzija augmentacije. Umjesto da se </w:t>
+      </w:r>
+      <w:r>
+        <w:t xml:space="preserve">unaprijed </w:t>
+      </w:r>
+      <w:r>
+        <w:t xml:space="preserve">generišu nove slike, </w:t>
+      </w:r>
+      <w:r>
+        <w:t xml:space="preserve">augmentacije se primjenjuju </w:t>
+      </w:r>
+      <w:r>
+        <w:t>kada model želi da dobije sliku</w:t>
+      </w:r>
+      <w:r>
+        <w:t xml:space="preserve"> za treniranje</w:t>
+      </w:r>
+      <w:r>
+        <w:t>. Na ovaj način niti jedna epoha neće biti trenirana na istim podacima</w:t>
+      </w:r>
+      <w:r>
+        <w:t>,</w:t>
+      </w:r>
+      <w:r>
+        <w:t xml:space="preserve"> </w:t>
+      </w:r>
+      <w:r>
+        <w:t>jer je ista slika u svakoj epohi malo drugačija</w:t>
+      </w:r>
+      <w:r>
+        <w:t>.</w:t>
+      </w:r>
+      <w:r>
+        <w:t xml:space="preserve"> Time se efektivno povećava broj primjera i raste šansa da model uspješno generalizira.</w:t>
+      </w:r>
+    </w:p>
+    <w:p>
+      <w:r>
+        <w:t>Odabrane augmentacije zas</w:t>
+      </w:r>
+      <w:r>
+        <w:t>n</w:t>
+      </w:r>
+      <w:r>
+        <w:t xml:space="preserve">ovane su na istraživanju koje je poredilo </w:t>
+      </w:r>
+      <w:r>
+        <w:t>jedan</w:t>
+      </w:r>
+      <w:r>
+        <w:t>ae</w:t>
+      </w:r>
+      <w:r>
+        <w:t>st</w:t>
+      </w:r>
+      <w:r>
+        <w:t xml:space="preserve"> metoda augmentacije na </w:t>
+      </w:r>
+      <w:r>
+        <w:t>medicinskim slikama uključujući CT snimke pluća</w:t>
+      </w:r>
+      <w:r>
+        <w:t>, te je kombinacija geometrijskih augmentacija poput translacije, rotacije</w:t>
+      </w:r>
+      <w:r>
+        <w:t xml:space="preserve"> i</w:t>
+      </w:r>
+      <w:r>
+        <w:t xml:space="preserve"> smicanja dal</w:t>
+      </w:r>
+      <w:r>
+        <w:t>a</w:t>
+      </w:r>
+      <w:r>
+        <w:t xml:space="preserve"> najbolje rezultate</w:t>
+      </w:r>
+      <w:r>
+        <w:t xml:space="preserve">. </w:t>
+      </w:r>
+      <w:sdt>
+        <w:sdtPr>
+          <w:id w:val="1591043431"/>
+          <w:citation/>
+        </w:sdtPr>
+        <w:sdtContent>
+          <w:r>
+            <w:fldChar w:fldCharType="begin"/>
+          </w:r>
+          <w:r>
+            <w:rPr>
+              <w:lang w:val="en-US"/>
+            </w:rPr>
+            <w:instrText xml:space="preserve"> CITATION Goc23 \l 1033 </w:instrText>
+          </w:r>
+          <w:r>
+            <w:fldChar w:fldCharType="separate"/>
+          </w:r>
+          <w:r>
+            <w:rPr>
+              <w:noProof/>
+              <w:lang w:val="en-US"/>
+            </w:rPr>
+            <w:t>[9]</w:t>
+          </w:r>
+          <w:r>
+            <w:fldChar w:fldCharType="end"/>
+          </w:r>
+        </w:sdtContent>
+      </w:sdt>
+    </w:p>
+    <w:p>
+      <w:pPr>
+        <w:rPr>
+          <w:rFonts w:ascii="Cascadia Mono" w:hAnsi="Cascadia Mono"/>
+          <w:color w:val="000000"/>
+          <w:sz w:val="18"/>
+          <w:szCs w:val="18"/>
+        </w:rPr>
+      </w:pPr>
+      <w:r>
+        <w:t>Pored geometrijskih transformacija, primijenjene su i promjene svjetline i kontrasta. Iako navedeno istraživanje te metode nije testiralo na CT snimcima pluća, već na snimcima očnog fundusa, gdje su dale dobre rezultate, njihova primjena ovdje je opravdana i time što simuliraju varijacije u parametrima snimanja i postavkama uređaja.</w:t>
+      </w:r>
+    </w:p>
+    <w:p>
+      <w:pPr>
+        <w:spacing w:line="276" w:lineRule="auto"/>
+      </w:pPr>
+      <w:r>
+        <w:t>Korištene augmentacije su:</w:t>
+      </w:r>
+    </w:p>
+    <w:p>
+      <w:pPr>
         <w:pStyle w:val="ListParagraph"/>
         <w:numPr>
           <w:ilvl w:val="0"/>
-          <w:numId w:val="8"/>
+          <w:numId w:val="32"/>
         </w:numPr>
-        <w:spacing w:after="160" w:line="259" w:lineRule="auto"/>
-      </w:pPr>
-      <w:r>
-        <w:t xml:space="preserve">Proširivanje skupa podataka (eng. </w:t>
-      </w:r>
-      <w:r>
-        <w:rPr>
-          <w:i/>
-          <w:iCs/>
-        </w:rPr>
-        <w:t>Data Augmentation</w:t>
-      </w:r>
-      <w:r>
-        <w:t>) - Zadnja operacija koja će biti urađena jeste dodavanje dodatnih slika uz određene transformacije na skup podataka. Kako je skup podataka relativno mali, cilj ove operacije jeste vještačko uvođenje raznolikosti u skup podataka, radi smanjenja mogućnosti prekomjernog prilagođavanja i poboljšanja šansi da će model uspjeti generalizirati problem. Ovo će biti postignuto rotiranjem postojećih slika vertikalno i horizontalno.</w:t>
-      </w:r>
+        <w:spacing w:line="276" w:lineRule="auto"/>
+      </w:pPr>
+      <w:r>
+        <w:t xml:space="preserve">Rotacija: sliku rotiramo za nasumično generisani ugao </w:t>
+      </w:r>
+      <w:r>
+        <w:t>od -25 do 25 stepeni</w:t>
+      </w:r>
+    </w:p>
+    <w:p>
+      <w:pPr>
+        <w:pStyle w:val="ListParagraph"/>
+        <w:numPr>
+          <w:ilvl w:val="0"/>
+          <w:numId w:val="32"/>
+        </w:numPr>
+        <w:spacing w:line="276" w:lineRule="auto"/>
+      </w:pPr>
+      <w:r>
+        <w:t>Translacija: sliku pomjeramo u</w:t>
+      </w:r>
+      <w:r>
+        <w:t xml:space="preserve"> x</w:t>
+      </w:r>
+      <w:r>
+        <w:t xml:space="preserve"> i y osi za nasumično generisanu udaljenost</w:t>
+      </w:r>
+      <w:r>
+        <w:t xml:space="preserve"> od -15 do 15 piksela</w:t>
+      </w:r>
+    </w:p>
+    <w:p>
+      <w:pPr>
+        <w:pStyle w:val="ListParagraph"/>
+        <w:numPr>
+          <w:ilvl w:val="0"/>
+          <w:numId w:val="32"/>
+        </w:numPr>
+        <w:spacing w:line="276" w:lineRule="auto"/>
+      </w:pPr>
+      <w:r>
+        <w:t xml:space="preserve">Smicanje – svaku </w:t>
+      </w:r>
+      <w:r>
+        <w:t xml:space="preserve">tačku na slike </w:t>
+      </w:r>
+      <w:r>
+        <w:t>pomjeramo horizontalno i vertik</w:t>
+      </w:r>
+      <w:r>
+        <w:t>a</w:t>
+      </w:r>
+      <w:r>
+        <w:t xml:space="preserve">lano </w:t>
+      </w:r>
+      <w:r>
+        <w:t>sazmjerno</w:t>
+      </w:r>
+      <w:r>
+        <w:t xml:space="preserve"> njezinoj udaljenosti od ose, za nasumično generisani ugao</w:t>
+      </w:r>
+      <w:r>
+        <w:t xml:space="preserve"> od -15 do 15 </w:t>
+      </w:r>
+      <w:r>
+        <w:t>stepeni</w:t>
+      </w:r>
+      <w:r>
+        <w:t xml:space="preserve">, </w:t>
+      </w:r>
+      <w:r>
+        <w:t xml:space="preserve">pretvarajući </w:t>
+      </w:r>
+      <w:r>
+        <w:t>pravougaonik</w:t>
+      </w:r>
+      <w:r>
+        <w:t xml:space="preserve"> u paralelogram</w:t>
+      </w:r>
+    </w:p>
+    <w:p>
+      <w:pPr>
+        <w:pStyle w:val="ListParagraph"/>
+        <w:numPr>
+          <w:ilvl w:val="0"/>
+          <w:numId w:val="32"/>
+        </w:numPr>
+        <w:spacing w:line="276" w:lineRule="auto"/>
+      </w:pPr>
+      <w:r>
+        <w:t xml:space="preserve">Skaliranje – </w:t>
+      </w:r>
+      <w:r>
+        <w:t>sliku</w:t>
+      </w:r>
+      <w:r>
+        <w:t xml:space="preserve"> </w:t>
+      </w:r>
+      <w:r>
+        <w:t>nasumično skaliramo</w:t>
+      </w:r>
+      <w:r>
+        <w:t xml:space="preserve"> od 90% do 110%</w:t>
+      </w:r>
+    </w:p>
+    <w:p>
+      <w:pPr>
+        <w:pStyle w:val="ListParagraph"/>
+        <w:numPr>
+          <w:ilvl w:val="0"/>
+          <w:numId w:val="32"/>
+        </w:numPr>
+        <w:spacing w:line="276" w:lineRule="auto"/>
+      </w:pPr>
+      <w:r>
+        <w:t>Svjetlost – mijenjamo svjetlost slike</w:t>
+      </w:r>
+      <w:r>
+        <w:t xml:space="preserve"> </w:t>
+      </w:r>
+      <w:r>
+        <w:t xml:space="preserve">do </w:t>
+      </w:r>
+      <w:r>
+        <w:t>20%</w:t>
+      </w:r>
+      <w:r>
+        <w:t xml:space="preserve"> u odnosu na originalnu vrijednost</w:t>
+      </w:r>
+    </w:p>
+    <w:p>
+      <w:pPr>
+        <w:pStyle w:val="ListParagraph"/>
+        <w:numPr>
+          <w:ilvl w:val="0"/>
+          <w:numId w:val="32"/>
+        </w:numPr>
+        <w:spacing w:line="276" w:lineRule="auto"/>
+      </w:pPr>
+      <w:r>
+        <w:t xml:space="preserve">Kontrast – </w:t>
+      </w:r>
+      <w:r>
+        <w:t xml:space="preserve">mijenjamo </w:t>
+      </w:r>
+      <w:r>
+        <w:t>kontrast</w:t>
+      </w:r>
+      <w:r>
+        <w:t xml:space="preserve"> slike do 20% u odnosu na originalnu vrijednost</w:t>
+      </w:r>
+    </w:p>
+    <w:p>
+      <w:pPr>
+        <w:spacing w:line="276" w:lineRule="auto"/>
+        <w:ind w:left="360"/>
+      </w:pPr>
+    </w:p>
+    <w:p>
+      <w:pPr>
+        <w:spacing w:line="276" w:lineRule="auto"/>
+      </w:pPr>
     </w:p>
     <w:p>
       <w:pPr>
@@ -12570,7 +12999,7 @@
               <w:noProof/>
               <w:lang w:val="en-US"/>
             </w:rPr>
-            <w:t>[9]</w:t>
+            <w:t>[10]</w:t>
           </w:r>
           <w:r>
             <w:rPr>
@@ -12584,10 +13013,7 @@
     <w:p>
       <w:r>
         <w:lastRenderedPageBreak/>
-        <w:t>A</w:t>
-      </w:r>
-      <w:r>
-        <w:t xml:space="preserve">rhitektura je dodatno analizirana pomoću alata </w:t>
+        <w:t xml:space="preserve">Arhitektura je dodatno analizirana pomoću alata </w:t>
       </w:r>
       <w:r>
         <w:t>torchinfo</w:t>
@@ -12756,19 +13182,7 @@
           </w:tcPr>
           <w:p>
             <w:r>
-              <w:t xml:space="preserve">[1, 64, </w:t>
-            </w:r>
-            <w:r>
-              <w:t>127,</w:t>
-            </w:r>
-            <w:r>
-              <w:t xml:space="preserve"> </w:t>
-            </w:r>
-            <w:r>
-              <w:t>127</w:t>
-            </w:r>
-            <w:r>
-              <w:t>]</w:t>
+              <w:t>[1, 64, 127, 127]</w:t>
             </w:r>
           </w:p>
         </w:tc>
@@ -12802,19 +13216,7 @@
           </w:tcPr>
           <w:p>
             <w:r>
-              <w:t>[1, 64, 12</w:t>
-            </w:r>
-            <w:r>
-              <w:t>5</w:t>
-            </w:r>
-            <w:r>
-              <w:t>, 12</w:t>
-            </w:r>
-            <w:r>
-              <w:t>5</w:t>
-            </w:r>
-            <w:r>
-              <w:t>]</w:t>
+              <w:t>[1, 64, 125, 125]</w:t>
             </w:r>
           </w:p>
         </w:tc>
@@ -12899,19 +13301,7 @@
           </w:tcPr>
           <w:p>
             <w:r>
-              <w:t xml:space="preserve">[1, 64, </w:t>
-            </w:r>
-            <w:r>
-              <w:t>62</w:t>
-            </w:r>
-            <w:r>
-              <w:t xml:space="preserve">, </w:t>
-            </w:r>
-            <w:r>
-              <w:t>62</w:t>
-            </w:r>
-            <w:r>
-              <w:t>]</w:t>
+              <w:t>[1, 64, 62, 62]</w:t>
             </w:r>
           </w:p>
         </w:tc>
@@ -13244,30 +13634,10 @@
     </w:p>
     <w:p>
       <w:pPr>
-        <w:rPr>
-          <w:lang w:val="en-GB"/>
-        </w:rPr>
-      </w:pPr>
-    </w:p>
-    <w:p>
-      <w:pPr>
-        <w:rPr>
-          <w:lang w:val="en-GB"/>
-        </w:rPr>
-      </w:pPr>
-    </w:p>
-    <w:p>
-      <w:pPr>
-        <w:rPr>
-          <w:lang w:val="en-GB"/>
-        </w:rPr>
-      </w:pPr>
-    </w:p>
-    <w:p>
-      <w:pPr>
         <w:pStyle w:val="Heading2"/>
       </w:pPr>
       <w:r>
+        <w:lastRenderedPageBreak/>
         <w:t>Funkcija troška, Optimizator</w:t>
       </w:r>
     </w:p>
@@ -15220,7 +15590,7 @@
               <w:noProof/>
               <w:lang w:val="en-US"/>
             </w:rPr>
-            <w:t>[10]</w:t>
+            <w:t>[11]</w:t>
           </w:r>
           <w:r>
             <w:rPr>
@@ -15319,10 +15689,17 @@
     </w:p>
     <w:p>
       <w:pPr>
+        <w:pStyle w:val="Paragraf"/>
+        <w:ind w:firstLine="0"/>
+      </w:pPr>
+    </w:p>
+    <w:p>
+      <w:pPr>
         <w:pStyle w:val="Heading2"/>
       </w:pPr>
       <w:bookmarkStart w:id="18" w:name="_Toc236486948"/>
       <w:r>
+        <w:lastRenderedPageBreak/>
         <w:t>Broj epoha i veličina serije</w:t>
       </w:r>
       <w:bookmarkEnd w:id="18"/>
@@ -15498,6 +15875,7 @@
       </w:pPr>
       <w:bookmarkStart w:id="19" w:name="_Toc236486949"/>
       <w:r>
+        <w:lastRenderedPageBreak/>
         <w:t>Orkestracija i .NET Aspire</w:t>
       </w:r>
       <w:bookmarkEnd w:id="19"/>
@@ -15592,6 +15970,7 @@
       </w:pPr>
       <w:bookmarkStart w:id="20" w:name="_Toc236486950"/>
       <w:r>
+        <w:lastRenderedPageBreak/>
         <w:t>Korisnički</w:t>
       </w:r>
       <w:r>
@@ -15736,7 +16115,6 @@
         <w:rPr>
           <w:noProof/>
         </w:rPr>
-        <w:lastRenderedPageBreak/>
         <w:drawing>
           <wp:inline distT="0" distB="0" distL="0" distR="0" wp14:anchorId="1508C483" wp14:editId="0C6791C3">
             <wp:extent cx="5299827" cy="2706535"/>
@@ -15819,6 +16197,7 @@
     </w:p>
     <w:p>
       <w:r>
+        <w:lastRenderedPageBreak/>
         <w:t>Treća stranica služi za evaluaciju modela (Slika 3). Na datoj stranici korisnik može izabrati proizvoljnu sliku i trenirani model, nakon čega se vrši predikcija koja se prikazuje korisniku.</w:t>
       </w:r>
     </w:p>
@@ -15927,7 +16306,6 @@
           <w:noProof/>
           <w:lang w:val="de-DE"/>
         </w:rPr>
-        <w:lastRenderedPageBreak/>
         <w:drawing>
           <wp:inline distT="0" distB="0" distL="0" distR="0" wp14:anchorId="3ADF8887" wp14:editId="2C858341">
             <wp:extent cx="5266944" cy="2625594"/>
@@ -16016,6 +16394,7 @@
         </w:rPr>
       </w:pPr>
       <w:r>
+        <w:lastRenderedPageBreak/>
         <w:t>Peta stranica služi za poređenje modela (Slika 5). Ovdje korisnik može odabrati proizvoljan broj modela, kao i željene metrike. Odabrane metrike biće prikazane u obliku grafa i pratiće performanse modela kroz epohe.</w:t>
       </w:r>
     </w:p>
@@ -16137,6 +16516,7 @@
       </w:pPr>
       <w:bookmarkStart w:id="26" w:name="_Toc236486951"/>
       <w:r>
+        <w:lastRenderedPageBreak/>
         <w:t>Metodologija testiranja i kontrola varijabli</w:t>
       </w:r>
       <w:bookmarkEnd w:id="26"/>
@@ -16193,7 +16573,13 @@
         </w:rPr>
       </w:pPr>
       <w:r>
-        <w:t>Identično preprocesiranje podatak</w:t>
+        <w:t xml:space="preserve">Identično preprocesiranje </w:t>
+      </w:r>
+      <w:r>
+        <w:t xml:space="preserve">i augmentacija </w:t>
+      </w:r>
+      <w:r>
+        <w:t>podatak</w:t>
       </w:r>
       <w:r>
         <w:t>a</w:t>
@@ -16284,14 +16670,7 @@
         <w:rPr>
           <w:lang w:val="de-DE"/>
         </w:rPr>
-        <w:t xml:space="preserve"> mreže sa preslikanim parametrima. To uključuje korištenje iste funkcije troška (Cross-Entropy </w:t>
-      </w:r>
-      <w:r>
-        <w:rPr>
-          <w:lang w:val="de-DE"/>
-        </w:rPr>
-        <w:lastRenderedPageBreak/>
-        <w:t>Loss), istog optimizatora (Adam) sa stopom učenja (0.0001), isti broj epoha (100) te identičnu veličinu serije (8).</w:t>
+        <w:t xml:space="preserve"> mreže sa preslikanim parametrima. To uključuje korištenje iste funkcije troška (Cross-Entropy Loss), istog optimizatora (Adam) sa stopom učenja (0.0001), isti broj epoha (100) te identičnu veličinu serije (8).</w:t>
       </w:r>
     </w:p>
     <w:p>
@@ -17290,6 +17669,7 @@
         <w:rPr>
           <w:lang w:val="de-DE"/>
         </w:rPr>
+        <w:lastRenderedPageBreak/>
         <w:t>Višestruke iteracije treniranja</w:t>
       </w:r>
     </w:p>
@@ -17587,6 +17967,7 @@
       <w:bookmarkStart w:id="27" w:name="_Toc236486952"/>
       <w:proofErr w:type="spellStart"/>
       <w:r>
+        <w:lastRenderedPageBreak/>
         <w:t>Rezultati</w:t>
       </w:r>
       <w:proofErr w:type="spellEnd"/>
@@ -17896,7 +18277,6 @@
         <w:rPr>
           <w:lang w:val="bs-Latn-BA"/>
         </w:rPr>
-        <w:lastRenderedPageBreak/>
         <w:t>5,88</w:t>
       </w:r>
       <w:r>
@@ -18095,6 +18475,7 @@
       </w:pPr>
       <w:bookmarkStart w:id="30" w:name="_Toc236486955"/>
       <w:r>
+        <w:lastRenderedPageBreak/>
         <w:t>Makro odziv</w:t>
       </w:r>
       <w:bookmarkEnd w:id="30"/>
@@ -18294,7 +18675,6 @@
         <w:rPr>
           <w:noProof/>
         </w:rPr>
-        <w:lastRenderedPageBreak/>
         <w:drawing>
           <wp:inline distT="0" distB="0" distL="0" distR="0" wp14:anchorId="0D373FC7" wp14:editId="6632F1F4">
             <wp:extent cx="5943600" cy="2292350"/>
@@ -18400,6 +18780,7 @@
       </w:pPr>
       <w:bookmarkStart w:id="33" w:name="_Toc236486956"/>
       <w:r>
+        <w:lastRenderedPageBreak/>
         <w:t>Makro F1 mjera</w:t>
       </w:r>
       <w:bookmarkEnd w:id="33"/>
@@ -18655,7 +19036,6 @@
         <w:rPr>
           <w:noProof/>
         </w:rPr>
-        <w:lastRenderedPageBreak/>
         <w:drawing>
           <wp:inline distT="0" distB="0" distL="0" distR="0" wp14:anchorId="5347BBAF" wp14:editId="0E4D1B6F">
             <wp:extent cx="5943600" cy="2265680"/>
@@ -18768,6 +19148,7 @@
       </w:pPr>
       <w:bookmarkStart w:id="35" w:name="_Toc236486957"/>
       <w:r>
+        <w:lastRenderedPageBreak/>
         <w:t>Odziv maligne klase</w:t>
       </w:r>
       <w:bookmarkEnd w:id="35"/>
@@ -18985,7 +19366,6 @@
         <w:rPr>
           <w:noProof/>
         </w:rPr>
-        <w:lastRenderedPageBreak/>
         <w:drawing>
           <wp:inline distT="0" distB="0" distL="0" distR="0" wp14:anchorId="1E3E51F4" wp14:editId="6F09D760">
             <wp:extent cx="5943600" cy="2330450"/>
@@ -19098,6 +19478,7 @@
       </w:pPr>
       <w:bookmarkStart w:id="37" w:name="_Toc236486958"/>
       <w:r>
+        <w:lastRenderedPageBreak/>
         <w:t>Tačnost</w:t>
       </w:r>
       <w:bookmarkEnd w:id="37"/>
@@ -19383,7 +19764,6 @@
         <w:rPr>
           <w:noProof/>
         </w:rPr>
-        <w:lastRenderedPageBreak/>
         <w:drawing>
           <wp:inline distT="0" distB="0" distL="0" distR="0" wp14:anchorId="525B71C9" wp14:editId="7BDD91E6">
             <wp:extent cx="5943600" cy="2330450"/>
@@ -19492,6 +19872,7 @@
     </w:p>
     <w:p>
       <w:r>
+        <w:lastRenderedPageBreak/>
         <w:t xml:space="preserve">Na slici 10. je prikazan grafik funkcije troška na validacijskom skupu podataka kroz epohe. </w:t>
       </w:r>
     </w:p>
@@ -19602,7 +19983,6 @@
         <w:rPr>
           <w:noProof/>
         </w:rPr>
-        <w:lastRenderedPageBreak/>
         <w:drawing>
           <wp:inline distT="0" distB="0" distL="0" distR="0" wp14:anchorId="53855FE4" wp14:editId="5063D5B0">
             <wp:extent cx="5943600" cy="2319655"/>
@@ -19707,6 +20087,7 @@
       </w:pPr>
       <w:bookmarkStart w:id="41" w:name="_Toc236486959"/>
       <w:r>
+        <w:lastRenderedPageBreak/>
         <w:t>Analiza rezultata</w:t>
       </w:r>
       <w:bookmarkEnd w:id="41"/>
@@ -19998,7 +20379,6 @@
     </w:p>
     <w:p>
       <w:r>
-        <w:lastRenderedPageBreak/>
         <w:t>Za treniranje optimalnijeg modela za dati problem, bilo bi neophodno prilagoditi arhitekturu CNN modela i provesti treniranje na znatno većem skupu podataka.</w:t>
       </w:r>
     </w:p>
@@ -20028,6 +20408,7 @@
       <w:bookmarkStart w:id="42" w:name="_Toc236486960"/>
       <w:proofErr w:type="spellStart"/>
       <w:r>
+        <w:lastRenderedPageBreak/>
         <w:t>Zaključak</w:t>
       </w:r>
       <w:bookmarkEnd w:id="42"/>
@@ -20087,7 +20468,6 @@
         </w:sectPr>
       </w:pPr>
       <w:r>
-        <w:lastRenderedPageBreak/>
         <w:t>Dati rad se fokusirao na problem detekcije raka pluća, te bi za obuhvatniju analizu bilo potrebno testirati oba okruženja na većem broju različitih algoritama mašinskog učenja.</w:t>
       </w:r>
     </w:p>
@@ -20158,7 +20538,7 @@
           </w:tblGrid>
           <w:tr>
             <w:trPr>
-              <w:divId w:val="1530223782"/>
+              <w:divId w:val="2142385046"/>
               <w:tblCellSpacing w:w="15" w:type="dxa"/>
             </w:trPr>
             <w:tc>
@@ -20172,11 +20552,13 @@
                   <w:rPr>
                     <w:noProof/>
                     <w:szCs w:val="24"/>
+                    <w:lang w:val="en-US"/>
                   </w:rPr>
                 </w:pPr>
                 <w:r>
                   <w:rPr>
                     <w:noProof/>
+                    <w:lang w:val="en-US"/>
                   </w:rPr>
                   <w:t xml:space="preserve">[1] </w:t>
                 </w:r>
@@ -20192,11 +20574,13 @@
                   <w:pStyle w:val="Bibliography"/>
                   <w:rPr>
                     <w:noProof/>
+                    <w:lang w:val="en-US"/>
                   </w:rPr>
                 </w:pPr>
                 <w:r>
                   <w:rPr>
                     <w:noProof/>
+                    <w:lang w:val="en-US"/>
                   </w:rPr>
                   <w:t>PyTorch, "PyTorch GitHub Repository," GitHub, [Online]. Available: https://github.com/pytorch/pytorch.</w:t>
                 </w:r>
@@ -20205,7 +20589,7 @@
           </w:tr>
           <w:tr>
             <w:trPr>
-              <w:divId w:val="1530223782"/>
+              <w:divId w:val="2142385046"/>
               <w:tblCellSpacing w:w="15" w:type="dxa"/>
             </w:trPr>
             <w:tc>
@@ -20218,11 +20602,13 @@
                   <w:pStyle w:val="Bibliography"/>
                   <w:rPr>
                     <w:noProof/>
+                    <w:lang w:val="en-US"/>
                   </w:rPr>
                 </w:pPr>
                 <w:r>
                   <w:rPr>
                     <w:noProof/>
+                    <w:lang w:val="en-US"/>
                   </w:rPr>
                   <w:t xml:space="preserve">[2] </w:t>
                 </w:r>
@@ -20238,11 +20624,13 @@
                   <w:pStyle w:val="Bibliography"/>
                   <w:rPr>
                     <w:noProof/>
+                    <w:lang w:val="en-US"/>
                   </w:rPr>
                 </w:pPr>
                 <w:r>
                   <w:rPr>
                     <w:noProof/>
+                    <w:lang w:val="en-US"/>
                   </w:rPr>
                   <w:t>GitHub, "Octoverse: A new developer joins GitHub every second as AI leads TypeScript to #1," GitHub, 28 October 2025. [Online]. Available: https://github.blog/news-insights/octoverse/octoverse-a-new-developer-joins-github-every-second-as-ai-leads-typescript-to-1/.</w:t>
                 </w:r>
@@ -20251,7 +20639,7 @@
           </w:tr>
           <w:tr>
             <w:trPr>
-              <w:divId w:val="1530223782"/>
+              <w:divId w:val="2142385046"/>
               <w:tblCellSpacing w:w="15" w:type="dxa"/>
             </w:trPr>
             <w:tc>
@@ -20264,11 +20652,13 @@
                   <w:pStyle w:val="Bibliography"/>
                   <w:rPr>
                     <w:noProof/>
+                    <w:lang w:val="en-US"/>
                   </w:rPr>
                 </w:pPr>
                 <w:r>
                   <w:rPr>
                     <w:noProof/>
+                    <w:lang w:val="en-US"/>
                   </w:rPr>
                   <w:t xml:space="preserve">[3] </w:t>
                 </w:r>
@@ -20284,11 +20674,13 @@
                   <w:pStyle w:val="Bibliography"/>
                   <w:rPr>
                     <w:noProof/>
+                    <w:lang w:val="en-US"/>
                   </w:rPr>
                 </w:pPr>
                 <w:r>
                   <w:rPr>
                     <w:noProof/>
+                    <w:lang w:val="en-US"/>
                   </w:rPr>
                   <w:t xml:space="preserve">Paszke, A. et al., "PyTorch: An Imperative Style, High-Performance Deep Learning Library," </w:t>
                 </w:r>
@@ -20297,12 +20689,14 @@
                     <w:i/>
                     <w:iCs/>
                     <w:noProof/>
+                    <w:lang w:val="en-US"/>
                   </w:rPr>
                   <w:t xml:space="preserve">Advances in Neural Information Processing Systems, </w:t>
                 </w:r>
                 <w:r>
                   <w:rPr>
                     <w:noProof/>
+                    <w:lang w:val="en-US"/>
                   </w:rPr>
                   <w:t xml:space="preserve">vol. 32, 2019. </w:t>
                 </w:r>
@@ -20311,7 +20705,7 @@
           </w:tr>
           <w:tr>
             <w:trPr>
-              <w:divId w:val="1530223782"/>
+              <w:divId w:val="2142385046"/>
               <w:tblCellSpacing w:w="15" w:type="dxa"/>
             </w:trPr>
             <w:tc>
@@ -20324,11 +20718,13 @@
                   <w:pStyle w:val="Bibliography"/>
                   <w:rPr>
                     <w:noProof/>
+                    <w:lang w:val="en-US"/>
                   </w:rPr>
                 </w:pPr>
                 <w:r>
                   <w:rPr>
                     <w:noProof/>
+                    <w:lang w:val="en-US"/>
                   </w:rPr>
                   <w:t xml:space="preserve">[4] </w:t>
                 </w:r>
@@ -20344,11 +20740,13 @@
                   <w:pStyle w:val="Bibliography"/>
                   <w:rPr>
                     <w:noProof/>
+                    <w:lang w:val="en-US"/>
                   </w:rPr>
                 </w:pPr>
                 <w:r>
                   <w:rPr>
                     <w:noProof/>
+                    <w:lang w:val="en-US"/>
                   </w:rPr>
                   <w:t>TorchSharp, "TorchSharp Github Repository," GitHub, [Online]. Available: https://github.com/dotnet/torchsharp.</w:t>
                 </w:r>
@@ -20357,7 +20755,7 @@
           </w:tr>
           <w:tr>
             <w:trPr>
-              <w:divId w:val="1530223782"/>
+              <w:divId w:val="2142385046"/>
               <w:tblCellSpacing w:w="15" w:type="dxa"/>
             </w:trPr>
             <w:tc>
@@ -20370,11 +20768,13 @@
                   <w:pStyle w:val="Bibliography"/>
                   <w:rPr>
                     <w:noProof/>
+                    <w:lang w:val="en-US"/>
                   </w:rPr>
                 </w:pPr>
                 <w:r>
                   <w:rPr>
                     <w:noProof/>
+                    <w:lang w:val="en-US"/>
                   </w:rPr>
                   <w:t xml:space="preserve">[5] </w:t>
                 </w:r>
@@ -20390,11 +20790,13 @@
                   <w:pStyle w:val="Bibliography"/>
                   <w:rPr>
                     <w:noProof/>
+                    <w:lang w:val="en-US"/>
                   </w:rPr>
                 </w:pPr>
                 <w:r>
                   <w:rPr>
                     <w:noProof/>
+                    <w:lang w:val="en-US"/>
                   </w:rPr>
                   <w:t xml:space="preserve">D. M. W. Powers, "Evaluation: from precision, recall and F-measure to ROC, informedness, markedness and correlation," </w:t>
                 </w:r>
@@ -20403,12 +20805,14 @@
                     <w:i/>
                     <w:iCs/>
                     <w:noProof/>
+                    <w:lang w:val="en-US"/>
                   </w:rPr>
                   <w:t xml:space="preserve">Journal of Machine Learning Technologies, </w:t>
                 </w:r>
                 <w:r>
                   <w:rPr>
                     <w:noProof/>
+                    <w:lang w:val="en-US"/>
                   </w:rPr>
                   <w:t xml:space="preserve">vol. 2, 2011. </w:t>
                 </w:r>
@@ -20417,7 +20821,7 @@
           </w:tr>
           <w:tr>
             <w:trPr>
-              <w:divId w:val="1530223782"/>
+              <w:divId w:val="2142385046"/>
               <w:tblCellSpacing w:w="15" w:type="dxa"/>
             </w:trPr>
             <w:tc>
@@ -20430,11 +20834,13 @@
                   <w:pStyle w:val="Bibliography"/>
                   <w:rPr>
                     <w:noProof/>
+                    <w:lang w:val="en-US"/>
                   </w:rPr>
                 </w:pPr>
                 <w:r>
                   <w:rPr>
                     <w:noProof/>
+                    <w:lang w:val="en-US"/>
                   </w:rPr>
                   <w:t xml:space="preserve">[6] </w:t>
                 </w:r>
@@ -20450,11 +20856,13 @@
                   <w:pStyle w:val="Bibliography"/>
                   <w:rPr>
                     <w:noProof/>
+                    <w:lang w:val="en-US"/>
                   </w:rPr>
                 </w:pPr>
                 <w:r>
                   <w:rPr>
                     <w:noProof/>
+                    <w:lang w:val="en-US"/>
                   </w:rPr>
                   <w:t xml:space="preserve">H. Al-Yasriy, M. S. Al-Husieny, F. Y. Mohsen, E. A. Khalil and Z. S. Hassan, "Diagnosis of Lung Cancer Based on CT Scans Using CNN," </w:t>
                 </w:r>
@@ -20463,12 +20871,14 @@
                     <w:i/>
                     <w:iCs/>
                     <w:noProof/>
+                    <w:lang w:val="en-US"/>
                   </w:rPr>
                   <w:t xml:space="preserve">IOP Conference Series: Materials Science and Engineering, </w:t>
                 </w:r>
                 <w:r>
                   <w:rPr>
                     <w:noProof/>
+                    <w:lang w:val="en-US"/>
                   </w:rPr>
                   <w:t xml:space="preserve">vol. 928, 2020. </w:t>
                 </w:r>
@@ -20477,7 +20887,7 @@
           </w:tr>
           <w:tr>
             <w:trPr>
-              <w:divId w:val="1530223782"/>
+              <w:divId w:val="2142385046"/>
               <w:tblCellSpacing w:w="15" w:type="dxa"/>
             </w:trPr>
             <w:tc>
@@ -20490,11 +20900,13 @@
                   <w:pStyle w:val="Bibliography"/>
                   <w:rPr>
                     <w:noProof/>
+                    <w:lang w:val="en-US"/>
                   </w:rPr>
                 </w:pPr>
                 <w:r>
                   <w:rPr>
                     <w:noProof/>
+                    <w:lang w:val="en-US"/>
                   </w:rPr>
                   <w:t xml:space="preserve">[7] </w:t>
                 </w:r>
@@ -20510,11 +20922,13 @@
                   <w:pStyle w:val="Bibliography"/>
                   <w:rPr>
                     <w:noProof/>
+                    <w:lang w:val="en-US"/>
                   </w:rPr>
                 </w:pPr>
                 <w:r>
                   <w:rPr>
                     <w:noProof/>
+                    <w:lang w:val="en-US"/>
                   </w:rPr>
                   <w:t xml:space="preserve">H. F. Kareem, M. S. Al-Husieny, F. Y. Mohsen, E. A. Khalil and Z. S. Hassan, "Evaluation of SVM Performance in the Detection of Lung Cancer in Marked CT Scan Dataset," </w:t>
                 </w:r>
@@ -20523,12 +20937,14 @@
                     <w:i/>
                     <w:iCs/>
                     <w:noProof/>
+                    <w:lang w:val="en-US"/>
                   </w:rPr>
                   <w:t xml:space="preserve">Indonesian Journal of Electrical Engineering and Computer Science, </w:t>
                 </w:r>
                 <w:r>
                   <w:rPr>
                     <w:noProof/>
+                    <w:lang w:val="en-US"/>
                   </w:rPr>
                   <w:t xml:space="preserve">vol. 21, 2021. </w:t>
                 </w:r>
@@ -20537,7 +20953,7 @@
           </w:tr>
           <w:tr>
             <w:trPr>
-              <w:divId w:val="1530223782"/>
+              <w:divId w:val="2142385046"/>
               <w:tblCellSpacing w:w="15" w:type="dxa"/>
             </w:trPr>
             <w:tc>
@@ -20550,11 +20966,13 @@
                   <w:pStyle w:val="Bibliography"/>
                   <w:rPr>
                     <w:noProof/>
+                    <w:lang w:val="en-US"/>
                   </w:rPr>
                 </w:pPr>
                 <w:r>
                   <w:rPr>
                     <w:noProof/>
+                    <w:lang w:val="en-US"/>
                   </w:rPr>
                   <w:t xml:space="preserve">[8] </w:t>
                 </w:r>
@@ -20570,11 +20988,13 @@
                   <w:pStyle w:val="Bibliography"/>
                   <w:rPr>
                     <w:noProof/>
+                    <w:lang w:val="en-US"/>
                   </w:rPr>
                 </w:pPr>
                 <w:r>
                   <w:rPr>
                     <w:noProof/>
+                    <w:lang w:val="en-US"/>
                   </w:rPr>
                   <w:t xml:space="preserve">H. Alyasriy and M. Al-Huseiny, "The IQ-OTH/NCCD lung cancer dataset," </w:t>
                 </w:r>
@@ -20583,12 +21003,14 @@
                     <w:i/>
                     <w:iCs/>
                     <w:noProof/>
+                    <w:lang w:val="en-US"/>
                   </w:rPr>
                   <w:t xml:space="preserve">Mendeley Data, </w:t>
                 </w:r>
                 <w:r>
                   <w:rPr>
                     <w:noProof/>
+                    <w:lang w:val="en-US"/>
                   </w:rPr>
                   <w:t xml:space="preserve">vol. 4, 2023. </w:t>
                 </w:r>
@@ -20597,7 +21019,7 @@
           </w:tr>
           <w:tr>
             <w:trPr>
-              <w:divId w:val="1530223782"/>
+              <w:divId w:val="2142385046"/>
               <w:tblCellSpacing w:w="15" w:type="dxa"/>
             </w:trPr>
             <w:tc>
@@ -20610,11 +21032,13 @@
                   <w:pStyle w:val="Bibliography"/>
                   <w:rPr>
                     <w:noProof/>
+                    <w:lang w:val="en-US"/>
                   </w:rPr>
                 </w:pPr>
                 <w:r>
                   <w:rPr>
                     <w:noProof/>
+                    <w:lang w:val="en-US"/>
                   </w:rPr>
                   <w:t xml:space="preserve">[9] </w:t>
                 </w:r>
@@ -20630,20 +21054,38 @@
                   <w:pStyle w:val="Bibliography"/>
                   <w:rPr>
                     <w:noProof/>
+                    <w:lang w:val="en-US"/>
                   </w:rPr>
                 </w:pPr>
                 <w:r>
                   <w:rPr>
                     <w:noProof/>
+                    <w:lang w:val="en-US"/>
                   </w:rPr>
-                  <w:t>A. Mahimkar, "Lung Cancer Prediction on Image Data," Kaggle, 2019. [Online]. Available: https://www.kaggle.com/code/adityamahimkar/lung-cancer-prediction-on-image-data/notebook.</w:t>
+                  <w:t xml:space="preserve">G. E., "Medical image data augmentation: techniques, comparisons and interpretations," </w:t>
+                </w:r>
+                <w:r>
+                  <w:rPr>
+                    <w:i/>
+                    <w:iCs/>
+                    <w:noProof/>
+                    <w:lang w:val="en-US"/>
+                  </w:rPr>
+                  <w:t xml:space="preserve">Artificial Intelligence Review, </w:t>
+                </w:r>
+                <w:r>
+                  <w:rPr>
+                    <w:noProof/>
+                    <w:lang w:val="en-US"/>
+                  </w:rPr>
+                  <w:t xml:space="preserve">2023. </w:t>
                 </w:r>
               </w:p>
             </w:tc>
           </w:tr>
           <w:tr>
             <w:trPr>
-              <w:divId w:val="1530223782"/>
+              <w:divId w:val="2142385046"/>
               <w:tblCellSpacing w:w="15" w:type="dxa"/>
             </w:trPr>
             <w:tc>
@@ -20656,11 +21098,13 @@
                   <w:pStyle w:val="Bibliography"/>
                   <w:rPr>
                     <w:noProof/>
+                    <w:lang w:val="en-US"/>
                   </w:rPr>
                 </w:pPr>
                 <w:r>
                   <w:rPr>
                     <w:noProof/>
+                    <w:lang w:val="en-US"/>
                   </w:rPr>
                   <w:t xml:space="preserve">[10] </w:t>
                 </w:r>
@@ -20676,11 +21120,63 @@
                   <w:pStyle w:val="Bibliography"/>
                   <w:rPr>
                     <w:noProof/>
+                    <w:lang w:val="en-US"/>
                   </w:rPr>
                 </w:pPr>
                 <w:r>
                   <w:rPr>
                     <w:noProof/>
+                    <w:lang w:val="en-US"/>
+                  </w:rPr>
+                  <w:t>A. Mahimkar, "Lung Cancer Prediction on Image Data," Kaggle, 2019. [Online]. Available: https://www.kaggle.com/code/adityamahimkar/lung-cancer-prediction-on-image-data/notebook.</w:t>
+                </w:r>
+              </w:p>
+            </w:tc>
+          </w:tr>
+          <w:tr>
+            <w:trPr>
+              <w:divId w:val="2142385046"/>
+              <w:tblCellSpacing w:w="15" w:type="dxa"/>
+            </w:trPr>
+            <w:tc>
+              <w:tcPr>
+                <w:tcW w:w="50" w:type="pct"/>
+                <w:hideMark/>
+              </w:tcPr>
+              <w:p>
+                <w:pPr>
+                  <w:pStyle w:val="Bibliography"/>
+                  <w:rPr>
+                    <w:noProof/>
+                    <w:lang w:val="en-US"/>
+                  </w:rPr>
+                </w:pPr>
+                <w:r>
+                  <w:rPr>
+                    <w:noProof/>
+                    <w:lang w:val="en-US"/>
+                  </w:rPr>
+                  <w:t xml:space="preserve">[11] </w:t>
+                </w:r>
+              </w:p>
+            </w:tc>
+            <w:tc>
+              <w:tcPr>
+                <w:tcW w:w="0" w:type="auto"/>
+                <w:hideMark/>
+              </w:tcPr>
+              <w:p>
+                <w:pPr>
+                  <w:pStyle w:val="Bibliography"/>
+                  <w:rPr>
+                    <w:noProof/>
+                    <w:lang w:val="en-US"/>
+                  </w:rPr>
+                </w:pPr>
+                <w:r>
+                  <w:rPr>
+                    <w:noProof/>
+                    <w:lang w:val="en-US"/>
                   </w:rPr>
                   <w:t xml:space="preserve">D. P. Kingma and J. Ba, "Adam: A Method for Stochastic Optimization," </w:t>
                 </w:r>
@@ -20689,12 +21185,14 @@
                     <w:i/>
                     <w:iCs/>
                     <w:noProof/>
+                    <w:lang w:val="en-US"/>
                   </w:rPr>
                   <w:t xml:space="preserve">3rd International Conference on Learning Representations (ICLR), </w:t>
                 </w:r>
                 <w:r>
                   <w:rPr>
                     <w:noProof/>
+                    <w:lang w:val="en-US"/>
                   </w:rPr>
                   <w:t xml:space="preserve">2015. </w:t>
                 </w:r>
@@ -20704,7 +21202,7 @@
         </w:tbl>
         <w:p>
           <w:pPr>
-            <w:divId w:val="1530223782"/>
+            <w:divId w:val="2142385046"/>
             <w:rPr>
               <w:rFonts w:eastAsia="Times New Roman"/>
               <w:noProof/>
@@ -20734,7 +21232,6 @@
           <w:sz w:val="52"/>
           <w:szCs w:val="52"/>
         </w:rPr>
-        <w:lastRenderedPageBreak/>
         <w:t>Dodatak</w:t>
       </w:r>
     </w:p>
@@ -20904,13 +21401,7 @@
           <w:rPr>
             <w:noProof/>
           </w:rPr>
-          <w:t>vi</w:t>
-        </w:r>
-        <w:r>
-          <w:rPr>
-            <w:noProof/>
-          </w:rPr>
-          <w:t>i</w:t>
+          <w:t>vii</w:t>
         </w:r>
         <w:r>
           <w:rPr>
@@ -23456,6 +23947,119 @@
     </w:lvl>
   </w:abstractNum>
   <w:abstractNum w:abstractNumId="19" w15:restartNumberingAfterBreak="0">
+    <w:nsid w:val="46A44769"/>
+    <w:multiLevelType w:val="hybridMultilevel"/>
+    <w:tmpl w:val="3C98DE0E"/>
+    <w:lvl w:ilvl="0" w:tplc="A4EC73B4">
+      <w:start w:val="3"/>
+      <w:numFmt w:val="bullet"/>
+      <w:lvlText w:val="-"/>
+      <w:lvlJc w:val="left"/>
+      <w:pPr>
+        <w:ind w:left="720" w:hanging="360"/>
+      </w:pPr>
+      <w:rPr>
+        <w:rFonts w:ascii="Times New Roman" w:eastAsiaTheme="minorHAnsi" w:hAnsi="Times New Roman" w:cs="Times New Roman" w:hint="default"/>
+      </w:rPr>
+    </w:lvl>
+    <w:lvl w:ilvl="1" w:tplc="141A0003" w:tentative="1">
+      <w:start w:val="1"/>
+      <w:numFmt w:val="bullet"/>
+      <w:lvlText w:val="o"/>
+      <w:lvlJc w:val="left"/>
+      <w:pPr>
+        <w:ind w:left="1440" w:hanging="360"/>
+      </w:pPr>
+      <w:rPr>
+        <w:rFonts w:ascii="Courier New" w:hAnsi="Courier New" w:cs="Courier New" w:hint="default"/>
+      </w:rPr>
+    </w:lvl>
+    <w:lvl w:ilvl="2" w:tplc="141A0005" w:tentative="1">
+      <w:start w:val="1"/>
+      <w:numFmt w:val="bullet"/>
+      <w:lvlText w:val=""/>
+      <w:lvlJc w:val="left"/>
+      <w:pPr>
+        <w:ind w:left="2160" w:hanging="360"/>
+      </w:pPr>
+      <w:rPr>
+        <w:rFonts w:ascii="Wingdings" w:hAnsi="Wingdings" w:hint="default"/>
+      </w:rPr>
+    </w:lvl>
+    <w:lvl w:ilvl="3" w:tplc="141A0001" w:tentative="1">
+      <w:start w:val="1"/>
+      <w:numFmt w:val="bullet"/>
+      <w:lvlText w:val=""/>
+      <w:lvlJc w:val="left"/>
+      <w:pPr>
+        <w:ind w:left="2880" w:hanging="360"/>
+      </w:pPr>
+      <w:rPr>
+        <w:rFonts w:ascii="Symbol" w:hAnsi="Symbol" w:hint="default"/>
+      </w:rPr>
+    </w:lvl>
+    <w:lvl w:ilvl="4" w:tplc="141A0003" w:tentative="1">
+      <w:start w:val="1"/>
+      <w:numFmt w:val="bullet"/>
+      <w:lvlText w:val="o"/>
+      <w:lvlJc w:val="left"/>
+      <w:pPr>
+        <w:ind w:left="3600" w:hanging="360"/>
+      </w:pPr>
+      <w:rPr>
+        <w:rFonts w:ascii="Courier New" w:hAnsi="Courier New" w:cs="Courier New" w:hint="default"/>
+      </w:rPr>
+    </w:lvl>
+    <w:lvl w:ilvl="5" w:tplc="141A0005" w:tentative="1">
+      <w:start w:val="1"/>
+      <w:numFmt w:val="bullet"/>
+      <w:lvlText w:val=""/>
+      <w:lvlJc w:val="left"/>
+      <w:pPr>
+        <w:ind w:left="4320" w:hanging="360"/>
+      </w:pPr>
+      <w:rPr>
+        <w:rFonts w:ascii="Wingdings" w:hAnsi="Wingdings" w:hint="default"/>
+      </w:rPr>
+    </w:lvl>
+    <w:lvl w:ilvl="6" w:tplc="141A0001" w:tentative="1">
+      <w:start w:val="1"/>
+      <w:numFmt w:val="bullet"/>
+      <w:lvlText w:val=""/>
+      <w:lvlJc w:val="left"/>
+      <w:pPr>
+        <w:ind w:left="5040" w:hanging="360"/>
+      </w:pPr>
+      <w:rPr>
+        <w:rFonts w:ascii="Symbol" w:hAnsi="Symbol" w:hint="default"/>
+      </w:rPr>
+    </w:lvl>
+    <w:lvl w:ilvl="7" w:tplc="141A0003" w:tentative="1">
+      <w:start w:val="1"/>
+      <w:numFmt w:val="bullet"/>
+      <w:lvlText w:val="o"/>
+      <w:lvlJc w:val="left"/>
+      <w:pPr>
+        <w:ind w:left="5760" w:hanging="360"/>
+      </w:pPr>
+      <w:rPr>
+        <w:rFonts w:ascii="Courier New" w:hAnsi="Courier New" w:cs="Courier New" w:hint="default"/>
+      </w:rPr>
+    </w:lvl>
+    <w:lvl w:ilvl="8" w:tplc="141A0005" w:tentative="1">
+      <w:start w:val="1"/>
+      <w:numFmt w:val="bullet"/>
+      <w:lvlText w:val=""/>
+      <w:lvlJc w:val="left"/>
+      <w:pPr>
+        <w:ind w:left="6480" w:hanging="360"/>
+      </w:pPr>
+      <w:rPr>
+        <w:rFonts w:ascii="Wingdings" w:hAnsi="Wingdings" w:hint="default"/>
+      </w:rPr>
+    </w:lvl>
+  </w:abstractNum>
+  <w:abstractNum w:abstractNumId="20" w15:restartNumberingAfterBreak="0">
     <w:nsid w:val="4A834243"/>
     <w:multiLevelType w:val="hybridMultilevel"/>
     <w:tmpl w:val="9C8E8210"/>
@@ -23544,7 +24148,7 @@
       </w:pPr>
     </w:lvl>
   </w:abstractNum>
-  <w:abstractNum w:abstractNumId="20" w15:restartNumberingAfterBreak="0">
+  <w:abstractNum w:abstractNumId="21" w15:restartNumberingAfterBreak="0">
     <w:nsid w:val="535942DE"/>
     <w:multiLevelType w:val="hybridMultilevel"/>
     <w:tmpl w:val="49C0CC88"/>
@@ -23633,7 +24237,7 @@
       </w:pPr>
     </w:lvl>
   </w:abstractNum>
-  <w:abstractNum w:abstractNumId="21" w15:restartNumberingAfterBreak="0">
+  <w:abstractNum w:abstractNumId="22" w15:restartNumberingAfterBreak="0">
     <w:nsid w:val="5B1F75AB"/>
     <w:multiLevelType w:val="hybridMultilevel"/>
     <w:tmpl w:val="2ACC4F52"/>
@@ -23722,7 +24326,7 @@
       </w:pPr>
     </w:lvl>
   </w:abstractNum>
-  <w:abstractNum w:abstractNumId="22" w15:restartNumberingAfterBreak="0">
+  <w:abstractNum w:abstractNumId="23" w15:restartNumberingAfterBreak="0">
     <w:nsid w:val="5FDF4664"/>
     <w:multiLevelType w:val="multilevel"/>
     <w:tmpl w:val="9B5451AA"/>
@@ -23863,7 +24467,120 @@
       </w:rPr>
     </w:lvl>
   </w:abstractNum>
-  <w:abstractNum w:abstractNumId="23" w15:restartNumberingAfterBreak="0">
+  <w:abstractNum w:abstractNumId="24" w15:restartNumberingAfterBreak="0">
+    <w:nsid w:val="63A6251C"/>
+    <w:multiLevelType w:val="hybridMultilevel"/>
+    <w:tmpl w:val="A90CA12C"/>
+    <w:lvl w:ilvl="0" w:tplc="04090001">
+      <w:start w:val="1"/>
+      <w:numFmt w:val="bullet"/>
+      <w:lvlText w:val=""/>
+      <w:lvlJc w:val="left"/>
+      <w:pPr>
+        <w:ind w:left="720" w:hanging="360"/>
+      </w:pPr>
+      <w:rPr>
+        <w:rFonts w:ascii="Symbol" w:hAnsi="Symbol" w:hint="default"/>
+      </w:rPr>
+    </w:lvl>
+    <w:lvl w:ilvl="1" w:tplc="141A0003" w:tentative="1">
+      <w:start w:val="1"/>
+      <w:numFmt w:val="bullet"/>
+      <w:lvlText w:val="o"/>
+      <w:lvlJc w:val="left"/>
+      <w:pPr>
+        <w:ind w:left="1440" w:hanging="360"/>
+      </w:pPr>
+      <w:rPr>
+        <w:rFonts w:ascii="Courier New" w:hAnsi="Courier New" w:cs="Courier New" w:hint="default"/>
+      </w:rPr>
+    </w:lvl>
+    <w:lvl w:ilvl="2" w:tplc="141A0005" w:tentative="1">
+      <w:start w:val="1"/>
+      <w:numFmt w:val="bullet"/>
+      <w:lvlText w:val=""/>
+      <w:lvlJc w:val="left"/>
+      <w:pPr>
+        <w:ind w:left="2160" w:hanging="360"/>
+      </w:pPr>
+      <w:rPr>
+        <w:rFonts w:ascii="Wingdings" w:hAnsi="Wingdings" w:hint="default"/>
+      </w:rPr>
+    </w:lvl>
+    <w:lvl w:ilvl="3" w:tplc="141A0001" w:tentative="1">
+      <w:start w:val="1"/>
+      <w:numFmt w:val="bullet"/>
+      <w:lvlText w:val=""/>
+      <w:lvlJc w:val="left"/>
+      <w:pPr>
+        <w:ind w:left="2880" w:hanging="360"/>
+      </w:pPr>
+      <w:rPr>
+        <w:rFonts w:ascii="Symbol" w:hAnsi="Symbol" w:hint="default"/>
+      </w:rPr>
+    </w:lvl>
+    <w:lvl w:ilvl="4" w:tplc="141A0003" w:tentative="1">
+      <w:start w:val="1"/>
+      <w:numFmt w:val="bullet"/>
+      <w:lvlText w:val="o"/>
+      <w:lvlJc w:val="left"/>
+      <w:pPr>
+        <w:ind w:left="3600" w:hanging="360"/>
+      </w:pPr>
+      <w:rPr>
+        <w:rFonts w:ascii="Courier New" w:hAnsi="Courier New" w:cs="Courier New" w:hint="default"/>
+      </w:rPr>
+    </w:lvl>
+    <w:lvl w:ilvl="5" w:tplc="141A0005" w:tentative="1">
+      <w:start w:val="1"/>
+      <w:numFmt w:val="bullet"/>
+      <w:lvlText w:val=""/>
+      <w:lvlJc w:val="left"/>
+      <w:pPr>
+        <w:ind w:left="4320" w:hanging="360"/>
+      </w:pPr>
+      <w:rPr>
+        <w:rFonts w:ascii="Wingdings" w:hAnsi="Wingdings" w:hint="default"/>
+      </w:rPr>
+    </w:lvl>
+    <w:lvl w:ilvl="6" w:tplc="141A0001" w:tentative="1">
+      <w:start w:val="1"/>
+      <w:numFmt w:val="bullet"/>
+      <w:lvlText w:val=""/>
+      <w:lvlJc w:val="left"/>
+      <w:pPr>
+        <w:ind w:left="5040" w:hanging="360"/>
+      </w:pPr>
+      <w:rPr>
+        <w:rFonts w:ascii="Symbol" w:hAnsi="Symbol" w:hint="default"/>
+      </w:rPr>
+    </w:lvl>
+    <w:lvl w:ilvl="7" w:tplc="141A0003" w:tentative="1">
+      <w:start w:val="1"/>
+      <w:numFmt w:val="bullet"/>
+      <w:lvlText w:val="o"/>
+      <w:lvlJc w:val="left"/>
+      <w:pPr>
+        <w:ind w:left="5760" w:hanging="360"/>
+      </w:pPr>
+      <w:rPr>
+        <w:rFonts w:ascii="Courier New" w:hAnsi="Courier New" w:cs="Courier New" w:hint="default"/>
+      </w:rPr>
+    </w:lvl>
+    <w:lvl w:ilvl="8" w:tplc="141A0005" w:tentative="1">
+      <w:start w:val="1"/>
+      <w:numFmt w:val="bullet"/>
+      <w:lvlText w:val=""/>
+      <w:lvlJc w:val="left"/>
+      <w:pPr>
+        <w:ind w:left="6480" w:hanging="360"/>
+      </w:pPr>
+      <w:rPr>
+        <w:rFonts w:ascii="Wingdings" w:hAnsi="Wingdings" w:hint="default"/>
+      </w:rPr>
+    </w:lvl>
+  </w:abstractNum>
+  <w:abstractNum w:abstractNumId="25" w15:restartNumberingAfterBreak="0">
     <w:nsid w:val="67556A96"/>
     <w:multiLevelType w:val="hybridMultilevel"/>
     <w:tmpl w:val="9946ABD8"/>
@@ -23976,7 +24693,7 @@
       </w:rPr>
     </w:lvl>
   </w:abstractNum>
-  <w:abstractNum w:abstractNumId="24" w15:restartNumberingAfterBreak="0">
+  <w:abstractNum w:abstractNumId="26" w15:restartNumberingAfterBreak="0">
     <w:nsid w:val="68D620C3"/>
     <w:multiLevelType w:val="hybridMultilevel"/>
     <w:tmpl w:val="1B92FA4C"/>
@@ -24065,7 +24782,7 @@
       </w:pPr>
     </w:lvl>
   </w:abstractNum>
-  <w:abstractNum w:abstractNumId="25" w15:restartNumberingAfterBreak="0">
+  <w:abstractNum w:abstractNumId="27" w15:restartNumberingAfterBreak="0">
     <w:nsid w:val="6C484A00"/>
     <w:multiLevelType w:val="hybridMultilevel"/>
     <w:tmpl w:val="305C91F2"/>
@@ -24178,7 +24895,7 @@
       </w:rPr>
     </w:lvl>
   </w:abstractNum>
-  <w:abstractNum w:abstractNumId="26" w15:restartNumberingAfterBreak="0">
+  <w:abstractNum w:abstractNumId="28" w15:restartNumberingAfterBreak="0">
     <w:nsid w:val="6E0758DC"/>
     <w:multiLevelType w:val="hybridMultilevel"/>
     <w:tmpl w:val="6D9EA9C2"/>
@@ -24291,7 +25008,7 @@
       </w:rPr>
     </w:lvl>
   </w:abstractNum>
-  <w:abstractNum w:abstractNumId="27" w15:restartNumberingAfterBreak="0">
+  <w:abstractNum w:abstractNumId="29" w15:restartNumberingAfterBreak="0">
     <w:nsid w:val="6E53293A"/>
     <w:multiLevelType w:val="hybridMultilevel"/>
     <w:tmpl w:val="AAC841F8"/>
@@ -24404,7 +25121,7 @@
       </w:rPr>
     </w:lvl>
   </w:abstractNum>
-  <w:abstractNum w:abstractNumId="28" w15:restartNumberingAfterBreak="0">
+  <w:abstractNum w:abstractNumId="30" w15:restartNumberingAfterBreak="0">
     <w:nsid w:val="71B217DE"/>
     <w:multiLevelType w:val="hybridMultilevel"/>
     <w:tmpl w:val="4142DE1E"/>
@@ -24494,7 +25211,7 @@
       </w:pPr>
     </w:lvl>
   </w:abstractNum>
-  <w:abstractNum w:abstractNumId="29" w15:restartNumberingAfterBreak="0">
+  <w:abstractNum w:abstractNumId="31" w15:restartNumberingAfterBreak="0">
     <w:nsid w:val="7A850D4B"/>
     <w:multiLevelType w:val="hybridMultilevel"/>
     <w:tmpl w:val="F572B8AC"/>
@@ -24584,19 +25301,19 @@
     </w:lvl>
   </w:abstractNum>
   <w:num w:numId="1">
-    <w:abstractNumId w:val="19"/>
+    <w:abstractNumId w:val="20"/>
   </w:num>
   <w:num w:numId="2">
-    <w:abstractNumId w:val="22"/>
+    <w:abstractNumId w:val="23"/>
   </w:num>
   <w:num w:numId="3">
-    <w:abstractNumId w:val="23"/>
+    <w:abstractNumId w:val="25"/>
   </w:num>
   <w:num w:numId="4">
     <w:abstractNumId w:val="10"/>
   </w:num>
   <w:num w:numId="5">
-    <w:abstractNumId w:val="26"/>
+    <w:abstractNumId w:val="28"/>
   </w:num>
   <w:num w:numId="6">
     <w:abstractNumId w:val="12"/>
@@ -24608,16 +25325,16 @@
     <w:abstractNumId w:val="9"/>
   </w:num>
   <w:num w:numId="9">
-    <w:abstractNumId w:val="25"/>
+    <w:abstractNumId w:val="27"/>
   </w:num>
   <w:num w:numId="10">
     <w:abstractNumId w:val="18"/>
   </w:num>
   <w:num w:numId="11">
-    <w:abstractNumId w:val="27"/>
+    <w:abstractNumId w:val="29"/>
   </w:num>
   <w:num w:numId="12">
-    <w:abstractNumId w:val="28"/>
+    <w:abstractNumId w:val="30"/>
   </w:num>
   <w:num w:numId="13">
     <w:abstractNumId w:val="8"/>
@@ -24644,13 +25361,13 @@
     <w:abstractNumId w:val="17"/>
   </w:num>
   <w:num w:numId="21">
-    <w:abstractNumId w:val="20"/>
+    <w:abstractNumId w:val="21"/>
   </w:num>
   <w:num w:numId="22">
-    <w:abstractNumId w:val="29"/>
+    <w:abstractNumId w:val="31"/>
   </w:num>
   <w:num w:numId="23">
-    <w:abstractNumId w:val="21"/>
+    <w:abstractNumId w:val="22"/>
   </w:num>
   <w:num w:numId="24">
     <w:abstractNumId w:val="13"/>
@@ -24662,7 +25379,7 @@
     <w:abstractNumId w:val="5"/>
   </w:num>
   <w:num w:numId="27">
-    <w:abstractNumId w:val="24"/>
+    <w:abstractNumId w:val="26"/>
   </w:num>
   <w:num w:numId="28">
     <w:abstractNumId w:val="0"/>
@@ -24672,6 +25389,12 @@
   </w:num>
   <w:num w:numId="30">
     <w:abstractNumId w:val="3"/>
+  </w:num>
+  <w:num w:numId="31">
+    <w:abstractNumId w:val="19"/>
+  </w:num>
+  <w:num w:numId="32">
+    <w:abstractNumId w:val="24"/>
   </w:num>
   <w:numIdMacAtCleanup w:val="14"/>
 </w:numbering>
@@ -25327,6 +26050,7 @@
   <w:style w:type="character" w:default="1" w:styleId="DefaultParagraphFont">
     <w:name w:val="Default Paragraph Font"/>
     <w:uiPriority w:val="1"/>
+    <w:semiHidden/>
     <w:unhideWhenUsed/>
   </w:style>
   <w:style w:type="table" w:default="1" w:styleId="TableNormal">
@@ -25935,6 +26659,56 @@
       <w:szCs w:val="20"/>
     </w:rPr>
   </w:style>
+  <w:style w:type="paragraph" w:styleId="HTMLPreformatted">
+    <w:name w:val="HTML Preformatted"/>
+    <w:basedOn w:val="Normal"/>
+    <w:link w:val="HTMLPreformattedChar"/>
+    <w:uiPriority w:val="99"/>
+    <w:semiHidden/>
+    <w:unhideWhenUsed/>
+    <w:rsid w:val="00BD3108"/>
+    <w:pPr>
+      <w:tabs>
+        <w:tab w:val="left" w:pos="916"/>
+        <w:tab w:val="left" w:pos="1832"/>
+        <w:tab w:val="left" w:pos="2748"/>
+        <w:tab w:val="left" w:pos="3664"/>
+        <w:tab w:val="left" w:pos="4580"/>
+        <w:tab w:val="left" w:pos="5496"/>
+        <w:tab w:val="left" w:pos="6412"/>
+        <w:tab w:val="left" w:pos="7328"/>
+        <w:tab w:val="left" w:pos="8244"/>
+        <w:tab w:val="left" w:pos="9160"/>
+        <w:tab w:val="left" w:pos="10076"/>
+        <w:tab w:val="left" w:pos="10992"/>
+        <w:tab w:val="left" w:pos="11908"/>
+        <w:tab w:val="left" w:pos="12824"/>
+        <w:tab w:val="left" w:pos="13740"/>
+        <w:tab w:val="left" w:pos="14656"/>
+      </w:tabs>
+      <w:spacing w:after="0"/>
+    </w:pPr>
+    <w:rPr>
+      <w:rFonts w:ascii="Courier New" w:eastAsia="Times New Roman" w:hAnsi="Courier New" w:cs="Courier New"/>
+      <w:sz w:val="20"/>
+      <w:szCs w:val="20"/>
+      <w:lang w:val="bs-Latn-BA" w:eastAsia="bs-Latn-BA"/>
+    </w:rPr>
+  </w:style>
+  <w:style w:type="character" w:customStyle="1" w:styleId="HTMLPreformattedChar">
+    <w:name w:val="HTML Preformatted Char"/>
+    <w:basedOn w:val="DefaultParagraphFont"/>
+    <w:link w:val="HTMLPreformatted"/>
+    <w:uiPriority w:val="99"/>
+    <w:semiHidden/>
+    <w:rsid w:val="00BD3108"/>
+    <w:rPr>
+      <w:rFonts w:ascii="Courier New" w:eastAsia="Times New Roman" w:hAnsi="Courier New" w:cs="Courier New"/>
+      <w:sz w:val="20"/>
+      <w:szCs w:val="20"/>
+      <w:lang w:val="bs-Latn-BA" w:eastAsia="bs-Latn-BA"/>
+    </w:rPr>
+  </w:style>
 </w:styles>
 </file>
 
@@ -26286,7 +27060,7 @@
     </b:Author>
     <b:ProductionCompany>Kaggle</b:ProductionCompany>
     <b:URL>https://www.kaggle.com/code/adityamahimkar/lung-cancer-prediction-on-image-data/notebook</b:URL>
-    <b:RefOrder>9</b:RefOrder>
+    <b:RefOrder>10</b:RefOrder>
   </b:Source>
   <b:Source>
     <b:Tag>Pas19</b:Tag>
@@ -26442,13 +27216,32 @@
       </b:Author>
     </b:Author>
     <b:JournalName>3rd International Conference on Learning Representations (ICLR)</b:JournalName>
-    <b:RefOrder>10</b:RefOrder>
+    <b:RefOrder>11</b:RefOrder>
+  </b:Source>
+  <b:Source>
+    <b:Tag>Goc23</b:Tag>
+    <b:SourceType>JournalArticle</b:SourceType>
+    <b:Guid>{18293744-98C8-49B3-A6C3-66FE8F5F936B}</b:Guid>
+    <b:Title>Medical image data augmentation: techniques, comparisons and interpretations</b:Title>
+    <b:Year>2023</b:Year>
+    <b:Author>
+      <b:Author>
+        <b:NameList>
+          <b:Person>
+            <b:Last>E.</b:Last>
+            <b:First>Goceri</b:First>
+          </b:Person>
+        </b:NameList>
+      </b:Author>
+    </b:Author>
+    <b:JournalName>Artificial Intelligence Review</b:JournalName>
+    <b:RefOrder>9</b:RefOrder>
   </b:Source>
 </b:Sources>
 </file>
 
 <file path=customXml/itemProps1.xml><?xml version="1.0" encoding="utf-8"?>
-<ds:datastoreItem xmlns:ds="http://schemas.openxmlformats.org/officeDocument/2006/customXml" ds:itemID="{C4DA6E3D-E0BD-483C-AF19-70ED169AD605}">
+<ds:datastoreItem xmlns:ds="http://schemas.openxmlformats.org/officeDocument/2006/customXml" ds:itemID="{833BC7F2-E61D-4F00-BCF7-AB39E323AF1A}">
   <ds:schemaRefs>
     <ds:schemaRef ds:uri="http://schemas.openxmlformats.org/officeDocument/2006/bibliography"/>
   </ds:schemaRefs>

</xml_diff>

<commit_message>
Fixed roc calculation and added roc and auc calculation for each class.
</commit_message>
<xml_diff>
--- a/Word/omar_kurtovic_diplomski_rad.docx
+++ b/Word/omar_kurtovic_diplomski_rad.docx
@@ -10140,21 +10140,7 @@
           <w:rFonts w:eastAsiaTheme="minorEastAsia"/>
           <w:lang w:val="en-US"/>
         </w:rPr>
-        <w:t>]</w:t>
-      </w:r>
-      <w:r>
-        <w:rPr>
-          <w:rFonts w:eastAsiaTheme="minorEastAsia"/>
-          <w:lang w:val="en-US"/>
-        </w:rPr>
-        <w:t xml:space="preserve"> … </w:t>
-      </w:r>
-      <w:r>
-        <w:rPr>
-          <w:rFonts w:eastAsiaTheme="minorEastAsia"/>
-          <w:lang w:val="en-US"/>
-        </w:rPr>
-        <w:t xml:space="preserve"> </w:t>
+        <w:t xml:space="preserve">] …  </w:t>
       </w:r>
       <w:r>
         <w:rPr>
@@ -10254,8 +10240,135 @@
                 <w:rFonts w:ascii="Cambria Math" w:eastAsiaTheme="minorEastAsia" w:hAnsi="Cambria Math"/>
                 <w:lang w:val="en-US"/>
               </w:rPr>
-              <m:t xml:space="preserve"> </m:t>
+              <m:t xml:space="preserve"> z</m:t>
             </m:r>
+          </m:e>
+          <m:sub>
+            <m:r>
+              <w:rPr>
+                <w:rFonts w:ascii="Cambria Math" w:eastAsiaTheme="minorEastAsia" w:hAnsi="Cambria Math"/>
+                <w:lang w:val="en-US"/>
+              </w:rPr>
+              <m:t>n</m:t>
+            </m:r>
+          </m:sub>
+        </m:sSub>
+      </m:oMath>
+      <w:r>
+        <w:rPr>
+          <w:rFonts w:eastAsiaTheme="minorEastAsia"/>
+          <w:lang w:val="en-US"/>
+        </w:rPr>
+        <w:t>]</w:t>
+      </w:r>
+    </w:p>
+    <w:p>
+      <w:pPr>
+        <w:rPr>
+          <w:lang w:val="en-US"/>
+        </w:rPr>
+      </w:pPr>
+      <w:proofErr w:type="spellStart"/>
+      <w:r>
+        <w:rPr>
+          <w:lang w:val="en-US"/>
+        </w:rPr>
+        <w:t>gdje</w:t>
+      </w:r>
+      <w:proofErr w:type="spellEnd"/>
+      <w:r>
+        <w:rPr>
+          <w:lang w:val="en-US"/>
+        </w:rPr>
+        <w:t xml:space="preserve"> </w:t>
+      </w:r>
+      <m:oMath>
+        <m:sSub>
+          <m:sSubPr>
+            <m:ctrlPr>
+              <w:rPr>
+                <w:rFonts w:ascii="Cambria Math" w:hAnsi="Cambria Math"/>
+                <w:i/>
+                <w:lang w:val="en-US"/>
+              </w:rPr>
+            </m:ctrlPr>
+          </m:sSubPr>
+          <m:e>
+            <m:r>
+              <w:rPr>
+                <w:rFonts w:ascii="Cambria Math" w:hAnsi="Cambria Math"/>
+                <w:lang w:val="en-US"/>
+              </w:rPr>
+              <m:t>x</m:t>
+            </m:r>
+          </m:e>
+          <m:sub>
+            <m:r>
+              <w:rPr>
+                <w:rFonts w:ascii="Cambria Math" w:hAnsi="Cambria Math"/>
+                <w:lang w:val="en-US"/>
+              </w:rPr>
+              <m:t>i</m:t>
+            </m:r>
+          </m:sub>
+        </m:sSub>
+      </m:oMath>
+      <w:r>
+        <w:rPr>
+          <w:lang w:val="en-US"/>
+        </w:rPr>
+        <w:t xml:space="preserve">, </w:t>
+      </w:r>
+      <m:oMath>
+        <m:sSub>
+          <m:sSubPr>
+            <m:ctrlPr>
+              <w:rPr>
+                <w:rFonts w:ascii="Cambria Math" w:hAnsi="Cambria Math"/>
+                <w:i/>
+                <w:lang w:val="en-US"/>
+              </w:rPr>
+            </m:ctrlPr>
+          </m:sSubPr>
+          <m:e>
+            <m:r>
+              <w:rPr>
+                <w:rFonts w:ascii="Cambria Math" w:hAnsi="Cambria Math"/>
+                <w:lang w:val="en-US"/>
+              </w:rPr>
+              <m:t>y</m:t>
+            </m:r>
+          </m:e>
+          <m:sub>
+            <m:r>
+              <w:rPr>
+                <w:rFonts w:ascii="Cambria Math" w:hAnsi="Cambria Math"/>
+                <w:lang w:val="en-US"/>
+              </w:rPr>
+              <m:t>i</m:t>
+            </m:r>
+          </m:sub>
+        </m:sSub>
+      </m:oMath>
+      <w:r>
+        <w:rPr>
+          <w:rFonts w:eastAsiaTheme="minorEastAsia"/>
+          <w:lang w:val="en-US"/>
+        </w:rPr>
+        <w:t xml:space="preserve"> i </w:t>
+      </w:r>
+      <m:oMath>
+        <m:sSub>
+          <m:sSubPr>
+            <m:ctrlPr>
+              <w:rPr>
+                <w:rFonts w:ascii="Cambria Math" w:eastAsiaTheme="minorEastAsia" w:hAnsi="Cambria Math"/>
+                <w:i/>
+                <w:lang w:val="en-US"/>
+              </w:rPr>
+            </m:ctrlPr>
+          </m:sSubPr>
+          <m:e>
             <m:r>
               <w:rPr>
                 <w:rFonts w:ascii="Cambria Math" w:eastAsiaTheme="minorEastAsia" w:hAnsi="Cambria Math"/>
@@ -10270,65 +10383,6 @@
                 <w:rFonts w:ascii="Cambria Math" w:eastAsiaTheme="minorEastAsia" w:hAnsi="Cambria Math"/>
                 <w:lang w:val="en-US"/>
               </w:rPr>
-              <m:t>n</m:t>
-            </m:r>
-          </m:sub>
-        </m:sSub>
-      </m:oMath>
-      <w:r>
-        <w:rPr>
-          <w:rFonts w:eastAsiaTheme="minorEastAsia"/>
-          <w:lang w:val="en-US"/>
-        </w:rPr>
-        <w:t>]</w:t>
-      </w:r>
-    </w:p>
-    <w:p>
-      <w:pPr>
-        <w:rPr>
-          <w:lang w:val="en-US"/>
-        </w:rPr>
-      </w:pPr>
-      <w:proofErr w:type="spellStart"/>
-      <w:r>
-        <w:rPr>
-          <w:lang w:val="en-US"/>
-        </w:rPr>
-        <w:t>gdje</w:t>
-      </w:r>
-      <w:proofErr w:type="spellEnd"/>
-      <w:r>
-        <w:rPr>
-          <w:lang w:val="en-US"/>
-        </w:rPr>
-        <w:t xml:space="preserve"> </w:t>
-      </w:r>
-      <m:oMath>
-        <m:sSub>
-          <m:sSubPr>
-            <m:ctrlPr>
-              <w:rPr>
-                <w:rFonts w:ascii="Cambria Math" w:hAnsi="Cambria Math"/>
-                <w:i/>
-                <w:lang w:val="en-US"/>
-              </w:rPr>
-            </m:ctrlPr>
-          </m:sSubPr>
-          <m:e>
-            <m:r>
-              <w:rPr>
-                <w:rFonts w:ascii="Cambria Math" w:hAnsi="Cambria Math"/>
-                <w:lang w:val="en-US"/>
-              </w:rPr>
-              <m:t>x</m:t>
-            </m:r>
-          </m:e>
-          <m:sub>
-            <m:r>
-              <w:rPr>
-                <w:rFonts w:ascii="Cambria Math" w:hAnsi="Cambria Math"/>
-                <w:lang w:val="en-US"/>
-              </w:rPr>
               <m:t>i</m:t>
             </m:r>
           </m:sub>
@@ -10336,133 +10390,10 @@
       </m:oMath>
       <w:r>
         <w:rPr>
-          <w:lang w:val="en-US"/>
-        </w:rPr>
-        <w:t xml:space="preserve">, </w:t>
-      </w:r>
-      <m:oMath>
-        <m:sSub>
-          <m:sSubPr>
-            <m:ctrlPr>
-              <w:rPr>
-                <w:rFonts w:ascii="Cambria Math" w:hAnsi="Cambria Math"/>
-                <w:i/>
-                <w:lang w:val="en-US"/>
-              </w:rPr>
-            </m:ctrlPr>
-          </m:sSubPr>
-          <m:e>
-            <m:r>
-              <w:rPr>
-                <w:rFonts w:ascii="Cambria Math" w:hAnsi="Cambria Math"/>
-                <w:lang w:val="en-US"/>
-              </w:rPr>
-              <m:t>y</m:t>
-            </m:r>
-          </m:e>
-          <m:sub>
-            <m:r>
-              <w:rPr>
-                <w:rFonts w:ascii="Cambria Math" w:hAnsi="Cambria Math"/>
-                <w:lang w:val="en-US"/>
-              </w:rPr>
-              <m:t>i</m:t>
-            </m:r>
-          </m:sub>
-        </m:sSub>
-      </m:oMath>
-      <w:r>
-        <w:rPr>
           <w:rFonts w:eastAsiaTheme="minorEastAsia"/>
           <w:lang w:val="en-US"/>
         </w:rPr>
-        <w:t xml:space="preserve"> </w:t>
-      </w:r>
-      <w:proofErr w:type="spellStart"/>
-      <w:r>
-        <w:rPr>
-          <w:rFonts w:eastAsiaTheme="minorEastAsia"/>
-          <w:lang w:val="en-US"/>
-        </w:rPr>
-        <w:t>i</w:t>
-      </w:r>
-      <w:proofErr w:type="spellEnd"/>
-      <w:r>
-        <w:rPr>
-          <w:rFonts w:eastAsiaTheme="minorEastAsia"/>
-          <w:lang w:val="en-US"/>
-        </w:rPr>
-        <w:t xml:space="preserve"> </w:t>
-      </w:r>
-      <m:oMath>
-        <m:sSub>
-          <m:sSubPr>
-            <m:ctrlPr>
-              <w:rPr>
-                <w:rFonts w:ascii="Cambria Math" w:eastAsiaTheme="minorEastAsia" w:hAnsi="Cambria Math"/>
-                <w:i/>
-                <w:lang w:val="en-US"/>
-              </w:rPr>
-            </m:ctrlPr>
-          </m:sSubPr>
-          <m:e>
-            <m:r>
-              <w:rPr>
-                <w:rFonts w:ascii="Cambria Math" w:eastAsiaTheme="minorEastAsia" w:hAnsi="Cambria Math"/>
-                <w:lang w:val="en-US"/>
-              </w:rPr>
-              <m:t>z</m:t>
-            </m:r>
-          </m:e>
-          <m:sub>
-            <m:r>
-              <w:rPr>
-                <w:rFonts w:ascii="Cambria Math" w:eastAsiaTheme="minorEastAsia" w:hAnsi="Cambria Math"/>
-                <w:lang w:val="en-US"/>
-              </w:rPr>
-              <m:t>i</m:t>
-            </m:r>
-          </m:sub>
-        </m:sSub>
-      </m:oMath>
-      <w:r>
-        <w:rPr>
-          <w:rFonts w:eastAsiaTheme="minorEastAsia"/>
-          <w:lang w:val="en-US"/>
-        </w:rPr>
-        <w:t xml:space="preserve"> </w:t>
-      </w:r>
-      <w:proofErr w:type="spellStart"/>
-      <w:r>
-        <w:rPr>
-          <w:rFonts w:eastAsiaTheme="minorEastAsia"/>
-          <w:lang w:val="en-US"/>
-        </w:rPr>
-        <w:t>predstavljaju</w:t>
-      </w:r>
-      <w:proofErr w:type="spellEnd"/>
-      <w:r>
-        <w:rPr>
-          <w:rFonts w:eastAsiaTheme="minorEastAsia"/>
-          <w:lang w:val="en-US"/>
-        </w:rPr>
-        <w:t xml:space="preserve"> </w:t>
-      </w:r>
-      <w:proofErr w:type="spellStart"/>
-      <w:r>
-        <w:rPr>
-          <w:rFonts w:eastAsiaTheme="minorEastAsia"/>
-          <w:lang w:val="en-US"/>
-        </w:rPr>
-        <w:t>vjerovatnoće</w:t>
-      </w:r>
-      <w:proofErr w:type="spellEnd"/>
-      <w:r>
-        <w:rPr>
-          <w:rFonts w:eastAsiaTheme="minorEastAsia"/>
-          <w:lang w:val="en-US"/>
-        </w:rPr>
-        <w:t xml:space="preserve"> </w:t>
+        <w:t xml:space="preserve"> predstavljaju vjerovatnoće </w:t>
       </w:r>
       <w:r>
         <w:rPr>
@@ -12027,13 +11958,7 @@
         <w:rPr>
           <w:lang w:val="en-US"/>
         </w:rPr>
-        <w:t>)</w:t>
-      </w:r>
-      <w:r>
-        <w:rPr>
-          <w:lang w:val="en-US"/>
-        </w:rPr>
-        <w:t>, FP</w:t>
+        <w:t>), FP</w:t>
       </w:r>
       <w:r>
         <w:rPr>
@@ -12073,13 +11998,7 @@
         <w:rPr>
           <w:lang w:val="en-US"/>
         </w:rPr>
-        <w:t>)</w:t>
-      </w:r>
-      <w:r>
-        <w:rPr>
-          <w:lang w:val="en-US"/>
-        </w:rPr>
-        <w:t xml:space="preserve"> </w:t>
+        <w:t xml:space="preserve">) </w:t>
       </w:r>
       <w:proofErr w:type="spellStart"/>
       <w:r>
@@ -12139,7 +12058,21 @@
         <w:rPr>
           <w:lang w:val="en-US"/>
         </w:rPr>
-        <w:t xml:space="preserve">, a </w:t>
+        <w:t xml:space="preserve">, </w:t>
+      </w:r>
+      <w:proofErr w:type="gramStart"/>
+      <w:r>
+        <w:rPr>
+          <w:lang w:val="en-US"/>
+        </w:rPr>
+        <w:t>a</w:t>
+      </w:r>
+      <w:proofErr w:type="gramEnd"/>
+      <w:r>
+        <w:rPr>
+          <w:lang w:val="en-US"/>
+        </w:rPr>
+        <w:t xml:space="preserve"> </w:t>
       </w:r>
       <w:proofErr w:type="spellStart"/>
       <w:r>
@@ -12393,19 +12326,7 @@
                 <w:rPr>
                   <w:rFonts w:ascii="Cambria Math" w:hAnsi="Cambria Math" w:cs="Cambria Math"/>
                 </w:rPr>
-                <m:t>FP</m:t>
-              </m:r>
-              <m:r>
-                <w:rPr>
-                  <w:rFonts w:ascii="Cambria Math" w:hAnsi="Cambria Math" w:cs="Cambria Math"/>
-                </w:rPr>
-                <m:t>+</m:t>
-              </m:r>
-              <m:r>
-                <w:rPr>
-                  <w:rFonts w:ascii="Cambria Math" w:hAnsi="Cambria Math" w:cs="Cambria Math"/>
-                </w:rPr>
-                <m:t>TN</m:t>
+                <m:t>FP+TN</m:t>
               </m:r>
             </m:den>
           </m:f>
@@ -12415,7 +12336,6 @@
     <w:p>
       <w:pPr>
         <w:rPr>
-          <w:u w:val="single"/>
           <w:lang w:val="en-US"/>
         </w:rPr>
       </w:pPr>
@@ -12430,27 +12350,18 @@
         <w:rPr>
           <w:lang w:val="en-US"/>
         </w:rPr>
-        <w:t>rač</w:t>
-      </w:r>
-      <w:r>
-        <w:rPr>
-          <w:u w:val="single"/>
-          <w:lang w:val="en-US"/>
-        </w:rPr>
-        <w:t>una</w:t>
-      </w:r>
-      <w:proofErr w:type="spellEnd"/>
-      <w:r>
-        <w:rPr>
-          <w:u w:val="single"/>
-          <w:lang w:val="en-US"/>
-        </w:rPr>
-        <w:t xml:space="preserve"> </w:t>
-      </w:r>
-      <w:proofErr w:type="spellStart"/>
-      <w:r>
-        <w:rPr>
-          <w:u w:val="single"/>
+        <w:t>računa</w:t>
+      </w:r>
+      <w:proofErr w:type="spellEnd"/>
+      <w:r>
+        <w:rPr>
+          <w:lang w:val="en-US"/>
+        </w:rPr>
+        <w:t xml:space="preserve"> </w:t>
+      </w:r>
+      <w:proofErr w:type="spellStart"/>
+      <w:r>
+        <w:rPr>
           <w:lang w:val="en-US"/>
         </w:rPr>
         <w:t>na</w:t>
@@ -12458,15 +12369,13 @@
       <w:proofErr w:type="spellEnd"/>
       <w:r>
         <w:rPr>
-          <w:u w:val="single"/>
-          <w:lang w:val="en-US"/>
-        </w:rPr>
-        <w:t xml:space="preserve"> </w:t>
-      </w:r>
-      <w:proofErr w:type="spellStart"/>
-      <w:r>
-        <w:rPr>
-          <w:u w:val="single"/>
+          <w:lang w:val="en-US"/>
+        </w:rPr>
+        <w:t xml:space="preserve"> </w:t>
+      </w:r>
+      <w:proofErr w:type="spellStart"/>
+      <w:r>
+        <w:rPr>
           <w:lang w:val="en-US"/>
         </w:rPr>
         <w:t>isti</w:t>
@@ -12474,15 +12383,13 @@
       <w:proofErr w:type="spellEnd"/>
       <w:r>
         <w:rPr>
-          <w:u w:val="single"/>
-          <w:lang w:val="en-US"/>
-        </w:rPr>
-        <w:t xml:space="preserve"> </w:t>
-      </w:r>
-      <w:proofErr w:type="spellStart"/>
-      <w:r>
-        <w:rPr>
-          <w:u w:val="single"/>
+          <w:lang w:val="en-US"/>
+        </w:rPr>
+        <w:t xml:space="preserve"> </w:t>
+      </w:r>
+      <w:proofErr w:type="spellStart"/>
+      <w:r>
+        <w:rPr>
           <w:lang w:val="en-US"/>
         </w:rPr>
         <w:t>način</w:t>
@@ -12490,15 +12397,13 @@
       <w:proofErr w:type="spellEnd"/>
       <w:r>
         <w:rPr>
-          <w:u w:val="single"/>
-          <w:lang w:val="en-US"/>
-        </w:rPr>
-        <w:t xml:space="preserve"> </w:t>
-      </w:r>
-      <w:proofErr w:type="spellStart"/>
-      <w:r>
-        <w:rPr>
-          <w:u w:val="single"/>
+          <w:lang w:val="en-US"/>
+        </w:rPr>
+        <w:t xml:space="preserve"> </w:t>
+      </w:r>
+      <w:proofErr w:type="spellStart"/>
+      <w:r>
+        <w:rPr>
           <w:lang w:val="en-US"/>
         </w:rPr>
         <w:t>kao</w:t>
@@ -12506,15 +12411,13 @@
       <w:proofErr w:type="spellEnd"/>
       <w:r>
         <w:rPr>
-          <w:u w:val="single"/>
-          <w:lang w:val="en-US"/>
-        </w:rPr>
-        <w:t xml:space="preserve"> </w:t>
-      </w:r>
-      <w:proofErr w:type="spellStart"/>
-      <w:r>
-        <w:rPr>
-          <w:u w:val="single"/>
+          <w:lang w:val="en-US"/>
+        </w:rPr>
+        <w:t xml:space="preserve"> </w:t>
+      </w:r>
+      <w:proofErr w:type="spellStart"/>
+      <w:r>
+        <w:rPr>
           <w:lang w:val="en-US"/>
         </w:rPr>
         <w:t>i</w:t>
@@ -12522,15 +12425,13 @@
       <w:proofErr w:type="spellEnd"/>
       <w:r>
         <w:rPr>
-          <w:u w:val="single"/>
-          <w:lang w:val="en-US"/>
-        </w:rPr>
-        <w:t xml:space="preserve"> </w:t>
-      </w:r>
-      <w:proofErr w:type="spellStart"/>
-      <w:r>
-        <w:rPr>
-          <w:u w:val="single"/>
+          <w:lang w:val="en-US"/>
+        </w:rPr>
+        <w:t xml:space="preserve"> </w:t>
+      </w:r>
+      <w:proofErr w:type="spellStart"/>
+      <w:r>
+        <w:rPr>
           <w:lang w:val="en-US"/>
         </w:rPr>
         <w:t>odziv</w:t>
@@ -12538,15 +12439,13 @@
       <w:proofErr w:type="spellEnd"/>
       <w:r>
         <w:rPr>
-          <w:u w:val="single"/>
-          <w:lang w:val="en-US"/>
-        </w:rPr>
-        <w:t xml:space="preserve"> </w:t>
-      </w:r>
-      <w:proofErr w:type="spellStart"/>
-      <w:r>
-        <w:rPr>
-          <w:u w:val="single"/>
+          <w:lang w:val="en-US"/>
+        </w:rPr>
+        <w:t xml:space="preserve"> </w:t>
+      </w:r>
+      <w:proofErr w:type="spellStart"/>
+      <w:r>
+        <w:rPr>
           <w:lang w:val="en-US"/>
         </w:rPr>
         <w:t>te</w:t>
@@ -12554,15 +12453,13 @@
       <w:proofErr w:type="spellEnd"/>
       <w:r>
         <w:rPr>
-          <w:u w:val="single"/>
-          <w:lang w:val="en-US"/>
-        </w:rPr>
-        <w:t xml:space="preserve"> </w:t>
-      </w:r>
-      <w:proofErr w:type="spellStart"/>
-      <w:r>
-        <w:rPr>
-          <w:u w:val="single"/>
+          <w:lang w:val="en-US"/>
+        </w:rPr>
+        <w:t xml:space="preserve"> </w:t>
+      </w:r>
+      <w:proofErr w:type="spellStart"/>
+      <w:r>
+        <w:rPr>
           <w:lang w:val="en-US"/>
         </w:rPr>
         <w:t>predstavlja</w:t>
@@ -12570,15 +12467,13 @@
       <w:proofErr w:type="spellEnd"/>
       <w:r>
         <w:rPr>
-          <w:u w:val="single"/>
-          <w:lang w:val="en-US"/>
-        </w:rPr>
-        <w:t xml:space="preserve"> </w:t>
-      </w:r>
-      <w:proofErr w:type="spellStart"/>
-      <w:r>
-        <w:rPr>
-          <w:u w:val="single"/>
+          <w:lang w:val="en-US"/>
+        </w:rPr>
+        <w:t xml:space="preserve"> </w:t>
+      </w:r>
+      <w:proofErr w:type="spellStart"/>
+      <w:r>
+        <w:rPr>
           <w:lang w:val="en-US"/>
         </w:rPr>
         <w:t>udio</w:t>
@@ -12586,15 +12481,13 @@
       <w:proofErr w:type="spellEnd"/>
       <w:r>
         <w:rPr>
-          <w:u w:val="single"/>
-          <w:lang w:val="en-US"/>
-        </w:rPr>
-        <w:t xml:space="preserve"> </w:t>
-      </w:r>
-      <w:proofErr w:type="spellStart"/>
-      <w:r>
-        <w:rPr>
-          <w:u w:val="single"/>
+          <w:lang w:val="en-US"/>
+        </w:rPr>
+        <w:t xml:space="preserve"> </w:t>
+      </w:r>
+      <w:proofErr w:type="spellStart"/>
+      <w:r>
+        <w:rPr>
           <w:lang w:val="en-US"/>
         </w:rPr>
         <w:t>stvarno</w:t>
@@ -12602,15 +12495,13 @@
       <w:proofErr w:type="spellEnd"/>
       <w:r>
         <w:rPr>
-          <w:u w:val="single"/>
-          <w:lang w:val="en-US"/>
-        </w:rPr>
-        <w:t xml:space="preserve"> </w:t>
-      </w:r>
-      <w:proofErr w:type="spellStart"/>
-      <w:r>
-        <w:rPr>
-          <w:u w:val="single"/>
+          <w:lang w:val="en-US"/>
+        </w:rPr>
+        <w:t xml:space="preserve"> </w:t>
+      </w:r>
+      <w:proofErr w:type="spellStart"/>
+      <w:r>
+        <w:rPr>
           <w:lang w:val="en-US"/>
         </w:rPr>
         <w:t>pozitivnih</w:t>
@@ -12618,15 +12509,13 @@
       <w:proofErr w:type="spellEnd"/>
       <w:r>
         <w:rPr>
-          <w:u w:val="single"/>
-          <w:lang w:val="en-US"/>
-        </w:rPr>
-        <w:t xml:space="preserve"> </w:t>
-      </w:r>
-      <w:proofErr w:type="spellStart"/>
-      <w:r>
-        <w:rPr>
-          <w:u w:val="single"/>
+          <w:lang w:val="en-US"/>
+        </w:rPr>
+        <w:t xml:space="preserve"> </w:t>
+      </w:r>
+      <w:proofErr w:type="spellStart"/>
+      <w:r>
+        <w:rPr>
           <w:lang w:val="en-US"/>
         </w:rPr>
         <w:t>primjera</w:t>
@@ -12634,15 +12523,13 @@
       <w:proofErr w:type="spellEnd"/>
       <w:r>
         <w:rPr>
-          <w:u w:val="single"/>
-          <w:lang w:val="en-US"/>
-        </w:rPr>
-        <w:t xml:space="preserve"> </w:t>
-      </w:r>
-      <w:proofErr w:type="spellStart"/>
-      <w:r>
-        <w:rPr>
-          <w:u w:val="single"/>
+          <w:lang w:val="en-US"/>
+        </w:rPr>
+        <w:t xml:space="preserve"> </w:t>
+      </w:r>
+      <w:proofErr w:type="spellStart"/>
+      <w:r>
+        <w:rPr>
           <w:lang w:val="en-US"/>
         </w:rPr>
         <w:t>koje</w:t>
@@ -12650,7 +12537,6 @@
       <w:proofErr w:type="spellEnd"/>
       <w:r>
         <w:rPr>
-          <w:u w:val="single"/>
           <w:lang w:val="en-US"/>
         </w:rPr>
         <w:t xml:space="preserve"> je model </w:t>
@@ -12658,7 +12544,6 @@
       <w:proofErr w:type="spellStart"/>
       <w:r>
         <w:rPr>
-          <w:u w:val="single"/>
           <w:lang w:val="en-US"/>
         </w:rPr>
         <w:t>prepoznao</w:t>
@@ -12666,7 +12551,6 @@
       <w:proofErr w:type="spellEnd"/>
       <w:r>
         <w:rPr>
-          <w:u w:val="single"/>
           <w:lang w:val="en-US"/>
         </w:rPr>
         <w:t xml:space="preserve">. FPR </w:t>
@@ -12674,7 +12558,6 @@
       <w:proofErr w:type="spellStart"/>
       <w:r>
         <w:rPr>
-          <w:u w:val="single"/>
           <w:lang w:val="en-US"/>
         </w:rPr>
         <w:t>predstavlja</w:t>
@@ -12682,15 +12565,13 @@
       <w:proofErr w:type="spellEnd"/>
       <w:r>
         <w:rPr>
-          <w:u w:val="single"/>
-          <w:lang w:val="en-US"/>
-        </w:rPr>
-        <w:t xml:space="preserve"> </w:t>
-      </w:r>
-      <w:proofErr w:type="spellStart"/>
-      <w:r>
-        <w:rPr>
-          <w:u w:val="single"/>
+          <w:lang w:val="en-US"/>
+        </w:rPr>
+        <w:t xml:space="preserve"> </w:t>
+      </w:r>
+      <w:proofErr w:type="spellStart"/>
+      <w:r>
+        <w:rPr>
           <w:lang w:val="en-US"/>
         </w:rPr>
         <w:t>udio</w:t>
@@ -12698,15 +12579,13 @@
       <w:proofErr w:type="spellEnd"/>
       <w:r>
         <w:rPr>
-          <w:u w:val="single"/>
-          <w:lang w:val="en-US"/>
-        </w:rPr>
-        <w:t xml:space="preserve"> </w:t>
-      </w:r>
-      <w:proofErr w:type="spellStart"/>
-      <w:r>
-        <w:rPr>
-          <w:u w:val="single"/>
+          <w:lang w:val="en-US"/>
+        </w:rPr>
+        <w:t xml:space="preserve"> </w:t>
+      </w:r>
+      <w:proofErr w:type="spellStart"/>
+      <w:r>
+        <w:rPr>
           <w:lang w:val="en-US"/>
         </w:rPr>
         <w:t>negativnih</w:t>
@@ -12714,15 +12593,13 @@
       <w:proofErr w:type="spellEnd"/>
       <w:r>
         <w:rPr>
-          <w:u w:val="single"/>
-          <w:lang w:val="en-US"/>
-        </w:rPr>
-        <w:t xml:space="preserve"> </w:t>
-      </w:r>
-      <w:proofErr w:type="spellStart"/>
-      <w:r>
-        <w:rPr>
-          <w:u w:val="single"/>
+          <w:lang w:val="en-US"/>
+        </w:rPr>
+        <w:t xml:space="preserve"> </w:t>
+      </w:r>
+      <w:proofErr w:type="spellStart"/>
+      <w:r>
+        <w:rPr>
           <w:lang w:val="en-US"/>
         </w:rPr>
         <w:t>primjera</w:t>
@@ -12730,15 +12607,13 @@
       <w:proofErr w:type="spellEnd"/>
       <w:r>
         <w:rPr>
-          <w:u w:val="single"/>
-          <w:lang w:val="en-US"/>
-        </w:rPr>
-        <w:t xml:space="preserve"> </w:t>
-      </w:r>
-      <w:proofErr w:type="spellStart"/>
-      <w:r>
-        <w:rPr>
-          <w:u w:val="single"/>
+          <w:lang w:val="en-US"/>
+        </w:rPr>
+        <w:t xml:space="preserve"> </w:t>
+      </w:r>
+      <w:proofErr w:type="spellStart"/>
+      <w:r>
+        <w:rPr>
           <w:lang w:val="en-US"/>
         </w:rPr>
         <w:t>koje</w:t>
@@ -12746,7 +12621,6 @@
       <w:proofErr w:type="spellEnd"/>
       <w:r>
         <w:rPr>
-          <w:u w:val="single"/>
           <w:lang w:val="en-US"/>
         </w:rPr>
         <w:t xml:space="preserve"> je model </w:t>
@@ -12754,7 +12628,6 @@
       <w:proofErr w:type="spellStart"/>
       <w:r>
         <w:rPr>
-          <w:u w:val="single"/>
           <w:lang w:val="en-US"/>
         </w:rPr>
         <w:t>pogrešno</w:t>
@@ -12762,15 +12635,13 @@
       <w:proofErr w:type="spellEnd"/>
       <w:r>
         <w:rPr>
-          <w:u w:val="single"/>
-          <w:lang w:val="en-US"/>
-        </w:rPr>
-        <w:t xml:space="preserve"> </w:t>
-      </w:r>
-      <w:proofErr w:type="spellStart"/>
-      <w:r>
-        <w:rPr>
-          <w:u w:val="single"/>
+          <w:lang w:val="en-US"/>
+        </w:rPr>
+        <w:t xml:space="preserve"> </w:t>
+      </w:r>
+      <w:proofErr w:type="spellStart"/>
+      <w:r>
+        <w:rPr>
           <w:lang w:val="en-US"/>
         </w:rPr>
         <w:t>obilježio</w:t>
@@ -12778,15 +12649,13 @@
       <w:proofErr w:type="spellEnd"/>
       <w:r>
         <w:rPr>
-          <w:u w:val="single"/>
-          <w:lang w:val="en-US"/>
-        </w:rPr>
-        <w:t xml:space="preserve"> </w:t>
-      </w:r>
-      <w:proofErr w:type="spellStart"/>
-      <w:r>
-        <w:rPr>
-          <w:u w:val="single"/>
+          <w:lang w:val="en-US"/>
+        </w:rPr>
+        <w:t xml:space="preserve"> </w:t>
+      </w:r>
+      <w:proofErr w:type="spellStart"/>
+      <w:r>
+        <w:rPr>
           <w:lang w:val="en-US"/>
         </w:rPr>
         <w:t>kao</w:t>
@@ -12794,15 +12663,13 @@
       <w:proofErr w:type="spellEnd"/>
       <w:r>
         <w:rPr>
-          <w:u w:val="single"/>
-          <w:lang w:val="en-US"/>
-        </w:rPr>
-        <w:t xml:space="preserve"> </w:t>
-      </w:r>
-      <w:proofErr w:type="spellStart"/>
-      <w:r>
-        <w:rPr>
-          <w:u w:val="single"/>
+          <w:lang w:val="en-US"/>
+        </w:rPr>
+        <w:t xml:space="preserve"> </w:t>
+      </w:r>
+      <w:proofErr w:type="spellStart"/>
+      <w:r>
+        <w:rPr>
           <w:lang w:val="en-US"/>
         </w:rPr>
         <w:t>pozitivne</w:t>
@@ -12810,7 +12677,6 @@
       <w:proofErr w:type="spellEnd"/>
       <w:r>
         <w:rPr>
-          <w:u w:val="single"/>
           <w:lang w:val="en-US"/>
         </w:rPr>
         <w:t>.</w:t>
@@ -16780,6 +16646,7 @@
         <w:t xml:space="preserve"> </w:t>
       </w:r>
       <w:proofErr w:type="spellStart"/>
+      <w:proofErr w:type="gramStart"/>
       <w:r>
         <w:rPr>
           <w:lang w:val="en-GB"/>
@@ -16801,6 +16668,7 @@
         <w:t>sa</w:t>
       </w:r>
       <w:proofErr w:type="spellEnd"/>
+      <w:proofErr w:type="gramEnd"/>
       <w:r>
         <w:rPr>
           <w:lang w:val="en-GB"/>
@@ -17074,6 +16942,7 @@
         </w:rPr>
         <w:t xml:space="preserve">x64 = </w:t>
       </w:r>
+      <w:proofErr w:type="gramStart"/>
       <w:r>
         <w:rPr>
           <w:lang w:val="en-GB"/>
@@ -17094,6 +16963,7 @@
         <w:t>vrijednosti</w:t>
       </w:r>
       <w:proofErr w:type="spellEnd"/>
+      <w:proofErr w:type="gramEnd"/>
       <w:r>
         <w:rPr>
           <w:lang w:val="en-GB"/>
@@ -22688,6 +22558,922 @@
         <w:t xml:space="preserve"> rezultati.</w:t>
       </w:r>
     </w:p>
+    <w:tbl>
+      <w:tblPr>
+        <w:tblStyle w:val="TableGrid"/>
+        <w:tblW w:w="0" w:type="auto"/>
+        <w:tblLayout w:type="fixed"/>
+        <w:tblLook w:val="04A0" w:firstRow="1" w:lastRow="0" w:firstColumn="1" w:lastColumn="0" w:noHBand="0" w:noVBand="1"/>
+      </w:tblPr>
+      <w:tblGrid>
+        <w:gridCol w:w="1249"/>
+        <w:gridCol w:w="1250"/>
+        <w:gridCol w:w="1250"/>
+        <w:gridCol w:w="1249"/>
+        <w:gridCol w:w="1250"/>
+        <w:gridCol w:w="1250"/>
+        <w:gridCol w:w="1250"/>
+      </w:tblGrid>
+      <w:tr>
+        <w:tc>
+          <w:tcPr>
+            <w:tcW w:w="1249" w:type="dxa"/>
+          </w:tcPr>
+          <w:p>
+            <w:pPr>
+              <w:pStyle w:val="Paragraf"/>
+              <w:ind w:firstLine="0"/>
+              <w:rPr>
+                <w:lang w:val="bs-Latn-BA"/>
+              </w:rPr>
+            </w:pPr>
+          </w:p>
+        </w:tc>
+        <w:tc>
+          <w:tcPr>
+            <w:tcW w:w="1250" w:type="dxa"/>
+          </w:tcPr>
+          <w:p>
+            <w:pPr>
+              <w:pStyle w:val="Paragraf"/>
+              <w:ind w:firstLine="0"/>
+              <w:rPr>
+                <w:lang w:val="bs-Latn-BA"/>
+              </w:rPr>
+            </w:pPr>
+            <w:r>
+              <w:rPr>
+                <w:lang w:val="bs-Latn-BA"/>
+              </w:rPr>
+              <w:t>Vrijeme treniranja</w:t>
+            </w:r>
+          </w:p>
+        </w:tc>
+        <w:tc>
+          <w:tcPr>
+            <w:tcW w:w="1250" w:type="dxa"/>
+          </w:tcPr>
+          <w:p>
+            <w:pPr>
+              <w:pStyle w:val="Paragraf"/>
+              <w:ind w:firstLine="0"/>
+              <w:rPr>
+                <w:lang w:val="bs-Latn-BA"/>
+              </w:rPr>
+            </w:pPr>
+            <w:r>
+              <w:rPr>
+                <w:lang w:val="bs-Latn-BA"/>
+              </w:rPr>
+              <w:t>Tačnost</w:t>
+            </w:r>
+          </w:p>
+        </w:tc>
+        <w:tc>
+          <w:tcPr>
+            <w:tcW w:w="1249" w:type="dxa"/>
+          </w:tcPr>
+          <w:p>
+            <w:pPr>
+              <w:pStyle w:val="Paragraf"/>
+              <w:ind w:firstLine="0"/>
+              <w:rPr>
+                <w:lang w:val="bs-Latn-BA"/>
+              </w:rPr>
+            </w:pPr>
+            <w:r>
+              <w:rPr>
+                <w:lang w:val="bs-Latn-BA"/>
+              </w:rPr>
+              <w:t>Makro Odziv</w:t>
+            </w:r>
+          </w:p>
+        </w:tc>
+        <w:tc>
+          <w:tcPr>
+            <w:tcW w:w="1250" w:type="dxa"/>
+          </w:tcPr>
+          <w:p>
+            <w:pPr>
+              <w:pStyle w:val="Paragraf"/>
+              <w:ind w:firstLine="0"/>
+              <w:rPr>
+                <w:lang w:val="bs-Latn-BA"/>
+              </w:rPr>
+            </w:pPr>
+            <w:r>
+              <w:rPr>
+                <w:lang w:val="bs-Latn-BA"/>
+              </w:rPr>
+              <w:t>Makro Preciznost</w:t>
+            </w:r>
+          </w:p>
+        </w:tc>
+        <w:tc>
+          <w:tcPr>
+            <w:tcW w:w="1250" w:type="dxa"/>
+          </w:tcPr>
+          <w:p>
+            <w:pPr>
+              <w:pStyle w:val="Paragraf"/>
+              <w:ind w:firstLine="0"/>
+              <w:rPr>
+                <w:lang w:val="bs-Latn-BA"/>
+              </w:rPr>
+            </w:pPr>
+            <w:r>
+              <w:rPr>
+                <w:lang w:val="bs-Latn-BA"/>
+              </w:rPr>
+              <w:t>Makro F1 skor</w:t>
+            </w:r>
+          </w:p>
+        </w:tc>
+        <w:tc>
+          <w:tcPr>
+            <w:tcW w:w="1250" w:type="dxa"/>
+          </w:tcPr>
+          <w:p>
+            <w:pPr>
+              <w:pStyle w:val="Paragraf"/>
+              <w:ind w:firstLine="0"/>
+              <w:rPr>
+                <w:lang w:val="bs-Latn-BA"/>
+              </w:rPr>
+            </w:pPr>
+            <w:r>
+              <w:rPr>
+                <w:lang w:val="bs-Latn-BA"/>
+              </w:rPr>
+              <w:t>AUC</w:t>
+            </w:r>
+          </w:p>
+        </w:tc>
+      </w:tr>
+      <w:tr>
+        <w:tc>
+          <w:tcPr>
+            <w:tcW w:w="1249" w:type="dxa"/>
+          </w:tcPr>
+          <w:p>
+            <w:pPr>
+              <w:pStyle w:val="Paragraf"/>
+              <w:ind w:firstLine="0"/>
+              <w:rPr>
+                <w:lang w:val="bs-Latn-BA"/>
+              </w:rPr>
+            </w:pPr>
+            <w:proofErr w:type="spellStart"/>
+            <w:r>
+              <w:rPr>
+                <w:lang w:val="bs-Latn-BA"/>
+              </w:rPr>
+              <w:t>CSharp</w:t>
+            </w:r>
+            <w:proofErr w:type="spellEnd"/>
+            <w:r>
+              <w:rPr>
+                <w:lang w:val="bs-Latn-BA"/>
+              </w:rPr>
+              <w:t xml:space="preserve"> 1</w:t>
+            </w:r>
+          </w:p>
+        </w:tc>
+        <w:tc>
+          <w:tcPr>
+            <w:tcW w:w="1250" w:type="dxa"/>
+          </w:tcPr>
+          <w:p>
+            <w:pPr>
+              <w:pStyle w:val="Paragraf"/>
+              <w:ind w:firstLine="0"/>
+              <w:rPr>
+                <w:lang w:val="bs-Latn-BA"/>
+              </w:rPr>
+            </w:pPr>
+          </w:p>
+        </w:tc>
+        <w:tc>
+          <w:tcPr>
+            <w:tcW w:w="1250" w:type="dxa"/>
+          </w:tcPr>
+          <w:p>
+            <w:pPr>
+              <w:pStyle w:val="Paragraf"/>
+              <w:ind w:firstLine="0"/>
+              <w:rPr>
+                <w:lang w:val="bs-Latn-BA"/>
+              </w:rPr>
+            </w:pPr>
+          </w:p>
+        </w:tc>
+        <w:tc>
+          <w:tcPr>
+            <w:tcW w:w="1249" w:type="dxa"/>
+          </w:tcPr>
+          <w:p>
+            <w:pPr>
+              <w:pStyle w:val="Paragraf"/>
+              <w:ind w:firstLine="0"/>
+              <w:rPr>
+                <w:lang w:val="bs-Latn-BA"/>
+              </w:rPr>
+            </w:pPr>
+          </w:p>
+        </w:tc>
+        <w:tc>
+          <w:tcPr>
+            <w:tcW w:w="1250" w:type="dxa"/>
+          </w:tcPr>
+          <w:p>
+            <w:pPr>
+              <w:pStyle w:val="Paragraf"/>
+              <w:ind w:firstLine="0"/>
+              <w:rPr>
+                <w:lang w:val="bs-Latn-BA"/>
+              </w:rPr>
+            </w:pPr>
+          </w:p>
+        </w:tc>
+        <w:tc>
+          <w:tcPr>
+            <w:tcW w:w="1250" w:type="dxa"/>
+          </w:tcPr>
+          <w:p>
+            <w:pPr>
+              <w:pStyle w:val="Paragraf"/>
+              <w:ind w:firstLine="0"/>
+              <w:rPr>
+                <w:lang w:val="bs-Latn-BA"/>
+              </w:rPr>
+            </w:pPr>
+          </w:p>
+        </w:tc>
+        <w:tc>
+          <w:tcPr>
+            <w:tcW w:w="1250" w:type="dxa"/>
+          </w:tcPr>
+          <w:p>
+            <w:pPr>
+              <w:pStyle w:val="Paragraf"/>
+              <w:ind w:firstLine="0"/>
+              <w:rPr>
+                <w:lang w:val="bs-Latn-BA"/>
+              </w:rPr>
+            </w:pPr>
+          </w:p>
+        </w:tc>
+      </w:tr>
+      <w:tr>
+        <w:tc>
+          <w:tcPr>
+            <w:tcW w:w="1249" w:type="dxa"/>
+          </w:tcPr>
+          <w:p>
+            <w:pPr>
+              <w:pStyle w:val="Paragraf"/>
+              <w:ind w:firstLine="0"/>
+              <w:rPr>
+                <w:lang w:val="bs-Latn-BA"/>
+              </w:rPr>
+            </w:pPr>
+            <w:proofErr w:type="spellStart"/>
+            <w:r>
+              <w:rPr>
+                <w:lang w:val="bs-Latn-BA"/>
+              </w:rPr>
+              <w:t>CSharp</w:t>
+            </w:r>
+            <w:proofErr w:type="spellEnd"/>
+            <w:r>
+              <w:rPr>
+                <w:lang w:val="bs-Latn-BA"/>
+              </w:rPr>
+              <w:t xml:space="preserve"> </w:t>
+            </w:r>
+            <w:r>
+              <w:rPr>
+                <w:lang w:val="bs-Latn-BA"/>
+              </w:rPr>
+              <w:t>2</w:t>
+            </w:r>
+          </w:p>
+        </w:tc>
+        <w:tc>
+          <w:tcPr>
+            <w:tcW w:w="1250" w:type="dxa"/>
+          </w:tcPr>
+          <w:p>
+            <w:pPr>
+              <w:pStyle w:val="Paragraf"/>
+              <w:ind w:firstLine="0"/>
+              <w:rPr>
+                <w:lang w:val="bs-Latn-BA"/>
+              </w:rPr>
+            </w:pPr>
+          </w:p>
+        </w:tc>
+        <w:tc>
+          <w:tcPr>
+            <w:tcW w:w="1250" w:type="dxa"/>
+          </w:tcPr>
+          <w:p>
+            <w:pPr>
+              <w:pStyle w:val="Paragraf"/>
+              <w:ind w:firstLine="0"/>
+              <w:rPr>
+                <w:lang w:val="bs-Latn-BA"/>
+              </w:rPr>
+            </w:pPr>
+          </w:p>
+        </w:tc>
+        <w:tc>
+          <w:tcPr>
+            <w:tcW w:w="1249" w:type="dxa"/>
+          </w:tcPr>
+          <w:p>
+            <w:pPr>
+              <w:pStyle w:val="Paragraf"/>
+              <w:ind w:firstLine="0"/>
+              <w:rPr>
+                <w:lang w:val="bs-Latn-BA"/>
+              </w:rPr>
+            </w:pPr>
+          </w:p>
+        </w:tc>
+        <w:tc>
+          <w:tcPr>
+            <w:tcW w:w="1250" w:type="dxa"/>
+          </w:tcPr>
+          <w:p>
+            <w:pPr>
+              <w:pStyle w:val="Paragraf"/>
+              <w:ind w:firstLine="0"/>
+              <w:rPr>
+                <w:lang w:val="bs-Latn-BA"/>
+              </w:rPr>
+            </w:pPr>
+          </w:p>
+        </w:tc>
+        <w:tc>
+          <w:tcPr>
+            <w:tcW w:w="1250" w:type="dxa"/>
+          </w:tcPr>
+          <w:p>
+            <w:pPr>
+              <w:pStyle w:val="Paragraf"/>
+              <w:ind w:firstLine="0"/>
+              <w:rPr>
+                <w:lang w:val="bs-Latn-BA"/>
+              </w:rPr>
+            </w:pPr>
+          </w:p>
+        </w:tc>
+        <w:tc>
+          <w:tcPr>
+            <w:tcW w:w="1250" w:type="dxa"/>
+          </w:tcPr>
+          <w:p>
+            <w:pPr>
+              <w:pStyle w:val="Paragraf"/>
+              <w:ind w:firstLine="0"/>
+              <w:rPr>
+                <w:lang w:val="bs-Latn-BA"/>
+              </w:rPr>
+            </w:pPr>
+          </w:p>
+        </w:tc>
+      </w:tr>
+      <w:tr>
+        <w:tc>
+          <w:tcPr>
+            <w:tcW w:w="1249" w:type="dxa"/>
+          </w:tcPr>
+          <w:p>
+            <w:pPr>
+              <w:pStyle w:val="Paragraf"/>
+              <w:ind w:firstLine="0"/>
+              <w:rPr>
+                <w:lang w:val="bs-Latn-BA"/>
+              </w:rPr>
+            </w:pPr>
+            <w:proofErr w:type="spellStart"/>
+            <w:r>
+              <w:rPr>
+                <w:lang w:val="bs-Latn-BA"/>
+              </w:rPr>
+              <w:t>CSharp</w:t>
+            </w:r>
+            <w:proofErr w:type="spellEnd"/>
+            <w:r>
+              <w:rPr>
+                <w:lang w:val="bs-Latn-BA"/>
+              </w:rPr>
+              <w:t xml:space="preserve"> </w:t>
+            </w:r>
+            <w:r>
+              <w:rPr>
+                <w:lang w:val="bs-Latn-BA"/>
+              </w:rPr>
+              <w:t>3</w:t>
+            </w:r>
+          </w:p>
+        </w:tc>
+        <w:tc>
+          <w:tcPr>
+            <w:tcW w:w="1250" w:type="dxa"/>
+          </w:tcPr>
+          <w:p>
+            <w:pPr>
+              <w:pStyle w:val="Paragraf"/>
+              <w:ind w:firstLine="0"/>
+              <w:rPr>
+                <w:lang w:val="bs-Latn-BA"/>
+              </w:rPr>
+            </w:pPr>
+          </w:p>
+        </w:tc>
+        <w:tc>
+          <w:tcPr>
+            <w:tcW w:w="1250" w:type="dxa"/>
+          </w:tcPr>
+          <w:p>
+            <w:pPr>
+              <w:pStyle w:val="Paragraf"/>
+              <w:ind w:firstLine="0"/>
+              <w:rPr>
+                <w:lang w:val="bs-Latn-BA"/>
+              </w:rPr>
+            </w:pPr>
+          </w:p>
+        </w:tc>
+        <w:tc>
+          <w:tcPr>
+            <w:tcW w:w="1249" w:type="dxa"/>
+          </w:tcPr>
+          <w:p>
+            <w:pPr>
+              <w:pStyle w:val="Paragraf"/>
+              <w:ind w:firstLine="0"/>
+              <w:rPr>
+                <w:lang w:val="bs-Latn-BA"/>
+              </w:rPr>
+            </w:pPr>
+          </w:p>
+        </w:tc>
+        <w:tc>
+          <w:tcPr>
+            <w:tcW w:w="1250" w:type="dxa"/>
+          </w:tcPr>
+          <w:p>
+            <w:pPr>
+              <w:pStyle w:val="Paragraf"/>
+              <w:ind w:firstLine="0"/>
+              <w:rPr>
+                <w:lang w:val="bs-Latn-BA"/>
+              </w:rPr>
+            </w:pPr>
+          </w:p>
+        </w:tc>
+        <w:tc>
+          <w:tcPr>
+            <w:tcW w:w="1250" w:type="dxa"/>
+          </w:tcPr>
+          <w:p>
+            <w:pPr>
+              <w:pStyle w:val="Paragraf"/>
+              <w:ind w:firstLine="0"/>
+              <w:rPr>
+                <w:lang w:val="bs-Latn-BA"/>
+              </w:rPr>
+            </w:pPr>
+          </w:p>
+        </w:tc>
+        <w:tc>
+          <w:tcPr>
+            <w:tcW w:w="1250" w:type="dxa"/>
+          </w:tcPr>
+          <w:p>
+            <w:pPr>
+              <w:pStyle w:val="Paragraf"/>
+              <w:ind w:firstLine="0"/>
+              <w:rPr>
+                <w:lang w:val="bs-Latn-BA"/>
+              </w:rPr>
+            </w:pPr>
+          </w:p>
+        </w:tc>
+      </w:tr>
+      <w:tr>
+        <w:tc>
+          <w:tcPr>
+            <w:tcW w:w="1249" w:type="dxa"/>
+          </w:tcPr>
+          <w:p>
+            <w:pPr>
+              <w:pStyle w:val="Paragraf"/>
+              <w:ind w:firstLine="0"/>
+              <w:rPr>
+                <w:lang w:val="bs-Latn-BA"/>
+              </w:rPr>
+            </w:pPr>
+          </w:p>
+        </w:tc>
+        <w:tc>
+          <w:tcPr>
+            <w:tcW w:w="1250" w:type="dxa"/>
+          </w:tcPr>
+          <w:p>
+            <w:pPr>
+              <w:pStyle w:val="Paragraf"/>
+              <w:ind w:firstLine="0"/>
+              <w:rPr>
+                <w:lang w:val="bs-Latn-BA"/>
+              </w:rPr>
+            </w:pPr>
+          </w:p>
+        </w:tc>
+        <w:tc>
+          <w:tcPr>
+            <w:tcW w:w="1250" w:type="dxa"/>
+          </w:tcPr>
+          <w:p>
+            <w:pPr>
+              <w:pStyle w:val="Paragraf"/>
+              <w:ind w:firstLine="0"/>
+              <w:rPr>
+                <w:lang w:val="bs-Latn-BA"/>
+              </w:rPr>
+            </w:pPr>
+          </w:p>
+        </w:tc>
+        <w:tc>
+          <w:tcPr>
+            <w:tcW w:w="1249" w:type="dxa"/>
+          </w:tcPr>
+          <w:p>
+            <w:pPr>
+              <w:pStyle w:val="Paragraf"/>
+              <w:ind w:firstLine="0"/>
+              <w:rPr>
+                <w:lang w:val="bs-Latn-BA"/>
+              </w:rPr>
+            </w:pPr>
+          </w:p>
+        </w:tc>
+        <w:tc>
+          <w:tcPr>
+            <w:tcW w:w="1250" w:type="dxa"/>
+          </w:tcPr>
+          <w:p>
+            <w:pPr>
+              <w:pStyle w:val="Paragraf"/>
+              <w:ind w:firstLine="0"/>
+              <w:rPr>
+                <w:lang w:val="bs-Latn-BA"/>
+              </w:rPr>
+            </w:pPr>
+          </w:p>
+        </w:tc>
+        <w:tc>
+          <w:tcPr>
+            <w:tcW w:w="1250" w:type="dxa"/>
+          </w:tcPr>
+          <w:p>
+            <w:pPr>
+              <w:pStyle w:val="Paragraf"/>
+              <w:ind w:firstLine="0"/>
+              <w:rPr>
+                <w:lang w:val="bs-Latn-BA"/>
+              </w:rPr>
+            </w:pPr>
+          </w:p>
+        </w:tc>
+        <w:tc>
+          <w:tcPr>
+            <w:tcW w:w="1250" w:type="dxa"/>
+          </w:tcPr>
+          <w:p>
+            <w:pPr>
+              <w:pStyle w:val="Paragraf"/>
+              <w:ind w:firstLine="0"/>
+              <w:rPr>
+                <w:lang w:val="bs-Latn-BA"/>
+              </w:rPr>
+            </w:pPr>
+          </w:p>
+        </w:tc>
+      </w:tr>
+      <w:tr>
+        <w:tc>
+          <w:tcPr>
+            <w:tcW w:w="1249" w:type="dxa"/>
+          </w:tcPr>
+          <w:p>
+            <w:pPr>
+              <w:pStyle w:val="Paragraf"/>
+              <w:ind w:firstLine="0"/>
+              <w:rPr>
+                <w:lang w:val="bs-Latn-BA"/>
+              </w:rPr>
+            </w:pPr>
+          </w:p>
+        </w:tc>
+        <w:tc>
+          <w:tcPr>
+            <w:tcW w:w="1250" w:type="dxa"/>
+          </w:tcPr>
+          <w:p>
+            <w:pPr>
+              <w:pStyle w:val="Paragraf"/>
+              <w:ind w:firstLine="0"/>
+              <w:rPr>
+                <w:lang w:val="bs-Latn-BA"/>
+              </w:rPr>
+            </w:pPr>
+          </w:p>
+        </w:tc>
+        <w:tc>
+          <w:tcPr>
+            <w:tcW w:w="1250" w:type="dxa"/>
+          </w:tcPr>
+          <w:p>
+            <w:pPr>
+              <w:pStyle w:val="Paragraf"/>
+              <w:ind w:firstLine="0"/>
+              <w:rPr>
+                <w:lang w:val="bs-Latn-BA"/>
+              </w:rPr>
+            </w:pPr>
+          </w:p>
+        </w:tc>
+        <w:tc>
+          <w:tcPr>
+            <w:tcW w:w="1249" w:type="dxa"/>
+          </w:tcPr>
+          <w:p>
+            <w:pPr>
+              <w:pStyle w:val="Paragraf"/>
+              <w:ind w:firstLine="0"/>
+              <w:rPr>
+                <w:lang w:val="bs-Latn-BA"/>
+              </w:rPr>
+            </w:pPr>
+          </w:p>
+        </w:tc>
+        <w:tc>
+          <w:tcPr>
+            <w:tcW w:w="1250" w:type="dxa"/>
+          </w:tcPr>
+          <w:p>
+            <w:pPr>
+              <w:pStyle w:val="Paragraf"/>
+              <w:ind w:firstLine="0"/>
+              <w:rPr>
+                <w:lang w:val="bs-Latn-BA"/>
+              </w:rPr>
+            </w:pPr>
+          </w:p>
+        </w:tc>
+        <w:tc>
+          <w:tcPr>
+            <w:tcW w:w="1250" w:type="dxa"/>
+          </w:tcPr>
+          <w:p>
+            <w:pPr>
+              <w:pStyle w:val="Paragraf"/>
+              <w:ind w:firstLine="0"/>
+              <w:rPr>
+                <w:lang w:val="bs-Latn-BA"/>
+              </w:rPr>
+            </w:pPr>
+          </w:p>
+        </w:tc>
+        <w:tc>
+          <w:tcPr>
+            <w:tcW w:w="1250" w:type="dxa"/>
+          </w:tcPr>
+          <w:p>
+            <w:pPr>
+              <w:pStyle w:val="Paragraf"/>
+              <w:ind w:firstLine="0"/>
+              <w:rPr>
+                <w:lang w:val="bs-Latn-BA"/>
+              </w:rPr>
+            </w:pPr>
+          </w:p>
+        </w:tc>
+      </w:tr>
+      <w:tr>
+        <w:tc>
+          <w:tcPr>
+            <w:tcW w:w="1249" w:type="dxa"/>
+          </w:tcPr>
+          <w:p>
+            <w:pPr>
+              <w:pStyle w:val="Paragraf"/>
+              <w:ind w:firstLine="0"/>
+              <w:rPr>
+                <w:lang w:val="bs-Latn-BA"/>
+              </w:rPr>
+            </w:pPr>
+          </w:p>
+        </w:tc>
+        <w:tc>
+          <w:tcPr>
+            <w:tcW w:w="1250" w:type="dxa"/>
+          </w:tcPr>
+          <w:p>
+            <w:pPr>
+              <w:pStyle w:val="Paragraf"/>
+              <w:ind w:firstLine="0"/>
+              <w:rPr>
+                <w:lang w:val="bs-Latn-BA"/>
+              </w:rPr>
+            </w:pPr>
+          </w:p>
+        </w:tc>
+        <w:tc>
+          <w:tcPr>
+            <w:tcW w:w="1250" w:type="dxa"/>
+          </w:tcPr>
+          <w:p>
+            <w:pPr>
+              <w:pStyle w:val="Paragraf"/>
+              <w:ind w:firstLine="0"/>
+              <w:rPr>
+                <w:lang w:val="bs-Latn-BA"/>
+              </w:rPr>
+            </w:pPr>
+          </w:p>
+        </w:tc>
+        <w:tc>
+          <w:tcPr>
+            <w:tcW w:w="1249" w:type="dxa"/>
+          </w:tcPr>
+          <w:p>
+            <w:pPr>
+              <w:pStyle w:val="Paragraf"/>
+              <w:ind w:firstLine="0"/>
+              <w:rPr>
+                <w:lang w:val="bs-Latn-BA"/>
+              </w:rPr>
+            </w:pPr>
+          </w:p>
+        </w:tc>
+        <w:tc>
+          <w:tcPr>
+            <w:tcW w:w="1250" w:type="dxa"/>
+          </w:tcPr>
+          <w:p>
+            <w:pPr>
+              <w:pStyle w:val="Paragraf"/>
+              <w:ind w:firstLine="0"/>
+              <w:rPr>
+                <w:lang w:val="bs-Latn-BA"/>
+              </w:rPr>
+            </w:pPr>
+          </w:p>
+        </w:tc>
+        <w:tc>
+          <w:tcPr>
+            <w:tcW w:w="1250" w:type="dxa"/>
+          </w:tcPr>
+          <w:p>
+            <w:pPr>
+              <w:pStyle w:val="Paragraf"/>
+              <w:ind w:firstLine="0"/>
+              <w:rPr>
+                <w:lang w:val="bs-Latn-BA"/>
+              </w:rPr>
+            </w:pPr>
+          </w:p>
+        </w:tc>
+        <w:tc>
+          <w:tcPr>
+            <w:tcW w:w="1250" w:type="dxa"/>
+          </w:tcPr>
+          <w:p>
+            <w:pPr>
+              <w:pStyle w:val="Paragraf"/>
+              <w:ind w:firstLine="0"/>
+              <w:rPr>
+                <w:lang w:val="bs-Latn-BA"/>
+              </w:rPr>
+            </w:pPr>
+          </w:p>
+        </w:tc>
+      </w:tr>
+      <w:tr>
+        <w:tc>
+          <w:tcPr>
+            <w:tcW w:w="1249" w:type="dxa"/>
+          </w:tcPr>
+          <w:p>
+            <w:pPr>
+              <w:pStyle w:val="Paragraf"/>
+              <w:ind w:firstLine="0"/>
+              <w:rPr>
+                <w:lang w:val="bs-Latn-BA"/>
+              </w:rPr>
+            </w:pPr>
+          </w:p>
+        </w:tc>
+        <w:tc>
+          <w:tcPr>
+            <w:tcW w:w="1250" w:type="dxa"/>
+          </w:tcPr>
+          <w:p>
+            <w:pPr>
+              <w:pStyle w:val="Paragraf"/>
+              <w:ind w:firstLine="0"/>
+              <w:rPr>
+                <w:lang w:val="bs-Latn-BA"/>
+              </w:rPr>
+            </w:pPr>
+          </w:p>
+        </w:tc>
+        <w:tc>
+          <w:tcPr>
+            <w:tcW w:w="1250" w:type="dxa"/>
+          </w:tcPr>
+          <w:p>
+            <w:pPr>
+              <w:pStyle w:val="Paragraf"/>
+              <w:ind w:firstLine="0"/>
+              <w:rPr>
+                <w:lang w:val="bs-Latn-BA"/>
+              </w:rPr>
+            </w:pPr>
+          </w:p>
+        </w:tc>
+        <w:tc>
+          <w:tcPr>
+            <w:tcW w:w="1249" w:type="dxa"/>
+          </w:tcPr>
+          <w:p>
+            <w:pPr>
+              <w:pStyle w:val="Paragraf"/>
+              <w:ind w:firstLine="0"/>
+              <w:rPr>
+                <w:lang w:val="bs-Latn-BA"/>
+              </w:rPr>
+            </w:pPr>
+          </w:p>
+        </w:tc>
+        <w:tc>
+          <w:tcPr>
+            <w:tcW w:w="1250" w:type="dxa"/>
+          </w:tcPr>
+          <w:p>
+            <w:pPr>
+              <w:pStyle w:val="Paragraf"/>
+              <w:ind w:firstLine="0"/>
+              <w:rPr>
+                <w:lang w:val="bs-Latn-BA"/>
+              </w:rPr>
+            </w:pPr>
+          </w:p>
+        </w:tc>
+        <w:tc>
+          <w:tcPr>
+            <w:tcW w:w="1250" w:type="dxa"/>
+          </w:tcPr>
+          <w:p>
+            <w:pPr>
+              <w:pStyle w:val="Paragraf"/>
+              <w:ind w:firstLine="0"/>
+              <w:rPr>
+                <w:lang w:val="bs-Latn-BA"/>
+              </w:rPr>
+            </w:pPr>
+          </w:p>
+        </w:tc>
+        <w:tc>
+          <w:tcPr>
+            <w:tcW w:w="1250" w:type="dxa"/>
+          </w:tcPr>
+          <w:p>
+            <w:pPr>
+              <w:pStyle w:val="Paragraf"/>
+              <w:ind w:firstLine="0"/>
+              <w:rPr>
+                <w:lang w:val="bs-Latn-BA"/>
+              </w:rPr>
+            </w:pPr>
+          </w:p>
+        </w:tc>
+      </w:tr>
+    </w:tbl>
+    <w:p>
+      <w:pPr>
+        <w:pStyle w:val="Paragraf"/>
+        <w:ind w:firstLine="0"/>
+        <w:rPr>
+          <w:lang w:val="bs-Latn-BA"/>
+        </w:rPr>
+      </w:pPr>
+    </w:p>
     <w:p>
       <w:pPr>
         <w:pStyle w:val="Paragraf"/>
@@ -23078,6 +23864,7 @@
         <w:rPr>
           <w:lang w:val="bs-Latn-BA"/>
         </w:rPr>
+        <w:lastRenderedPageBreak/>
         <w:t>Vrijeme analize slike</w:t>
       </w:r>
       <w:bookmarkEnd w:id="29"/>
@@ -23137,7 +23924,6 @@
       </w:pPr>
       <w:bookmarkStart w:id="30" w:name="_Toc236486955"/>
       <w:r>
-        <w:lastRenderedPageBreak/>
         <w:t>Makro odziv</w:t>
       </w:r>
       <w:bookmarkEnd w:id="30"/>
@@ -23337,6 +24123,7 @@
         <w:rPr>
           <w:noProof/>
         </w:rPr>
+        <w:lastRenderedPageBreak/>
         <w:drawing>
           <wp:inline distT="0" distB="0" distL="0" distR="0" wp14:anchorId="0D373FC7" wp14:editId="6632F1F4">
             <wp:extent cx="5943600" cy="2292350"/>
@@ -23442,7 +24229,6 @@
       </w:pPr>
       <w:bookmarkStart w:id="33" w:name="_Toc236486956"/>
       <w:r>
-        <w:lastRenderedPageBreak/>
         <w:t>Makro F1 mjera</w:t>
       </w:r>
       <w:bookmarkEnd w:id="33"/>
@@ -23698,6 +24484,7 @@
         <w:rPr>
           <w:noProof/>
         </w:rPr>
+        <w:lastRenderedPageBreak/>
         <w:drawing>
           <wp:inline distT="0" distB="0" distL="0" distR="0" wp14:anchorId="5347BBAF" wp14:editId="0E4D1B6F">
             <wp:extent cx="5943600" cy="2265680"/>
@@ -23810,7 +24597,6 @@
       </w:pPr>
       <w:bookmarkStart w:id="35" w:name="_Toc236486957"/>
       <w:r>
-        <w:lastRenderedPageBreak/>
         <w:t>Odziv maligne klase</w:t>
       </w:r>
       <w:bookmarkEnd w:id="35"/>
@@ -24028,6 +24814,7 @@
         <w:rPr>
           <w:noProof/>
         </w:rPr>
+        <w:lastRenderedPageBreak/>
         <w:drawing>
           <wp:inline distT="0" distB="0" distL="0" distR="0" wp14:anchorId="1E3E51F4" wp14:editId="6F09D760">
             <wp:extent cx="5943600" cy="2330450"/>
@@ -24140,7 +24927,6 @@
       </w:pPr>
       <w:bookmarkStart w:id="37" w:name="_Toc236486958"/>
       <w:r>
-        <w:lastRenderedPageBreak/>
         <w:t>Tačnost</w:t>
       </w:r>
       <w:bookmarkEnd w:id="37"/>
@@ -24426,6 +25212,7 @@
         <w:rPr>
           <w:noProof/>
         </w:rPr>
+        <w:lastRenderedPageBreak/>
         <w:drawing>
           <wp:inline distT="0" distB="0" distL="0" distR="0" wp14:anchorId="525B71C9" wp14:editId="7BDD91E6">
             <wp:extent cx="5943600" cy="2330450"/>
@@ -24534,7 +25321,6 @@
     </w:p>
     <w:p>
       <w:r>
-        <w:lastRenderedPageBreak/>
         <w:t xml:space="preserve">Na slici 10. je prikazan grafik funkcije troška na validacijskom skupu podataka kroz epohe. </w:t>
       </w:r>
     </w:p>
@@ -24645,6 +25431,7 @@
         <w:rPr>
           <w:noProof/>
         </w:rPr>
+        <w:lastRenderedPageBreak/>
         <w:drawing>
           <wp:inline distT="0" distB="0" distL="0" distR="0" wp14:anchorId="53855FE4" wp14:editId="5063D5B0">
             <wp:extent cx="5943600" cy="2319655"/>
@@ -24754,7 +25541,6 @@
         <w:pStyle w:val="Heading2"/>
       </w:pPr>
       <w:r>
-        <w:lastRenderedPageBreak/>
         <w:t>ROC i AUC</w:t>
       </w:r>
     </w:p>
@@ -24914,7 +25700,6 @@
       </w:pPr>
       <w:bookmarkStart w:id="41" w:name="_Toc236486959"/>
       <w:r>
-        <w:lastRenderedPageBreak/>
         <w:t>Analiza rezultata</w:t>
       </w:r>
       <w:bookmarkEnd w:id="41"/>
@@ -25206,6 +25991,7 @@
     </w:p>
     <w:p>
       <w:r>
+        <w:lastRenderedPageBreak/>
         <w:t>Za treniranje optimalnijeg modela za dati problem, bilo bi neophodno prilagoditi arhitekturu CNN modela i provesti treniranje na znatno većem skupu podataka.</w:t>
       </w:r>
     </w:p>
@@ -25235,7 +26021,6 @@
       <w:bookmarkStart w:id="42" w:name="_Toc236486960"/>
       <w:proofErr w:type="spellStart"/>
       <w:r>
-        <w:lastRenderedPageBreak/>
         <w:t>Zaključak</w:t>
       </w:r>
       <w:bookmarkEnd w:id="42"/>
@@ -25295,6 +26080,7 @@
         </w:sectPr>
       </w:pPr>
       <w:r>
+        <w:lastRenderedPageBreak/>
         <w:t>Dati rad se fokusirao na problem detekcije raka pluća, te bi za obuhvatniju analizu bilo potrebno testirati oba okruženja na većem broju različitih algoritama mašinskog učenja.</w:t>
       </w:r>
     </w:p>
@@ -26228,7 +27014,13 @@
           <w:rPr>
             <w:noProof/>
           </w:rPr>
-          <w:t>vii</w:t>
+          <w:t>vi</w:t>
+        </w:r>
+        <w:r>
+          <w:rPr>
+            <w:noProof/>
+          </w:rPr>
+          <w:t>i</w:t>
         </w:r>
         <w:r>
           <w:rPr>

</xml_diff>

<commit_message>
Added macro auc calculation and table for most important metrics.
</commit_message>
<xml_diff>
--- a/Word/omar_kurtovic_diplomski_rad.docx
+++ b/Word/omar_kurtovic_diplomski_rad.docx
@@ -14335,9 +14335,40 @@
     </w:p>
     <w:p>
       <w:pPr>
+        <w:spacing w:line="276" w:lineRule="auto"/>
+      </w:pPr>
+    </w:p>
+    <w:p>
+      <w:pPr>
+        <w:spacing w:line="276" w:lineRule="auto"/>
+      </w:pPr>
+    </w:p>
+    <w:p>
+      <w:pPr>
+        <w:spacing w:line="276" w:lineRule="auto"/>
+      </w:pPr>
+    </w:p>
+    <w:p>
+      <w:pPr>
+        <w:spacing w:line="276" w:lineRule="auto"/>
+      </w:pPr>
+    </w:p>
+    <w:p>
+      <w:pPr>
+        <w:spacing w:line="276" w:lineRule="auto"/>
+      </w:pPr>
+    </w:p>
+    <w:p>
+      <w:pPr>
+        <w:spacing w:line="276" w:lineRule="auto"/>
+      </w:pPr>
+    </w:p>
+    <w:p>
+      <w:pPr>
         <w:pStyle w:val="Heading2"/>
       </w:pPr>
       <w:r>
+        <w:lastRenderedPageBreak/>
         <w:t>Augmentacija podataka</w:t>
       </w:r>
     </w:p>
@@ -14433,7 +14464,6 @@
         <w:spacing w:line="276" w:lineRule="auto"/>
       </w:pPr>
       <w:r>
-        <w:lastRenderedPageBreak/>
         <w:t xml:space="preserve">U datom radu je korištena drugačija verzija augmentacije. Umjesto da se </w:t>
       </w:r>
       <w:r>
@@ -14746,6 +14776,7 @@
       </w:pPr>
       <w:bookmarkStart w:id="15" w:name="_Toc236486946"/>
       <w:r>
+        <w:lastRenderedPageBreak/>
         <w:t>Razdvajanje podataka na skup za treniranje i validaciju</w:t>
       </w:r>
       <w:bookmarkEnd w:id="15"/>
@@ -14758,7 +14789,6 @@
     </w:p>
     <w:p>
       <w:r>
-        <w:lastRenderedPageBreak/>
         <w:t>Glavni cilj treniranja neuronske mreže nije da mreža postigne visoku preciznost na podacima na kojima se mreža trenira (stvarne klase datih primjera su već poznate), već stvaranje modela koji uspješno generalizira problem, odnosno da model daje precizne i tačne rezultate na potpuno novim, neviđenim podacima.</w:t>
       </w:r>
     </w:p>
@@ -14826,6 +14856,7 @@
       </w:pPr>
       <w:bookmarkStart w:id="16" w:name="_Toc236486947"/>
       <w:r>
+        <w:lastRenderedPageBreak/>
         <w:t>Dizajn i arhitektura CNN modela</w:t>
       </w:r>
       <w:bookmarkEnd w:id="16"/>
@@ -14929,7 +14960,6 @@
     </w:p>
     <w:p>
       <w:r>
-        <w:lastRenderedPageBreak/>
         <w:t xml:space="preserve">Također, prilikom prolaska kroz prvi </w:t>
       </w:r>
       <w:r>
@@ -17545,6 +17575,7 @@
     </w:p>
     <w:p>
       <w:r>
+        <w:lastRenderedPageBreak/>
         <w:t xml:space="preserve">Arhitektura je dodatno analizirana pomoću alata </w:t>
       </w:r>
       <w:r>
@@ -17897,7 +17928,6 @@
           </w:tcPr>
           <w:p>
             <w:r>
-              <w:lastRenderedPageBreak/>
               <w:t>Linear</w:t>
             </w:r>
           </w:p>
@@ -18170,6 +18200,7 @@
         <w:pStyle w:val="Heading2"/>
       </w:pPr>
       <w:r>
+        <w:lastRenderedPageBreak/>
         <w:t>Funkcija troška, Optimizator</w:t>
       </w:r>
     </w:p>
@@ -19135,7 +19166,6 @@
         <w:rPr>
           <w:lang w:val="en-US"/>
         </w:rPr>
-        <w:lastRenderedPageBreak/>
         <w:t xml:space="preserve">U </w:t>
       </w:r>
       <w:proofErr w:type="spellStart"/>
@@ -20232,6 +20262,7 @@
       </w:pPr>
       <w:bookmarkStart w:id="18" w:name="_Toc236486948"/>
       <w:r>
+        <w:lastRenderedPageBreak/>
         <w:t>Broj epoha i veličina serije</w:t>
       </w:r>
       <w:bookmarkEnd w:id="18"/>
@@ -20308,7 +20339,6 @@
         <w:spacing w:after="160" w:line="259" w:lineRule="auto"/>
       </w:pPr>
       <w:r>
-        <w:lastRenderedPageBreak/>
         <w:t xml:space="preserve">Veličina serije (eng. </w:t>
       </w:r>
       <w:r>
@@ -20408,6 +20438,7 @@
       </w:pPr>
       <w:bookmarkStart w:id="19" w:name="_Toc236486949"/>
       <w:r>
+        <w:lastRenderedPageBreak/>
         <w:t>Orkestracija i .NET Aspire</w:t>
       </w:r>
       <w:bookmarkEnd w:id="19"/>
@@ -20502,6 +20533,7 @@
       </w:pPr>
       <w:bookmarkStart w:id="20" w:name="_Toc236486950"/>
       <w:r>
+        <w:lastRenderedPageBreak/>
         <w:t>Korisnički</w:t>
       </w:r>
       <w:r>
@@ -20546,7 +20578,6 @@
         <w:rPr>
           <w:noProof/>
         </w:rPr>
-        <w:lastRenderedPageBreak/>
         <w:drawing>
           <wp:inline distT="0" distB="0" distL="0" distR="0" wp14:anchorId="68CE63BB" wp14:editId="50D4F6B1">
             <wp:extent cx="5299100" cy="2704749"/>
@@ -20729,6 +20760,7 @@
     </w:p>
     <w:p>
       <w:r>
+        <w:lastRenderedPageBreak/>
         <w:t>Treća stranica služi za evaluaciju modela (Slika 3). Na datoj stranici korisnik može izabrati proizvoljnu sliku i trenirani model, nakon čega se vrši predikcija koja se prikazuje korisniku.</w:t>
       </w:r>
     </w:p>
@@ -20742,7 +20774,6 @@
           <w:noProof/>
           <w:lang w:val="en-US"/>
         </w:rPr>
-        <w:lastRenderedPageBreak/>
         <w:drawing>
           <wp:inline distT="0" distB="0" distL="0" distR="0" wp14:anchorId="7C4F93D8" wp14:editId="13E7B38B">
             <wp:extent cx="5255209" cy="3287875"/>
@@ -22535,7 +22566,13 @@
         </w:rPr>
       </w:pPr>
       <w:r>
-        <w:t>Nakon treniranja modela, dobijeni su sl</w:t>
+        <w:t>Nakon treniranja modela</w:t>
+      </w:r>
+      <w:r>
+        <w:t xml:space="preserve"> svih šest modela</w:t>
+      </w:r>
+      <w:r>
+        <w:t>, dobijeni su sl</w:t>
       </w:r>
       <w:r>
         <w:t>i</w:t>
@@ -22556,911 +22593,1353 @@
           <w:lang w:val="bs-Latn-BA"/>
         </w:rPr>
         <w:t xml:space="preserve"> rezultati.</w:t>
+      </w:r>
+    </w:p>
+    <w:p>
+      <w:pPr>
+        <w:pStyle w:val="Paragraf"/>
+        <w:ind w:firstLine="0"/>
+        <w:rPr>
+          <w:rFonts w:asciiTheme="minorHAnsi" w:hAnsiTheme="minorHAnsi"/>
+          <w:sz w:val="22"/>
+          <w:lang w:val="en-US"/>
+        </w:rPr>
+      </w:pPr>
+      <w:r>
+        <w:rPr>
+          <w:lang w:val="bs-Latn-BA"/>
+        </w:rPr>
+        <w:fldChar w:fldCharType="begin"/>
+      </w:r>
+      <w:r>
+        <w:rPr>
+          <w:lang w:val="bs-Latn-BA"/>
+        </w:rPr>
+        <w:instrText xml:space="preserve"> LINK Excel.Sheet.12 "C:\\Users\\Administrator\\source\\repos\\omarkurtovic\\ml-dotnet-vs-python\\Word\\rezultati.xlsx" "Sheet1!R1C1:R8C9" \a \f 5 \h  \* MERGEFORMAT </w:instrText>
+      </w:r>
+      <w:r>
+        <w:rPr>
+          <w:lang w:val="bs-Latn-BA"/>
+        </w:rPr>
+        <w:fldChar w:fldCharType="separate"/>
       </w:r>
     </w:p>
     <w:tbl>
       <w:tblPr>
         <w:tblStyle w:val="TableGrid"/>
-        <w:tblW w:w="0" w:type="auto"/>
-        <w:tblLayout w:type="fixed"/>
+        <w:tblW w:w="10080" w:type="dxa"/>
         <w:tblLook w:val="04A0" w:firstRow="1" w:lastRow="0" w:firstColumn="1" w:lastColumn="0" w:noHBand="0" w:noVBand="1"/>
       </w:tblPr>
       <w:tblGrid>
-        <w:gridCol w:w="1249"/>
-        <w:gridCol w:w="1250"/>
-        <w:gridCol w:w="1250"/>
-        <w:gridCol w:w="1249"/>
-        <w:gridCol w:w="1250"/>
-        <w:gridCol w:w="1250"/>
-        <w:gridCol w:w="1250"/>
+        <w:gridCol w:w="1121"/>
+        <w:gridCol w:w="1119"/>
+        <w:gridCol w:w="1120"/>
+        <w:gridCol w:w="1120"/>
+        <w:gridCol w:w="1120"/>
+        <w:gridCol w:w="1120"/>
+        <w:gridCol w:w="1120"/>
+        <w:gridCol w:w="1120"/>
+        <w:gridCol w:w="1120"/>
       </w:tblGrid>
       <w:tr>
+        <w:trPr>
+          <w:divId w:val="1154031062"/>
+          <w:trHeight w:val="315"/>
+        </w:trPr>
         <w:tc>
           <w:tcPr>
-            <w:tcW w:w="1249" w:type="dxa"/>
+            <w:tcW w:w="1120" w:type="dxa"/>
+            <w:hideMark/>
           </w:tcPr>
           <w:p>
             <w:pPr>
               <w:pStyle w:val="Paragraf"/>
               <w:ind w:firstLine="0"/>
-              <w:rPr>
-                <w:lang w:val="bs-Latn-BA"/>
+              <w:jc w:val="left"/>
+              <w:rPr>
+                <w:b/>
+                <w:bCs/>
               </w:rPr>
             </w:pPr>
+            <w:r>
+              <w:rPr>
+                <w:b/>
+                <w:bCs/>
+              </w:rPr>
+              <w:t>Metrike</w:t>
+            </w:r>
           </w:p>
         </w:tc>
         <w:tc>
           <w:tcPr>
-            <w:tcW w:w="1250" w:type="dxa"/>
+            <w:tcW w:w="1120" w:type="dxa"/>
+            <w:hideMark/>
           </w:tcPr>
           <w:p>
             <w:pPr>
               <w:pStyle w:val="Paragraf"/>
               <w:ind w:firstLine="0"/>
               <w:rPr>
-                <w:lang w:val="bs-Latn-BA"/>
+                <w:b/>
+                <w:bCs/>
               </w:rPr>
             </w:pPr>
             <w:r>
               <w:rPr>
-                <w:lang w:val="bs-Latn-BA"/>
-              </w:rPr>
-              <w:t>Vrijeme treniranja</w:t>
+                <w:b/>
+                <w:bCs/>
+              </w:rPr>
+              <w:t>C# 1</w:t>
             </w:r>
           </w:p>
         </w:tc>
         <w:tc>
           <w:tcPr>
-            <w:tcW w:w="1250" w:type="dxa"/>
+            <w:tcW w:w="1120" w:type="dxa"/>
+            <w:hideMark/>
           </w:tcPr>
           <w:p>
             <w:pPr>
               <w:pStyle w:val="Paragraf"/>
               <w:ind w:firstLine="0"/>
-              <w:rPr>
-                <w:lang w:val="bs-Latn-BA"/>
+              <w:jc w:val="left"/>
+              <w:rPr>
+                <w:b/>
+                <w:bCs/>
               </w:rPr>
             </w:pPr>
             <w:r>
               <w:rPr>
-                <w:lang w:val="bs-Latn-BA"/>
-              </w:rPr>
-              <w:t>Tačnost</w:t>
+                <w:b/>
+                <w:bCs/>
+              </w:rPr>
+              <w:t>C# 2</w:t>
             </w:r>
           </w:p>
         </w:tc>
         <w:tc>
           <w:tcPr>
-            <w:tcW w:w="1249" w:type="dxa"/>
+            <w:tcW w:w="1120" w:type="dxa"/>
+            <w:hideMark/>
           </w:tcPr>
           <w:p>
             <w:pPr>
               <w:pStyle w:val="Paragraf"/>
               <w:ind w:firstLine="0"/>
-              <w:rPr>
-                <w:lang w:val="bs-Latn-BA"/>
+              <w:jc w:val="left"/>
+              <w:rPr>
+                <w:b/>
+                <w:bCs/>
               </w:rPr>
             </w:pPr>
             <w:r>
               <w:rPr>
-                <w:lang w:val="bs-Latn-BA"/>
-              </w:rPr>
-              <w:t>Makro Odziv</w:t>
+                <w:b/>
+                <w:bCs/>
+              </w:rPr>
+              <w:t>C# 3</w:t>
             </w:r>
           </w:p>
         </w:tc>
         <w:tc>
           <w:tcPr>
-            <w:tcW w:w="1250" w:type="dxa"/>
+            <w:tcW w:w="1120" w:type="dxa"/>
+            <w:hideMark/>
           </w:tcPr>
           <w:p>
             <w:pPr>
               <w:pStyle w:val="Paragraf"/>
               <w:ind w:firstLine="0"/>
-              <w:rPr>
-                <w:lang w:val="bs-Latn-BA"/>
+              <w:jc w:val="left"/>
+              <w:rPr>
+                <w:b/>
+                <w:bCs/>
               </w:rPr>
             </w:pPr>
             <w:r>
               <w:rPr>
-                <w:lang w:val="bs-Latn-BA"/>
-              </w:rPr>
-              <w:t>Makro Preciznost</w:t>
+                <w:b/>
+                <w:bCs/>
+              </w:rPr>
+              <w:t>Prosjek  ± SD</w:t>
             </w:r>
           </w:p>
         </w:tc>
         <w:tc>
           <w:tcPr>
-            <w:tcW w:w="1250" w:type="dxa"/>
+            <w:tcW w:w="1120" w:type="dxa"/>
+            <w:hideMark/>
           </w:tcPr>
           <w:p>
             <w:pPr>
               <w:pStyle w:val="Paragraf"/>
               <w:ind w:firstLine="0"/>
-              <w:rPr>
-                <w:lang w:val="bs-Latn-BA"/>
+              <w:jc w:val="left"/>
+              <w:rPr>
+                <w:b/>
+                <w:bCs/>
               </w:rPr>
             </w:pPr>
             <w:r>
               <w:rPr>
-                <w:lang w:val="bs-Latn-BA"/>
-              </w:rPr>
-              <w:t>Makro F1 skor</w:t>
+                <w:b/>
+                <w:bCs/>
+              </w:rPr>
+              <w:t>Python 1</w:t>
             </w:r>
           </w:p>
         </w:tc>
         <w:tc>
           <w:tcPr>
-            <w:tcW w:w="1250" w:type="dxa"/>
+            <w:tcW w:w="1120" w:type="dxa"/>
+            <w:hideMark/>
           </w:tcPr>
           <w:p>
             <w:pPr>
               <w:pStyle w:val="Paragraf"/>
               <w:ind w:firstLine="0"/>
-              <w:rPr>
-                <w:lang w:val="bs-Latn-BA"/>
+              <w:jc w:val="left"/>
+              <w:rPr>
+                <w:b/>
+                <w:bCs/>
               </w:rPr>
             </w:pPr>
             <w:r>
               <w:rPr>
-                <w:lang w:val="bs-Latn-BA"/>
-              </w:rPr>
-              <w:t>AUC</w:t>
+                <w:b/>
+                <w:bCs/>
+              </w:rPr>
+              <w:t>Python 2</w:t>
             </w:r>
           </w:p>
         </w:tc>
-      </w:tr>
-      <w:tr>
         <w:tc>
           <w:tcPr>
-            <w:tcW w:w="1249" w:type="dxa"/>
+            <w:tcW w:w="1120" w:type="dxa"/>
+            <w:hideMark/>
           </w:tcPr>
           <w:p>
             <w:pPr>
               <w:pStyle w:val="Paragraf"/>
               <w:ind w:firstLine="0"/>
-              <w:rPr>
-                <w:lang w:val="bs-Latn-BA"/>
+              <w:jc w:val="left"/>
+              <w:rPr>
+                <w:b/>
+                <w:bCs/>
               </w:rPr>
             </w:pPr>
-            <w:proofErr w:type="spellStart"/>
-            <w:r>
-              <w:rPr>
-                <w:lang w:val="bs-Latn-BA"/>
-              </w:rPr>
-              <w:t>CSharp</w:t>
-            </w:r>
-            <w:proofErr w:type="spellEnd"/>
-            <w:r>
-              <w:rPr>
-                <w:lang w:val="bs-Latn-BA"/>
-              </w:rPr>
-              <w:t xml:space="preserve"> 1</w:t>
+            <w:r>
+              <w:rPr>
+                <w:b/>
+                <w:bCs/>
+              </w:rPr>
+              <w:t>Python 3</w:t>
             </w:r>
           </w:p>
         </w:tc>
         <w:tc>
           <w:tcPr>
-            <w:tcW w:w="1250" w:type="dxa"/>
+            <w:tcW w:w="1120" w:type="dxa"/>
+            <w:hideMark/>
           </w:tcPr>
           <w:p>
             <w:pPr>
               <w:pStyle w:val="Paragraf"/>
               <w:ind w:firstLine="0"/>
-              <w:rPr>
-                <w:lang w:val="bs-Latn-BA"/>
+              <w:jc w:val="left"/>
+              <w:rPr>
+                <w:b/>
+                <w:bCs/>
               </w:rPr>
             </w:pPr>
+            <w:r>
+              <w:rPr>
+                <w:b/>
+                <w:bCs/>
+              </w:rPr>
+              <w:t>Prosjek ± SD</w:t>
+            </w:r>
           </w:p>
         </w:tc>
+      </w:tr>
+      <w:tr>
+        <w:trPr>
+          <w:divId w:val="1154031062"/>
+          <w:trHeight w:val="600"/>
+        </w:trPr>
         <w:tc>
           <w:tcPr>
-            <w:tcW w:w="1250" w:type="dxa"/>
+            <w:tcW w:w="1120" w:type="dxa"/>
+            <w:hideMark/>
           </w:tcPr>
           <w:p>
             <w:pPr>
               <w:pStyle w:val="Paragraf"/>
               <w:ind w:firstLine="0"/>
-              <w:rPr>
-                <w:lang w:val="bs-Latn-BA"/>
-              </w:rPr>
+              <w:jc w:val="left"/>
             </w:pPr>
+            <w:r>
+              <w:t>Vrijeme treniranja</w:t>
+            </w:r>
           </w:p>
         </w:tc>
         <w:tc>
           <w:tcPr>
-            <w:tcW w:w="1249" w:type="dxa"/>
+            <w:tcW w:w="1120" w:type="dxa"/>
+            <w:hideMark/>
           </w:tcPr>
           <w:p>
             <w:pPr>
               <w:pStyle w:val="Paragraf"/>
               <w:ind w:firstLine="0"/>
-              <w:rPr>
-                <w:lang w:val="bs-Latn-BA"/>
-              </w:rPr>
+              <w:jc w:val="left"/>
             </w:pPr>
+            <w:r>
+              <w:t>184,05</w:t>
+            </w:r>
           </w:p>
         </w:tc>
         <w:tc>
           <w:tcPr>
-            <w:tcW w:w="1250" w:type="dxa"/>
+            <w:tcW w:w="1120" w:type="dxa"/>
+            <w:hideMark/>
           </w:tcPr>
           <w:p>
             <w:pPr>
               <w:pStyle w:val="Paragraf"/>
               <w:ind w:firstLine="0"/>
-              <w:rPr>
-                <w:lang w:val="bs-Latn-BA"/>
-              </w:rPr>
+              <w:jc w:val="left"/>
             </w:pPr>
+            <w:r>
+              <w:t>189,80</w:t>
+            </w:r>
           </w:p>
         </w:tc>
         <w:tc>
           <w:tcPr>
-            <w:tcW w:w="1250" w:type="dxa"/>
+            <w:tcW w:w="1120" w:type="dxa"/>
+            <w:hideMark/>
           </w:tcPr>
           <w:p>
             <w:pPr>
               <w:pStyle w:val="Paragraf"/>
               <w:ind w:firstLine="0"/>
-              <w:rPr>
-                <w:lang w:val="bs-Latn-BA"/>
-              </w:rPr>
+              <w:jc w:val="left"/>
             </w:pPr>
+            <w:r>
+              <w:t>192,57</w:t>
+            </w:r>
           </w:p>
         </w:tc>
         <w:tc>
           <w:tcPr>
-            <w:tcW w:w="1250" w:type="dxa"/>
+            <w:tcW w:w="1120" w:type="dxa"/>
+            <w:hideMark/>
           </w:tcPr>
           <w:p>
             <w:pPr>
               <w:pStyle w:val="Paragraf"/>
               <w:ind w:firstLine="0"/>
-              <w:rPr>
-                <w:lang w:val="bs-Latn-BA"/>
-              </w:rPr>
+              <w:jc w:val="left"/>
             </w:pPr>
+            <w:r>
+              <w:t>188</w:t>
+            </w:r>
+            <w:r>
+              <w:t>,</w:t>
+            </w:r>
+            <w:r>
+              <w:t>80 ± 4</w:t>
+            </w:r>
+            <w:r>
+              <w:t>,</w:t>
+            </w:r>
+            <w:r>
+              <w:t>34</w:t>
+            </w:r>
           </w:p>
         </w:tc>
-      </w:tr>
-      <w:tr>
         <w:tc>
           <w:tcPr>
-            <w:tcW w:w="1249" w:type="dxa"/>
+            <w:tcW w:w="1120" w:type="dxa"/>
+            <w:hideMark/>
           </w:tcPr>
           <w:p>
             <w:pPr>
               <w:pStyle w:val="Paragraf"/>
               <w:ind w:firstLine="0"/>
-              <w:rPr>
-                <w:lang w:val="bs-Latn-BA"/>
-              </w:rPr>
+              <w:jc w:val="left"/>
             </w:pPr>
-            <w:proofErr w:type="spellStart"/>
-            <w:r>
-              <w:rPr>
-                <w:lang w:val="bs-Latn-BA"/>
-              </w:rPr>
-              <w:t>CSharp</w:t>
-            </w:r>
-            <w:proofErr w:type="spellEnd"/>
-            <w:r>
-              <w:rPr>
-                <w:lang w:val="bs-Latn-BA"/>
-              </w:rPr>
-              <w:t xml:space="preserve"> </w:t>
-            </w:r>
-            <w:r>
-              <w:rPr>
-                <w:lang w:val="bs-Latn-BA"/>
-              </w:rPr>
-              <w:t>2</w:t>
+            <w:r>
+              <w:t>283,79</w:t>
             </w:r>
           </w:p>
         </w:tc>
         <w:tc>
           <w:tcPr>
-            <w:tcW w:w="1250" w:type="dxa"/>
+            <w:tcW w:w="1120" w:type="dxa"/>
+            <w:hideMark/>
           </w:tcPr>
           <w:p>
             <w:pPr>
               <w:pStyle w:val="Paragraf"/>
               <w:ind w:firstLine="0"/>
-              <w:rPr>
-                <w:lang w:val="bs-Latn-BA"/>
-              </w:rPr>
+              <w:jc w:val="left"/>
             </w:pPr>
+            <w:r>
+              <w:t>330,07</w:t>
+            </w:r>
           </w:p>
         </w:tc>
         <w:tc>
           <w:tcPr>
-            <w:tcW w:w="1250" w:type="dxa"/>
+            <w:tcW w:w="1120" w:type="dxa"/>
+            <w:hideMark/>
           </w:tcPr>
           <w:p>
             <w:pPr>
               <w:pStyle w:val="Paragraf"/>
               <w:ind w:firstLine="0"/>
-              <w:rPr>
-                <w:lang w:val="bs-Latn-BA"/>
-              </w:rPr>
+              <w:jc w:val="left"/>
             </w:pPr>
+            <w:r>
+              <w:t>294,75</w:t>
+            </w:r>
           </w:p>
         </w:tc>
         <w:tc>
           <w:tcPr>
-            <w:tcW w:w="1249" w:type="dxa"/>
+            <w:tcW w:w="1120" w:type="dxa"/>
+            <w:noWrap/>
+            <w:hideMark/>
           </w:tcPr>
           <w:p>
             <w:pPr>
               <w:pStyle w:val="Paragraf"/>
               <w:ind w:firstLine="0"/>
-              <w:rPr>
-                <w:lang w:val="bs-Latn-BA"/>
-              </w:rPr>
+              <w:jc w:val="left"/>
             </w:pPr>
+            <w:r>
+              <w:t>302</w:t>
+            </w:r>
+            <w:r>
+              <w:t>,</w:t>
+            </w:r>
+            <w:r>
+              <w:t>87 ± 24</w:t>
+            </w:r>
+            <w:r>
+              <w:t>,</w:t>
+            </w:r>
+            <w:r>
+              <w:t>18</w:t>
+            </w:r>
           </w:p>
         </w:tc>
+      </w:tr>
+      <w:tr>
+        <w:trPr>
+          <w:divId w:val="1154031062"/>
+          <w:trHeight w:val="600"/>
+        </w:trPr>
         <w:tc>
           <w:tcPr>
-            <w:tcW w:w="1250" w:type="dxa"/>
+            <w:tcW w:w="1120" w:type="dxa"/>
+            <w:hideMark/>
           </w:tcPr>
           <w:p>
             <w:pPr>
               <w:pStyle w:val="Paragraf"/>
               <w:ind w:firstLine="0"/>
-              <w:rPr>
-                <w:lang w:val="bs-Latn-BA"/>
-              </w:rPr>
+              <w:jc w:val="left"/>
             </w:pPr>
+            <w:r>
+              <w:t>Tačnost</w:t>
+            </w:r>
           </w:p>
         </w:tc>
         <w:tc>
           <w:tcPr>
-            <w:tcW w:w="1250" w:type="dxa"/>
+            <w:tcW w:w="1120" w:type="dxa"/>
+            <w:hideMark/>
           </w:tcPr>
           <w:p>
             <w:pPr>
               <w:pStyle w:val="Paragraf"/>
               <w:ind w:firstLine="0"/>
-              <w:rPr>
-                <w:lang w:val="bs-Latn-BA"/>
-              </w:rPr>
+              <w:jc w:val="left"/>
             </w:pPr>
+            <w:r>
+              <w:t>81,45%</w:t>
+            </w:r>
           </w:p>
         </w:tc>
         <w:tc>
           <w:tcPr>
-            <w:tcW w:w="1250" w:type="dxa"/>
+            <w:tcW w:w="1120" w:type="dxa"/>
+            <w:hideMark/>
           </w:tcPr>
           <w:p>
             <w:pPr>
               <w:pStyle w:val="Paragraf"/>
               <w:ind w:firstLine="0"/>
-              <w:rPr>
-                <w:lang w:val="bs-Latn-BA"/>
-              </w:rPr>
+              <w:jc w:val="left"/>
             </w:pPr>
+            <w:r>
+              <w:t>80,73%</w:t>
+            </w:r>
           </w:p>
         </w:tc>
-      </w:tr>
-      <w:tr>
         <w:tc>
           <w:tcPr>
-            <w:tcW w:w="1249" w:type="dxa"/>
+            <w:tcW w:w="1120" w:type="dxa"/>
+            <w:hideMark/>
           </w:tcPr>
           <w:p>
             <w:pPr>
               <w:pStyle w:val="Paragraf"/>
               <w:ind w:firstLine="0"/>
-              <w:rPr>
-                <w:lang w:val="bs-Latn-BA"/>
-              </w:rPr>
+              <w:jc w:val="left"/>
             </w:pPr>
-            <w:proofErr w:type="spellStart"/>
-            <w:r>
-              <w:rPr>
-                <w:lang w:val="bs-Latn-BA"/>
-              </w:rPr>
-              <w:t>CSharp</w:t>
-            </w:r>
-            <w:proofErr w:type="spellEnd"/>
-            <w:r>
-              <w:rPr>
-                <w:lang w:val="bs-Latn-BA"/>
-              </w:rPr>
-              <w:t xml:space="preserve"> </w:t>
-            </w:r>
-            <w:r>
-              <w:rPr>
-                <w:lang w:val="bs-Latn-BA"/>
-              </w:rPr>
-              <w:t>3</w:t>
+            <w:r>
+              <w:t>86,91%</w:t>
             </w:r>
           </w:p>
         </w:tc>
         <w:tc>
           <w:tcPr>
-            <w:tcW w:w="1250" w:type="dxa"/>
+            <w:tcW w:w="1120" w:type="dxa"/>
+            <w:hideMark/>
           </w:tcPr>
           <w:p>
             <w:pPr>
               <w:pStyle w:val="Paragraf"/>
               <w:ind w:firstLine="0"/>
-              <w:rPr>
-                <w:lang w:val="bs-Latn-BA"/>
-              </w:rPr>
+              <w:jc w:val="left"/>
             </w:pPr>
+            <w:r>
+              <w:t>83,03 ± 3,38</w:t>
+            </w:r>
           </w:p>
         </w:tc>
         <w:tc>
           <w:tcPr>
-            <w:tcW w:w="1250" w:type="dxa"/>
+            <w:tcW w:w="1120" w:type="dxa"/>
+            <w:hideMark/>
           </w:tcPr>
           <w:p>
             <w:pPr>
               <w:pStyle w:val="Paragraf"/>
               <w:ind w:firstLine="0"/>
-              <w:rPr>
-                <w:lang w:val="bs-Latn-BA"/>
-              </w:rPr>
+              <w:jc w:val="left"/>
             </w:pPr>
+            <w:r>
+              <w:t>80,73%</w:t>
+            </w:r>
           </w:p>
         </w:tc>
         <w:tc>
           <w:tcPr>
-            <w:tcW w:w="1249" w:type="dxa"/>
+            <w:tcW w:w="1120" w:type="dxa"/>
+            <w:hideMark/>
           </w:tcPr>
           <w:p>
             <w:pPr>
               <w:pStyle w:val="Paragraf"/>
               <w:ind w:firstLine="0"/>
-              <w:rPr>
-                <w:lang w:val="bs-Latn-BA"/>
-              </w:rPr>
+              <w:jc w:val="left"/>
             </w:pPr>
+            <w:r>
+              <w:t>82,18%</w:t>
+            </w:r>
           </w:p>
         </w:tc>
         <w:tc>
           <w:tcPr>
-            <w:tcW w:w="1250" w:type="dxa"/>
+            <w:tcW w:w="1120" w:type="dxa"/>
+            <w:hideMark/>
           </w:tcPr>
           <w:p>
             <w:pPr>
               <w:pStyle w:val="Paragraf"/>
               <w:ind w:firstLine="0"/>
-              <w:rPr>
-                <w:lang w:val="bs-Latn-BA"/>
-              </w:rPr>
+              <w:jc w:val="left"/>
             </w:pPr>
+            <w:r>
+              <w:t>88,73%</w:t>
+            </w:r>
           </w:p>
         </w:tc>
         <w:tc>
           <w:tcPr>
-            <w:tcW w:w="1250" w:type="dxa"/>
+            <w:tcW w:w="1120" w:type="dxa"/>
+            <w:noWrap/>
+            <w:hideMark/>
           </w:tcPr>
           <w:p>
             <w:pPr>
               <w:pStyle w:val="Paragraf"/>
               <w:ind w:firstLine="0"/>
-              <w:rPr>
-                <w:lang w:val="bs-Latn-BA"/>
-              </w:rPr>
+              <w:jc w:val="left"/>
             </w:pPr>
+            <w:r>
+              <w:t>83,88 ± 4,26</w:t>
+            </w:r>
           </w:p>
         </w:tc>
+      </w:tr>
+      <w:tr>
+        <w:trPr>
+          <w:divId w:val="1154031062"/>
+          <w:trHeight w:val="600"/>
+        </w:trPr>
         <w:tc>
           <w:tcPr>
-            <w:tcW w:w="1250" w:type="dxa"/>
+            <w:tcW w:w="1120" w:type="dxa"/>
+            <w:hideMark/>
           </w:tcPr>
           <w:p>
             <w:pPr>
               <w:pStyle w:val="Paragraf"/>
               <w:ind w:firstLine="0"/>
-              <w:rPr>
-                <w:lang w:val="bs-Latn-BA"/>
-              </w:rPr>
+              <w:jc w:val="left"/>
             </w:pPr>
+            <w:r>
+              <w:t>Odziv maligne klase</w:t>
+            </w:r>
           </w:p>
         </w:tc>
-      </w:tr>
-      <w:tr>
         <w:tc>
           <w:tcPr>
-            <w:tcW w:w="1249" w:type="dxa"/>
+            <w:tcW w:w="1120" w:type="dxa"/>
+            <w:hideMark/>
           </w:tcPr>
           <w:p>
             <w:pPr>
               <w:pStyle w:val="Paragraf"/>
               <w:ind w:firstLine="0"/>
-              <w:rPr>
-                <w:lang w:val="bs-Latn-BA"/>
-              </w:rPr>
+              <w:jc w:val="left"/>
             </w:pPr>
+            <w:r>
+              <w:t>100,00%</w:t>
+            </w:r>
           </w:p>
         </w:tc>
         <w:tc>
           <w:tcPr>
-            <w:tcW w:w="1250" w:type="dxa"/>
+            <w:tcW w:w="1120" w:type="dxa"/>
+            <w:hideMark/>
           </w:tcPr>
           <w:p>
             <w:pPr>
               <w:pStyle w:val="Paragraf"/>
               <w:ind w:firstLine="0"/>
-              <w:rPr>
-                <w:lang w:val="bs-Latn-BA"/>
-              </w:rPr>
+              <w:jc w:val="left"/>
             </w:pPr>
+            <w:r>
+              <w:t>100,00%</w:t>
+            </w:r>
           </w:p>
         </w:tc>
         <w:tc>
           <w:tcPr>
-            <w:tcW w:w="1250" w:type="dxa"/>
+            <w:tcW w:w="1120" w:type="dxa"/>
+            <w:hideMark/>
           </w:tcPr>
           <w:p>
             <w:pPr>
               <w:pStyle w:val="Paragraf"/>
               <w:ind w:firstLine="0"/>
-              <w:rPr>
-                <w:lang w:val="bs-Latn-BA"/>
-              </w:rPr>
+              <w:jc w:val="left"/>
             </w:pPr>
+            <w:r>
+              <w:t>100,00%</w:t>
+            </w:r>
           </w:p>
         </w:tc>
         <w:tc>
           <w:tcPr>
-            <w:tcW w:w="1249" w:type="dxa"/>
+            <w:tcW w:w="1120" w:type="dxa"/>
+            <w:hideMark/>
           </w:tcPr>
           <w:p>
             <w:pPr>
               <w:pStyle w:val="Paragraf"/>
               <w:ind w:firstLine="0"/>
-              <w:rPr>
-                <w:lang w:val="bs-Latn-BA"/>
-              </w:rPr>
+              <w:jc w:val="left"/>
             </w:pPr>
+            <w:r>
+              <w:t>100,00 ± 0,00</w:t>
+            </w:r>
           </w:p>
         </w:tc>
         <w:tc>
           <w:tcPr>
-            <w:tcW w:w="1250" w:type="dxa"/>
+            <w:tcW w:w="1120" w:type="dxa"/>
+            <w:hideMark/>
           </w:tcPr>
           <w:p>
             <w:pPr>
               <w:pStyle w:val="Paragraf"/>
               <w:ind w:firstLine="0"/>
-              <w:rPr>
-                <w:lang w:val="bs-Latn-BA"/>
-              </w:rPr>
+              <w:jc w:val="left"/>
             </w:pPr>
+            <w:r>
+              <w:t>100,00%</w:t>
+            </w:r>
           </w:p>
         </w:tc>
         <w:tc>
           <w:tcPr>
-            <w:tcW w:w="1250" w:type="dxa"/>
+            <w:tcW w:w="1120" w:type="dxa"/>
+            <w:hideMark/>
           </w:tcPr>
           <w:p>
             <w:pPr>
               <w:pStyle w:val="Paragraf"/>
               <w:ind w:firstLine="0"/>
-              <w:rPr>
-                <w:lang w:val="bs-Latn-BA"/>
-              </w:rPr>
+              <w:jc w:val="left"/>
             </w:pPr>
+            <w:r>
+              <w:t>100,00%</w:t>
+            </w:r>
           </w:p>
         </w:tc>
         <w:tc>
           <w:tcPr>
-            <w:tcW w:w="1250" w:type="dxa"/>
+            <w:tcW w:w="1120" w:type="dxa"/>
+            <w:hideMark/>
           </w:tcPr>
           <w:p>
             <w:pPr>
               <w:pStyle w:val="Paragraf"/>
               <w:ind w:firstLine="0"/>
-              <w:rPr>
-                <w:lang w:val="bs-Latn-BA"/>
-              </w:rPr>
+              <w:jc w:val="left"/>
             </w:pPr>
+            <w:r>
+              <w:t>100,00%</w:t>
+            </w:r>
           </w:p>
         </w:tc>
-      </w:tr>
-      <w:tr>
         <w:tc>
           <w:tcPr>
-            <w:tcW w:w="1249" w:type="dxa"/>
+            <w:tcW w:w="1120" w:type="dxa"/>
+            <w:noWrap/>
+            <w:hideMark/>
           </w:tcPr>
           <w:p>
             <w:pPr>
               <w:pStyle w:val="Paragraf"/>
               <w:ind w:firstLine="0"/>
-              <w:rPr>
-                <w:lang w:val="bs-Latn-BA"/>
-              </w:rPr>
+              <w:jc w:val="left"/>
             </w:pPr>
+            <w:r>
+              <w:t>100,00 ± 0,00</w:t>
+            </w:r>
           </w:p>
         </w:tc>
+      </w:tr>
+      <w:tr>
+        <w:trPr>
+          <w:divId w:val="1154031062"/>
+          <w:trHeight w:val="600"/>
+        </w:trPr>
         <w:tc>
           <w:tcPr>
-            <w:tcW w:w="1250" w:type="dxa"/>
+            <w:tcW w:w="1120" w:type="dxa"/>
+            <w:hideMark/>
           </w:tcPr>
           <w:p>
             <w:pPr>
               <w:pStyle w:val="Paragraf"/>
               <w:ind w:firstLine="0"/>
-              <w:rPr>
-                <w:lang w:val="bs-Latn-BA"/>
-              </w:rPr>
+              <w:jc w:val="left"/>
             </w:pPr>
+            <w:r>
+              <w:t>Makro preciznost</w:t>
+            </w:r>
           </w:p>
         </w:tc>
         <w:tc>
           <w:tcPr>
-            <w:tcW w:w="1250" w:type="dxa"/>
+            <w:tcW w:w="1120" w:type="dxa"/>
+            <w:hideMark/>
           </w:tcPr>
           <w:p>
             <w:pPr>
               <w:pStyle w:val="Paragraf"/>
               <w:ind w:firstLine="0"/>
-              <w:rPr>
-                <w:lang w:val="bs-Latn-BA"/>
-              </w:rPr>
+              <w:jc w:val="left"/>
             </w:pPr>
+            <w:r>
+              <w:t>68,81%</w:t>
+            </w:r>
           </w:p>
         </w:tc>
         <w:tc>
           <w:tcPr>
-            <w:tcW w:w="1249" w:type="dxa"/>
+            <w:tcW w:w="1120" w:type="dxa"/>
+            <w:hideMark/>
           </w:tcPr>
           <w:p>
             <w:pPr>
               <w:pStyle w:val="Paragraf"/>
               <w:ind w:firstLine="0"/>
-              <w:rPr>
-                <w:lang w:val="bs-Latn-BA"/>
-              </w:rPr>
+              <w:jc w:val="left"/>
             </w:pPr>
+            <w:r>
+              <w:t>74,76%</w:t>
+            </w:r>
           </w:p>
         </w:tc>
         <w:tc>
           <w:tcPr>
-            <w:tcW w:w="1250" w:type="dxa"/>
+            <w:tcW w:w="1120" w:type="dxa"/>
+            <w:hideMark/>
           </w:tcPr>
           <w:p>
             <w:pPr>
               <w:pStyle w:val="Paragraf"/>
               <w:ind w:firstLine="0"/>
-              <w:rPr>
-                <w:lang w:val="bs-Latn-BA"/>
-              </w:rPr>
+              <w:jc w:val="left"/>
             </w:pPr>
+            <w:r>
+              <w:t>75,06%</w:t>
+            </w:r>
           </w:p>
         </w:tc>
         <w:tc>
           <w:tcPr>
-            <w:tcW w:w="1250" w:type="dxa"/>
+            <w:tcW w:w="1120" w:type="dxa"/>
+            <w:hideMark/>
           </w:tcPr>
           <w:p>
             <w:pPr>
               <w:pStyle w:val="Paragraf"/>
               <w:ind w:firstLine="0"/>
-              <w:rPr>
-                <w:lang w:val="bs-Latn-BA"/>
-              </w:rPr>
+              <w:jc w:val="left"/>
             </w:pPr>
+            <w:r>
+              <w:t>72,88 ± 3,53</w:t>
+            </w:r>
           </w:p>
         </w:tc>
         <w:tc>
           <w:tcPr>
-            <w:tcW w:w="1250" w:type="dxa"/>
+            <w:tcW w:w="1120" w:type="dxa"/>
+            <w:hideMark/>
           </w:tcPr>
           <w:p>
             <w:pPr>
               <w:pStyle w:val="Paragraf"/>
               <w:ind w:firstLine="0"/>
-              <w:rPr>
-                <w:lang w:val="bs-Latn-BA"/>
-              </w:rPr>
+              <w:jc w:val="left"/>
             </w:pPr>
+            <w:r>
+              <w:t>65,38%</w:t>
+            </w:r>
           </w:p>
         </w:tc>
-      </w:tr>
-      <w:tr>
         <w:tc>
           <w:tcPr>
-            <w:tcW w:w="1249" w:type="dxa"/>
+            <w:tcW w:w="1120" w:type="dxa"/>
+            <w:hideMark/>
           </w:tcPr>
           <w:p>
             <w:pPr>
               <w:pStyle w:val="Paragraf"/>
               <w:ind w:firstLine="0"/>
-              <w:rPr>
-                <w:lang w:val="bs-Latn-BA"/>
-              </w:rPr>
+              <w:jc w:val="left"/>
             </w:pPr>
+            <w:r>
+              <w:t>72,45%</w:t>
+            </w:r>
           </w:p>
         </w:tc>
         <w:tc>
           <w:tcPr>
-            <w:tcW w:w="1250" w:type="dxa"/>
+            <w:tcW w:w="1120" w:type="dxa"/>
+            <w:hideMark/>
           </w:tcPr>
           <w:p>
             <w:pPr>
               <w:pStyle w:val="Paragraf"/>
               <w:ind w:firstLine="0"/>
-              <w:rPr>
-                <w:lang w:val="bs-Latn-BA"/>
-              </w:rPr>
+              <w:jc w:val="left"/>
             </w:pPr>
+            <w:r>
+              <w:t>76,49%</w:t>
+            </w:r>
           </w:p>
         </w:tc>
         <w:tc>
           <w:tcPr>
-            <w:tcW w:w="1250" w:type="dxa"/>
+            <w:tcW w:w="1120" w:type="dxa"/>
+            <w:noWrap/>
+            <w:hideMark/>
           </w:tcPr>
           <w:p>
             <w:pPr>
               <w:pStyle w:val="Paragraf"/>
               <w:ind w:firstLine="0"/>
-              <w:rPr>
-                <w:lang w:val="bs-Latn-BA"/>
-              </w:rPr>
+              <w:jc w:val="left"/>
             </w:pPr>
+            <w:r>
+              <w:t>71,44 ± 5,62</w:t>
+            </w:r>
           </w:p>
         </w:tc>
+      </w:tr>
+      <w:tr>
+        <w:trPr>
+          <w:divId w:val="1154031062"/>
+          <w:trHeight w:val="600"/>
+        </w:trPr>
         <w:tc>
           <w:tcPr>
-            <w:tcW w:w="1249" w:type="dxa"/>
+            <w:tcW w:w="1120" w:type="dxa"/>
+            <w:hideMark/>
           </w:tcPr>
           <w:p>
             <w:pPr>
               <w:pStyle w:val="Paragraf"/>
               <w:ind w:firstLine="0"/>
-              <w:rPr>
-                <w:lang w:val="bs-Latn-BA"/>
-              </w:rPr>
+              <w:jc w:val="left"/>
             </w:pPr>
+            <w:r>
+              <w:t>Makro odziv</w:t>
+            </w:r>
           </w:p>
         </w:tc>
         <w:tc>
           <w:tcPr>
-            <w:tcW w:w="1250" w:type="dxa"/>
+            <w:tcW w:w="1120" w:type="dxa"/>
+            <w:hideMark/>
           </w:tcPr>
           <w:p>
             <w:pPr>
               <w:pStyle w:val="Paragraf"/>
               <w:ind w:firstLine="0"/>
-              <w:rPr>
-                <w:lang w:val="bs-Latn-BA"/>
-              </w:rPr>
+              <w:jc w:val="left"/>
             </w:pPr>
+            <w:r>
+              <w:t>69,42%</w:t>
+            </w:r>
           </w:p>
         </w:tc>
         <w:tc>
           <w:tcPr>
-            <w:tcW w:w="1250" w:type="dxa"/>
+            <w:tcW w:w="1120" w:type="dxa"/>
+            <w:hideMark/>
           </w:tcPr>
           <w:p>
             <w:pPr>
               <w:pStyle w:val="Paragraf"/>
               <w:ind w:firstLine="0"/>
-              <w:rPr>
-                <w:lang w:val="bs-Latn-BA"/>
-              </w:rPr>
+              <w:jc w:val="left"/>
             </w:pPr>
+            <w:r>
+              <w:t>78,27%</w:t>
+            </w:r>
           </w:p>
         </w:tc>
         <w:tc>
           <w:tcPr>
-            <w:tcW w:w="1250" w:type="dxa"/>
+            <w:tcW w:w="1120" w:type="dxa"/>
+            <w:hideMark/>
           </w:tcPr>
           <w:p>
             <w:pPr>
               <w:pStyle w:val="Paragraf"/>
               <w:ind w:firstLine="0"/>
-              <w:rPr>
-                <w:lang w:val="bs-Latn-BA"/>
-              </w:rPr>
+              <w:jc w:val="left"/>
             </w:pPr>
+            <w:r>
+              <w:t>75,81%</w:t>
+            </w:r>
           </w:p>
         </w:tc>
-      </w:tr>
-      <w:tr>
         <w:tc>
           <w:tcPr>
-            <w:tcW w:w="1249" w:type="dxa"/>
+            <w:tcW w:w="1120" w:type="dxa"/>
+            <w:hideMark/>
           </w:tcPr>
           <w:p>
             <w:pPr>
               <w:pStyle w:val="Paragraf"/>
               <w:ind w:firstLine="0"/>
-              <w:rPr>
-                <w:lang w:val="bs-Latn-BA"/>
-              </w:rPr>
+              <w:jc w:val="left"/>
             </w:pPr>
+            <w:r>
+              <w:t>72,62 ± 4,52</w:t>
+            </w:r>
           </w:p>
         </w:tc>
         <w:tc>
           <w:tcPr>
-            <w:tcW w:w="1250" w:type="dxa"/>
+            <w:tcW w:w="1120" w:type="dxa"/>
+            <w:hideMark/>
           </w:tcPr>
           <w:p>
             <w:pPr>
               <w:pStyle w:val="Paragraf"/>
               <w:ind w:firstLine="0"/>
-              <w:rPr>
-                <w:lang w:val="bs-Latn-BA"/>
-              </w:rPr>
+              <w:jc w:val="left"/>
             </w:pPr>
+            <w:r>
+              <w:t>64,83%</w:t>
+            </w:r>
           </w:p>
         </w:tc>
         <w:tc>
           <w:tcPr>
-            <w:tcW w:w="1250" w:type="dxa"/>
+            <w:tcW w:w="1120" w:type="dxa"/>
+            <w:hideMark/>
           </w:tcPr>
           <w:p>
             <w:pPr>
               <w:pStyle w:val="Paragraf"/>
               <w:ind w:firstLine="0"/>
-              <w:rPr>
-                <w:lang w:val="bs-Latn-BA"/>
-              </w:rPr>
+              <w:jc w:val="left"/>
             </w:pPr>
+            <w:r>
+              <w:t>74,81%</w:t>
+            </w:r>
           </w:p>
         </w:tc>
         <w:tc>
           <w:tcPr>
-            <w:tcW w:w="1249" w:type="dxa"/>
+            <w:tcW w:w="1120" w:type="dxa"/>
+            <w:hideMark/>
           </w:tcPr>
           <w:p>
             <w:pPr>
               <w:pStyle w:val="Paragraf"/>
               <w:ind w:firstLine="0"/>
-              <w:rPr>
-                <w:lang w:val="bs-Latn-BA"/>
-              </w:rPr>
+              <w:jc w:val="left"/>
             </w:pPr>
+            <w:r>
+              <w:t>71,09%</w:t>
+            </w:r>
           </w:p>
         </w:tc>
         <w:tc>
           <w:tcPr>
-            <w:tcW w:w="1250" w:type="dxa"/>
+            <w:tcW w:w="1120" w:type="dxa"/>
+            <w:noWrap/>
+            <w:hideMark/>
           </w:tcPr>
           <w:p>
             <w:pPr>
               <w:pStyle w:val="Paragraf"/>
               <w:ind w:firstLine="0"/>
-              <w:rPr>
-                <w:lang w:val="bs-Latn-BA"/>
-              </w:rPr>
+              <w:jc w:val="left"/>
             </w:pPr>
+            <w:r>
+              <w:t>70,24 ± 5,04</w:t>
+            </w:r>
           </w:p>
         </w:tc>
+      </w:tr>
+      <w:tr>
+        <w:trPr>
+          <w:divId w:val="1154031062"/>
+          <w:trHeight w:val="600"/>
+        </w:trPr>
         <w:tc>
           <w:tcPr>
-            <w:tcW w:w="1250" w:type="dxa"/>
+            <w:tcW w:w="1120" w:type="dxa"/>
+            <w:hideMark/>
           </w:tcPr>
           <w:p>
             <w:pPr>
               <w:pStyle w:val="Paragraf"/>
               <w:ind w:firstLine="0"/>
-              <w:rPr>
-                <w:lang w:val="bs-Latn-BA"/>
-              </w:rPr>
+              <w:jc w:val="left"/>
             </w:pPr>
+            <w:r>
+              <w:t>Makro F1</w:t>
+            </w:r>
           </w:p>
         </w:tc>
         <w:tc>
           <w:tcPr>
-            <w:tcW w:w="1250" w:type="dxa"/>
+            <w:tcW w:w="1120" w:type="dxa"/>
+            <w:hideMark/>
           </w:tcPr>
           <w:p>
             <w:pPr>
               <w:pStyle w:val="Paragraf"/>
               <w:ind w:firstLine="0"/>
-              <w:rPr>
-                <w:lang w:val="bs-Latn-BA"/>
-              </w:rPr>
+              <w:jc w:val="left"/>
             </w:pPr>
+            <w:r>
+              <w:t>68,53%</w:t>
+            </w:r>
+          </w:p>
+        </w:tc>
+        <w:tc>
+          <w:tcPr>
+            <w:tcW w:w="1120" w:type="dxa"/>
+            <w:hideMark/>
+          </w:tcPr>
+          <w:p>
+            <w:pPr>
+              <w:pStyle w:val="Paragraf"/>
+              <w:ind w:firstLine="0"/>
+              <w:jc w:val="left"/>
+            </w:pPr>
+            <w:r>
+              <w:t>71,93%</w:t>
+            </w:r>
+          </w:p>
+        </w:tc>
+        <w:tc>
+          <w:tcPr>
+            <w:tcW w:w="1120" w:type="dxa"/>
+            <w:hideMark/>
+          </w:tcPr>
+          <w:p>
+            <w:pPr>
+              <w:pStyle w:val="Paragraf"/>
+              <w:ind w:firstLine="0"/>
+              <w:jc w:val="left"/>
+            </w:pPr>
+            <w:r>
+              <w:t>75,37%</w:t>
+            </w:r>
+          </w:p>
+        </w:tc>
+        <w:tc>
+          <w:tcPr>
+            <w:tcW w:w="1120" w:type="dxa"/>
+            <w:hideMark/>
+          </w:tcPr>
+          <w:p>
+            <w:pPr>
+              <w:pStyle w:val="Paragraf"/>
+              <w:ind w:firstLine="0"/>
+              <w:jc w:val="left"/>
+            </w:pPr>
+            <w:r>
+              <w:t>71,95 ± 4,84</w:t>
+            </w:r>
+          </w:p>
+        </w:tc>
+        <w:tc>
+          <w:tcPr>
+            <w:tcW w:w="1120" w:type="dxa"/>
+            <w:hideMark/>
+          </w:tcPr>
+          <w:p>
+            <w:pPr>
+              <w:pStyle w:val="Paragraf"/>
+              <w:ind w:firstLine="0"/>
+              <w:jc w:val="left"/>
+            </w:pPr>
+            <w:r>
+              <w:t>64,94%</w:t>
+            </w:r>
+          </w:p>
+        </w:tc>
+        <w:tc>
+          <w:tcPr>
+            <w:tcW w:w="1120" w:type="dxa"/>
+            <w:hideMark/>
+          </w:tcPr>
+          <w:p>
+            <w:pPr>
+              <w:pStyle w:val="Paragraf"/>
+              <w:ind w:firstLine="0"/>
+              <w:jc w:val="left"/>
+            </w:pPr>
+            <w:r>
+              <w:t>72,09%</w:t>
+            </w:r>
+          </w:p>
+        </w:tc>
+        <w:tc>
+          <w:tcPr>
+            <w:tcW w:w="1120" w:type="dxa"/>
+            <w:hideMark/>
+          </w:tcPr>
+          <w:p>
+            <w:pPr>
+              <w:pStyle w:val="Paragraf"/>
+              <w:ind w:firstLine="0"/>
+              <w:jc w:val="left"/>
+            </w:pPr>
+            <w:r>
+              <w:t>71,48%</w:t>
+            </w:r>
+          </w:p>
+        </w:tc>
+        <w:tc>
+          <w:tcPr>
+            <w:tcW w:w="1120" w:type="dxa"/>
+            <w:noWrap/>
+            <w:hideMark/>
+          </w:tcPr>
+          <w:p>
+            <w:pPr>
+              <w:pStyle w:val="Paragraf"/>
+              <w:ind w:firstLine="0"/>
+              <w:jc w:val="left"/>
+            </w:pPr>
+            <w:r>
+              <w:t>69,50 ± 3,96</w:t>
+            </w:r>
+          </w:p>
+        </w:tc>
+      </w:tr>
+      <w:tr>
+        <w:trPr>
+          <w:divId w:val="1154031062"/>
+          <w:trHeight w:val="600"/>
+        </w:trPr>
+        <w:tc>
+          <w:tcPr>
+            <w:tcW w:w="1120" w:type="dxa"/>
+            <w:hideMark/>
+          </w:tcPr>
+          <w:p>
+            <w:pPr>
+              <w:pStyle w:val="Paragraf"/>
+              <w:ind w:firstLine="0"/>
+              <w:jc w:val="left"/>
+            </w:pPr>
+            <w:r>
+              <w:t>Makro AUC</w:t>
+            </w:r>
+          </w:p>
+        </w:tc>
+        <w:tc>
+          <w:tcPr>
+            <w:tcW w:w="1120" w:type="dxa"/>
+            <w:hideMark/>
+          </w:tcPr>
+          <w:p>
+            <w:pPr>
+              <w:pStyle w:val="Paragraf"/>
+              <w:ind w:firstLine="0"/>
+              <w:jc w:val="left"/>
+            </w:pPr>
+            <w:r>
+              <w:t>91,49%</w:t>
+            </w:r>
+          </w:p>
+        </w:tc>
+        <w:tc>
+          <w:tcPr>
+            <w:tcW w:w="1120" w:type="dxa"/>
+            <w:hideMark/>
+          </w:tcPr>
+          <w:p>
+            <w:pPr>
+              <w:pStyle w:val="Paragraf"/>
+              <w:ind w:firstLine="0"/>
+              <w:jc w:val="left"/>
+            </w:pPr>
+            <w:r>
+              <w:t>94,89%</w:t>
+            </w:r>
+          </w:p>
+        </w:tc>
+        <w:tc>
+          <w:tcPr>
+            <w:tcW w:w="1120" w:type="dxa"/>
+            <w:hideMark/>
+          </w:tcPr>
+          <w:p>
+            <w:pPr>
+              <w:pStyle w:val="Paragraf"/>
+              <w:ind w:firstLine="0"/>
+              <w:jc w:val="left"/>
+            </w:pPr>
+            <w:r>
+              <w:t>93,14%</w:t>
+            </w:r>
+          </w:p>
+        </w:tc>
+        <w:tc>
+          <w:tcPr>
+            <w:tcW w:w="1120" w:type="dxa"/>
+            <w:hideMark/>
+          </w:tcPr>
+          <w:p>
+            <w:pPr>
+              <w:pStyle w:val="Paragraf"/>
+              <w:ind w:firstLine="0"/>
+              <w:jc w:val="left"/>
+            </w:pPr>
+            <w:r>
+              <w:t>93,17 ± 1,70</w:t>
+            </w:r>
+          </w:p>
+        </w:tc>
+        <w:tc>
+          <w:tcPr>
+            <w:tcW w:w="1120" w:type="dxa"/>
+            <w:hideMark/>
+          </w:tcPr>
+          <w:p>
+            <w:pPr>
+              <w:pStyle w:val="Paragraf"/>
+              <w:ind w:firstLine="0"/>
+              <w:jc w:val="left"/>
+            </w:pPr>
+            <w:r>
+              <w:t>91,46%</w:t>
+            </w:r>
+          </w:p>
+        </w:tc>
+        <w:tc>
+          <w:tcPr>
+            <w:tcW w:w="1120" w:type="dxa"/>
+            <w:hideMark/>
+          </w:tcPr>
+          <w:p>
+            <w:pPr>
+              <w:pStyle w:val="Paragraf"/>
+              <w:ind w:firstLine="0"/>
+              <w:jc w:val="left"/>
+            </w:pPr>
+            <w:r>
+              <w:t>91,87%</w:t>
+            </w:r>
+          </w:p>
+        </w:tc>
+        <w:tc>
+          <w:tcPr>
+            <w:tcW w:w="1120" w:type="dxa"/>
+            <w:hideMark/>
+          </w:tcPr>
+          <w:p>
+            <w:pPr>
+              <w:pStyle w:val="Paragraf"/>
+              <w:ind w:firstLine="0"/>
+              <w:jc w:val="left"/>
+            </w:pPr>
+            <w:r>
+              <w:t>93,21%</w:t>
+            </w:r>
+          </w:p>
+        </w:tc>
+        <w:tc>
+          <w:tcPr>
+            <w:tcW w:w="1120" w:type="dxa"/>
+            <w:noWrap/>
+            <w:hideMark/>
+          </w:tcPr>
+          <w:p>
+            <w:pPr>
+              <w:pStyle w:val="Paragraf"/>
+              <w:ind w:firstLine="0"/>
+              <w:jc w:val="left"/>
+            </w:pPr>
+            <w:r>
+              <w:t>92,18 ± 0,92</w:t>
+            </w:r>
           </w:p>
         </w:tc>
       </w:tr>
@@ -23470,17 +23949,57 @@
         <w:pStyle w:val="Paragraf"/>
         <w:ind w:firstLine="0"/>
         <w:rPr>
+          <w:rFonts w:asciiTheme="minorHAnsi" w:hAnsiTheme="minorHAnsi"/>
+          <w:sz w:val="22"/>
+          <w:lang w:val="en-US"/>
+        </w:rPr>
+      </w:pPr>
+      <w:r>
+        <w:rPr>
           <w:lang w:val="bs-Latn-BA"/>
         </w:rPr>
-      </w:pPr>
+        <w:fldChar w:fldCharType="end"/>
+      </w:r>
+      <w:r>
+        <w:rPr>
+          <w:lang w:val="bs-Latn-BA"/>
+        </w:rPr>
+        <w:fldChar w:fldCharType="begin"/>
+      </w:r>
+      <w:r>
+        <w:rPr>
+          <w:lang w:val="bs-Latn-BA"/>
+        </w:rPr>
+        <w:instrText xml:space="preserve"> LINK Excel.Sheet.12 "C:\\Users\\Administrator\\source\\repos\\omarkurtovic\\ml-dotnet-vs-python\\Word\\rezultati.xlsx" "Sheet1!R1C1:R8C9" \a \f 5 \h </w:instrText>
+      </w:r>
+      <w:r>
+        <w:rPr>
+          <w:lang w:val="bs-Latn-BA"/>
+        </w:rPr>
+        <w:fldChar w:fldCharType="separate"/>
+      </w:r>
     </w:p>
     <w:p>
       <w:pPr>
         <w:pStyle w:val="Paragraf"/>
+        <w:ind w:firstLine="0"/>
         <w:rPr>
           <w:lang w:val="bs-Latn-BA"/>
         </w:rPr>
       </w:pPr>
+      <w:r>
+        <w:rPr>
+          <w:lang w:val="bs-Latn-BA"/>
+        </w:rPr>
+        <w:fldChar w:fldCharType="end"/>
+      </w:r>
+    </w:p>
+    <w:p>
+      <w:pPr>
+        <w:rPr>
+          <w:lang w:val="bs-Latn-BA"/>
+        </w:rPr>
+      </w:pPr>
     </w:p>
     <w:p>
       <w:pPr>
@@ -23489,385 +24008,14 @@
           <w:lang w:val="bs-Latn-BA"/>
         </w:rPr>
       </w:pPr>
-      <w:bookmarkStart w:id="28" w:name="_Toc236486953"/>
+      <w:bookmarkStart w:id="28" w:name="_Toc236486954"/>
       <w:r>
         <w:rPr>
           <w:lang w:val="bs-Latn-BA"/>
         </w:rPr>
-        <w:t>Vrijeme treniranja</w:t>
+        <w:t>Vrijeme analize slike</w:t>
       </w:r>
       <w:bookmarkEnd w:id="28"/>
-    </w:p>
-    <w:p>
-      <w:pPr>
-        <w:pStyle w:val="Paragraf"/>
-        <w:rPr>
-          <w:lang w:val="bs-Latn-BA"/>
-        </w:rPr>
-      </w:pPr>
-    </w:p>
-    <w:p>
-      <w:pPr>
-        <w:rPr>
-          <w:lang w:val="bs-Latn-BA"/>
-        </w:rPr>
-      </w:pPr>
-      <w:r>
-        <w:rPr>
-          <w:lang w:val="bs-Latn-BA"/>
-        </w:rPr>
-        <w:t>Vrijeme treniranja tri C# modela iznosi:</w:t>
-      </w:r>
-    </w:p>
-    <w:p>
-      <w:pPr>
-        <w:pStyle w:val="Paragraf"/>
-        <w:numPr>
-          <w:ilvl w:val="0"/>
-          <w:numId w:val="19"/>
-        </w:numPr>
-        <w:rPr>
-          <w:lang w:val="bs-Latn-BA"/>
-        </w:rPr>
-      </w:pPr>
-      <w:r>
-        <w:rPr>
-          <w:lang w:val="bs-Latn-BA"/>
-        </w:rPr>
-        <w:t>6</w:t>
-      </w:r>
-      <w:r>
-        <w:rPr>
-          <w:lang w:val="bs-Latn-BA"/>
-        </w:rPr>
-        <w:t>,</w:t>
-      </w:r>
-      <w:r>
-        <w:rPr>
-          <w:lang w:val="bs-Latn-BA"/>
-        </w:rPr>
-        <w:t>1</w:t>
-      </w:r>
-      <w:r>
-        <w:rPr>
-          <w:lang w:val="bs-Latn-BA"/>
-        </w:rPr>
-        <w:t>0</w:t>
-      </w:r>
-      <w:r>
-        <w:rPr>
-          <w:lang w:val="bs-Latn-BA"/>
-        </w:rPr>
-        <w:t xml:space="preserve"> minuta</w:t>
-      </w:r>
-    </w:p>
-    <w:p>
-      <w:pPr>
-        <w:pStyle w:val="Paragraf"/>
-        <w:numPr>
-          <w:ilvl w:val="0"/>
-          <w:numId w:val="19"/>
-        </w:numPr>
-        <w:rPr>
-          <w:lang w:val="bs-Latn-BA"/>
-        </w:rPr>
-      </w:pPr>
-      <w:r>
-        <w:rPr>
-          <w:lang w:val="bs-Latn-BA"/>
-        </w:rPr>
-        <w:t>6</w:t>
-      </w:r>
-      <w:r>
-        <w:rPr>
-          <w:lang w:val="bs-Latn-BA"/>
-        </w:rPr>
-        <w:t>,</w:t>
-      </w:r>
-      <w:r>
-        <w:rPr>
-          <w:lang w:val="bs-Latn-BA"/>
-        </w:rPr>
-        <w:t xml:space="preserve">16 minuta </w:t>
-      </w:r>
-    </w:p>
-    <w:p>
-      <w:pPr>
-        <w:pStyle w:val="ListParagraph"/>
-        <w:numPr>
-          <w:ilvl w:val="0"/>
-          <w:numId w:val="19"/>
-        </w:numPr>
-        <w:rPr>
-          <w:lang w:val="bs-Latn-BA"/>
-        </w:rPr>
-      </w:pPr>
-      <w:r>
-        <w:rPr>
-          <w:lang w:val="bs-Latn-BA"/>
-        </w:rPr>
-        <w:t>5,</w:t>
-      </w:r>
-      <w:r>
-        <w:rPr>
-          <w:lang w:val="bs-Latn-BA"/>
-        </w:rPr>
-        <w:t xml:space="preserve">79 minuta. </w:t>
-      </w:r>
-    </w:p>
-    <w:p>
-      <w:pPr>
-        <w:rPr>
-          <w:lang w:val="bs-Latn-BA"/>
-        </w:rPr>
-      </w:pPr>
-      <w:r>
-        <w:t>Prosje</w:t>
-      </w:r>
-      <w:proofErr w:type="spellStart"/>
-      <w:r>
-        <w:rPr>
-          <w:lang w:val="bs-Latn-BA"/>
-        </w:rPr>
-        <w:t>čno</w:t>
-      </w:r>
-      <w:proofErr w:type="spellEnd"/>
-      <w:r>
-        <w:rPr>
-          <w:lang w:val="bs-Latn-BA"/>
-        </w:rPr>
-        <w:t xml:space="preserve"> vrijeme treniranja C# modela iznosi 6</w:t>
-      </w:r>
-      <w:r>
-        <w:rPr>
-          <w:lang w:val="bs-Latn-BA"/>
-        </w:rPr>
-        <w:t>,</w:t>
-      </w:r>
-      <w:r>
-        <w:rPr>
-          <w:lang w:val="bs-Latn-BA"/>
-        </w:rPr>
-        <w:t>02 minuta ili 361 sekund</w:t>
-      </w:r>
-      <w:r>
-        <w:rPr>
-          <w:lang w:val="bs-Latn-BA"/>
-        </w:rPr>
-        <w:t>i</w:t>
-      </w:r>
-      <w:r>
-        <w:rPr>
-          <w:lang w:val="bs-Latn-BA"/>
-        </w:rPr>
-        <w:t>.</w:t>
-      </w:r>
-    </w:p>
-    <w:p>
-      <w:pPr>
-        <w:pStyle w:val="Paragraf"/>
-        <w:rPr>
-          <w:lang w:val="bs-Latn-BA"/>
-        </w:rPr>
-      </w:pPr>
-    </w:p>
-    <w:p>
-      <w:pPr>
-        <w:rPr>
-          <w:lang w:val="bs-Latn-BA"/>
-        </w:rPr>
-      </w:pPr>
-      <w:r>
-        <w:rPr>
-          <w:lang w:val="bs-Latn-BA"/>
-        </w:rPr>
-        <w:t>Vrijeme treniranj</w:t>
-      </w:r>
-      <w:r>
-        <w:rPr>
-          <w:lang w:val="bs-Latn-BA"/>
-        </w:rPr>
-        <w:t>a</w:t>
-      </w:r>
-      <w:r>
-        <w:rPr>
-          <w:lang w:val="bs-Latn-BA"/>
-        </w:rPr>
-        <w:t xml:space="preserve"> tri </w:t>
-      </w:r>
-      <w:proofErr w:type="spellStart"/>
-      <w:r>
-        <w:rPr>
-          <w:lang w:val="bs-Latn-BA"/>
-        </w:rPr>
-        <w:t>Python</w:t>
-      </w:r>
-      <w:proofErr w:type="spellEnd"/>
-      <w:r>
-        <w:rPr>
-          <w:lang w:val="bs-Latn-BA"/>
-        </w:rPr>
-        <w:t xml:space="preserve"> modela iznosi:</w:t>
-      </w:r>
-    </w:p>
-    <w:p>
-      <w:pPr>
-        <w:pStyle w:val="Paragraf"/>
-        <w:numPr>
-          <w:ilvl w:val="0"/>
-          <w:numId w:val="20"/>
-        </w:numPr>
-        <w:rPr>
-          <w:lang w:val="bs-Latn-BA"/>
-        </w:rPr>
-      </w:pPr>
-      <w:r>
-        <w:rPr>
-          <w:lang w:val="bs-Latn-BA"/>
-        </w:rPr>
-        <w:t>5,88</w:t>
-      </w:r>
-      <w:r>
-        <w:rPr>
-          <w:lang w:val="bs-Latn-BA"/>
-        </w:rPr>
-        <w:t xml:space="preserve"> minuta</w:t>
-      </w:r>
-    </w:p>
-    <w:p>
-      <w:pPr>
-        <w:pStyle w:val="Paragraf"/>
-        <w:numPr>
-          <w:ilvl w:val="0"/>
-          <w:numId w:val="20"/>
-        </w:numPr>
-        <w:rPr>
-          <w:lang w:val="bs-Latn-BA"/>
-        </w:rPr>
-      </w:pPr>
-      <w:r>
-        <w:rPr>
-          <w:lang w:val="bs-Latn-BA"/>
-        </w:rPr>
-        <w:t>5</w:t>
-      </w:r>
-      <w:r>
-        <w:rPr>
-          <w:lang w:val="bs-Latn-BA"/>
-        </w:rPr>
-        <w:t>,</w:t>
-      </w:r>
-      <w:r>
-        <w:rPr>
-          <w:lang w:val="bs-Latn-BA"/>
-        </w:rPr>
-        <w:t>91 minuta</w:t>
-      </w:r>
-    </w:p>
-    <w:p>
-      <w:pPr>
-        <w:pStyle w:val="Paragraf"/>
-        <w:numPr>
-          <w:ilvl w:val="0"/>
-          <w:numId w:val="20"/>
-        </w:numPr>
-        <w:rPr>
-          <w:lang w:val="bs-Latn-BA"/>
-        </w:rPr>
-      </w:pPr>
-      <w:r>
-        <w:rPr>
-          <w:lang w:val="bs-Latn-BA"/>
-        </w:rPr>
-        <w:t>6</w:t>
-      </w:r>
-      <w:r>
-        <w:rPr>
-          <w:lang w:val="bs-Latn-BA"/>
-        </w:rPr>
-        <w:t>,</w:t>
-      </w:r>
-      <w:r>
-        <w:rPr>
-          <w:lang w:val="bs-Latn-BA"/>
-        </w:rPr>
-        <w:t>01 minuta</w:t>
-      </w:r>
-    </w:p>
-    <w:p>
-      <w:pPr>
-        <w:rPr>
-          <w:lang w:val="bs-Latn-BA"/>
-        </w:rPr>
-      </w:pPr>
-      <w:r>
-        <w:rPr>
-          <w:lang w:val="bs-Latn-BA"/>
-        </w:rPr>
-        <w:t xml:space="preserve">Prosječno vrijeme treniranja </w:t>
-      </w:r>
-      <w:proofErr w:type="spellStart"/>
-      <w:r>
-        <w:rPr>
-          <w:lang w:val="bs-Latn-BA"/>
-        </w:rPr>
-        <w:t>Python</w:t>
-      </w:r>
-      <w:proofErr w:type="spellEnd"/>
-      <w:r>
-        <w:rPr>
-          <w:lang w:val="bs-Latn-BA"/>
-        </w:rPr>
-        <w:t xml:space="preserve"> modela iznosi </w:t>
-      </w:r>
-      <w:r>
-        <w:rPr>
-          <w:lang w:val="bs-Latn-BA"/>
-        </w:rPr>
-        <w:t>5,93</w:t>
-      </w:r>
-      <w:r>
-        <w:rPr>
-          <w:lang w:val="bs-Latn-BA"/>
-        </w:rPr>
-        <w:t xml:space="preserve"> minuta ili 3</w:t>
-      </w:r>
-      <w:r>
-        <w:rPr>
-          <w:lang w:val="bs-Latn-BA"/>
-        </w:rPr>
-        <w:t>56</w:t>
-      </w:r>
-      <w:r>
-        <w:rPr>
-          <w:lang w:val="bs-Latn-BA"/>
-        </w:rPr>
-        <w:t xml:space="preserve"> sekundi.</w:t>
-      </w:r>
-    </w:p>
-    <w:p>
-      <w:pPr>
-        <w:rPr>
-          <w:lang w:val="bs-Latn-BA"/>
-        </w:rPr>
-      </w:pPr>
-    </w:p>
-    <w:p>
-      <w:pPr>
-        <w:pStyle w:val="Heading2"/>
-        <w:rPr>
-          <w:lang w:val="bs-Latn-BA"/>
-        </w:rPr>
-      </w:pPr>
-      <w:bookmarkStart w:id="29" w:name="_Toc236486954"/>
-      <w:r>
-        <w:rPr>
-          <w:lang w:val="bs-Latn-BA"/>
-        </w:rPr>
-        <w:lastRenderedPageBreak/>
-        <w:t>Vrijeme analize slike</w:t>
-      </w:r>
-      <w:bookmarkEnd w:id="29"/>
     </w:p>
     <w:p>
       <w:pPr>
@@ -23920,1609 +24068,18 @@
     </w:p>
     <w:p>
       <w:pPr>
-        <w:pStyle w:val="Heading2"/>
-      </w:pPr>
-      <w:bookmarkStart w:id="30" w:name="_Toc236486955"/>
-      <w:r>
-        <w:t>Makro odziv</w:t>
-      </w:r>
-      <w:bookmarkEnd w:id="30"/>
-      <w:r>
-        <w:t xml:space="preserve"> </w:t>
-      </w:r>
-    </w:p>
-    <w:p>
-      <w:pPr>
-        <w:pStyle w:val="Paragraf"/>
-      </w:pPr>
-    </w:p>
-    <w:p>
-      <w:r>
-        <w:t>Vrijednost</w:t>
-      </w:r>
-      <w:r>
-        <w:t>i</w:t>
-      </w:r>
-      <w:r>
-        <w:t xml:space="preserve"> makro odziva dobijenih C# modela iznos</w:t>
-      </w:r>
-      <w:r>
-        <w:t>e</w:t>
-      </w:r>
-      <w:r>
-        <w:t>:</w:t>
-      </w:r>
-    </w:p>
-    <w:p>
-      <w:pPr>
-        <w:pStyle w:val="Paragraf"/>
-        <w:numPr>
-          <w:ilvl w:val="0"/>
-          <w:numId w:val="21"/>
-        </w:numPr>
-      </w:pPr>
-      <w:r>
-        <w:t>79</w:t>
-      </w:r>
-      <w:r>
-        <w:t>,</w:t>
-      </w:r>
-      <w:r>
-        <w:t>25%</w:t>
-      </w:r>
-    </w:p>
-    <w:p>
-      <w:pPr>
-        <w:pStyle w:val="Paragraf"/>
-        <w:numPr>
-          <w:ilvl w:val="0"/>
-          <w:numId w:val="21"/>
-        </w:numPr>
-      </w:pPr>
-      <w:r>
-        <w:t>79</w:t>
-      </w:r>
-      <w:r>
-        <w:t>,</w:t>
-      </w:r>
-      <w:r>
-        <w:t>81%</w:t>
-      </w:r>
-    </w:p>
-    <w:p>
-      <w:pPr>
-        <w:pStyle w:val="Paragraf"/>
-        <w:numPr>
-          <w:ilvl w:val="0"/>
-          <w:numId w:val="21"/>
-        </w:numPr>
-      </w:pPr>
-      <w:r>
-        <w:t>78</w:t>
-      </w:r>
-      <w:r>
-        <w:t>,</w:t>
-      </w:r>
-      <w:r>
-        <w:t>61%</w:t>
-      </w:r>
-    </w:p>
-    <w:p>
-      <w:r>
-        <w:t>Prosječna vrijednost makro odziva dobijenih C# modela iznosi 79</w:t>
-      </w:r>
-      <w:r>
-        <w:t>,</w:t>
-      </w:r>
-      <w:r>
-        <w:t>22%.</w:t>
-      </w:r>
-    </w:p>
-    <w:p>
-      <w:pPr>
         <w:pStyle w:val="Paragraf"/>
         <w:ind w:left="340" w:firstLine="0"/>
       </w:pPr>
     </w:p>
     <w:p>
-      <w:r>
-        <w:t>Vrijednost</w:t>
-      </w:r>
-      <w:r>
-        <w:t>i</w:t>
-      </w:r>
-      <w:r>
-        <w:t xml:space="preserve"> makro odziva dobijenih Python modela iznos</w:t>
-      </w:r>
-      <w:r>
-        <w:t>e</w:t>
-      </w:r>
-      <w:r>
-        <w:t>:</w:t>
-      </w:r>
-    </w:p>
-    <w:p>
-      <w:pPr>
-        <w:pStyle w:val="Paragraf"/>
-        <w:numPr>
-          <w:ilvl w:val="0"/>
-          <w:numId w:val="22"/>
-        </w:numPr>
-      </w:pPr>
-      <w:r>
-        <w:t>80.19</w:t>
-      </w:r>
-      <w:r>
-        <w:t>%</w:t>
-      </w:r>
-    </w:p>
-    <w:p>
-      <w:pPr>
-        <w:pStyle w:val="Paragraf"/>
-        <w:numPr>
-          <w:ilvl w:val="0"/>
-          <w:numId w:val="22"/>
-        </w:numPr>
-      </w:pPr>
-      <w:r>
-        <w:t>82</w:t>
-      </w:r>
-      <w:r>
-        <w:t>,</w:t>
-      </w:r>
-      <w:r>
-        <w:t>26%</w:t>
-      </w:r>
-    </w:p>
-    <w:p>
-      <w:pPr>
-        <w:pStyle w:val="Paragraf"/>
-        <w:numPr>
-          <w:ilvl w:val="0"/>
-          <w:numId w:val="22"/>
-        </w:numPr>
-      </w:pPr>
-      <w:r>
-        <w:t>77</w:t>
-      </w:r>
-      <w:r>
-        <w:t>,</w:t>
-      </w:r>
-      <w:r>
-        <w:t>41%</w:t>
-      </w:r>
-    </w:p>
-    <w:p>
-      <w:r>
-        <w:t>Prosječna vrijednost makro odziva dobijenih Python modela iznosi 7</w:t>
-      </w:r>
-      <w:r>
-        <w:t>9,95</w:t>
-      </w:r>
-      <w:r>
-        <w:t>%.</w:t>
-      </w:r>
-    </w:p>
-    <w:p>
-      <w:r>
-        <w:t xml:space="preserve">Na slici 6. prikazan </w:t>
-      </w:r>
-      <w:r>
-        <w:t xml:space="preserve">je </w:t>
-      </w:r>
-      <w:r>
-        <w:t>graf poređenja makro odziva treniranih modela.</w:t>
-      </w:r>
-    </w:p>
-    <w:p>
-      <w:pPr>
-        <w:pStyle w:val="Paragraf"/>
-        <w:keepNext/>
-      </w:pPr>
-      <w:r>
-        <w:rPr>
-          <w:noProof/>
-        </w:rPr>
+      <w:pPr>
+        <w:pStyle w:val="Heading2"/>
+      </w:pPr>
+      <w:r>
         <w:lastRenderedPageBreak/>
-        <w:drawing>
-          <wp:inline distT="0" distB="0" distL="0" distR="0" wp14:anchorId="0D373FC7" wp14:editId="6632F1F4">
-            <wp:extent cx="5943600" cy="2292350"/>
-            <wp:effectExtent l="19050" t="19050" r="0" b="0"/>
-            <wp:docPr id="1" name="Picture 1"/>
-            <wp:cNvGraphicFramePr>
-              <a:graphicFrameLocks xmlns:a="http://schemas.openxmlformats.org/drawingml/2006/main" noChangeAspect="1"/>
-            </wp:cNvGraphicFramePr>
-            <a:graphic xmlns:a="http://schemas.openxmlformats.org/drawingml/2006/main">
-              <a:graphicData uri="http://schemas.openxmlformats.org/drawingml/2006/picture">
-                <pic:pic xmlns:pic="http://schemas.openxmlformats.org/drawingml/2006/picture">
-                  <pic:nvPicPr>
-                    <pic:cNvPr id="1" name=""/>
-                    <pic:cNvPicPr/>
-                  </pic:nvPicPr>
-                  <pic:blipFill>
-                    <a:blip r:embed="rId23"/>
-                    <a:stretch>
-                      <a:fillRect/>
-                    </a:stretch>
-                  </pic:blipFill>
-                  <pic:spPr>
-                    <a:xfrm>
-                      <a:off x="0" y="0"/>
-                      <a:ext cx="5943600" cy="2292350"/>
-                    </a:xfrm>
-                    <a:prstGeom prst="rect">
-                      <a:avLst/>
-                    </a:prstGeom>
-                    <a:ln w="6350">
-                      <a:solidFill>
-                        <a:schemeClr val="tx1"/>
-                      </a:solidFill>
-                    </a:ln>
-                  </pic:spPr>
-                </pic:pic>
-              </a:graphicData>
-            </a:graphic>
-          </wp:inline>
-        </w:drawing>
-      </w:r>
-    </w:p>
-    <w:p>
-      <w:pPr>
-        <w:pStyle w:val="Caption"/>
-        <w:jc w:val="center"/>
-      </w:pPr>
-      <w:bookmarkStart w:id="31" w:name="_Toc234846089"/>
-      <w:bookmarkStart w:id="32" w:name="_Hlk234154236"/>
-      <w:r>
-        <w:t xml:space="preserve">Slika </w:t>
-      </w:r>
-      <w:r>
-        <w:fldChar w:fldCharType="begin"/>
-      </w:r>
-      <w:r>
-        <w:instrText xml:space="preserve"> SEQ Slika \* ARABIC </w:instrText>
-      </w:r>
-      <w:r>
-        <w:fldChar w:fldCharType="separate"/>
-      </w:r>
-      <w:r>
-        <w:rPr>
-          <w:noProof/>
-        </w:rPr>
-        <w:t>6</w:t>
-      </w:r>
-      <w:r>
-        <w:fldChar w:fldCharType="end"/>
-      </w:r>
-      <w:r>
-        <w:t xml:space="preserve">. </w:t>
-      </w:r>
-      <w:r>
-        <w:t>Pore</w:t>
-      </w:r>
-      <w:proofErr w:type="spellStart"/>
-      <w:r>
-        <w:rPr>
-          <w:lang w:val="bs-Latn-BA"/>
-        </w:rPr>
-        <w:t>đenj</w:t>
-      </w:r>
-      <w:r>
-        <w:rPr>
-          <w:lang w:val="bs-Latn-BA"/>
-        </w:rPr>
-        <w:t>e</w:t>
-      </w:r>
-      <w:proofErr w:type="spellEnd"/>
-      <w:r>
-        <w:t xml:space="preserve"> makro odziva modela</w:t>
-      </w:r>
-      <w:bookmarkEnd w:id="31"/>
-    </w:p>
-    <w:bookmarkEnd w:id="32"/>
-    <w:p/>
-    <w:p/>
-    <w:p/>
-    <w:p>
-      <w:pPr>
-        <w:pStyle w:val="Heading2"/>
-      </w:pPr>
-      <w:bookmarkStart w:id="33" w:name="_Toc236486956"/>
-      <w:r>
-        <w:t>Makro F1 mjera</w:t>
-      </w:r>
-      <w:bookmarkEnd w:id="33"/>
-    </w:p>
-    <w:p/>
-    <w:p>
-      <w:r>
-        <w:t>Vrijednost</w:t>
-      </w:r>
-      <w:r>
-        <w:t>i</w:t>
-      </w:r>
-      <w:r>
-        <w:t xml:space="preserve"> makro </w:t>
-      </w:r>
-      <w:r>
-        <w:t>F1 mjera</w:t>
-      </w:r>
-      <w:r>
-        <w:t xml:space="preserve"> dobijenih C# modela iznos</w:t>
-      </w:r>
-      <w:r>
-        <w:t>e</w:t>
-      </w:r>
-      <w:r>
-        <w:t>:</w:t>
-      </w:r>
-    </w:p>
-    <w:p>
-      <w:pPr>
-        <w:pStyle w:val="Paragraf"/>
-        <w:numPr>
-          <w:ilvl w:val="0"/>
-          <w:numId w:val="24"/>
-        </w:numPr>
-      </w:pPr>
-      <w:r>
-        <w:t>79</w:t>
-      </w:r>
-      <w:r>
-        <w:t>,</w:t>
-      </w:r>
-      <w:r>
-        <w:t>95</w:t>
-      </w:r>
-      <w:r>
-        <w:t>%</w:t>
-      </w:r>
-    </w:p>
-    <w:p>
-      <w:pPr>
-        <w:pStyle w:val="Paragraf"/>
-        <w:numPr>
-          <w:ilvl w:val="0"/>
-          <w:numId w:val="24"/>
-        </w:numPr>
-      </w:pPr>
-      <w:r>
-        <w:t>80</w:t>
-      </w:r>
-      <w:r>
-        <w:t>,</w:t>
-      </w:r>
-      <w:r>
-        <w:t>54</w:t>
-      </w:r>
-      <w:r>
-        <w:t>%</w:t>
-      </w:r>
-    </w:p>
-    <w:p>
-      <w:pPr>
-        <w:pStyle w:val="Paragraf"/>
-        <w:numPr>
-          <w:ilvl w:val="0"/>
-          <w:numId w:val="24"/>
-        </w:numPr>
-      </w:pPr>
-      <w:r>
-        <w:t>7</w:t>
-      </w:r>
-      <w:r>
-        <w:t>8</w:t>
-      </w:r>
-      <w:r>
-        <w:t>,</w:t>
-      </w:r>
-      <w:r>
-        <w:t>95</w:t>
-      </w:r>
-      <w:r>
-        <w:t>%</w:t>
-      </w:r>
-    </w:p>
-    <w:p>
-      <w:r>
-        <w:t xml:space="preserve">Prosječna vrijednost </w:t>
-      </w:r>
-      <w:r>
-        <w:t>F1</w:t>
-      </w:r>
-      <w:r>
-        <w:t xml:space="preserve"> </w:t>
-      </w:r>
-      <w:r>
-        <w:t>mjera</w:t>
-      </w:r>
-      <w:r>
-        <w:t xml:space="preserve"> dobijenih C# modela iznosi 79</w:t>
-      </w:r>
-      <w:r>
-        <w:t>,</w:t>
-      </w:r>
-      <w:r>
-        <w:t>81</w:t>
-      </w:r>
-      <w:r>
-        <w:t>%.</w:t>
-      </w:r>
-    </w:p>
-    <w:p>
-      <w:pPr>
-        <w:pStyle w:val="Paragraf"/>
-        <w:ind w:left="340" w:firstLine="0"/>
-      </w:pPr>
-    </w:p>
-    <w:p>
-      <w:r>
-        <w:t>Vrijednost</w:t>
-      </w:r>
-      <w:r>
-        <w:t>i</w:t>
-      </w:r>
-      <w:r>
-        <w:t xml:space="preserve"> makro </w:t>
-      </w:r>
-      <w:r>
-        <w:t xml:space="preserve">F1 mjera </w:t>
-      </w:r>
-      <w:r>
-        <w:t>dobijenih Python modela iznos</w:t>
-      </w:r>
-      <w:r>
-        <w:t>e</w:t>
-      </w:r>
-      <w:r>
-        <w:t>:</w:t>
-      </w:r>
-    </w:p>
-    <w:p>
-      <w:pPr>
-        <w:pStyle w:val="Paragraf"/>
-        <w:numPr>
-          <w:ilvl w:val="0"/>
-          <w:numId w:val="23"/>
-        </w:numPr>
-      </w:pPr>
-      <w:r>
-        <w:t>7</w:t>
-      </w:r>
-      <w:r>
-        <w:t>8</w:t>
-      </w:r>
-      <w:r>
-        <w:t>,</w:t>
-      </w:r>
-      <w:r>
-        <w:t>55</w:t>
-      </w:r>
-      <w:r>
-        <w:t>%</w:t>
-      </w:r>
-    </w:p>
-    <w:p>
-      <w:pPr>
-        <w:pStyle w:val="Paragraf"/>
-        <w:numPr>
-          <w:ilvl w:val="0"/>
-          <w:numId w:val="23"/>
-        </w:numPr>
-      </w:pPr>
-      <w:r>
-        <w:t>80</w:t>
-      </w:r>
-      <w:r>
-        <w:t>,</w:t>
-      </w:r>
-      <w:r>
-        <w:t>41</w:t>
-      </w:r>
-      <w:r>
-        <w:t>%</w:t>
-      </w:r>
-    </w:p>
-    <w:p>
-      <w:pPr>
-        <w:pStyle w:val="Paragraf"/>
-        <w:numPr>
-          <w:ilvl w:val="0"/>
-          <w:numId w:val="23"/>
-        </w:numPr>
-      </w:pPr>
-      <w:r>
-        <w:t>77</w:t>
-      </w:r>
-      <w:r>
-        <w:t>,</w:t>
-      </w:r>
-      <w:r>
-        <w:t>66</w:t>
-      </w:r>
-      <w:r>
-        <w:t>%</w:t>
-      </w:r>
-    </w:p>
-    <w:p>
-      <w:r>
-        <w:t xml:space="preserve">Prosječna </w:t>
-      </w:r>
-      <w:r>
-        <w:t xml:space="preserve">vrijednost makro F1 mjera </w:t>
-      </w:r>
-      <w:r>
-        <w:t>dobijenih Python modela iznosi 78</w:t>
-      </w:r>
-      <w:r>
-        <w:t>,</w:t>
-      </w:r>
-      <w:r>
-        <w:t>87</w:t>
-      </w:r>
-      <w:r>
-        <w:t>%.</w:t>
-      </w:r>
-    </w:p>
-    <w:p>
-      <w:r>
-        <w:t xml:space="preserve">Na slici 7. prikazan </w:t>
-      </w:r>
-      <w:r>
-        <w:t xml:space="preserve">je </w:t>
-      </w:r>
-      <w:r>
-        <w:t>graf poređenja makro F1 mjera treniranih modela.</w:t>
-      </w:r>
-    </w:p>
-    <w:p>
-      <w:pPr>
-        <w:pStyle w:val="Paragraf"/>
-        <w:keepNext/>
-      </w:pPr>
-      <w:r>
-        <w:rPr>
-          <w:noProof/>
-        </w:rPr>
-        <w:lastRenderedPageBreak/>
-        <w:drawing>
-          <wp:inline distT="0" distB="0" distL="0" distR="0" wp14:anchorId="5347BBAF" wp14:editId="0E4D1B6F">
-            <wp:extent cx="5943600" cy="2265680"/>
-            <wp:effectExtent l="19050" t="19050" r="0" b="1270"/>
-            <wp:docPr id="7" name="Picture 7"/>
-            <wp:cNvGraphicFramePr>
-              <a:graphicFrameLocks xmlns:a="http://schemas.openxmlformats.org/drawingml/2006/main" noChangeAspect="1"/>
-            </wp:cNvGraphicFramePr>
-            <a:graphic xmlns:a="http://schemas.openxmlformats.org/drawingml/2006/main">
-              <a:graphicData uri="http://schemas.openxmlformats.org/drawingml/2006/picture">
-                <pic:pic xmlns:pic="http://schemas.openxmlformats.org/drawingml/2006/picture">
-                  <pic:nvPicPr>
-                    <pic:cNvPr id="1" name=""/>
-                    <pic:cNvPicPr/>
-                  </pic:nvPicPr>
-                  <pic:blipFill>
-                    <a:blip r:embed="rId24"/>
-                    <a:stretch>
-                      <a:fillRect/>
-                    </a:stretch>
-                  </pic:blipFill>
-                  <pic:spPr>
-                    <a:xfrm>
-                      <a:off x="0" y="0"/>
-                      <a:ext cx="5943600" cy="2265680"/>
-                    </a:xfrm>
-                    <a:prstGeom prst="rect">
-                      <a:avLst/>
-                    </a:prstGeom>
-                    <a:ln w="6350">
-                      <a:solidFill>
-                        <a:schemeClr val="tx1"/>
-                      </a:solidFill>
-                    </a:ln>
-                  </pic:spPr>
-                </pic:pic>
-              </a:graphicData>
-            </a:graphic>
-          </wp:inline>
-        </w:drawing>
-      </w:r>
-    </w:p>
-    <w:p>
-      <w:pPr>
-        <w:pStyle w:val="Caption"/>
-        <w:jc w:val="center"/>
-      </w:pPr>
-      <w:bookmarkStart w:id="34" w:name="_Toc234846090"/>
-      <w:r>
-        <w:t xml:space="preserve">Slika </w:t>
-      </w:r>
-      <w:r>
-        <w:fldChar w:fldCharType="begin"/>
-      </w:r>
-      <w:r>
-        <w:instrText xml:space="preserve"> SEQ Slika \* ARABIC </w:instrText>
-      </w:r>
-      <w:r>
-        <w:fldChar w:fldCharType="separate"/>
-      </w:r>
-      <w:r>
-        <w:rPr>
-          <w:noProof/>
-        </w:rPr>
-        <w:t>7</w:t>
-      </w:r>
-      <w:r>
-        <w:fldChar w:fldCharType="end"/>
-      </w:r>
-      <w:r>
-        <w:t xml:space="preserve">. </w:t>
-      </w:r>
-      <w:r>
-        <w:t>Poređenje</w:t>
-      </w:r>
-      <w:r>
-        <w:t xml:space="preserve"> makro </w:t>
-      </w:r>
-      <w:r>
-        <w:t>F1 mjera</w:t>
-      </w:r>
-      <w:r>
-        <w:t xml:space="preserve"> modela</w:t>
-      </w:r>
-      <w:bookmarkEnd w:id="34"/>
-    </w:p>
-    <w:p>
-      <w:pPr>
-        <w:pStyle w:val="Paragraf"/>
-      </w:pPr>
-    </w:p>
-    <w:p>
-      <w:pPr>
-        <w:pStyle w:val="Paragraf"/>
-      </w:pPr>
-    </w:p>
-    <w:p>
-      <w:pPr>
-        <w:pStyle w:val="Paragraf"/>
-      </w:pPr>
-    </w:p>
-    <w:p>
-      <w:pPr>
-        <w:pStyle w:val="Paragraf"/>
-      </w:pPr>
-    </w:p>
-    <w:p>
-      <w:pPr>
-        <w:pStyle w:val="Heading2"/>
-      </w:pPr>
-      <w:bookmarkStart w:id="35" w:name="_Toc236486957"/>
-      <w:r>
-        <w:t>Odziv maligne klase</w:t>
-      </w:r>
-      <w:bookmarkEnd w:id="35"/>
-    </w:p>
-    <w:p>
-      <w:pPr>
-        <w:pStyle w:val="Paragraf"/>
-      </w:pPr>
-    </w:p>
-    <w:p>
-      <w:r>
-        <w:t>Vrijednost</w:t>
-      </w:r>
-      <w:r>
-        <w:t>i</w:t>
-      </w:r>
-      <w:r>
-        <w:t xml:space="preserve"> odziva maligne klase dobijenih C# modela iznos</w:t>
-      </w:r>
-      <w:r>
-        <w:t>e:</w:t>
-      </w:r>
-    </w:p>
-    <w:p>
-      <w:pPr>
-        <w:pStyle w:val="Paragraf"/>
-        <w:numPr>
-          <w:ilvl w:val="0"/>
-          <w:numId w:val="29"/>
-        </w:numPr>
-      </w:pPr>
-      <w:r>
-        <w:t>98</w:t>
-      </w:r>
-      <w:r>
-        <w:t>,</w:t>
-      </w:r>
-      <w:r>
-        <w:t>58%</w:t>
-      </w:r>
-    </w:p>
-    <w:p>
-      <w:pPr>
-        <w:pStyle w:val="Paragraf"/>
-        <w:numPr>
-          <w:ilvl w:val="0"/>
-          <w:numId w:val="29"/>
-        </w:numPr>
-      </w:pPr>
-      <w:r>
-        <w:t>99</w:t>
-      </w:r>
-      <w:r>
-        <w:t>,</w:t>
-      </w:r>
-      <w:r>
-        <w:t>29%</w:t>
-      </w:r>
-    </w:p>
-    <w:p>
-      <w:pPr>
-        <w:pStyle w:val="Paragraf"/>
-        <w:numPr>
-          <w:ilvl w:val="0"/>
-          <w:numId w:val="29"/>
-        </w:numPr>
-      </w:pPr>
-      <w:r>
-        <w:t>98</w:t>
-      </w:r>
-      <w:r>
-        <w:t>,</w:t>
-      </w:r>
-      <w:r>
-        <w:t>58%</w:t>
-      </w:r>
-    </w:p>
-    <w:p>
-      <w:r>
-        <w:t>Prosječna vrijednost odziva maligne klase dobijenih C# modela iznosi 98</w:t>
-      </w:r>
-      <w:r>
-        <w:t>,</w:t>
-      </w:r>
-      <w:r>
-        <w:t>82</w:t>
-      </w:r>
-      <w:r>
-        <w:t>%.</w:t>
-      </w:r>
-    </w:p>
-    <w:p>
-      <w:pPr>
-        <w:pStyle w:val="Paragraf"/>
-        <w:ind w:left="340" w:firstLine="0"/>
-      </w:pPr>
-    </w:p>
-    <w:p>
-      <w:r>
-        <w:t>Vrijednost</w:t>
-      </w:r>
-      <w:r>
-        <w:t>i odziva maligne klase</w:t>
-      </w:r>
-      <w:r>
-        <w:t xml:space="preserve"> dobijenih Python modela iznos</w:t>
-      </w:r>
-      <w:r>
-        <w:t>e</w:t>
-      </w:r>
-      <w:r>
-        <w:t>:</w:t>
-      </w:r>
-    </w:p>
-    <w:p>
-      <w:pPr>
-        <w:pStyle w:val="Paragraf"/>
-        <w:numPr>
-          <w:ilvl w:val="0"/>
-          <w:numId w:val="28"/>
-        </w:numPr>
-      </w:pPr>
-      <w:r>
-        <w:t>9</w:t>
-      </w:r>
-      <w:r>
-        <w:t>8</w:t>
-      </w:r>
-      <w:r>
-        <w:t>,</w:t>
-      </w:r>
-      <w:r>
-        <w:t>58</w:t>
-      </w:r>
-      <w:r>
-        <w:t>%</w:t>
-      </w:r>
-      <w:r>
-        <w:tab/>
-      </w:r>
-    </w:p>
-    <w:p>
-      <w:pPr>
-        <w:pStyle w:val="Paragraf"/>
-        <w:numPr>
-          <w:ilvl w:val="0"/>
-          <w:numId w:val="28"/>
-        </w:numPr>
-      </w:pPr>
-      <w:r>
-        <w:t>97</w:t>
-      </w:r>
-      <w:r>
-        <w:t>,</w:t>
-      </w:r>
-      <w:r>
-        <w:t>16%</w:t>
-      </w:r>
-    </w:p>
-    <w:p>
-      <w:pPr>
-        <w:pStyle w:val="Paragraf"/>
-        <w:numPr>
-          <w:ilvl w:val="0"/>
-          <w:numId w:val="28"/>
-        </w:numPr>
-      </w:pPr>
-      <w:r>
-        <w:t>97</w:t>
-      </w:r>
-      <w:r>
-        <w:t>,</w:t>
-      </w:r>
-      <w:r>
-        <w:t>87%</w:t>
-      </w:r>
-    </w:p>
-    <w:p>
-      <w:r>
-        <w:t>Prosječna vrijednost</w:t>
-      </w:r>
-      <w:r>
-        <w:t xml:space="preserve"> odziva maligne klase </w:t>
-      </w:r>
-      <w:r>
-        <w:t>dobijenih Python modela iznosi 97</w:t>
-      </w:r>
-      <w:r>
-        <w:t>,</w:t>
-      </w:r>
-      <w:r>
-        <w:t>87</w:t>
-      </w:r>
-      <w:r>
-        <w:t>%.</w:t>
-      </w:r>
-    </w:p>
-    <w:p>
-      <w:r>
-        <w:t xml:space="preserve">Na slici 8. prikazan </w:t>
-      </w:r>
-      <w:r>
-        <w:t xml:space="preserve">je </w:t>
-      </w:r>
-      <w:r>
-        <w:t>graf poređenja odziva malignih klasa treniranih modela.</w:t>
-      </w:r>
-    </w:p>
-    <w:p>
-      <w:pPr>
-        <w:pStyle w:val="Paragraf"/>
-        <w:keepNext/>
-      </w:pPr>
-      <w:r>
-        <w:rPr>
-          <w:noProof/>
-        </w:rPr>
-        <w:lastRenderedPageBreak/>
-        <w:drawing>
-          <wp:inline distT="0" distB="0" distL="0" distR="0" wp14:anchorId="1E3E51F4" wp14:editId="6F09D760">
-            <wp:extent cx="5943600" cy="2330450"/>
-            <wp:effectExtent l="19050" t="19050" r="0" b="0"/>
-            <wp:docPr id="11" name="Picture 11"/>
-            <wp:cNvGraphicFramePr>
-              <a:graphicFrameLocks xmlns:a="http://schemas.openxmlformats.org/drawingml/2006/main" noChangeAspect="1"/>
-            </wp:cNvGraphicFramePr>
-            <a:graphic xmlns:a="http://schemas.openxmlformats.org/drawingml/2006/main">
-              <a:graphicData uri="http://schemas.openxmlformats.org/drawingml/2006/picture">
-                <pic:pic xmlns:pic="http://schemas.openxmlformats.org/drawingml/2006/picture">
-                  <pic:nvPicPr>
-                    <pic:cNvPr id="1" name=""/>
-                    <pic:cNvPicPr/>
-                  </pic:nvPicPr>
-                  <pic:blipFill>
-                    <a:blip r:embed="rId25"/>
-                    <a:stretch>
-                      <a:fillRect/>
-                    </a:stretch>
-                  </pic:blipFill>
-                  <pic:spPr>
-                    <a:xfrm>
-                      <a:off x="0" y="0"/>
-                      <a:ext cx="5943600" cy="2330450"/>
-                    </a:xfrm>
-                    <a:prstGeom prst="rect">
-                      <a:avLst/>
-                    </a:prstGeom>
-                    <a:ln w="6350">
-                      <a:solidFill>
-                        <a:schemeClr val="tx1"/>
-                      </a:solidFill>
-                    </a:ln>
-                  </pic:spPr>
-                </pic:pic>
-              </a:graphicData>
-            </a:graphic>
-          </wp:inline>
-        </w:drawing>
-      </w:r>
-    </w:p>
-    <w:p>
-      <w:pPr>
-        <w:pStyle w:val="Caption"/>
-        <w:jc w:val="center"/>
-      </w:pPr>
-      <w:bookmarkStart w:id="36" w:name="_Toc234846091"/>
-      <w:r>
-        <w:t xml:space="preserve">Slika </w:t>
-      </w:r>
-      <w:r>
-        <w:fldChar w:fldCharType="begin"/>
-      </w:r>
-      <w:r>
-        <w:instrText xml:space="preserve"> SEQ Slika \* ARABIC </w:instrText>
-      </w:r>
-      <w:r>
-        <w:fldChar w:fldCharType="separate"/>
-      </w:r>
-      <w:r>
-        <w:rPr>
-          <w:noProof/>
-        </w:rPr>
-        <w:t>8</w:t>
-      </w:r>
-      <w:r>
-        <w:fldChar w:fldCharType="end"/>
-      </w:r>
-      <w:r>
-        <w:t xml:space="preserve">. </w:t>
-      </w:r>
-      <w:r>
-        <w:t>Poređenje</w:t>
-      </w:r>
-      <w:r>
-        <w:t xml:space="preserve"> </w:t>
-      </w:r>
-      <w:r>
-        <w:t>odziva malignih klasa</w:t>
-      </w:r>
-      <w:r>
-        <w:t xml:space="preserve"> modela</w:t>
-      </w:r>
-      <w:bookmarkEnd w:id="36"/>
-    </w:p>
-    <w:p>
-      <w:pPr>
-        <w:pStyle w:val="Paragraf"/>
-      </w:pPr>
-    </w:p>
-    <w:p>
-      <w:pPr>
-        <w:pStyle w:val="Paragraf"/>
-      </w:pPr>
-    </w:p>
-    <w:p>
-      <w:pPr>
-        <w:pStyle w:val="Paragraf"/>
-      </w:pPr>
-    </w:p>
-    <w:p>
-      <w:pPr>
-        <w:pStyle w:val="Paragraf"/>
-      </w:pPr>
-    </w:p>
-    <w:p>
-      <w:pPr>
-        <w:pStyle w:val="Heading2"/>
-      </w:pPr>
-      <w:bookmarkStart w:id="37" w:name="_Toc236486958"/>
-      <w:r>
-        <w:t>Tačnost</w:t>
-      </w:r>
-      <w:bookmarkEnd w:id="37"/>
-    </w:p>
-    <w:p>
-      <w:pPr>
-        <w:pStyle w:val="Paragraf"/>
-      </w:pPr>
-    </w:p>
-    <w:p>
-      <w:r>
-        <w:t>Vrijednost</w:t>
-      </w:r>
-      <w:r>
-        <w:t>i</w:t>
-      </w:r>
-      <w:r>
-        <w:t xml:space="preserve"> </w:t>
-      </w:r>
-      <w:r>
-        <w:t>tačnosti</w:t>
-      </w:r>
-      <w:r>
-        <w:t xml:space="preserve"> dobijenih C# modela iznos</w:t>
-      </w:r>
-      <w:r>
-        <w:t>e</w:t>
-      </w:r>
-      <w:r>
-        <w:t>:</w:t>
-      </w:r>
-    </w:p>
-    <w:p>
-      <w:pPr>
-        <w:pStyle w:val="Paragraf"/>
-        <w:numPr>
-          <w:ilvl w:val="0"/>
-          <w:numId w:val="26"/>
-        </w:numPr>
-      </w:pPr>
-      <w:r>
-        <w:t>82</w:t>
-      </w:r>
-      <w:r>
-        <w:t>,</w:t>
-      </w:r>
-      <w:r>
-        <w:t>55</w:t>
-      </w:r>
-      <w:r>
-        <w:t>%</w:t>
-      </w:r>
-    </w:p>
-    <w:p>
-      <w:pPr>
-        <w:pStyle w:val="Paragraf"/>
-        <w:numPr>
-          <w:ilvl w:val="0"/>
-          <w:numId w:val="26"/>
-        </w:numPr>
-      </w:pPr>
-      <w:r>
-        <w:t>83</w:t>
-      </w:r>
-      <w:r>
-        <w:t>,</w:t>
-      </w:r>
-      <w:r>
-        <w:t>27</w:t>
-      </w:r>
-      <w:r>
-        <w:t>%</w:t>
-      </w:r>
-    </w:p>
-    <w:p>
-      <w:pPr>
-        <w:pStyle w:val="Paragraf"/>
-        <w:numPr>
-          <w:ilvl w:val="0"/>
-          <w:numId w:val="26"/>
-        </w:numPr>
-      </w:pPr>
-      <w:r>
-        <w:t>81</w:t>
-      </w:r>
-      <w:r>
-        <w:t>,</w:t>
-      </w:r>
-      <w:r>
-        <w:t>82</w:t>
-      </w:r>
-      <w:r>
-        <w:t>%</w:t>
-      </w:r>
-    </w:p>
-    <w:p>
-      <w:r>
-        <w:t xml:space="preserve">Prosječna vrijednost </w:t>
-      </w:r>
-      <w:r>
-        <w:t xml:space="preserve">tačnosti </w:t>
-      </w:r>
-      <w:r>
-        <w:t xml:space="preserve">dobijenih C# modela iznosi </w:t>
-      </w:r>
-      <w:r>
-        <w:t>82</w:t>
-      </w:r>
-      <w:r>
-        <w:t>,</w:t>
-      </w:r>
-      <w:r>
-        <w:t>55</w:t>
-      </w:r>
-      <w:r>
-        <w:t>%.</w:t>
-      </w:r>
-    </w:p>
-    <w:p>
-      <w:pPr>
-        <w:pStyle w:val="Paragraf"/>
-        <w:ind w:left="340" w:firstLine="0"/>
-      </w:pPr>
-    </w:p>
-    <w:p>
-      <w:r>
-        <w:t>Vrijednost</w:t>
-      </w:r>
-      <w:r>
-        <w:t>i</w:t>
-      </w:r>
-      <w:r>
-        <w:t xml:space="preserve"> tačnosti</w:t>
-      </w:r>
-      <w:r>
-        <w:t xml:space="preserve"> dobijenih Python modela iznos</w:t>
-      </w:r>
-      <w:r>
-        <w:t>e</w:t>
-      </w:r>
-      <w:r>
-        <w:t>:</w:t>
-      </w:r>
-    </w:p>
-    <w:p>
-      <w:pPr>
-        <w:pStyle w:val="Paragraf"/>
-        <w:numPr>
-          <w:ilvl w:val="0"/>
-          <w:numId w:val="25"/>
-        </w:numPr>
-      </w:pPr>
-      <w:r>
-        <w:t>8</w:t>
-      </w:r>
-      <w:r>
-        <w:t>1</w:t>
-      </w:r>
-      <w:r>
-        <w:t>,</w:t>
-      </w:r>
-      <w:r>
-        <w:t>82</w:t>
-      </w:r>
-      <w:r>
-        <w:t>%</w:t>
-      </w:r>
-    </w:p>
-    <w:p>
-      <w:pPr>
-        <w:pStyle w:val="Paragraf"/>
-        <w:numPr>
-          <w:ilvl w:val="0"/>
-          <w:numId w:val="25"/>
-        </w:numPr>
-      </w:pPr>
-      <w:r>
-        <w:t>82</w:t>
-      </w:r>
-      <w:r>
-        <w:t>,</w:t>
-      </w:r>
-      <w:r>
-        <w:t>18</w:t>
-      </w:r>
-      <w:r>
-        <w:t>%</w:t>
-      </w:r>
-    </w:p>
-    <w:p>
-      <w:pPr>
-        <w:pStyle w:val="Paragraf"/>
-        <w:numPr>
-          <w:ilvl w:val="0"/>
-          <w:numId w:val="25"/>
-        </w:numPr>
-      </w:pPr>
-      <w:r>
-        <w:t>80</w:t>
-      </w:r>
-      <w:r>
-        <w:t>,</w:t>
-      </w:r>
-      <w:r>
-        <w:t>36</w:t>
-      </w:r>
-      <w:r>
-        <w:t>%</w:t>
-      </w:r>
-    </w:p>
-    <w:p>
-      <w:r>
-        <w:t xml:space="preserve">Prosječna vrijednost </w:t>
-      </w:r>
-      <w:r>
-        <w:t>ta</w:t>
-      </w:r>
-      <w:r>
-        <w:rPr>
-          <w:lang w:val="bs-Latn-BA"/>
-        </w:rPr>
-        <w:t>č</w:t>
-      </w:r>
-      <w:r>
-        <w:t>no</w:t>
-      </w:r>
-      <w:r>
-        <w:t>sti</w:t>
-      </w:r>
-      <w:r>
-        <w:t xml:space="preserve"> dobijenih Python modela iznosi </w:t>
-      </w:r>
-      <w:r>
-        <w:t>8</w:t>
-      </w:r>
-      <w:r>
-        <w:t>1</w:t>
-      </w:r>
-      <w:r>
-        <w:t>,</w:t>
-      </w:r>
-      <w:r>
-        <w:t>45</w:t>
-      </w:r>
-      <w:r>
-        <w:t>%.</w:t>
-      </w:r>
-    </w:p>
-    <w:p>
-      <w:r>
-        <w:t xml:space="preserve">Na slici </w:t>
-      </w:r>
-      <w:r>
-        <w:t>9</w:t>
-      </w:r>
-      <w:r>
-        <w:t xml:space="preserve">. je prikazan graf poređenja </w:t>
-      </w:r>
-      <w:r>
-        <w:t>ta</w:t>
-      </w:r>
-      <w:proofErr w:type="spellStart"/>
-      <w:r>
-        <w:rPr>
-          <w:lang w:val="bs-Latn-BA"/>
-        </w:rPr>
-        <w:t>čnosti</w:t>
-      </w:r>
-      <w:proofErr w:type="spellEnd"/>
-      <w:r>
-        <w:t xml:space="preserve"> </w:t>
-      </w:r>
-      <w:r>
-        <w:t>treniranih modela.</w:t>
-      </w:r>
-    </w:p>
-    <w:p>
-      <w:pPr>
-        <w:pStyle w:val="Paragraf"/>
-        <w:keepNext/>
-      </w:pPr>
-      <w:r>
-        <w:rPr>
-          <w:noProof/>
-        </w:rPr>
-        <w:lastRenderedPageBreak/>
-        <w:drawing>
-          <wp:inline distT="0" distB="0" distL="0" distR="0" wp14:anchorId="525B71C9" wp14:editId="7BDD91E6">
-            <wp:extent cx="5943600" cy="2330450"/>
-            <wp:effectExtent l="19050" t="19050" r="0" b="0"/>
-            <wp:docPr id="13" name="Picture 13"/>
-            <wp:cNvGraphicFramePr>
-              <a:graphicFrameLocks xmlns:a="http://schemas.openxmlformats.org/drawingml/2006/main" noChangeAspect="1"/>
-            </wp:cNvGraphicFramePr>
-            <a:graphic xmlns:a="http://schemas.openxmlformats.org/drawingml/2006/main">
-              <a:graphicData uri="http://schemas.openxmlformats.org/drawingml/2006/picture">
-                <pic:pic xmlns:pic="http://schemas.openxmlformats.org/drawingml/2006/picture">
-                  <pic:nvPicPr>
-                    <pic:cNvPr id="1" name=""/>
-                    <pic:cNvPicPr/>
-                  </pic:nvPicPr>
-                  <pic:blipFill>
-                    <a:blip r:embed="rId26"/>
-                    <a:stretch>
-                      <a:fillRect/>
-                    </a:stretch>
-                  </pic:blipFill>
-                  <pic:spPr>
-                    <a:xfrm>
-                      <a:off x="0" y="0"/>
-                      <a:ext cx="5943600" cy="2330450"/>
-                    </a:xfrm>
-                    <a:prstGeom prst="rect">
-                      <a:avLst/>
-                    </a:prstGeom>
-                    <a:ln w="6350">
-                      <a:solidFill>
-                        <a:schemeClr val="tx1"/>
-                      </a:solidFill>
-                    </a:ln>
-                  </pic:spPr>
-                </pic:pic>
-              </a:graphicData>
-            </a:graphic>
-          </wp:inline>
-        </w:drawing>
-      </w:r>
-    </w:p>
-    <w:p>
-      <w:pPr>
-        <w:pStyle w:val="Caption"/>
-        <w:jc w:val="center"/>
-      </w:pPr>
-      <w:bookmarkStart w:id="38" w:name="_Toc234846092"/>
-      <w:r>
-        <w:t xml:space="preserve">Slika </w:t>
-      </w:r>
-      <w:r>
-        <w:fldChar w:fldCharType="begin"/>
-      </w:r>
-      <w:r>
-        <w:instrText xml:space="preserve"> SEQ Slika \* ARABIC </w:instrText>
-      </w:r>
-      <w:r>
-        <w:fldChar w:fldCharType="separate"/>
-      </w:r>
-      <w:r>
-        <w:rPr>
-          <w:noProof/>
-        </w:rPr>
-        <w:t>9</w:t>
-      </w:r>
-      <w:r>
-        <w:fldChar w:fldCharType="end"/>
-      </w:r>
-      <w:r>
-        <w:t xml:space="preserve">. </w:t>
-      </w:r>
-      <w:r>
-        <w:t>Poređenje</w:t>
-      </w:r>
-      <w:r>
-        <w:t xml:space="preserve"> </w:t>
-      </w:r>
-      <w:r>
-        <w:t xml:space="preserve">tačnosti </w:t>
-      </w:r>
-      <w:r>
-        <w:t>modela</w:t>
-      </w:r>
-      <w:bookmarkEnd w:id="38"/>
-    </w:p>
-    <w:p>
-      <w:pPr>
-        <w:pStyle w:val="Paragraf"/>
-      </w:pPr>
-    </w:p>
-    <w:p>
-      <w:pPr>
-        <w:pStyle w:val="Paragraf"/>
-      </w:pPr>
-    </w:p>
-    <w:p>
-      <w:pPr>
-        <w:pStyle w:val="Paragraf"/>
-      </w:pPr>
-    </w:p>
-    <w:p>
-      <w:pPr>
-        <w:pStyle w:val="Paragraf"/>
-      </w:pPr>
-    </w:p>
-    <w:p>
-      <w:r>
-        <w:t xml:space="preserve">Na slici 10. je prikazan grafik funkcije troška na validacijskom skupu podataka kroz epohe. </w:t>
-      </w:r>
-    </w:p>
-    <w:p>
-      <w:pPr>
-        <w:pStyle w:val="Paragraf"/>
-      </w:pPr>
-    </w:p>
-    <w:p>
-      <w:pPr>
-        <w:pStyle w:val="Paragraf"/>
-        <w:keepNext/>
-      </w:pPr>
-      <w:r>
-        <w:rPr>
-          <w:noProof/>
-        </w:rPr>
-        <w:drawing>
-          <wp:inline distT="0" distB="0" distL="0" distR="0" wp14:anchorId="6F99753D" wp14:editId="786E6C3E">
-            <wp:extent cx="5943600" cy="2348865"/>
-            <wp:effectExtent l="19050" t="19050" r="0" b="0"/>
-            <wp:docPr id="14" name="Picture 14"/>
-            <wp:cNvGraphicFramePr>
-              <a:graphicFrameLocks xmlns:a="http://schemas.openxmlformats.org/drawingml/2006/main" noChangeAspect="1"/>
-            </wp:cNvGraphicFramePr>
-            <a:graphic xmlns:a="http://schemas.openxmlformats.org/drawingml/2006/main">
-              <a:graphicData uri="http://schemas.openxmlformats.org/drawingml/2006/picture">
-                <pic:pic xmlns:pic="http://schemas.openxmlformats.org/drawingml/2006/picture">
-                  <pic:nvPicPr>
-                    <pic:cNvPr id="1" name=""/>
-                    <pic:cNvPicPr/>
-                  </pic:nvPicPr>
-                  <pic:blipFill>
-                    <a:blip r:embed="rId27"/>
-                    <a:stretch>
-                      <a:fillRect/>
-                    </a:stretch>
-                  </pic:blipFill>
-                  <pic:spPr>
-                    <a:xfrm>
-                      <a:off x="0" y="0"/>
-                      <a:ext cx="5943600" cy="2348865"/>
-                    </a:xfrm>
-                    <a:prstGeom prst="rect">
-                      <a:avLst/>
-                    </a:prstGeom>
-                    <a:ln w="6350">
-                      <a:solidFill>
-                        <a:schemeClr val="tx1"/>
-                      </a:solidFill>
-                    </a:ln>
-                  </pic:spPr>
-                </pic:pic>
-              </a:graphicData>
-            </a:graphic>
-          </wp:inline>
-        </w:drawing>
-      </w:r>
-    </w:p>
-    <w:p>
-      <w:pPr>
-        <w:pStyle w:val="Caption"/>
-        <w:jc w:val="center"/>
-      </w:pPr>
-      <w:bookmarkStart w:id="39" w:name="_Toc234846093"/>
-      <w:r>
-        <w:t xml:space="preserve">Slika </w:t>
-      </w:r>
-      <w:r>
-        <w:fldChar w:fldCharType="begin"/>
-      </w:r>
-      <w:r>
-        <w:instrText xml:space="preserve"> SEQ Slika \* ARABIC </w:instrText>
-      </w:r>
-      <w:r>
-        <w:fldChar w:fldCharType="separate"/>
-      </w:r>
-      <w:r>
-        <w:rPr>
-          <w:noProof/>
-        </w:rPr>
-        <w:t>10</w:t>
-      </w:r>
-      <w:r>
-        <w:fldChar w:fldCharType="end"/>
-      </w:r>
-      <w:r>
-        <w:t>. Funkcija troška na validacijskom setu</w:t>
-      </w:r>
-      <w:bookmarkEnd w:id="39"/>
-    </w:p>
-    <w:p>
-      <w:pPr>
-        <w:pStyle w:val="Paragraf"/>
-      </w:pPr>
-    </w:p>
-    <w:p>
-      <w:r>
-        <w:t>Na slici 11. je prikazan grafik funkcije troška na skupu podataka za treniranje kroz epohe.</w:t>
-      </w:r>
-    </w:p>
-    <w:p>
-      <w:pPr>
-        <w:pStyle w:val="Paragraf"/>
-        <w:keepNext/>
-      </w:pPr>
-      <w:r>
-        <w:rPr>
-          <w:noProof/>
-        </w:rPr>
-        <w:lastRenderedPageBreak/>
-        <w:drawing>
-          <wp:inline distT="0" distB="0" distL="0" distR="0" wp14:anchorId="53855FE4" wp14:editId="5063D5B0">
-            <wp:extent cx="5943600" cy="2319655"/>
-            <wp:effectExtent l="19050" t="19050" r="0" b="4445"/>
-            <wp:docPr id="15" name="Picture 15"/>
-            <wp:cNvGraphicFramePr>
-              <a:graphicFrameLocks xmlns:a="http://schemas.openxmlformats.org/drawingml/2006/main" noChangeAspect="1"/>
-            </wp:cNvGraphicFramePr>
-            <a:graphic xmlns:a="http://schemas.openxmlformats.org/drawingml/2006/main">
-              <a:graphicData uri="http://schemas.openxmlformats.org/drawingml/2006/picture">
-                <pic:pic xmlns:pic="http://schemas.openxmlformats.org/drawingml/2006/picture">
-                  <pic:nvPicPr>
-                    <pic:cNvPr id="1" name=""/>
-                    <pic:cNvPicPr/>
-                  </pic:nvPicPr>
-                  <pic:blipFill>
-                    <a:blip r:embed="rId28"/>
-                    <a:stretch>
-                      <a:fillRect/>
-                    </a:stretch>
-                  </pic:blipFill>
-                  <pic:spPr>
-                    <a:xfrm>
-                      <a:off x="0" y="0"/>
-                      <a:ext cx="5943600" cy="2319655"/>
-                    </a:xfrm>
-                    <a:prstGeom prst="rect">
-                      <a:avLst/>
-                    </a:prstGeom>
-                    <a:ln w="6350">
-                      <a:solidFill>
-                        <a:schemeClr val="tx1"/>
-                      </a:solidFill>
-                    </a:ln>
-                  </pic:spPr>
-                </pic:pic>
-              </a:graphicData>
-            </a:graphic>
-          </wp:inline>
-        </w:drawing>
-      </w:r>
-    </w:p>
-    <w:p>
-      <w:pPr>
-        <w:pStyle w:val="Caption"/>
-        <w:jc w:val="center"/>
-        <w:rPr>
-          <w:lang w:val="en-US"/>
-        </w:rPr>
-      </w:pPr>
-      <w:bookmarkStart w:id="40" w:name="_Toc234846094"/>
-      <w:r>
-        <w:t xml:space="preserve">Slika </w:t>
-      </w:r>
-      <w:r>
-        <w:fldChar w:fldCharType="begin"/>
-      </w:r>
-      <w:r>
-        <w:instrText xml:space="preserve"> SEQ Slika \* ARABIC </w:instrText>
-      </w:r>
-      <w:r>
-        <w:fldChar w:fldCharType="separate"/>
-      </w:r>
-      <w:r>
-        <w:rPr>
-          <w:noProof/>
-        </w:rPr>
-        <w:t>11</w:t>
-      </w:r>
-      <w:r>
-        <w:fldChar w:fldCharType="end"/>
-      </w:r>
-      <w:r>
-        <w:t>. Funkcija troška na trening setu</w:t>
-      </w:r>
-      <w:bookmarkEnd w:id="40"/>
-    </w:p>
-    <w:p>
-      <w:pPr>
-        <w:pStyle w:val="Paragraf"/>
-      </w:pPr>
-    </w:p>
-    <w:p>
-      <w:pPr>
-        <w:pStyle w:val="Paragraf"/>
-      </w:pPr>
-    </w:p>
-    <w:p>
-      <w:pPr>
-        <w:pStyle w:val="Paragraf"/>
-      </w:pPr>
+        <w:t>ROC i AUC</w:t>
+      </w:r>
     </w:p>
     <w:p>
       <w:pPr>
@@ -25538,14 +24095,6 @@
     </w:p>
     <w:p>
       <w:pPr>
-        <w:pStyle w:val="Heading2"/>
-      </w:pPr>
-      <w:r>
-        <w:t>ROC i AUC</w:t>
-      </w:r>
-    </w:p>
-    <w:p>
-      <w:pPr>
         <w:pStyle w:val="Paragraf"/>
         <w:ind w:firstLine="0"/>
       </w:pPr>
@@ -25684,25 +24233,14 @@
     </w:p>
     <w:p>
       <w:pPr>
-        <w:pStyle w:val="Paragraf"/>
-        <w:ind w:firstLine="0"/>
-      </w:pPr>
-    </w:p>
-    <w:p>
-      <w:pPr>
-        <w:pStyle w:val="Paragraf"/>
-        <w:ind w:firstLine="0"/>
-      </w:pPr>
-    </w:p>
-    <w:p>
-      <w:pPr>
         <w:pStyle w:val="Heading2"/>
       </w:pPr>
-      <w:bookmarkStart w:id="41" w:name="_Toc236486959"/>
-      <w:r>
+      <w:bookmarkStart w:id="29" w:name="_Toc236486959"/>
+      <w:r>
+        <w:lastRenderedPageBreak/>
         <w:t>Analiza rezultata</w:t>
       </w:r>
-      <w:bookmarkEnd w:id="41"/>
+      <w:bookmarkEnd w:id="29"/>
     </w:p>
     <w:p>
       <w:pPr>
@@ -25991,7 +24529,6 @@
     </w:p>
     <w:p>
       <w:r>
-        <w:lastRenderedPageBreak/>
         <w:t>Za treniranje optimalnijeg modela za dati problem, bilo bi neophodno prilagoditi arhitekturu CNN modela i provesti treniranje na znatno većem skupu podataka.</w:t>
       </w:r>
     </w:p>
@@ -26018,12 +24555,13 @@
       <w:pPr>
         <w:pStyle w:val="Heading1"/>
       </w:pPr>
-      <w:bookmarkStart w:id="42" w:name="_Toc236486960"/>
-      <w:proofErr w:type="spellStart"/>
-      <w:r>
+      <w:bookmarkStart w:id="30" w:name="_Toc236486960"/>
+      <w:proofErr w:type="spellStart"/>
+      <w:r>
+        <w:lastRenderedPageBreak/>
         <w:t>Zaključak</w:t>
       </w:r>
-      <w:bookmarkEnd w:id="42"/>
+      <w:bookmarkEnd w:id="30"/>
       <w:proofErr w:type="spellEnd"/>
     </w:p>
     <w:p>
@@ -26072,7 +24610,7 @@
     <w:p>
       <w:pPr>
         <w:sectPr>
-          <w:headerReference w:type="default" r:id="rId29"/>
+          <w:headerReference w:type="default" r:id="rId23"/>
           <w:pgSz w:w="12240" w:h="15840"/>
           <w:pgMar w:top="1440" w:right="1440" w:bottom="1440" w:left="1440" w:header="708" w:footer="708" w:gutter="0"/>
           <w:cols w:space="708"/>
@@ -26080,7 +24618,6 @@
         </w:sectPr>
       </w:pPr>
       <w:r>
-        <w:lastRenderedPageBreak/>
         <w:t>Dati rad se fokusirao na problem detekcije raka pluća, te bi za obuhvatniju analizu bilo potrebno testirati oba okruženja na većem broju različitih algoritama mašinskog učenja.</w:t>
       </w:r>
     </w:p>
@@ -27014,13 +25551,7 @@
           <w:rPr>
             <w:noProof/>
           </w:rPr>
-          <w:t>vi</w:t>
-        </w:r>
-        <w:r>
-          <w:rPr>
-            <w:noProof/>
-          </w:rPr>
-          <w:t>i</w:t>
+          <w:t>vii</w:t>
         </w:r>
         <w:r>
           <w:rPr>
@@ -31669,7 +30200,6 @@
   <w:style w:type="character" w:default="1" w:styleId="DefaultParagraphFont">
     <w:name w:val="Default Paragraph Font"/>
     <w:uiPriority w:val="1"/>
-    <w:semiHidden/>
     <w:unhideWhenUsed/>
   </w:style>
   <w:style w:type="table" w:default="1" w:styleId="TableNormal">

</xml_diff>

<commit_message>
Formated main metrics and added addtional metrics.
</commit_message>
<xml_diff>
--- a/Word/omar_kurtovic_diplomski_rad.docx
+++ b/Word/omar_kurtovic_diplomski_rad.docx
@@ -22554,117 +22554,115 @@
     </w:p>
     <w:p>
       <w:pPr>
-        <w:pStyle w:val="Paragraf"/>
-      </w:pPr>
-    </w:p>
-    <w:p>
-      <w:pPr>
-        <w:pStyle w:val="Paragraf"/>
-        <w:ind w:firstLine="0"/>
+        <w:pStyle w:val="Heading2"/>
         <w:rPr>
           <w:lang w:val="bs-Latn-BA"/>
         </w:rPr>
       </w:pPr>
       <w:r>
-        <w:t>Nakon treniranja modela</w:t>
-      </w:r>
-      <w:r>
-        <w:t xml:space="preserve"> svih šest modela</w:t>
-      </w:r>
-      <w:r>
-        <w:t>, dobijeni su sl</w:t>
-      </w:r>
-      <w:r>
-        <w:t>i</w:t>
-      </w:r>
-      <w:r>
-        <w:t>jede</w:t>
-      </w:r>
-      <w:proofErr w:type="spellStart"/>
-      <w:r>
         <w:rPr>
           <w:lang w:val="bs-Latn-BA"/>
         </w:rPr>
-        <w:t>ći</w:t>
-      </w:r>
-      <w:proofErr w:type="spellEnd"/>
-      <w:r>
+        <w:t>Glavni rezultati</w:t>
+      </w:r>
+    </w:p>
+    <w:p>
+      <w:pPr>
         <w:rPr>
           <w:lang w:val="bs-Latn-BA"/>
         </w:rPr>
-        <w:t xml:space="preserve"> rezultati.</w:t>
-      </w:r>
-    </w:p>
-    <w:p>
-      <w:pPr>
-        <w:pStyle w:val="Paragraf"/>
-        <w:ind w:firstLine="0"/>
-        <w:rPr>
-          <w:rFonts w:asciiTheme="minorHAnsi" w:hAnsiTheme="minorHAnsi"/>
-          <w:sz w:val="22"/>
-          <w:lang w:val="en-US"/>
-        </w:rPr>
-      </w:pPr>
-      <w:r>
+      </w:pPr>
+    </w:p>
+    <w:p>
+      <w:pPr>
         <w:rPr>
           <w:lang w:val="bs-Latn-BA"/>
         </w:rPr>
-        <w:fldChar w:fldCharType="begin"/>
-      </w:r>
+      </w:pPr>
       <w:r>
         <w:rPr>
           <w:lang w:val="bs-Latn-BA"/>
         </w:rPr>
-        <w:instrText xml:space="preserve"> LINK Excel.Sheet.12 "C:\\Users\\Administrator\\source\\repos\\omarkurtovic\\ml-dotnet-vs-python\\Word\\rezultati.xlsx" "Sheet1!R1C1:R8C9" \a \f 5 \h  \* MERGEFORMAT </w:instrText>
+        <w:t>Najvažniji rezultati poput vremena treniranja i makro metrik</w:t>
       </w:r>
       <w:r>
         <w:rPr>
           <w:lang w:val="bs-Latn-BA"/>
         </w:rPr>
-        <w:fldChar w:fldCharType="separate"/>
-      </w:r>
+        <w:t>e</w:t>
+      </w:r>
+      <w:r>
+        <w:rPr>
+          <w:lang w:val="bs-Latn-BA"/>
+        </w:rPr>
+        <w:t xml:space="preserve"> su prikazan</w:t>
+      </w:r>
+      <w:r>
+        <w:rPr>
+          <w:lang w:val="bs-Latn-BA"/>
+        </w:rPr>
+        <w:t xml:space="preserve">e ispod. Za svaku metriku je izračunata prosječna vrijednost te standardna devijacija te su date vrijednost prikazane u </w:t>
+      </w:r>
+      <w:r>
+        <w:rPr>
+          <w:lang w:val="bs-Latn-BA" w:eastAsia="bs-Latn-BA"/>
+        </w:rPr>
+        <w:t>Prosjek  ± SD</w:t>
+      </w:r>
+      <w:r>
+        <w:rPr>
+          <w:lang w:val="bs-Latn-BA"/>
+        </w:rPr>
+        <w:t xml:space="preserve"> kolonama.</w:t>
+      </w:r>
+    </w:p>
+    <w:p>
+      <w:pPr>
+        <w:pStyle w:val="Caption"/>
+        <w:keepNext/>
+        <w:divId w:val="1154031062"/>
+      </w:pPr>
     </w:p>
     <w:tbl>
       <w:tblPr>
-        <w:tblStyle w:val="TableGrid"/>
-        <w:tblW w:w="10080" w:type="dxa"/>
+        <w:tblStyle w:val="PlainTable1"/>
+        <w:tblW w:w="9378" w:type="dxa"/>
+        <w:tblLayout w:type="fixed"/>
         <w:tblLook w:val="04A0" w:firstRow="1" w:lastRow="0" w:firstColumn="1" w:lastColumn="0" w:noHBand="0" w:noVBand="1"/>
       </w:tblPr>
       <w:tblGrid>
-        <w:gridCol w:w="1121"/>
-        <w:gridCol w:w="1119"/>
-        <w:gridCol w:w="1120"/>
-        <w:gridCol w:w="1120"/>
-        <w:gridCol w:w="1120"/>
-        <w:gridCol w:w="1120"/>
-        <w:gridCol w:w="1120"/>
-        <w:gridCol w:w="1120"/>
-        <w:gridCol w:w="1120"/>
+        <w:gridCol w:w="1042"/>
+        <w:gridCol w:w="1042"/>
+        <w:gridCol w:w="1042"/>
+        <w:gridCol w:w="1042"/>
+        <w:gridCol w:w="1042"/>
+        <w:gridCol w:w="1042"/>
+        <w:gridCol w:w="1042"/>
+        <w:gridCol w:w="1042"/>
+        <w:gridCol w:w="1042"/>
       </w:tblGrid>
       <w:tr>
         <w:trPr>
-          <w:divId w:val="1154031062"/>
-          <w:trHeight w:val="315"/>
+          <w:cnfStyle w:val="100000000000" w:firstRow="1" w:lastRow="0" w:firstColumn="0" w:lastColumn="0" w:oddVBand="0" w:evenVBand="0" w:oddHBand="0" w:evenHBand="0" w:firstRowFirstColumn="0" w:firstRowLastColumn="0" w:lastRowFirstColumn="0" w:lastRowLastColumn="0"/>
+          <w:trHeight w:val="845"/>
         </w:trPr>
         <w:tc>
           <w:tcPr>
-            <w:tcW w:w="1120" w:type="dxa"/>
+            <w:cnfStyle w:val="001000000000" w:firstRow="0" w:lastRow="0" w:firstColumn="1" w:lastColumn="0" w:oddVBand="0" w:evenVBand="0" w:oddHBand="0" w:evenHBand="0" w:firstRowFirstColumn="0" w:firstRowLastColumn="0" w:lastRowFirstColumn="0" w:lastRowLastColumn="0"/>
+            <w:tcW w:w="1042" w:type="dxa"/>
+            <w:vAlign w:val="center"/>
             <w:hideMark/>
           </w:tcPr>
           <w:p>
             <w:pPr>
-              <w:pStyle w:val="Paragraf"/>
-              <w:ind w:firstLine="0"/>
-              <w:jc w:val="left"/>
-              <w:rPr>
-                <w:b/>
-                <w:bCs/>
+              <w:jc w:val="center"/>
+              <w:rPr>
+                <w:lang w:val="bs-Latn-BA" w:eastAsia="bs-Latn-BA"/>
               </w:rPr>
             </w:pPr>
             <w:r>
               <w:rPr>
-                <w:b/>
-                <w:bCs/>
+                <w:lang w:val="bs-Latn-BA" w:eastAsia="bs-Latn-BA"/>
               </w:rPr>
               <w:t>Metrike</w:t>
             </w:r>
@@ -22672,22 +22670,21 @@
         </w:tc>
         <w:tc>
           <w:tcPr>
-            <w:tcW w:w="1120" w:type="dxa"/>
+            <w:tcW w:w="1042" w:type="dxa"/>
+            <w:vAlign w:val="center"/>
             <w:hideMark/>
           </w:tcPr>
           <w:p>
             <w:pPr>
-              <w:pStyle w:val="Paragraf"/>
-              <w:ind w:firstLine="0"/>
-              <w:rPr>
-                <w:b/>
-                <w:bCs/>
+              <w:jc w:val="center"/>
+              <w:cnfStyle w:val="100000000000" w:firstRow="1" w:lastRow="0" w:firstColumn="0" w:lastColumn="0" w:oddVBand="0" w:evenVBand="0" w:oddHBand="0" w:evenHBand="0" w:firstRowFirstColumn="0" w:firstRowLastColumn="0" w:lastRowFirstColumn="0" w:lastRowLastColumn="0"/>
+              <w:rPr>
+                <w:lang w:val="bs-Latn-BA" w:eastAsia="bs-Latn-BA"/>
               </w:rPr>
             </w:pPr>
             <w:r>
               <w:rPr>
-                <w:b/>
-                <w:bCs/>
+                <w:lang w:val="bs-Latn-BA" w:eastAsia="bs-Latn-BA"/>
               </w:rPr>
               <w:t>C# 1</w:t>
             </w:r>
@@ -22695,23 +22692,21 @@
         </w:tc>
         <w:tc>
           <w:tcPr>
-            <w:tcW w:w="1120" w:type="dxa"/>
+            <w:tcW w:w="1042" w:type="dxa"/>
+            <w:vAlign w:val="center"/>
             <w:hideMark/>
           </w:tcPr>
           <w:p>
             <w:pPr>
-              <w:pStyle w:val="Paragraf"/>
-              <w:ind w:firstLine="0"/>
-              <w:jc w:val="left"/>
-              <w:rPr>
-                <w:b/>
-                <w:bCs/>
+              <w:jc w:val="center"/>
+              <w:cnfStyle w:val="100000000000" w:firstRow="1" w:lastRow="0" w:firstColumn="0" w:lastColumn="0" w:oddVBand="0" w:evenVBand="0" w:oddHBand="0" w:evenHBand="0" w:firstRowFirstColumn="0" w:firstRowLastColumn="0" w:lastRowFirstColumn="0" w:lastRowLastColumn="0"/>
+              <w:rPr>
+                <w:lang w:val="bs-Latn-BA" w:eastAsia="bs-Latn-BA"/>
               </w:rPr>
             </w:pPr>
             <w:r>
               <w:rPr>
-                <w:b/>
-                <w:bCs/>
+                <w:lang w:val="bs-Latn-BA" w:eastAsia="bs-Latn-BA"/>
               </w:rPr>
               <w:t>C# 2</w:t>
             </w:r>
@@ -22719,23 +22714,21 @@
         </w:tc>
         <w:tc>
           <w:tcPr>
-            <w:tcW w:w="1120" w:type="dxa"/>
+            <w:tcW w:w="1042" w:type="dxa"/>
+            <w:vAlign w:val="center"/>
             <w:hideMark/>
           </w:tcPr>
           <w:p>
             <w:pPr>
-              <w:pStyle w:val="Paragraf"/>
-              <w:ind w:firstLine="0"/>
-              <w:jc w:val="left"/>
-              <w:rPr>
-                <w:b/>
-                <w:bCs/>
+              <w:jc w:val="center"/>
+              <w:cnfStyle w:val="100000000000" w:firstRow="1" w:lastRow="0" w:firstColumn="0" w:lastColumn="0" w:oddVBand="0" w:evenVBand="0" w:oddHBand="0" w:evenHBand="0" w:firstRowFirstColumn="0" w:firstRowLastColumn="0" w:lastRowFirstColumn="0" w:lastRowLastColumn="0"/>
+              <w:rPr>
+                <w:lang w:val="bs-Latn-BA" w:eastAsia="bs-Latn-BA"/>
               </w:rPr>
             </w:pPr>
             <w:r>
               <w:rPr>
-                <w:b/>
-                <w:bCs/>
+                <w:lang w:val="bs-Latn-BA" w:eastAsia="bs-Latn-BA"/>
               </w:rPr>
               <w:t>C# 3</w:t>
             </w:r>
@@ -22743,23 +22736,21 @@
         </w:tc>
         <w:tc>
           <w:tcPr>
-            <w:tcW w:w="1120" w:type="dxa"/>
+            <w:tcW w:w="1042" w:type="dxa"/>
+            <w:vAlign w:val="center"/>
             <w:hideMark/>
           </w:tcPr>
           <w:p>
             <w:pPr>
-              <w:pStyle w:val="Paragraf"/>
-              <w:ind w:firstLine="0"/>
-              <w:jc w:val="left"/>
-              <w:rPr>
-                <w:b/>
-                <w:bCs/>
+              <w:jc w:val="center"/>
+              <w:cnfStyle w:val="100000000000" w:firstRow="1" w:lastRow="0" w:firstColumn="0" w:lastColumn="0" w:oddVBand="0" w:evenVBand="0" w:oddHBand="0" w:evenHBand="0" w:firstRowFirstColumn="0" w:firstRowLastColumn="0" w:lastRowFirstColumn="0" w:lastRowLastColumn="0"/>
+              <w:rPr>
+                <w:lang w:val="bs-Latn-BA" w:eastAsia="bs-Latn-BA"/>
               </w:rPr>
             </w:pPr>
             <w:r>
               <w:rPr>
-                <w:b/>
-                <w:bCs/>
+                <w:lang w:val="bs-Latn-BA" w:eastAsia="bs-Latn-BA"/>
               </w:rPr>
               <w:t>Prosjek  ± SD</w:t>
             </w:r>
@@ -22767,95 +22758,111 @@
         </w:tc>
         <w:tc>
           <w:tcPr>
-            <w:tcW w:w="1120" w:type="dxa"/>
+            <w:tcW w:w="1042" w:type="dxa"/>
+            <w:vAlign w:val="center"/>
             <w:hideMark/>
           </w:tcPr>
           <w:p>
             <w:pPr>
-              <w:pStyle w:val="Paragraf"/>
-              <w:ind w:firstLine="0"/>
-              <w:jc w:val="left"/>
-              <w:rPr>
-                <w:b/>
-                <w:bCs/>
+              <w:jc w:val="center"/>
+              <w:cnfStyle w:val="100000000000" w:firstRow="1" w:lastRow="0" w:firstColumn="0" w:lastColumn="0" w:oddVBand="0" w:evenVBand="0" w:oddHBand="0" w:evenHBand="0" w:firstRowFirstColumn="0" w:firstRowLastColumn="0" w:lastRowFirstColumn="0" w:lastRowLastColumn="0"/>
+              <w:rPr>
+                <w:lang w:val="bs-Latn-BA" w:eastAsia="bs-Latn-BA"/>
               </w:rPr>
             </w:pPr>
-            <w:r>
-              <w:rPr>
-                <w:b/>
-                <w:bCs/>
-              </w:rPr>
-              <w:t>Python 1</w:t>
+            <w:proofErr w:type="spellStart"/>
+            <w:r>
+              <w:rPr>
+                <w:lang w:val="bs-Latn-BA" w:eastAsia="bs-Latn-BA"/>
+              </w:rPr>
+              <w:t>Python</w:t>
+            </w:r>
+            <w:proofErr w:type="spellEnd"/>
+            <w:r>
+              <w:rPr>
+                <w:lang w:val="bs-Latn-BA" w:eastAsia="bs-Latn-BA"/>
+              </w:rPr>
+              <w:t xml:space="preserve"> 1</w:t>
             </w:r>
           </w:p>
         </w:tc>
         <w:tc>
           <w:tcPr>
-            <w:tcW w:w="1120" w:type="dxa"/>
+            <w:tcW w:w="1042" w:type="dxa"/>
+            <w:vAlign w:val="center"/>
             <w:hideMark/>
           </w:tcPr>
           <w:p>
             <w:pPr>
-              <w:pStyle w:val="Paragraf"/>
-              <w:ind w:firstLine="0"/>
-              <w:jc w:val="left"/>
-              <w:rPr>
-                <w:b/>
-                <w:bCs/>
+              <w:jc w:val="center"/>
+              <w:cnfStyle w:val="100000000000" w:firstRow="1" w:lastRow="0" w:firstColumn="0" w:lastColumn="0" w:oddVBand="0" w:evenVBand="0" w:oddHBand="0" w:evenHBand="0" w:firstRowFirstColumn="0" w:firstRowLastColumn="0" w:lastRowFirstColumn="0" w:lastRowLastColumn="0"/>
+              <w:rPr>
+                <w:lang w:val="bs-Latn-BA" w:eastAsia="bs-Latn-BA"/>
               </w:rPr>
             </w:pPr>
-            <w:r>
-              <w:rPr>
-                <w:b/>
-                <w:bCs/>
-              </w:rPr>
-              <w:t>Python 2</w:t>
+            <w:proofErr w:type="spellStart"/>
+            <w:r>
+              <w:rPr>
+                <w:lang w:val="bs-Latn-BA" w:eastAsia="bs-Latn-BA"/>
+              </w:rPr>
+              <w:t>Python</w:t>
+            </w:r>
+            <w:proofErr w:type="spellEnd"/>
+            <w:r>
+              <w:rPr>
+                <w:lang w:val="bs-Latn-BA" w:eastAsia="bs-Latn-BA"/>
+              </w:rPr>
+              <w:t xml:space="preserve"> 2</w:t>
             </w:r>
           </w:p>
         </w:tc>
         <w:tc>
           <w:tcPr>
-            <w:tcW w:w="1120" w:type="dxa"/>
+            <w:tcW w:w="1042" w:type="dxa"/>
+            <w:vAlign w:val="center"/>
             <w:hideMark/>
           </w:tcPr>
           <w:p>
             <w:pPr>
-              <w:pStyle w:val="Paragraf"/>
-              <w:ind w:firstLine="0"/>
-              <w:jc w:val="left"/>
-              <w:rPr>
-                <w:b/>
-                <w:bCs/>
+              <w:jc w:val="center"/>
+              <w:cnfStyle w:val="100000000000" w:firstRow="1" w:lastRow="0" w:firstColumn="0" w:lastColumn="0" w:oddVBand="0" w:evenVBand="0" w:oddHBand="0" w:evenHBand="0" w:firstRowFirstColumn="0" w:firstRowLastColumn="0" w:lastRowFirstColumn="0" w:lastRowLastColumn="0"/>
+              <w:rPr>
+                <w:lang w:val="bs-Latn-BA" w:eastAsia="bs-Latn-BA"/>
               </w:rPr>
             </w:pPr>
-            <w:r>
-              <w:rPr>
-                <w:b/>
-                <w:bCs/>
-              </w:rPr>
-              <w:t>Python 3</w:t>
+            <w:proofErr w:type="spellStart"/>
+            <w:r>
+              <w:rPr>
+                <w:lang w:val="bs-Latn-BA" w:eastAsia="bs-Latn-BA"/>
+              </w:rPr>
+              <w:t>Python</w:t>
+            </w:r>
+            <w:proofErr w:type="spellEnd"/>
+            <w:r>
+              <w:rPr>
+                <w:lang w:val="bs-Latn-BA" w:eastAsia="bs-Latn-BA"/>
+              </w:rPr>
+              <w:t xml:space="preserve"> 3</w:t>
             </w:r>
           </w:p>
         </w:tc>
         <w:tc>
           <w:tcPr>
-            <w:tcW w:w="1120" w:type="dxa"/>
+            <w:tcW w:w="1042" w:type="dxa"/>
+            <w:vAlign w:val="center"/>
             <w:hideMark/>
           </w:tcPr>
           <w:p>
             <w:pPr>
-              <w:pStyle w:val="Paragraf"/>
-              <w:ind w:firstLine="0"/>
-              <w:jc w:val="left"/>
-              <w:rPr>
-                <w:b/>
-                <w:bCs/>
+              <w:jc w:val="center"/>
+              <w:cnfStyle w:val="100000000000" w:firstRow="1" w:lastRow="0" w:firstColumn="0" w:lastColumn="0" w:oddVBand="0" w:evenVBand="0" w:oddHBand="0" w:evenHBand="0" w:firstRowFirstColumn="0" w:firstRowLastColumn="0" w:lastRowFirstColumn="0" w:lastRowLastColumn="0"/>
+              <w:rPr>
+                <w:lang w:val="bs-Latn-BA" w:eastAsia="bs-Latn-BA"/>
               </w:rPr>
             </w:pPr>
             <w:r>
               <w:rPr>
-                <w:b/>
-                <w:bCs/>
+                <w:lang w:val="bs-Latn-BA" w:eastAsia="bs-Latn-BA"/>
               </w:rPr>
               <w:t>Prosjek ± SD</w:t>
             </w:r>
@@ -22864,174 +22871,284 @@
       </w:tr>
       <w:tr>
         <w:trPr>
-          <w:divId w:val="1154031062"/>
-          <w:trHeight w:val="600"/>
+          <w:cnfStyle w:val="000000100000" w:firstRow="0" w:lastRow="0" w:firstColumn="0" w:lastColumn="0" w:oddVBand="0" w:evenVBand="0" w:oddHBand="1" w:evenHBand="0" w:firstRowFirstColumn="0" w:firstRowLastColumn="0" w:lastRowFirstColumn="0" w:lastRowLastColumn="0"/>
+          <w:trHeight w:val="845"/>
         </w:trPr>
         <w:tc>
           <w:tcPr>
-            <w:tcW w:w="1120" w:type="dxa"/>
+            <w:cnfStyle w:val="001000000000" w:firstRow="0" w:lastRow="0" w:firstColumn="1" w:lastColumn="0" w:oddVBand="0" w:evenVBand="0" w:oddHBand="0" w:evenHBand="0" w:firstRowFirstColumn="0" w:firstRowLastColumn="0" w:lastRowFirstColumn="0" w:lastRowLastColumn="0"/>
+            <w:tcW w:w="1042" w:type="dxa"/>
+            <w:vAlign w:val="center"/>
             <w:hideMark/>
           </w:tcPr>
           <w:p>
             <w:pPr>
-              <w:pStyle w:val="Paragraf"/>
-              <w:ind w:firstLine="0"/>
-              <w:jc w:val="left"/>
+              <w:jc w:val="center"/>
+              <w:rPr>
+                <w:color w:val="000000"/>
+                <w:lang w:val="bs-Latn-BA" w:eastAsia="bs-Latn-BA"/>
+              </w:rPr>
             </w:pPr>
             <w:r>
+              <w:rPr>
+                <w:color w:val="000000"/>
+                <w:lang w:val="bs-Latn-BA" w:eastAsia="bs-Latn-BA"/>
+              </w:rPr>
               <w:t>Vrijeme treniranja</w:t>
             </w:r>
           </w:p>
         </w:tc>
         <w:tc>
           <w:tcPr>
-            <w:tcW w:w="1120" w:type="dxa"/>
+            <w:tcW w:w="1042" w:type="dxa"/>
+            <w:vAlign w:val="center"/>
             <w:hideMark/>
           </w:tcPr>
           <w:p>
             <w:pPr>
-              <w:pStyle w:val="Paragraf"/>
-              <w:ind w:firstLine="0"/>
-              <w:jc w:val="left"/>
+              <w:jc w:val="center"/>
+              <w:cnfStyle w:val="000000100000" w:firstRow="0" w:lastRow="0" w:firstColumn="0" w:lastColumn="0" w:oddVBand="0" w:evenVBand="0" w:oddHBand="1" w:evenHBand="0" w:firstRowFirstColumn="0" w:firstRowLastColumn="0" w:lastRowFirstColumn="0" w:lastRowLastColumn="0"/>
+              <w:rPr>
+                <w:color w:val="000000"/>
+                <w:lang w:val="bs-Latn-BA" w:eastAsia="bs-Latn-BA"/>
+              </w:rPr>
             </w:pPr>
             <w:r>
+              <w:rPr>
+                <w:color w:val="000000"/>
+                <w:lang w:val="bs-Latn-BA" w:eastAsia="bs-Latn-BA"/>
+              </w:rPr>
               <w:t>184,05</w:t>
             </w:r>
           </w:p>
         </w:tc>
         <w:tc>
           <w:tcPr>
-            <w:tcW w:w="1120" w:type="dxa"/>
+            <w:tcW w:w="1042" w:type="dxa"/>
+            <w:vAlign w:val="center"/>
             <w:hideMark/>
           </w:tcPr>
           <w:p>
             <w:pPr>
-              <w:pStyle w:val="Paragraf"/>
-              <w:ind w:firstLine="0"/>
-              <w:jc w:val="left"/>
+              <w:jc w:val="center"/>
+              <w:cnfStyle w:val="000000100000" w:firstRow="0" w:lastRow="0" w:firstColumn="0" w:lastColumn="0" w:oddVBand="0" w:evenVBand="0" w:oddHBand="1" w:evenHBand="0" w:firstRowFirstColumn="0" w:firstRowLastColumn="0" w:lastRowFirstColumn="0" w:lastRowLastColumn="0"/>
+              <w:rPr>
+                <w:color w:val="000000"/>
+                <w:lang w:val="bs-Latn-BA" w:eastAsia="bs-Latn-BA"/>
+              </w:rPr>
             </w:pPr>
             <w:r>
+              <w:rPr>
+                <w:color w:val="000000"/>
+                <w:lang w:val="bs-Latn-BA" w:eastAsia="bs-Latn-BA"/>
+              </w:rPr>
               <w:t>189,80</w:t>
             </w:r>
           </w:p>
         </w:tc>
         <w:tc>
           <w:tcPr>
-            <w:tcW w:w="1120" w:type="dxa"/>
+            <w:tcW w:w="1042" w:type="dxa"/>
+            <w:vAlign w:val="center"/>
             <w:hideMark/>
           </w:tcPr>
           <w:p>
             <w:pPr>
-              <w:pStyle w:val="Paragraf"/>
-              <w:ind w:firstLine="0"/>
-              <w:jc w:val="left"/>
+              <w:jc w:val="center"/>
+              <w:cnfStyle w:val="000000100000" w:firstRow="0" w:lastRow="0" w:firstColumn="0" w:lastColumn="0" w:oddVBand="0" w:evenVBand="0" w:oddHBand="1" w:evenHBand="0" w:firstRowFirstColumn="0" w:firstRowLastColumn="0" w:lastRowFirstColumn="0" w:lastRowLastColumn="0"/>
+              <w:rPr>
+                <w:color w:val="000000"/>
+                <w:lang w:val="bs-Latn-BA" w:eastAsia="bs-Latn-BA"/>
+              </w:rPr>
             </w:pPr>
             <w:r>
+              <w:rPr>
+                <w:color w:val="000000"/>
+                <w:lang w:val="bs-Latn-BA" w:eastAsia="bs-Latn-BA"/>
+              </w:rPr>
               <w:t>192,57</w:t>
             </w:r>
           </w:p>
         </w:tc>
         <w:tc>
           <w:tcPr>
-            <w:tcW w:w="1120" w:type="dxa"/>
+            <w:tcW w:w="1042" w:type="dxa"/>
+            <w:vAlign w:val="center"/>
             <w:hideMark/>
           </w:tcPr>
           <w:p>
             <w:pPr>
-              <w:pStyle w:val="Paragraf"/>
-              <w:ind w:firstLine="0"/>
-              <w:jc w:val="left"/>
+              <w:jc w:val="center"/>
+              <w:cnfStyle w:val="000000100000" w:firstRow="0" w:lastRow="0" w:firstColumn="0" w:lastColumn="0" w:oddVBand="0" w:evenVBand="0" w:oddHBand="1" w:evenHBand="0" w:firstRowFirstColumn="0" w:firstRowLastColumn="0" w:lastRowFirstColumn="0" w:lastRowLastColumn="0"/>
+              <w:rPr>
+                <w:color w:val="000000"/>
+                <w:lang w:val="bs-Latn-BA" w:eastAsia="bs-Latn-BA"/>
+              </w:rPr>
             </w:pPr>
             <w:r>
+              <w:rPr>
+                <w:color w:val="000000"/>
+                <w:lang w:val="bs-Latn-BA" w:eastAsia="bs-Latn-BA"/>
+              </w:rPr>
               <w:t>188</w:t>
             </w:r>
             <w:r>
+              <w:rPr>
+                <w:color w:val="000000"/>
+                <w:lang w:val="bs-Latn-BA" w:eastAsia="bs-Latn-BA"/>
+              </w:rPr>
               <w:t>,</w:t>
             </w:r>
             <w:r>
+              <w:rPr>
+                <w:color w:val="000000"/>
+                <w:lang w:val="bs-Latn-BA" w:eastAsia="bs-Latn-BA"/>
+              </w:rPr>
               <w:t>80 ± 4</w:t>
             </w:r>
             <w:r>
+              <w:rPr>
+                <w:color w:val="000000"/>
+                <w:lang w:val="bs-Latn-BA" w:eastAsia="bs-Latn-BA"/>
+              </w:rPr>
               <w:t>,</w:t>
             </w:r>
             <w:r>
+              <w:rPr>
+                <w:color w:val="000000"/>
+                <w:lang w:val="bs-Latn-BA" w:eastAsia="bs-Latn-BA"/>
+              </w:rPr>
               <w:t>34</w:t>
             </w:r>
           </w:p>
         </w:tc>
         <w:tc>
           <w:tcPr>
-            <w:tcW w:w="1120" w:type="dxa"/>
+            <w:tcW w:w="1042" w:type="dxa"/>
+            <w:vAlign w:val="center"/>
             <w:hideMark/>
           </w:tcPr>
           <w:p>
             <w:pPr>
-              <w:pStyle w:val="Paragraf"/>
-              <w:ind w:firstLine="0"/>
-              <w:jc w:val="left"/>
+              <w:jc w:val="center"/>
+              <w:cnfStyle w:val="000000100000" w:firstRow="0" w:lastRow="0" w:firstColumn="0" w:lastColumn="0" w:oddVBand="0" w:evenVBand="0" w:oddHBand="1" w:evenHBand="0" w:firstRowFirstColumn="0" w:firstRowLastColumn="0" w:lastRowFirstColumn="0" w:lastRowLastColumn="0"/>
+              <w:rPr>
+                <w:color w:val="000000"/>
+                <w:lang w:val="bs-Latn-BA" w:eastAsia="bs-Latn-BA"/>
+              </w:rPr>
             </w:pPr>
             <w:r>
+              <w:rPr>
+                <w:color w:val="000000"/>
+                <w:lang w:val="bs-Latn-BA" w:eastAsia="bs-Latn-BA"/>
+              </w:rPr>
               <w:t>283,79</w:t>
             </w:r>
           </w:p>
         </w:tc>
         <w:tc>
           <w:tcPr>
-            <w:tcW w:w="1120" w:type="dxa"/>
+            <w:tcW w:w="1042" w:type="dxa"/>
+            <w:vAlign w:val="center"/>
             <w:hideMark/>
           </w:tcPr>
           <w:p>
             <w:pPr>
-              <w:pStyle w:val="Paragraf"/>
-              <w:ind w:firstLine="0"/>
-              <w:jc w:val="left"/>
+              <w:jc w:val="center"/>
+              <w:cnfStyle w:val="000000100000" w:firstRow="0" w:lastRow="0" w:firstColumn="0" w:lastColumn="0" w:oddVBand="0" w:evenVBand="0" w:oddHBand="1" w:evenHBand="0" w:firstRowFirstColumn="0" w:firstRowLastColumn="0" w:lastRowFirstColumn="0" w:lastRowLastColumn="0"/>
+              <w:rPr>
+                <w:color w:val="000000"/>
+                <w:lang w:val="bs-Latn-BA" w:eastAsia="bs-Latn-BA"/>
+              </w:rPr>
             </w:pPr>
             <w:r>
+              <w:rPr>
+                <w:color w:val="000000"/>
+                <w:lang w:val="bs-Latn-BA" w:eastAsia="bs-Latn-BA"/>
+              </w:rPr>
               <w:t>330,07</w:t>
             </w:r>
           </w:p>
         </w:tc>
         <w:tc>
           <w:tcPr>
-            <w:tcW w:w="1120" w:type="dxa"/>
+            <w:tcW w:w="1042" w:type="dxa"/>
+            <w:vAlign w:val="center"/>
             <w:hideMark/>
           </w:tcPr>
           <w:p>
             <w:pPr>
-              <w:pStyle w:val="Paragraf"/>
-              <w:ind w:firstLine="0"/>
-              <w:jc w:val="left"/>
+              <w:jc w:val="center"/>
+              <w:cnfStyle w:val="000000100000" w:firstRow="0" w:lastRow="0" w:firstColumn="0" w:lastColumn="0" w:oddVBand="0" w:evenVBand="0" w:oddHBand="1" w:evenHBand="0" w:firstRowFirstColumn="0" w:firstRowLastColumn="0" w:lastRowFirstColumn="0" w:lastRowLastColumn="0"/>
+              <w:rPr>
+                <w:color w:val="000000"/>
+                <w:lang w:val="bs-Latn-BA" w:eastAsia="bs-Latn-BA"/>
+              </w:rPr>
             </w:pPr>
             <w:r>
+              <w:rPr>
+                <w:color w:val="000000"/>
+                <w:lang w:val="bs-Latn-BA" w:eastAsia="bs-Latn-BA"/>
+              </w:rPr>
               <w:t>294,75</w:t>
             </w:r>
           </w:p>
         </w:tc>
         <w:tc>
           <w:tcPr>
-            <w:tcW w:w="1120" w:type="dxa"/>
+            <w:tcW w:w="1042" w:type="dxa"/>
             <w:noWrap/>
+            <w:vAlign w:val="center"/>
             <w:hideMark/>
           </w:tcPr>
           <w:p>
             <w:pPr>
-              <w:pStyle w:val="Paragraf"/>
-              <w:ind w:firstLine="0"/>
-              <w:jc w:val="left"/>
+              <w:jc w:val="center"/>
+              <w:cnfStyle w:val="000000100000" w:firstRow="0" w:lastRow="0" w:firstColumn="0" w:lastColumn="0" w:oddVBand="0" w:evenVBand="0" w:oddHBand="1" w:evenHBand="0" w:firstRowFirstColumn="0" w:firstRowLastColumn="0" w:lastRowFirstColumn="0" w:lastRowLastColumn="0"/>
+              <w:rPr>
+                <w:rFonts w:ascii="Calibri" w:hAnsi="Calibri" w:cs="Calibri"/>
+                <w:color w:val="000000"/>
+                <w:lang w:val="bs-Latn-BA" w:eastAsia="bs-Latn-BA"/>
+              </w:rPr>
             </w:pPr>
             <w:r>
+              <w:rPr>
+                <w:rFonts w:ascii="Calibri" w:hAnsi="Calibri" w:cs="Calibri"/>
+                <w:color w:val="000000"/>
+                <w:lang w:val="bs-Latn-BA" w:eastAsia="bs-Latn-BA"/>
+              </w:rPr>
               <w:t>302</w:t>
             </w:r>
             <w:r>
+              <w:rPr>
+                <w:rFonts w:ascii="Calibri" w:hAnsi="Calibri" w:cs="Calibri"/>
+                <w:color w:val="000000"/>
+                <w:lang w:val="bs-Latn-BA" w:eastAsia="bs-Latn-BA"/>
+              </w:rPr>
               <w:t>,</w:t>
             </w:r>
             <w:r>
+              <w:rPr>
+                <w:rFonts w:ascii="Calibri" w:hAnsi="Calibri" w:cs="Calibri"/>
+                <w:color w:val="000000"/>
+                <w:lang w:val="bs-Latn-BA" w:eastAsia="bs-Latn-BA"/>
+              </w:rPr>
               <w:t>87 ± 24</w:t>
             </w:r>
             <w:r>
+              <w:rPr>
+                <w:rFonts w:ascii="Calibri" w:hAnsi="Calibri" w:cs="Calibri"/>
+                <w:color w:val="000000"/>
+                <w:lang w:val="bs-Latn-BA" w:eastAsia="bs-Latn-BA"/>
+              </w:rPr>
               <w:t>,</w:t>
             </w:r>
             <w:r>
+              <w:rPr>
+                <w:rFonts w:ascii="Calibri" w:hAnsi="Calibri" w:cs="Calibri"/>
+                <w:color w:val="000000"/>
+                <w:lang w:val="bs-Latn-BA" w:eastAsia="bs-Latn-BA"/>
+              </w:rPr>
               <w:t>18</w:t>
             </w:r>
           </w:p>
@@ -23039,150 +23156,223 @@
       </w:tr>
       <w:tr>
         <w:trPr>
-          <w:divId w:val="1154031062"/>
-          <w:trHeight w:val="600"/>
+          <w:trHeight w:val="845"/>
         </w:trPr>
         <w:tc>
           <w:tcPr>
-            <w:tcW w:w="1120" w:type="dxa"/>
+            <w:cnfStyle w:val="001000000000" w:firstRow="0" w:lastRow="0" w:firstColumn="1" w:lastColumn="0" w:oddVBand="0" w:evenVBand="0" w:oddHBand="0" w:evenHBand="0" w:firstRowFirstColumn="0" w:firstRowLastColumn="0" w:lastRowFirstColumn="0" w:lastRowLastColumn="0"/>
+            <w:tcW w:w="1042" w:type="dxa"/>
+            <w:vAlign w:val="center"/>
             <w:hideMark/>
           </w:tcPr>
           <w:p>
             <w:pPr>
-              <w:pStyle w:val="Paragraf"/>
-              <w:ind w:firstLine="0"/>
-              <w:jc w:val="left"/>
+              <w:jc w:val="center"/>
+              <w:rPr>
+                <w:color w:val="000000"/>
+                <w:lang w:val="bs-Latn-BA" w:eastAsia="bs-Latn-BA"/>
+              </w:rPr>
             </w:pPr>
             <w:r>
+              <w:rPr>
+                <w:color w:val="000000"/>
+                <w:lang w:val="bs-Latn-BA" w:eastAsia="bs-Latn-BA"/>
+              </w:rPr>
               <w:t>Tačnost</w:t>
             </w:r>
           </w:p>
         </w:tc>
         <w:tc>
           <w:tcPr>
-            <w:tcW w:w="1120" w:type="dxa"/>
+            <w:tcW w:w="1042" w:type="dxa"/>
+            <w:vAlign w:val="center"/>
             <w:hideMark/>
           </w:tcPr>
           <w:p>
             <w:pPr>
-              <w:pStyle w:val="Paragraf"/>
-              <w:ind w:firstLine="0"/>
-              <w:jc w:val="left"/>
+              <w:jc w:val="center"/>
+              <w:cnfStyle w:val="000000000000" w:firstRow="0" w:lastRow="0" w:firstColumn="0" w:lastColumn="0" w:oddVBand="0" w:evenVBand="0" w:oddHBand="0" w:evenHBand="0" w:firstRowFirstColumn="0" w:firstRowLastColumn="0" w:lastRowFirstColumn="0" w:lastRowLastColumn="0"/>
+              <w:rPr>
+                <w:color w:val="000000"/>
+                <w:lang w:val="bs-Latn-BA" w:eastAsia="bs-Latn-BA"/>
+              </w:rPr>
             </w:pPr>
             <w:r>
+              <w:rPr>
+                <w:color w:val="000000"/>
+                <w:lang w:val="bs-Latn-BA" w:eastAsia="bs-Latn-BA"/>
+              </w:rPr>
               <w:t>81,45%</w:t>
             </w:r>
           </w:p>
         </w:tc>
         <w:tc>
           <w:tcPr>
-            <w:tcW w:w="1120" w:type="dxa"/>
+            <w:tcW w:w="1042" w:type="dxa"/>
+            <w:vAlign w:val="center"/>
             <w:hideMark/>
           </w:tcPr>
           <w:p>
             <w:pPr>
-              <w:pStyle w:val="Paragraf"/>
-              <w:ind w:firstLine="0"/>
-              <w:jc w:val="left"/>
+              <w:jc w:val="center"/>
+              <w:cnfStyle w:val="000000000000" w:firstRow="0" w:lastRow="0" w:firstColumn="0" w:lastColumn="0" w:oddVBand="0" w:evenVBand="0" w:oddHBand="0" w:evenHBand="0" w:firstRowFirstColumn="0" w:firstRowLastColumn="0" w:lastRowFirstColumn="0" w:lastRowLastColumn="0"/>
+              <w:rPr>
+                <w:color w:val="000000"/>
+                <w:lang w:val="bs-Latn-BA" w:eastAsia="bs-Latn-BA"/>
+              </w:rPr>
             </w:pPr>
             <w:r>
+              <w:rPr>
+                <w:color w:val="000000"/>
+                <w:lang w:val="bs-Latn-BA" w:eastAsia="bs-Latn-BA"/>
+              </w:rPr>
               <w:t>80,73%</w:t>
             </w:r>
           </w:p>
         </w:tc>
         <w:tc>
           <w:tcPr>
-            <w:tcW w:w="1120" w:type="dxa"/>
+            <w:tcW w:w="1042" w:type="dxa"/>
+            <w:vAlign w:val="center"/>
             <w:hideMark/>
           </w:tcPr>
           <w:p>
             <w:pPr>
-              <w:pStyle w:val="Paragraf"/>
-              <w:ind w:firstLine="0"/>
-              <w:jc w:val="left"/>
+              <w:jc w:val="center"/>
+              <w:cnfStyle w:val="000000000000" w:firstRow="0" w:lastRow="0" w:firstColumn="0" w:lastColumn="0" w:oddVBand="0" w:evenVBand="0" w:oddHBand="0" w:evenHBand="0" w:firstRowFirstColumn="0" w:firstRowLastColumn="0" w:lastRowFirstColumn="0" w:lastRowLastColumn="0"/>
+              <w:rPr>
+                <w:color w:val="000000"/>
+                <w:lang w:val="bs-Latn-BA" w:eastAsia="bs-Latn-BA"/>
+              </w:rPr>
             </w:pPr>
             <w:r>
+              <w:rPr>
+                <w:color w:val="000000"/>
+                <w:lang w:val="bs-Latn-BA" w:eastAsia="bs-Latn-BA"/>
+              </w:rPr>
               <w:t>86,91%</w:t>
             </w:r>
           </w:p>
         </w:tc>
         <w:tc>
           <w:tcPr>
-            <w:tcW w:w="1120" w:type="dxa"/>
+            <w:tcW w:w="1042" w:type="dxa"/>
+            <w:vAlign w:val="center"/>
             <w:hideMark/>
           </w:tcPr>
           <w:p>
             <w:pPr>
-              <w:pStyle w:val="Paragraf"/>
-              <w:ind w:firstLine="0"/>
-              <w:jc w:val="left"/>
+              <w:jc w:val="center"/>
+              <w:cnfStyle w:val="000000000000" w:firstRow="0" w:lastRow="0" w:firstColumn="0" w:lastColumn="0" w:oddVBand="0" w:evenVBand="0" w:oddHBand="0" w:evenHBand="0" w:firstRowFirstColumn="0" w:firstRowLastColumn="0" w:lastRowFirstColumn="0" w:lastRowLastColumn="0"/>
+              <w:rPr>
+                <w:color w:val="000000"/>
+                <w:lang w:val="bs-Latn-BA" w:eastAsia="bs-Latn-BA"/>
+              </w:rPr>
             </w:pPr>
             <w:r>
+              <w:rPr>
+                <w:color w:val="000000"/>
+                <w:lang w:val="bs-Latn-BA" w:eastAsia="bs-Latn-BA"/>
+              </w:rPr>
               <w:t>83,03 ± 3,38</w:t>
             </w:r>
           </w:p>
         </w:tc>
         <w:tc>
           <w:tcPr>
-            <w:tcW w:w="1120" w:type="dxa"/>
+            <w:tcW w:w="1042" w:type="dxa"/>
+            <w:vAlign w:val="center"/>
             <w:hideMark/>
           </w:tcPr>
           <w:p>
             <w:pPr>
-              <w:pStyle w:val="Paragraf"/>
-              <w:ind w:firstLine="0"/>
-              <w:jc w:val="left"/>
+              <w:jc w:val="center"/>
+              <w:cnfStyle w:val="000000000000" w:firstRow="0" w:lastRow="0" w:firstColumn="0" w:lastColumn="0" w:oddVBand="0" w:evenVBand="0" w:oddHBand="0" w:evenHBand="0" w:firstRowFirstColumn="0" w:firstRowLastColumn="0" w:lastRowFirstColumn="0" w:lastRowLastColumn="0"/>
+              <w:rPr>
+                <w:color w:val="000000"/>
+                <w:lang w:val="bs-Latn-BA" w:eastAsia="bs-Latn-BA"/>
+              </w:rPr>
             </w:pPr>
             <w:r>
+              <w:rPr>
+                <w:color w:val="000000"/>
+                <w:lang w:val="bs-Latn-BA" w:eastAsia="bs-Latn-BA"/>
+              </w:rPr>
               <w:t>80,73%</w:t>
             </w:r>
           </w:p>
         </w:tc>
         <w:tc>
           <w:tcPr>
-            <w:tcW w:w="1120" w:type="dxa"/>
+            <w:tcW w:w="1042" w:type="dxa"/>
+            <w:vAlign w:val="center"/>
             <w:hideMark/>
           </w:tcPr>
           <w:p>
             <w:pPr>
-              <w:pStyle w:val="Paragraf"/>
-              <w:ind w:firstLine="0"/>
-              <w:jc w:val="left"/>
+              <w:jc w:val="center"/>
+              <w:cnfStyle w:val="000000000000" w:firstRow="0" w:lastRow="0" w:firstColumn="0" w:lastColumn="0" w:oddVBand="0" w:evenVBand="0" w:oddHBand="0" w:evenHBand="0" w:firstRowFirstColumn="0" w:firstRowLastColumn="0" w:lastRowFirstColumn="0" w:lastRowLastColumn="0"/>
+              <w:rPr>
+                <w:color w:val="000000"/>
+                <w:lang w:val="bs-Latn-BA" w:eastAsia="bs-Latn-BA"/>
+              </w:rPr>
             </w:pPr>
             <w:r>
+              <w:rPr>
+                <w:color w:val="000000"/>
+                <w:lang w:val="bs-Latn-BA" w:eastAsia="bs-Latn-BA"/>
+              </w:rPr>
               <w:t>82,18%</w:t>
             </w:r>
           </w:p>
         </w:tc>
         <w:tc>
           <w:tcPr>
-            <w:tcW w:w="1120" w:type="dxa"/>
+            <w:tcW w:w="1042" w:type="dxa"/>
+            <w:vAlign w:val="center"/>
             <w:hideMark/>
           </w:tcPr>
           <w:p>
             <w:pPr>
-              <w:pStyle w:val="Paragraf"/>
-              <w:ind w:firstLine="0"/>
-              <w:jc w:val="left"/>
+              <w:jc w:val="center"/>
+              <w:cnfStyle w:val="000000000000" w:firstRow="0" w:lastRow="0" w:firstColumn="0" w:lastColumn="0" w:oddVBand="0" w:evenVBand="0" w:oddHBand="0" w:evenHBand="0" w:firstRowFirstColumn="0" w:firstRowLastColumn="0" w:lastRowFirstColumn="0" w:lastRowLastColumn="0"/>
+              <w:rPr>
+                <w:color w:val="000000"/>
+                <w:lang w:val="bs-Latn-BA" w:eastAsia="bs-Latn-BA"/>
+              </w:rPr>
             </w:pPr>
             <w:r>
+              <w:rPr>
+                <w:color w:val="000000"/>
+                <w:lang w:val="bs-Latn-BA" w:eastAsia="bs-Latn-BA"/>
+              </w:rPr>
               <w:t>88,73%</w:t>
             </w:r>
           </w:p>
         </w:tc>
         <w:tc>
           <w:tcPr>
-            <w:tcW w:w="1120" w:type="dxa"/>
+            <w:tcW w:w="1042" w:type="dxa"/>
             <w:noWrap/>
+            <w:vAlign w:val="center"/>
             <w:hideMark/>
           </w:tcPr>
           <w:p>
             <w:pPr>
-              <w:pStyle w:val="Paragraf"/>
-              <w:ind w:firstLine="0"/>
-              <w:jc w:val="left"/>
+              <w:jc w:val="center"/>
+              <w:cnfStyle w:val="000000000000" w:firstRow="0" w:lastRow="0" w:firstColumn="0" w:lastColumn="0" w:oddVBand="0" w:evenVBand="0" w:oddHBand="0" w:evenHBand="0" w:firstRowFirstColumn="0" w:firstRowLastColumn="0" w:lastRowFirstColumn="0" w:lastRowLastColumn="0"/>
+              <w:rPr>
+                <w:rFonts w:ascii="Calibri" w:hAnsi="Calibri" w:cs="Calibri"/>
+                <w:color w:val="000000"/>
+                <w:lang w:val="bs-Latn-BA" w:eastAsia="bs-Latn-BA"/>
+              </w:rPr>
             </w:pPr>
             <w:r>
+              <w:rPr>
+                <w:rFonts w:ascii="Calibri" w:hAnsi="Calibri" w:cs="Calibri"/>
+                <w:color w:val="000000"/>
+                <w:lang w:val="bs-Latn-BA" w:eastAsia="bs-Latn-BA"/>
+              </w:rPr>
               <w:t>83,88 ± 4,26</w:t>
             </w:r>
           </w:p>
@@ -23190,150 +23380,224 @@
       </w:tr>
       <w:tr>
         <w:trPr>
-          <w:divId w:val="1154031062"/>
-          <w:trHeight w:val="600"/>
+          <w:cnfStyle w:val="000000100000" w:firstRow="0" w:lastRow="0" w:firstColumn="0" w:lastColumn="0" w:oddVBand="0" w:evenVBand="0" w:oddHBand="1" w:evenHBand="0" w:firstRowFirstColumn="0" w:firstRowLastColumn="0" w:lastRowFirstColumn="0" w:lastRowLastColumn="0"/>
+          <w:trHeight w:val="845"/>
         </w:trPr>
         <w:tc>
           <w:tcPr>
-            <w:tcW w:w="1120" w:type="dxa"/>
+            <w:cnfStyle w:val="001000000000" w:firstRow="0" w:lastRow="0" w:firstColumn="1" w:lastColumn="0" w:oddVBand="0" w:evenVBand="0" w:oddHBand="0" w:evenHBand="0" w:firstRowFirstColumn="0" w:firstRowLastColumn="0" w:lastRowFirstColumn="0" w:lastRowLastColumn="0"/>
+            <w:tcW w:w="1042" w:type="dxa"/>
+            <w:vAlign w:val="center"/>
             <w:hideMark/>
           </w:tcPr>
           <w:p>
             <w:pPr>
-              <w:pStyle w:val="Paragraf"/>
-              <w:ind w:firstLine="0"/>
-              <w:jc w:val="left"/>
+              <w:jc w:val="center"/>
+              <w:rPr>
+                <w:color w:val="000000"/>
+                <w:lang w:val="bs-Latn-BA" w:eastAsia="bs-Latn-BA"/>
+              </w:rPr>
             </w:pPr>
             <w:r>
+              <w:rPr>
+                <w:color w:val="000000"/>
+                <w:lang w:val="bs-Latn-BA" w:eastAsia="bs-Latn-BA"/>
+              </w:rPr>
               <w:t>Odziv maligne klase</w:t>
             </w:r>
           </w:p>
         </w:tc>
         <w:tc>
           <w:tcPr>
-            <w:tcW w:w="1120" w:type="dxa"/>
+            <w:tcW w:w="1042" w:type="dxa"/>
+            <w:vAlign w:val="center"/>
             <w:hideMark/>
           </w:tcPr>
           <w:p>
             <w:pPr>
-              <w:pStyle w:val="Paragraf"/>
-              <w:ind w:firstLine="0"/>
-              <w:jc w:val="left"/>
+              <w:jc w:val="center"/>
+              <w:cnfStyle w:val="000000100000" w:firstRow="0" w:lastRow="0" w:firstColumn="0" w:lastColumn="0" w:oddVBand="0" w:evenVBand="0" w:oddHBand="1" w:evenHBand="0" w:firstRowFirstColumn="0" w:firstRowLastColumn="0" w:lastRowFirstColumn="0" w:lastRowLastColumn="0"/>
+              <w:rPr>
+                <w:color w:val="000000"/>
+                <w:lang w:val="bs-Latn-BA" w:eastAsia="bs-Latn-BA"/>
+              </w:rPr>
             </w:pPr>
             <w:r>
+              <w:rPr>
+                <w:color w:val="000000"/>
+                <w:lang w:val="bs-Latn-BA" w:eastAsia="bs-Latn-BA"/>
+              </w:rPr>
               <w:t>100,00%</w:t>
             </w:r>
           </w:p>
         </w:tc>
         <w:tc>
           <w:tcPr>
-            <w:tcW w:w="1120" w:type="dxa"/>
+            <w:tcW w:w="1042" w:type="dxa"/>
+            <w:vAlign w:val="center"/>
             <w:hideMark/>
           </w:tcPr>
           <w:p>
             <w:pPr>
-              <w:pStyle w:val="Paragraf"/>
-              <w:ind w:firstLine="0"/>
-              <w:jc w:val="left"/>
+              <w:jc w:val="center"/>
+              <w:cnfStyle w:val="000000100000" w:firstRow="0" w:lastRow="0" w:firstColumn="0" w:lastColumn="0" w:oddVBand="0" w:evenVBand="0" w:oddHBand="1" w:evenHBand="0" w:firstRowFirstColumn="0" w:firstRowLastColumn="0" w:lastRowFirstColumn="0" w:lastRowLastColumn="0"/>
+              <w:rPr>
+                <w:color w:val="000000"/>
+                <w:lang w:val="bs-Latn-BA" w:eastAsia="bs-Latn-BA"/>
+              </w:rPr>
             </w:pPr>
             <w:r>
+              <w:rPr>
+                <w:color w:val="000000"/>
+                <w:lang w:val="bs-Latn-BA" w:eastAsia="bs-Latn-BA"/>
+              </w:rPr>
               <w:t>100,00%</w:t>
             </w:r>
           </w:p>
         </w:tc>
         <w:tc>
           <w:tcPr>
-            <w:tcW w:w="1120" w:type="dxa"/>
+            <w:tcW w:w="1042" w:type="dxa"/>
+            <w:vAlign w:val="center"/>
             <w:hideMark/>
           </w:tcPr>
           <w:p>
             <w:pPr>
-              <w:pStyle w:val="Paragraf"/>
-              <w:ind w:firstLine="0"/>
-              <w:jc w:val="left"/>
+              <w:jc w:val="center"/>
+              <w:cnfStyle w:val="000000100000" w:firstRow="0" w:lastRow="0" w:firstColumn="0" w:lastColumn="0" w:oddVBand="0" w:evenVBand="0" w:oddHBand="1" w:evenHBand="0" w:firstRowFirstColumn="0" w:firstRowLastColumn="0" w:lastRowFirstColumn="0" w:lastRowLastColumn="0"/>
+              <w:rPr>
+                <w:color w:val="000000"/>
+                <w:lang w:val="bs-Latn-BA" w:eastAsia="bs-Latn-BA"/>
+              </w:rPr>
             </w:pPr>
             <w:r>
+              <w:rPr>
+                <w:color w:val="000000"/>
+                <w:lang w:val="bs-Latn-BA" w:eastAsia="bs-Latn-BA"/>
+              </w:rPr>
               <w:t>100,00%</w:t>
             </w:r>
           </w:p>
         </w:tc>
         <w:tc>
           <w:tcPr>
-            <w:tcW w:w="1120" w:type="dxa"/>
+            <w:tcW w:w="1042" w:type="dxa"/>
+            <w:vAlign w:val="center"/>
             <w:hideMark/>
           </w:tcPr>
           <w:p>
             <w:pPr>
-              <w:pStyle w:val="Paragraf"/>
-              <w:ind w:firstLine="0"/>
-              <w:jc w:val="left"/>
+              <w:jc w:val="center"/>
+              <w:cnfStyle w:val="000000100000" w:firstRow="0" w:lastRow="0" w:firstColumn="0" w:lastColumn="0" w:oddVBand="0" w:evenVBand="0" w:oddHBand="1" w:evenHBand="0" w:firstRowFirstColumn="0" w:firstRowLastColumn="0" w:lastRowFirstColumn="0" w:lastRowLastColumn="0"/>
+              <w:rPr>
+                <w:color w:val="000000"/>
+                <w:lang w:val="bs-Latn-BA" w:eastAsia="bs-Latn-BA"/>
+              </w:rPr>
             </w:pPr>
             <w:r>
+              <w:rPr>
+                <w:color w:val="000000"/>
+                <w:lang w:val="bs-Latn-BA" w:eastAsia="bs-Latn-BA"/>
+              </w:rPr>
               <w:t>100,00 ± 0,00</w:t>
             </w:r>
           </w:p>
         </w:tc>
         <w:tc>
           <w:tcPr>
-            <w:tcW w:w="1120" w:type="dxa"/>
+            <w:tcW w:w="1042" w:type="dxa"/>
+            <w:vAlign w:val="center"/>
             <w:hideMark/>
           </w:tcPr>
           <w:p>
             <w:pPr>
-              <w:pStyle w:val="Paragraf"/>
-              <w:ind w:firstLine="0"/>
-              <w:jc w:val="left"/>
+              <w:jc w:val="center"/>
+              <w:cnfStyle w:val="000000100000" w:firstRow="0" w:lastRow="0" w:firstColumn="0" w:lastColumn="0" w:oddVBand="0" w:evenVBand="0" w:oddHBand="1" w:evenHBand="0" w:firstRowFirstColumn="0" w:firstRowLastColumn="0" w:lastRowFirstColumn="0" w:lastRowLastColumn="0"/>
+              <w:rPr>
+                <w:color w:val="000000"/>
+                <w:lang w:val="bs-Latn-BA" w:eastAsia="bs-Latn-BA"/>
+              </w:rPr>
             </w:pPr>
             <w:r>
+              <w:rPr>
+                <w:color w:val="000000"/>
+                <w:lang w:val="bs-Latn-BA" w:eastAsia="bs-Latn-BA"/>
+              </w:rPr>
               <w:t>100,00%</w:t>
             </w:r>
           </w:p>
         </w:tc>
         <w:tc>
           <w:tcPr>
-            <w:tcW w:w="1120" w:type="dxa"/>
+            <w:tcW w:w="1042" w:type="dxa"/>
+            <w:vAlign w:val="center"/>
             <w:hideMark/>
           </w:tcPr>
           <w:p>
             <w:pPr>
-              <w:pStyle w:val="Paragraf"/>
-              <w:ind w:firstLine="0"/>
-              <w:jc w:val="left"/>
+              <w:jc w:val="center"/>
+              <w:cnfStyle w:val="000000100000" w:firstRow="0" w:lastRow="0" w:firstColumn="0" w:lastColumn="0" w:oddVBand="0" w:evenVBand="0" w:oddHBand="1" w:evenHBand="0" w:firstRowFirstColumn="0" w:firstRowLastColumn="0" w:lastRowFirstColumn="0" w:lastRowLastColumn="0"/>
+              <w:rPr>
+                <w:color w:val="000000"/>
+                <w:lang w:val="bs-Latn-BA" w:eastAsia="bs-Latn-BA"/>
+              </w:rPr>
             </w:pPr>
             <w:r>
+              <w:rPr>
+                <w:color w:val="000000"/>
+                <w:lang w:val="bs-Latn-BA" w:eastAsia="bs-Latn-BA"/>
+              </w:rPr>
               <w:t>100,00%</w:t>
             </w:r>
           </w:p>
         </w:tc>
         <w:tc>
           <w:tcPr>
-            <w:tcW w:w="1120" w:type="dxa"/>
+            <w:tcW w:w="1042" w:type="dxa"/>
+            <w:vAlign w:val="center"/>
             <w:hideMark/>
           </w:tcPr>
           <w:p>
             <w:pPr>
-              <w:pStyle w:val="Paragraf"/>
-              <w:ind w:firstLine="0"/>
-              <w:jc w:val="left"/>
+              <w:jc w:val="center"/>
+              <w:cnfStyle w:val="000000100000" w:firstRow="0" w:lastRow="0" w:firstColumn="0" w:lastColumn="0" w:oddVBand="0" w:evenVBand="0" w:oddHBand="1" w:evenHBand="0" w:firstRowFirstColumn="0" w:firstRowLastColumn="0" w:lastRowFirstColumn="0" w:lastRowLastColumn="0"/>
+              <w:rPr>
+                <w:color w:val="000000"/>
+                <w:lang w:val="bs-Latn-BA" w:eastAsia="bs-Latn-BA"/>
+              </w:rPr>
             </w:pPr>
             <w:r>
+              <w:rPr>
+                <w:color w:val="000000"/>
+                <w:lang w:val="bs-Latn-BA" w:eastAsia="bs-Latn-BA"/>
+              </w:rPr>
               <w:t>100,00%</w:t>
             </w:r>
           </w:p>
         </w:tc>
         <w:tc>
           <w:tcPr>
-            <w:tcW w:w="1120" w:type="dxa"/>
+            <w:tcW w:w="1042" w:type="dxa"/>
             <w:noWrap/>
+            <w:vAlign w:val="center"/>
             <w:hideMark/>
           </w:tcPr>
           <w:p>
             <w:pPr>
-              <w:pStyle w:val="Paragraf"/>
-              <w:ind w:firstLine="0"/>
-              <w:jc w:val="left"/>
+              <w:jc w:val="center"/>
+              <w:cnfStyle w:val="000000100000" w:firstRow="0" w:lastRow="0" w:firstColumn="0" w:lastColumn="0" w:oddVBand="0" w:evenVBand="0" w:oddHBand="1" w:evenHBand="0" w:firstRowFirstColumn="0" w:firstRowLastColumn="0" w:lastRowFirstColumn="0" w:lastRowLastColumn="0"/>
+              <w:rPr>
+                <w:rFonts w:ascii="Calibri" w:hAnsi="Calibri" w:cs="Calibri"/>
+                <w:color w:val="000000"/>
+                <w:lang w:val="bs-Latn-BA" w:eastAsia="bs-Latn-BA"/>
+              </w:rPr>
             </w:pPr>
             <w:r>
+              <w:rPr>
+                <w:rFonts w:ascii="Calibri" w:hAnsi="Calibri" w:cs="Calibri"/>
+                <w:color w:val="000000"/>
+                <w:lang w:val="bs-Latn-BA" w:eastAsia="bs-Latn-BA"/>
+              </w:rPr>
               <w:t>100,00 ± 0,00</w:t>
             </w:r>
           </w:p>
@@ -23341,150 +23605,223 @@
       </w:tr>
       <w:tr>
         <w:trPr>
-          <w:divId w:val="1154031062"/>
-          <w:trHeight w:val="600"/>
+          <w:trHeight w:val="845"/>
         </w:trPr>
         <w:tc>
           <w:tcPr>
-            <w:tcW w:w="1120" w:type="dxa"/>
+            <w:cnfStyle w:val="001000000000" w:firstRow="0" w:lastRow="0" w:firstColumn="1" w:lastColumn="0" w:oddVBand="0" w:evenVBand="0" w:oddHBand="0" w:evenHBand="0" w:firstRowFirstColumn="0" w:firstRowLastColumn="0" w:lastRowFirstColumn="0" w:lastRowLastColumn="0"/>
+            <w:tcW w:w="1042" w:type="dxa"/>
+            <w:vAlign w:val="center"/>
             <w:hideMark/>
           </w:tcPr>
           <w:p>
             <w:pPr>
-              <w:pStyle w:val="Paragraf"/>
-              <w:ind w:firstLine="0"/>
-              <w:jc w:val="left"/>
+              <w:jc w:val="center"/>
+              <w:rPr>
+                <w:color w:val="000000"/>
+                <w:lang w:val="bs-Latn-BA" w:eastAsia="bs-Latn-BA"/>
+              </w:rPr>
             </w:pPr>
             <w:r>
+              <w:rPr>
+                <w:color w:val="000000"/>
+                <w:lang w:val="bs-Latn-BA" w:eastAsia="bs-Latn-BA"/>
+              </w:rPr>
               <w:t>Makro preciznost</w:t>
             </w:r>
           </w:p>
         </w:tc>
         <w:tc>
           <w:tcPr>
-            <w:tcW w:w="1120" w:type="dxa"/>
+            <w:tcW w:w="1042" w:type="dxa"/>
+            <w:vAlign w:val="center"/>
             <w:hideMark/>
           </w:tcPr>
           <w:p>
             <w:pPr>
-              <w:pStyle w:val="Paragraf"/>
-              <w:ind w:firstLine="0"/>
-              <w:jc w:val="left"/>
+              <w:jc w:val="center"/>
+              <w:cnfStyle w:val="000000000000" w:firstRow="0" w:lastRow="0" w:firstColumn="0" w:lastColumn="0" w:oddVBand="0" w:evenVBand="0" w:oddHBand="0" w:evenHBand="0" w:firstRowFirstColumn="0" w:firstRowLastColumn="0" w:lastRowFirstColumn="0" w:lastRowLastColumn="0"/>
+              <w:rPr>
+                <w:color w:val="000000"/>
+                <w:lang w:val="bs-Latn-BA" w:eastAsia="bs-Latn-BA"/>
+              </w:rPr>
             </w:pPr>
             <w:r>
+              <w:rPr>
+                <w:color w:val="000000"/>
+                <w:lang w:val="bs-Latn-BA" w:eastAsia="bs-Latn-BA"/>
+              </w:rPr>
               <w:t>68,81%</w:t>
             </w:r>
           </w:p>
         </w:tc>
         <w:tc>
           <w:tcPr>
-            <w:tcW w:w="1120" w:type="dxa"/>
+            <w:tcW w:w="1042" w:type="dxa"/>
+            <w:vAlign w:val="center"/>
             <w:hideMark/>
           </w:tcPr>
           <w:p>
             <w:pPr>
-              <w:pStyle w:val="Paragraf"/>
-              <w:ind w:firstLine="0"/>
-              <w:jc w:val="left"/>
+              <w:jc w:val="center"/>
+              <w:cnfStyle w:val="000000000000" w:firstRow="0" w:lastRow="0" w:firstColumn="0" w:lastColumn="0" w:oddVBand="0" w:evenVBand="0" w:oddHBand="0" w:evenHBand="0" w:firstRowFirstColumn="0" w:firstRowLastColumn="0" w:lastRowFirstColumn="0" w:lastRowLastColumn="0"/>
+              <w:rPr>
+                <w:color w:val="000000"/>
+                <w:lang w:val="bs-Latn-BA" w:eastAsia="bs-Latn-BA"/>
+              </w:rPr>
             </w:pPr>
             <w:r>
+              <w:rPr>
+                <w:color w:val="000000"/>
+                <w:lang w:val="bs-Latn-BA" w:eastAsia="bs-Latn-BA"/>
+              </w:rPr>
               <w:t>74,76%</w:t>
             </w:r>
           </w:p>
         </w:tc>
         <w:tc>
           <w:tcPr>
-            <w:tcW w:w="1120" w:type="dxa"/>
+            <w:tcW w:w="1042" w:type="dxa"/>
+            <w:vAlign w:val="center"/>
             <w:hideMark/>
           </w:tcPr>
           <w:p>
             <w:pPr>
-              <w:pStyle w:val="Paragraf"/>
-              <w:ind w:firstLine="0"/>
-              <w:jc w:val="left"/>
+              <w:jc w:val="center"/>
+              <w:cnfStyle w:val="000000000000" w:firstRow="0" w:lastRow="0" w:firstColumn="0" w:lastColumn="0" w:oddVBand="0" w:evenVBand="0" w:oddHBand="0" w:evenHBand="0" w:firstRowFirstColumn="0" w:firstRowLastColumn="0" w:lastRowFirstColumn="0" w:lastRowLastColumn="0"/>
+              <w:rPr>
+                <w:color w:val="000000"/>
+                <w:lang w:val="bs-Latn-BA" w:eastAsia="bs-Latn-BA"/>
+              </w:rPr>
             </w:pPr>
             <w:r>
+              <w:rPr>
+                <w:color w:val="000000"/>
+                <w:lang w:val="bs-Latn-BA" w:eastAsia="bs-Latn-BA"/>
+              </w:rPr>
               <w:t>75,06%</w:t>
             </w:r>
           </w:p>
         </w:tc>
         <w:tc>
           <w:tcPr>
-            <w:tcW w:w="1120" w:type="dxa"/>
+            <w:tcW w:w="1042" w:type="dxa"/>
+            <w:vAlign w:val="center"/>
             <w:hideMark/>
           </w:tcPr>
           <w:p>
             <w:pPr>
-              <w:pStyle w:val="Paragraf"/>
-              <w:ind w:firstLine="0"/>
-              <w:jc w:val="left"/>
+              <w:jc w:val="center"/>
+              <w:cnfStyle w:val="000000000000" w:firstRow="0" w:lastRow="0" w:firstColumn="0" w:lastColumn="0" w:oddVBand="0" w:evenVBand="0" w:oddHBand="0" w:evenHBand="0" w:firstRowFirstColumn="0" w:firstRowLastColumn="0" w:lastRowFirstColumn="0" w:lastRowLastColumn="0"/>
+              <w:rPr>
+                <w:color w:val="000000"/>
+                <w:lang w:val="bs-Latn-BA" w:eastAsia="bs-Latn-BA"/>
+              </w:rPr>
             </w:pPr>
             <w:r>
+              <w:rPr>
+                <w:color w:val="000000"/>
+                <w:lang w:val="bs-Latn-BA" w:eastAsia="bs-Latn-BA"/>
+              </w:rPr>
               <w:t>72,88 ± 3,53</w:t>
             </w:r>
           </w:p>
         </w:tc>
         <w:tc>
           <w:tcPr>
-            <w:tcW w:w="1120" w:type="dxa"/>
+            <w:tcW w:w="1042" w:type="dxa"/>
+            <w:vAlign w:val="center"/>
             <w:hideMark/>
           </w:tcPr>
           <w:p>
             <w:pPr>
-              <w:pStyle w:val="Paragraf"/>
-              <w:ind w:firstLine="0"/>
-              <w:jc w:val="left"/>
+              <w:jc w:val="center"/>
+              <w:cnfStyle w:val="000000000000" w:firstRow="0" w:lastRow="0" w:firstColumn="0" w:lastColumn="0" w:oddVBand="0" w:evenVBand="0" w:oddHBand="0" w:evenHBand="0" w:firstRowFirstColumn="0" w:firstRowLastColumn="0" w:lastRowFirstColumn="0" w:lastRowLastColumn="0"/>
+              <w:rPr>
+                <w:color w:val="000000"/>
+                <w:lang w:val="bs-Latn-BA" w:eastAsia="bs-Latn-BA"/>
+              </w:rPr>
             </w:pPr>
             <w:r>
+              <w:rPr>
+                <w:color w:val="000000"/>
+                <w:lang w:val="bs-Latn-BA" w:eastAsia="bs-Latn-BA"/>
+              </w:rPr>
               <w:t>65,38%</w:t>
             </w:r>
           </w:p>
         </w:tc>
         <w:tc>
           <w:tcPr>
-            <w:tcW w:w="1120" w:type="dxa"/>
+            <w:tcW w:w="1042" w:type="dxa"/>
+            <w:vAlign w:val="center"/>
             <w:hideMark/>
           </w:tcPr>
           <w:p>
             <w:pPr>
-              <w:pStyle w:val="Paragraf"/>
-              <w:ind w:firstLine="0"/>
-              <w:jc w:val="left"/>
+              <w:jc w:val="center"/>
+              <w:cnfStyle w:val="000000000000" w:firstRow="0" w:lastRow="0" w:firstColumn="0" w:lastColumn="0" w:oddVBand="0" w:evenVBand="0" w:oddHBand="0" w:evenHBand="0" w:firstRowFirstColumn="0" w:firstRowLastColumn="0" w:lastRowFirstColumn="0" w:lastRowLastColumn="0"/>
+              <w:rPr>
+                <w:color w:val="000000"/>
+                <w:lang w:val="bs-Latn-BA" w:eastAsia="bs-Latn-BA"/>
+              </w:rPr>
             </w:pPr>
             <w:r>
+              <w:rPr>
+                <w:color w:val="000000"/>
+                <w:lang w:val="bs-Latn-BA" w:eastAsia="bs-Latn-BA"/>
+              </w:rPr>
               <w:t>72,45%</w:t>
             </w:r>
           </w:p>
         </w:tc>
         <w:tc>
           <w:tcPr>
-            <w:tcW w:w="1120" w:type="dxa"/>
+            <w:tcW w:w="1042" w:type="dxa"/>
+            <w:vAlign w:val="center"/>
             <w:hideMark/>
           </w:tcPr>
           <w:p>
             <w:pPr>
-              <w:pStyle w:val="Paragraf"/>
-              <w:ind w:firstLine="0"/>
-              <w:jc w:val="left"/>
+              <w:jc w:val="center"/>
+              <w:cnfStyle w:val="000000000000" w:firstRow="0" w:lastRow="0" w:firstColumn="0" w:lastColumn="0" w:oddVBand="0" w:evenVBand="0" w:oddHBand="0" w:evenHBand="0" w:firstRowFirstColumn="0" w:firstRowLastColumn="0" w:lastRowFirstColumn="0" w:lastRowLastColumn="0"/>
+              <w:rPr>
+                <w:color w:val="000000"/>
+                <w:lang w:val="bs-Latn-BA" w:eastAsia="bs-Latn-BA"/>
+              </w:rPr>
             </w:pPr>
             <w:r>
+              <w:rPr>
+                <w:color w:val="000000"/>
+                <w:lang w:val="bs-Latn-BA" w:eastAsia="bs-Latn-BA"/>
+              </w:rPr>
               <w:t>76,49%</w:t>
             </w:r>
           </w:p>
         </w:tc>
         <w:tc>
           <w:tcPr>
-            <w:tcW w:w="1120" w:type="dxa"/>
+            <w:tcW w:w="1042" w:type="dxa"/>
             <w:noWrap/>
+            <w:vAlign w:val="center"/>
             <w:hideMark/>
           </w:tcPr>
           <w:p>
             <w:pPr>
-              <w:pStyle w:val="Paragraf"/>
-              <w:ind w:firstLine="0"/>
-              <w:jc w:val="left"/>
+              <w:jc w:val="center"/>
+              <w:cnfStyle w:val="000000000000" w:firstRow="0" w:lastRow="0" w:firstColumn="0" w:lastColumn="0" w:oddVBand="0" w:evenVBand="0" w:oddHBand="0" w:evenHBand="0" w:firstRowFirstColumn="0" w:firstRowLastColumn="0" w:lastRowFirstColumn="0" w:lastRowLastColumn="0"/>
+              <w:rPr>
+                <w:rFonts w:ascii="Calibri" w:hAnsi="Calibri" w:cs="Calibri"/>
+                <w:color w:val="000000"/>
+                <w:lang w:val="bs-Latn-BA" w:eastAsia="bs-Latn-BA"/>
+              </w:rPr>
             </w:pPr>
             <w:r>
+              <w:rPr>
+                <w:rFonts w:ascii="Calibri" w:hAnsi="Calibri" w:cs="Calibri"/>
+                <w:color w:val="000000"/>
+                <w:lang w:val="bs-Latn-BA" w:eastAsia="bs-Latn-BA"/>
+              </w:rPr>
               <w:t>71,44 ± 5,62</w:t>
             </w:r>
           </w:p>
@@ -23492,150 +23829,259 @@
       </w:tr>
       <w:tr>
         <w:trPr>
-          <w:divId w:val="1154031062"/>
-          <w:trHeight w:val="600"/>
+          <w:cnfStyle w:val="000000100000" w:firstRow="0" w:lastRow="0" w:firstColumn="0" w:lastColumn="0" w:oddVBand="0" w:evenVBand="0" w:oddHBand="1" w:evenHBand="0" w:firstRowFirstColumn="0" w:firstRowLastColumn="0" w:lastRowFirstColumn="0" w:lastRowLastColumn="0"/>
+          <w:trHeight w:val="845"/>
         </w:trPr>
         <w:tc>
           <w:tcPr>
-            <w:tcW w:w="1120" w:type="dxa"/>
+            <w:cnfStyle w:val="001000000000" w:firstRow="0" w:lastRow="0" w:firstColumn="1" w:lastColumn="0" w:oddVBand="0" w:evenVBand="0" w:oddHBand="0" w:evenHBand="0" w:firstRowFirstColumn="0" w:firstRowLastColumn="0" w:lastRowFirstColumn="0" w:lastRowLastColumn="0"/>
+            <w:tcW w:w="1042" w:type="dxa"/>
+            <w:vAlign w:val="center"/>
             <w:hideMark/>
           </w:tcPr>
           <w:p>
             <w:pPr>
-              <w:pStyle w:val="Paragraf"/>
-              <w:ind w:firstLine="0"/>
-              <w:jc w:val="left"/>
+              <w:jc w:val="center"/>
+              <w:rPr>
+                <w:color w:val="000000"/>
+                <w:lang w:val="bs-Latn-BA" w:eastAsia="bs-Latn-BA"/>
+              </w:rPr>
             </w:pPr>
             <w:r>
+              <w:rPr>
+                <w:color w:val="000000"/>
+                <w:lang w:val="bs-Latn-BA" w:eastAsia="bs-Latn-BA"/>
+              </w:rPr>
               <w:t>Makro odziv</w:t>
             </w:r>
           </w:p>
         </w:tc>
         <w:tc>
           <w:tcPr>
-            <w:tcW w:w="1120" w:type="dxa"/>
+            <w:tcW w:w="1042" w:type="dxa"/>
+            <w:vAlign w:val="center"/>
             <w:hideMark/>
           </w:tcPr>
           <w:p>
             <w:pPr>
-              <w:pStyle w:val="Paragraf"/>
-              <w:ind w:firstLine="0"/>
-              <w:jc w:val="left"/>
+              <w:jc w:val="center"/>
+              <w:cnfStyle w:val="000000100000" w:firstRow="0" w:lastRow="0" w:firstColumn="0" w:lastColumn="0" w:oddVBand="0" w:evenVBand="0" w:oddHBand="1" w:evenHBand="0" w:firstRowFirstColumn="0" w:firstRowLastColumn="0" w:lastRowFirstColumn="0" w:lastRowLastColumn="0"/>
+              <w:rPr>
+                <w:color w:val="000000"/>
+                <w:lang w:val="bs-Latn-BA" w:eastAsia="bs-Latn-BA"/>
+              </w:rPr>
             </w:pPr>
             <w:r>
+              <w:rPr>
+                <w:color w:val="000000"/>
+                <w:lang w:val="bs-Latn-BA" w:eastAsia="bs-Latn-BA"/>
+              </w:rPr>
               <w:t>69,42%</w:t>
             </w:r>
           </w:p>
         </w:tc>
         <w:tc>
           <w:tcPr>
-            <w:tcW w:w="1120" w:type="dxa"/>
+            <w:tcW w:w="1042" w:type="dxa"/>
+            <w:vAlign w:val="center"/>
             <w:hideMark/>
           </w:tcPr>
           <w:p>
             <w:pPr>
-              <w:pStyle w:val="Paragraf"/>
-              <w:ind w:firstLine="0"/>
-              <w:jc w:val="left"/>
+              <w:jc w:val="center"/>
+              <w:cnfStyle w:val="000000100000" w:firstRow="0" w:lastRow="0" w:firstColumn="0" w:lastColumn="0" w:oddVBand="0" w:evenVBand="0" w:oddHBand="1" w:evenHBand="0" w:firstRowFirstColumn="0" w:firstRowLastColumn="0" w:lastRowFirstColumn="0" w:lastRowLastColumn="0"/>
+              <w:rPr>
+                <w:color w:val="000000"/>
+                <w:lang w:val="bs-Latn-BA" w:eastAsia="bs-Latn-BA"/>
+              </w:rPr>
             </w:pPr>
             <w:r>
+              <w:rPr>
+                <w:color w:val="000000"/>
+                <w:lang w:val="bs-Latn-BA" w:eastAsia="bs-Latn-BA"/>
+              </w:rPr>
               <w:t>78,27%</w:t>
             </w:r>
           </w:p>
         </w:tc>
         <w:tc>
           <w:tcPr>
-            <w:tcW w:w="1120" w:type="dxa"/>
+            <w:tcW w:w="1042" w:type="dxa"/>
+            <w:vAlign w:val="center"/>
             <w:hideMark/>
           </w:tcPr>
           <w:p>
             <w:pPr>
-              <w:pStyle w:val="Paragraf"/>
-              <w:ind w:firstLine="0"/>
-              <w:jc w:val="left"/>
+              <w:jc w:val="center"/>
+              <w:cnfStyle w:val="000000100000" w:firstRow="0" w:lastRow="0" w:firstColumn="0" w:lastColumn="0" w:oddVBand="0" w:evenVBand="0" w:oddHBand="1" w:evenHBand="0" w:firstRowFirstColumn="0" w:firstRowLastColumn="0" w:lastRowFirstColumn="0" w:lastRowLastColumn="0"/>
+              <w:rPr>
+                <w:color w:val="000000"/>
+                <w:lang w:val="bs-Latn-BA" w:eastAsia="bs-Latn-BA"/>
+              </w:rPr>
             </w:pPr>
             <w:r>
+              <w:rPr>
+                <w:color w:val="000000"/>
+                <w:lang w:val="bs-Latn-BA" w:eastAsia="bs-Latn-BA"/>
+              </w:rPr>
               <w:t>75,81%</w:t>
             </w:r>
           </w:p>
         </w:tc>
         <w:tc>
           <w:tcPr>
-            <w:tcW w:w="1120" w:type="dxa"/>
+            <w:tcW w:w="1042" w:type="dxa"/>
+            <w:vAlign w:val="center"/>
             <w:hideMark/>
           </w:tcPr>
           <w:p>
             <w:pPr>
-              <w:pStyle w:val="Paragraf"/>
-              <w:ind w:firstLine="0"/>
-              <w:jc w:val="left"/>
+              <w:jc w:val="center"/>
+              <w:cnfStyle w:val="000000100000" w:firstRow="0" w:lastRow="0" w:firstColumn="0" w:lastColumn="0" w:oddVBand="0" w:evenVBand="0" w:oddHBand="1" w:evenHBand="0" w:firstRowFirstColumn="0" w:firstRowLastColumn="0" w:lastRowFirstColumn="0" w:lastRowLastColumn="0"/>
+              <w:rPr>
+                <w:color w:val="000000"/>
+                <w:lang w:val="bs-Latn-BA" w:eastAsia="bs-Latn-BA"/>
+              </w:rPr>
             </w:pPr>
             <w:r>
-              <w:t>72,62 ± 4,52</w:t>
+              <w:rPr>
+                <w:color w:val="000000"/>
+                <w:lang w:val="bs-Latn-BA" w:eastAsia="bs-Latn-BA"/>
+              </w:rPr>
+              <w:t>7</w:t>
+            </w:r>
+            <w:r>
+              <w:rPr>
+                <w:color w:val="000000"/>
+                <w:lang w:val="bs-Latn-BA" w:eastAsia="bs-Latn-BA"/>
+              </w:rPr>
+              <w:t>4</w:t>
+            </w:r>
+            <w:r>
+              <w:rPr>
+                <w:color w:val="000000"/>
+                <w:lang w:val="bs-Latn-BA" w:eastAsia="bs-Latn-BA"/>
+              </w:rPr>
+              <w:t>,</w:t>
+            </w:r>
+            <w:r>
+              <w:rPr>
+                <w:color w:val="000000"/>
+                <w:lang w:val="bs-Latn-BA" w:eastAsia="bs-Latn-BA"/>
+              </w:rPr>
+              <w:t>50</w:t>
+            </w:r>
+            <w:r>
+              <w:rPr>
+                <w:color w:val="000000"/>
+                <w:lang w:val="bs-Latn-BA" w:eastAsia="bs-Latn-BA"/>
+              </w:rPr>
+              <w:t xml:space="preserve"> ± 4,5</w:t>
+            </w:r>
+            <w:r>
+              <w:rPr>
+                <w:color w:val="000000"/>
+                <w:lang w:val="bs-Latn-BA" w:eastAsia="bs-Latn-BA"/>
+              </w:rPr>
+              <w:t>7</w:t>
             </w:r>
           </w:p>
         </w:tc>
         <w:tc>
           <w:tcPr>
-            <w:tcW w:w="1120" w:type="dxa"/>
+            <w:tcW w:w="1042" w:type="dxa"/>
+            <w:vAlign w:val="center"/>
             <w:hideMark/>
           </w:tcPr>
           <w:p>
             <w:pPr>
-              <w:pStyle w:val="Paragraf"/>
-              <w:ind w:firstLine="0"/>
-              <w:jc w:val="left"/>
+              <w:jc w:val="center"/>
+              <w:cnfStyle w:val="000000100000" w:firstRow="0" w:lastRow="0" w:firstColumn="0" w:lastColumn="0" w:oddVBand="0" w:evenVBand="0" w:oddHBand="1" w:evenHBand="0" w:firstRowFirstColumn="0" w:firstRowLastColumn="0" w:lastRowFirstColumn="0" w:lastRowLastColumn="0"/>
+              <w:rPr>
+                <w:color w:val="000000"/>
+                <w:lang w:val="bs-Latn-BA" w:eastAsia="bs-Latn-BA"/>
+              </w:rPr>
             </w:pPr>
             <w:r>
+              <w:rPr>
+                <w:color w:val="000000"/>
+                <w:lang w:val="bs-Latn-BA" w:eastAsia="bs-Latn-BA"/>
+              </w:rPr>
               <w:t>64,83%</w:t>
             </w:r>
           </w:p>
         </w:tc>
         <w:tc>
           <w:tcPr>
-            <w:tcW w:w="1120" w:type="dxa"/>
+            <w:tcW w:w="1042" w:type="dxa"/>
+            <w:vAlign w:val="center"/>
             <w:hideMark/>
           </w:tcPr>
           <w:p>
             <w:pPr>
-              <w:pStyle w:val="Paragraf"/>
-              <w:ind w:firstLine="0"/>
-              <w:jc w:val="left"/>
+              <w:jc w:val="center"/>
+              <w:cnfStyle w:val="000000100000" w:firstRow="0" w:lastRow="0" w:firstColumn="0" w:lastColumn="0" w:oddVBand="0" w:evenVBand="0" w:oddHBand="1" w:evenHBand="0" w:firstRowFirstColumn="0" w:firstRowLastColumn="0" w:lastRowFirstColumn="0" w:lastRowLastColumn="0"/>
+              <w:rPr>
+                <w:color w:val="000000"/>
+                <w:lang w:val="bs-Latn-BA" w:eastAsia="bs-Latn-BA"/>
+              </w:rPr>
             </w:pPr>
             <w:r>
+              <w:rPr>
+                <w:color w:val="000000"/>
+                <w:lang w:val="bs-Latn-BA" w:eastAsia="bs-Latn-BA"/>
+              </w:rPr>
               <w:t>74,81%</w:t>
             </w:r>
           </w:p>
         </w:tc>
         <w:tc>
           <w:tcPr>
-            <w:tcW w:w="1120" w:type="dxa"/>
+            <w:tcW w:w="1042" w:type="dxa"/>
+            <w:vAlign w:val="center"/>
             <w:hideMark/>
           </w:tcPr>
           <w:p>
             <w:pPr>
-              <w:pStyle w:val="Paragraf"/>
-              <w:ind w:firstLine="0"/>
-              <w:jc w:val="left"/>
+              <w:jc w:val="center"/>
+              <w:cnfStyle w:val="000000100000" w:firstRow="0" w:lastRow="0" w:firstColumn="0" w:lastColumn="0" w:oddVBand="0" w:evenVBand="0" w:oddHBand="1" w:evenHBand="0" w:firstRowFirstColumn="0" w:firstRowLastColumn="0" w:lastRowFirstColumn="0" w:lastRowLastColumn="0"/>
+              <w:rPr>
+                <w:color w:val="000000"/>
+                <w:lang w:val="bs-Latn-BA" w:eastAsia="bs-Latn-BA"/>
+              </w:rPr>
             </w:pPr>
             <w:r>
+              <w:rPr>
+                <w:color w:val="000000"/>
+                <w:lang w:val="bs-Latn-BA" w:eastAsia="bs-Latn-BA"/>
+              </w:rPr>
               <w:t>71,09%</w:t>
             </w:r>
           </w:p>
         </w:tc>
         <w:tc>
           <w:tcPr>
-            <w:tcW w:w="1120" w:type="dxa"/>
+            <w:tcW w:w="1042" w:type="dxa"/>
             <w:noWrap/>
+            <w:vAlign w:val="center"/>
             <w:hideMark/>
           </w:tcPr>
           <w:p>
             <w:pPr>
-              <w:pStyle w:val="Paragraf"/>
-              <w:ind w:firstLine="0"/>
-              <w:jc w:val="left"/>
+              <w:jc w:val="center"/>
+              <w:cnfStyle w:val="000000100000" w:firstRow="0" w:lastRow="0" w:firstColumn="0" w:lastColumn="0" w:oddVBand="0" w:evenVBand="0" w:oddHBand="1" w:evenHBand="0" w:firstRowFirstColumn="0" w:firstRowLastColumn="0" w:lastRowFirstColumn="0" w:lastRowLastColumn="0"/>
+              <w:rPr>
+                <w:rFonts w:ascii="Calibri" w:hAnsi="Calibri" w:cs="Calibri"/>
+                <w:color w:val="000000"/>
+                <w:lang w:val="bs-Latn-BA" w:eastAsia="bs-Latn-BA"/>
+              </w:rPr>
             </w:pPr>
             <w:r>
+              <w:rPr>
+                <w:rFonts w:ascii="Calibri" w:hAnsi="Calibri" w:cs="Calibri"/>
+                <w:color w:val="000000"/>
+                <w:lang w:val="bs-Latn-BA" w:eastAsia="bs-Latn-BA"/>
+              </w:rPr>
               <w:t>70,24 ± 5,04</w:t>
             </w:r>
           </w:p>
@@ -23643,150 +24089,223 @@
       </w:tr>
       <w:tr>
         <w:trPr>
-          <w:divId w:val="1154031062"/>
-          <w:trHeight w:val="600"/>
+          <w:trHeight w:val="845"/>
         </w:trPr>
         <w:tc>
           <w:tcPr>
-            <w:tcW w:w="1120" w:type="dxa"/>
+            <w:cnfStyle w:val="001000000000" w:firstRow="0" w:lastRow="0" w:firstColumn="1" w:lastColumn="0" w:oddVBand="0" w:evenVBand="0" w:oddHBand="0" w:evenHBand="0" w:firstRowFirstColumn="0" w:firstRowLastColumn="0" w:lastRowFirstColumn="0" w:lastRowLastColumn="0"/>
+            <w:tcW w:w="1042" w:type="dxa"/>
+            <w:vAlign w:val="center"/>
             <w:hideMark/>
           </w:tcPr>
           <w:p>
             <w:pPr>
-              <w:pStyle w:val="Paragraf"/>
-              <w:ind w:firstLine="0"/>
-              <w:jc w:val="left"/>
+              <w:jc w:val="center"/>
+              <w:rPr>
+                <w:color w:val="000000"/>
+                <w:lang w:val="bs-Latn-BA" w:eastAsia="bs-Latn-BA"/>
+              </w:rPr>
             </w:pPr>
             <w:r>
+              <w:rPr>
+                <w:color w:val="000000"/>
+                <w:lang w:val="bs-Latn-BA" w:eastAsia="bs-Latn-BA"/>
+              </w:rPr>
               <w:t>Makro F1</w:t>
             </w:r>
           </w:p>
         </w:tc>
         <w:tc>
           <w:tcPr>
-            <w:tcW w:w="1120" w:type="dxa"/>
+            <w:tcW w:w="1042" w:type="dxa"/>
+            <w:vAlign w:val="center"/>
             <w:hideMark/>
           </w:tcPr>
           <w:p>
             <w:pPr>
-              <w:pStyle w:val="Paragraf"/>
-              <w:ind w:firstLine="0"/>
-              <w:jc w:val="left"/>
+              <w:jc w:val="center"/>
+              <w:cnfStyle w:val="000000000000" w:firstRow="0" w:lastRow="0" w:firstColumn="0" w:lastColumn="0" w:oddVBand="0" w:evenVBand="0" w:oddHBand="0" w:evenHBand="0" w:firstRowFirstColumn="0" w:firstRowLastColumn="0" w:lastRowFirstColumn="0" w:lastRowLastColumn="0"/>
+              <w:rPr>
+                <w:color w:val="000000"/>
+                <w:lang w:val="bs-Latn-BA" w:eastAsia="bs-Latn-BA"/>
+              </w:rPr>
             </w:pPr>
             <w:r>
+              <w:rPr>
+                <w:color w:val="000000"/>
+                <w:lang w:val="bs-Latn-BA" w:eastAsia="bs-Latn-BA"/>
+              </w:rPr>
               <w:t>68,53%</w:t>
             </w:r>
           </w:p>
         </w:tc>
         <w:tc>
           <w:tcPr>
-            <w:tcW w:w="1120" w:type="dxa"/>
+            <w:tcW w:w="1042" w:type="dxa"/>
+            <w:vAlign w:val="center"/>
             <w:hideMark/>
           </w:tcPr>
           <w:p>
             <w:pPr>
-              <w:pStyle w:val="Paragraf"/>
-              <w:ind w:firstLine="0"/>
-              <w:jc w:val="left"/>
+              <w:jc w:val="center"/>
+              <w:cnfStyle w:val="000000000000" w:firstRow="0" w:lastRow="0" w:firstColumn="0" w:lastColumn="0" w:oddVBand="0" w:evenVBand="0" w:oddHBand="0" w:evenHBand="0" w:firstRowFirstColumn="0" w:firstRowLastColumn="0" w:lastRowFirstColumn="0" w:lastRowLastColumn="0"/>
+              <w:rPr>
+                <w:color w:val="000000"/>
+                <w:lang w:val="bs-Latn-BA" w:eastAsia="bs-Latn-BA"/>
+              </w:rPr>
             </w:pPr>
             <w:r>
+              <w:rPr>
+                <w:color w:val="000000"/>
+                <w:lang w:val="bs-Latn-BA" w:eastAsia="bs-Latn-BA"/>
+              </w:rPr>
               <w:t>71,93%</w:t>
             </w:r>
           </w:p>
         </w:tc>
         <w:tc>
           <w:tcPr>
-            <w:tcW w:w="1120" w:type="dxa"/>
+            <w:tcW w:w="1042" w:type="dxa"/>
+            <w:vAlign w:val="center"/>
             <w:hideMark/>
           </w:tcPr>
           <w:p>
             <w:pPr>
-              <w:pStyle w:val="Paragraf"/>
-              <w:ind w:firstLine="0"/>
-              <w:jc w:val="left"/>
+              <w:jc w:val="center"/>
+              <w:cnfStyle w:val="000000000000" w:firstRow="0" w:lastRow="0" w:firstColumn="0" w:lastColumn="0" w:oddVBand="0" w:evenVBand="0" w:oddHBand="0" w:evenHBand="0" w:firstRowFirstColumn="0" w:firstRowLastColumn="0" w:lastRowFirstColumn="0" w:lastRowLastColumn="0"/>
+              <w:rPr>
+                <w:color w:val="000000"/>
+                <w:lang w:val="bs-Latn-BA" w:eastAsia="bs-Latn-BA"/>
+              </w:rPr>
             </w:pPr>
             <w:r>
+              <w:rPr>
+                <w:color w:val="000000"/>
+                <w:lang w:val="bs-Latn-BA" w:eastAsia="bs-Latn-BA"/>
+              </w:rPr>
               <w:t>75,37%</w:t>
             </w:r>
           </w:p>
         </w:tc>
         <w:tc>
           <w:tcPr>
-            <w:tcW w:w="1120" w:type="dxa"/>
+            <w:tcW w:w="1042" w:type="dxa"/>
+            <w:vAlign w:val="center"/>
             <w:hideMark/>
           </w:tcPr>
           <w:p>
             <w:pPr>
-              <w:pStyle w:val="Paragraf"/>
-              <w:ind w:firstLine="0"/>
-              <w:jc w:val="left"/>
+              <w:jc w:val="center"/>
+              <w:cnfStyle w:val="000000000000" w:firstRow="0" w:lastRow="0" w:firstColumn="0" w:lastColumn="0" w:oddVBand="0" w:evenVBand="0" w:oddHBand="0" w:evenHBand="0" w:firstRowFirstColumn="0" w:firstRowLastColumn="0" w:lastRowFirstColumn="0" w:lastRowLastColumn="0"/>
+              <w:rPr>
+                <w:color w:val="000000"/>
+                <w:lang w:val="bs-Latn-BA" w:eastAsia="bs-Latn-BA"/>
+              </w:rPr>
             </w:pPr>
             <w:r>
+              <w:rPr>
+                <w:color w:val="000000"/>
+                <w:lang w:val="bs-Latn-BA" w:eastAsia="bs-Latn-BA"/>
+              </w:rPr>
               <w:t>71,95 ± 4,84</w:t>
             </w:r>
           </w:p>
         </w:tc>
         <w:tc>
           <w:tcPr>
-            <w:tcW w:w="1120" w:type="dxa"/>
+            <w:tcW w:w="1042" w:type="dxa"/>
+            <w:vAlign w:val="center"/>
             <w:hideMark/>
           </w:tcPr>
           <w:p>
             <w:pPr>
-              <w:pStyle w:val="Paragraf"/>
-              <w:ind w:firstLine="0"/>
-              <w:jc w:val="left"/>
+              <w:jc w:val="center"/>
+              <w:cnfStyle w:val="000000000000" w:firstRow="0" w:lastRow="0" w:firstColumn="0" w:lastColumn="0" w:oddVBand="0" w:evenVBand="0" w:oddHBand="0" w:evenHBand="0" w:firstRowFirstColumn="0" w:firstRowLastColumn="0" w:lastRowFirstColumn="0" w:lastRowLastColumn="0"/>
+              <w:rPr>
+                <w:color w:val="000000"/>
+                <w:lang w:val="bs-Latn-BA" w:eastAsia="bs-Latn-BA"/>
+              </w:rPr>
             </w:pPr>
             <w:r>
+              <w:rPr>
+                <w:color w:val="000000"/>
+                <w:lang w:val="bs-Latn-BA" w:eastAsia="bs-Latn-BA"/>
+              </w:rPr>
               <w:t>64,94%</w:t>
             </w:r>
           </w:p>
         </w:tc>
         <w:tc>
           <w:tcPr>
-            <w:tcW w:w="1120" w:type="dxa"/>
+            <w:tcW w:w="1042" w:type="dxa"/>
+            <w:vAlign w:val="center"/>
             <w:hideMark/>
           </w:tcPr>
           <w:p>
             <w:pPr>
-              <w:pStyle w:val="Paragraf"/>
-              <w:ind w:firstLine="0"/>
-              <w:jc w:val="left"/>
+              <w:jc w:val="center"/>
+              <w:cnfStyle w:val="000000000000" w:firstRow="0" w:lastRow="0" w:firstColumn="0" w:lastColumn="0" w:oddVBand="0" w:evenVBand="0" w:oddHBand="0" w:evenHBand="0" w:firstRowFirstColumn="0" w:firstRowLastColumn="0" w:lastRowFirstColumn="0" w:lastRowLastColumn="0"/>
+              <w:rPr>
+                <w:color w:val="000000"/>
+                <w:lang w:val="bs-Latn-BA" w:eastAsia="bs-Latn-BA"/>
+              </w:rPr>
             </w:pPr>
             <w:r>
+              <w:rPr>
+                <w:color w:val="000000"/>
+                <w:lang w:val="bs-Latn-BA" w:eastAsia="bs-Latn-BA"/>
+              </w:rPr>
               <w:t>72,09%</w:t>
             </w:r>
           </w:p>
         </w:tc>
         <w:tc>
           <w:tcPr>
-            <w:tcW w:w="1120" w:type="dxa"/>
+            <w:tcW w:w="1042" w:type="dxa"/>
+            <w:vAlign w:val="center"/>
             <w:hideMark/>
           </w:tcPr>
           <w:p>
             <w:pPr>
-              <w:pStyle w:val="Paragraf"/>
-              <w:ind w:firstLine="0"/>
-              <w:jc w:val="left"/>
+              <w:jc w:val="center"/>
+              <w:cnfStyle w:val="000000000000" w:firstRow="0" w:lastRow="0" w:firstColumn="0" w:lastColumn="0" w:oddVBand="0" w:evenVBand="0" w:oddHBand="0" w:evenHBand="0" w:firstRowFirstColumn="0" w:firstRowLastColumn="0" w:lastRowFirstColumn="0" w:lastRowLastColumn="0"/>
+              <w:rPr>
+                <w:color w:val="000000"/>
+                <w:lang w:val="bs-Latn-BA" w:eastAsia="bs-Latn-BA"/>
+              </w:rPr>
             </w:pPr>
             <w:r>
+              <w:rPr>
+                <w:color w:val="000000"/>
+                <w:lang w:val="bs-Latn-BA" w:eastAsia="bs-Latn-BA"/>
+              </w:rPr>
               <w:t>71,48%</w:t>
             </w:r>
           </w:p>
         </w:tc>
         <w:tc>
           <w:tcPr>
-            <w:tcW w:w="1120" w:type="dxa"/>
+            <w:tcW w:w="1042" w:type="dxa"/>
             <w:noWrap/>
+            <w:vAlign w:val="center"/>
             <w:hideMark/>
           </w:tcPr>
           <w:p>
             <w:pPr>
-              <w:pStyle w:val="Paragraf"/>
-              <w:ind w:firstLine="0"/>
-              <w:jc w:val="left"/>
+              <w:jc w:val="center"/>
+              <w:cnfStyle w:val="000000000000" w:firstRow="0" w:lastRow="0" w:firstColumn="0" w:lastColumn="0" w:oddVBand="0" w:evenVBand="0" w:oddHBand="0" w:evenHBand="0" w:firstRowFirstColumn="0" w:firstRowLastColumn="0" w:lastRowFirstColumn="0" w:lastRowLastColumn="0"/>
+              <w:rPr>
+                <w:rFonts w:ascii="Calibri" w:hAnsi="Calibri" w:cs="Calibri"/>
+                <w:color w:val="000000"/>
+                <w:lang w:val="bs-Latn-BA" w:eastAsia="bs-Latn-BA"/>
+              </w:rPr>
             </w:pPr>
             <w:r>
+              <w:rPr>
+                <w:rFonts w:ascii="Calibri" w:hAnsi="Calibri" w:cs="Calibri"/>
+                <w:color w:val="000000"/>
+                <w:lang w:val="bs-Latn-BA" w:eastAsia="bs-Latn-BA"/>
+              </w:rPr>
               <w:t>69,50 ± 3,96</w:t>
             </w:r>
           </w:p>
@@ -23794,150 +24313,225 @@
       </w:tr>
       <w:tr>
         <w:trPr>
-          <w:divId w:val="1154031062"/>
-          <w:trHeight w:val="600"/>
+          <w:cnfStyle w:val="000000100000" w:firstRow="0" w:lastRow="0" w:firstColumn="0" w:lastColumn="0" w:oddVBand="0" w:evenVBand="0" w:oddHBand="1" w:evenHBand="0" w:firstRowFirstColumn="0" w:firstRowLastColumn="0" w:lastRowFirstColumn="0" w:lastRowLastColumn="0"/>
+          <w:trHeight w:val="845"/>
         </w:trPr>
         <w:tc>
           <w:tcPr>
-            <w:tcW w:w="1120" w:type="dxa"/>
+            <w:cnfStyle w:val="001000000000" w:firstRow="0" w:lastRow="0" w:firstColumn="1" w:lastColumn="0" w:oddVBand="0" w:evenVBand="0" w:oddHBand="0" w:evenHBand="0" w:firstRowFirstColumn="0" w:firstRowLastColumn="0" w:lastRowFirstColumn="0" w:lastRowLastColumn="0"/>
+            <w:tcW w:w="1042" w:type="dxa"/>
+            <w:vAlign w:val="center"/>
             <w:hideMark/>
           </w:tcPr>
           <w:p>
             <w:pPr>
-              <w:pStyle w:val="Paragraf"/>
-              <w:ind w:firstLine="0"/>
-              <w:jc w:val="left"/>
+              <w:jc w:val="center"/>
+              <w:rPr>
+                <w:color w:val="000000"/>
+                <w:lang w:val="bs-Latn-BA" w:eastAsia="bs-Latn-BA"/>
+              </w:rPr>
             </w:pPr>
             <w:r>
+              <w:rPr>
+                <w:color w:val="000000"/>
+                <w:lang w:val="bs-Latn-BA" w:eastAsia="bs-Latn-BA"/>
+              </w:rPr>
               <w:t>Makro AUC</w:t>
             </w:r>
           </w:p>
         </w:tc>
         <w:tc>
           <w:tcPr>
-            <w:tcW w:w="1120" w:type="dxa"/>
+            <w:tcW w:w="1042" w:type="dxa"/>
+            <w:vAlign w:val="center"/>
             <w:hideMark/>
           </w:tcPr>
           <w:p>
             <w:pPr>
-              <w:pStyle w:val="Paragraf"/>
-              <w:ind w:firstLine="0"/>
-              <w:jc w:val="left"/>
+              <w:jc w:val="center"/>
+              <w:cnfStyle w:val="000000100000" w:firstRow="0" w:lastRow="0" w:firstColumn="0" w:lastColumn="0" w:oddVBand="0" w:evenVBand="0" w:oddHBand="1" w:evenHBand="0" w:firstRowFirstColumn="0" w:firstRowLastColumn="0" w:lastRowFirstColumn="0" w:lastRowLastColumn="0"/>
+              <w:rPr>
+                <w:color w:val="000000"/>
+                <w:lang w:val="bs-Latn-BA" w:eastAsia="bs-Latn-BA"/>
+              </w:rPr>
             </w:pPr>
             <w:r>
+              <w:rPr>
+                <w:color w:val="000000"/>
+                <w:lang w:val="bs-Latn-BA" w:eastAsia="bs-Latn-BA"/>
+              </w:rPr>
               <w:t>91,49%</w:t>
             </w:r>
           </w:p>
         </w:tc>
         <w:tc>
           <w:tcPr>
-            <w:tcW w:w="1120" w:type="dxa"/>
+            <w:tcW w:w="1042" w:type="dxa"/>
+            <w:vAlign w:val="center"/>
             <w:hideMark/>
           </w:tcPr>
           <w:p>
             <w:pPr>
-              <w:pStyle w:val="Paragraf"/>
-              <w:ind w:firstLine="0"/>
-              <w:jc w:val="left"/>
+              <w:jc w:val="center"/>
+              <w:cnfStyle w:val="000000100000" w:firstRow="0" w:lastRow="0" w:firstColumn="0" w:lastColumn="0" w:oddVBand="0" w:evenVBand="0" w:oddHBand="1" w:evenHBand="0" w:firstRowFirstColumn="0" w:firstRowLastColumn="0" w:lastRowFirstColumn="0" w:lastRowLastColumn="0"/>
+              <w:rPr>
+                <w:color w:val="000000"/>
+                <w:lang w:val="bs-Latn-BA" w:eastAsia="bs-Latn-BA"/>
+              </w:rPr>
             </w:pPr>
             <w:r>
+              <w:rPr>
+                <w:color w:val="000000"/>
+                <w:lang w:val="bs-Latn-BA" w:eastAsia="bs-Latn-BA"/>
+              </w:rPr>
               <w:t>94,89%</w:t>
             </w:r>
           </w:p>
         </w:tc>
         <w:tc>
           <w:tcPr>
-            <w:tcW w:w="1120" w:type="dxa"/>
+            <w:tcW w:w="1042" w:type="dxa"/>
+            <w:vAlign w:val="center"/>
             <w:hideMark/>
           </w:tcPr>
           <w:p>
             <w:pPr>
-              <w:pStyle w:val="Paragraf"/>
-              <w:ind w:firstLine="0"/>
-              <w:jc w:val="left"/>
+              <w:jc w:val="center"/>
+              <w:cnfStyle w:val="000000100000" w:firstRow="0" w:lastRow="0" w:firstColumn="0" w:lastColumn="0" w:oddVBand="0" w:evenVBand="0" w:oddHBand="1" w:evenHBand="0" w:firstRowFirstColumn="0" w:firstRowLastColumn="0" w:lastRowFirstColumn="0" w:lastRowLastColumn="0"/>
+              <w:rPr>
+                <w:color w:val="000000"/>
+                <w:lang w:val="bs-Latn-BA" w:eastAsia="bs-Latn-BA"/>
+              </w:rPr>
             </w:pPr>
             <w:r>
+              <w:rPr>
+                <w:color w:val="000000"/>
+                <w:lang w:val="bs-Latn-BA" w:eastAsia="bs-Latn-BA"/>
+              </w:rPr>
               <w:t>93,14%</w:t>
             </w:r>
           </w:p>
         </w:tc>
         <w:tc>
           <w:tcPr>
-            <w:tcW w:w="1120" w:type="dxa"/>
+            <w:tcW w:w="1042" w:type="dxa"/>
+            <w:vAlign w:val="center"/>
             <w:hideMark/>
           </w:tcPr>
           <w:p>
             <w:pPr>
-              <w:pStyle w:val="Paragraf"/>
-              <w:ind w:firstLine="0"/>
-              <w:jc w:val="left"/>
+              <w:jc w:val="center"/>
+              <w:cnfStyle w:val="000000100000" w:firstRow="0" w:lastRow="0" w:firstColumn="0" w:lastColumn="0" w:oddVBand="0" w:evenVBand="0" w:oddHBand="1" w:evenHBand="0" w:firstRowFirstColumn="0" w:firstRowLastColumn="0" w:lastRowFirstColumn="0" w:lastRowLastColumn="0"/>
+              <w:rPr>
+                <w:color w:val="000000"/>
+                <w:lang w:val="bs-Latn-BA" w:eastAsia="bs-Latn-BA"/>
+              </w:rPr>
             </w:pPr>
             <w:r>
+              <w:rPr>
+                <w:color w:val="000000"/>
+                <w:lang w:val="bs-Latn-BA" w:eastAsia="bs-Latn-BA"/>
+              </w:rPr>
               <w:t>93,17 ± 1,70</w:t>
             </w:r>
           </w:p>
         </w:tc>
         <w:tc>
           <w:tcPr>
-            <w:tcW w:w="1120" w:type="dxa"/>
+            <w:tcW w:w="1042" w:type="dxa"/>
+            <w:vAlign w:val="center"/>
             <w:hideMark/>
           </w:tcPr>
           <w:p>
             <w:pPr>
-              <w:pStyle w:val="Paragraf"/>
-              <w:ind w:firstLine="0"/>
-              <w:jc w:val="left"/>
+              <w:jc w:val="center"/>
+              <w:cnfStyle w:val="000000100000" w:firstRow="0" w:lastRow="0" w:firstColumn="0" w:lastColumn="0" w:oddVBand="0" w:evenVBand="0" w:oddHBand="1" w:evenHBand="0" w:firstRowFirstColumn="0" w:firstRowLastColumn="0" w:lastRowFirstColumn="0" w:lastRowLastColumn="0"/>
+              <w:rPr>
+                <w:color w:val="000000"/>
+                <w:lang w:val="bs-Latn-BA" w:eastAsia="bs-Latn-BA"/>
+              </w:rPr>
             </w:pPr>
             <w:r>
+              <w:rPr>
+                <w:color w:val="000000"/>
+                <w:lang w:val="bs-Latn-BA" w:eastAsia="bs-Latn-BA"/>
+              </w:rPr>
               <w:t>91,46%</w:t>
             </w:r>
           </w:p>
         </w:tc>
         <w:tc>
           <w:tcPr>
-            <w:tcW w:w="1120" w:type="dxa"/>
+            <w:tcW w:w="1042" w:type="dxa"/>
+            <w:vAlign w:val="center"/>
             <w:hideMark/>
           </w:tcPr>
           <w:p>
             <w:pPr>
-              <w:pStyle w:val="Paragraf"/>
-              <w:ind w:firstLine="0"/>
-              <w:jc w:val="left"/>
+              <w:jc w:val="center"/>
+              <w:cnfStyle w:val="000000100000" w:firstRow="0" w:lastRow="0" w:firstColumn="0" w:lastColumn="0" w:oddVBand="0" w:evenVBand="0" w:oddHBand="1" w:evenHBand="0" w:firstRowFirstColumn="0" w:firstRowLastColumn="0" w:lastRowFirstColumn="0" w:lastRowLastColumn="0"/>
+              <w:rPr>
+                <w:color w:val="000000"/>
+                <w:lang w:val="bs-Latn-BA" w:eastAsia="bs-Latn-BA"/>
+              </w:rPr>
             </w:pPr>
             <w:r>
+              <w:rPr>
+                <w:color w:val="000000"/>
+                <w:lang w:val="bs-Latn-BA" w:eastAsia="bs-Latn-BA"/>
+              </w:rPr>
               <w:t>91,87%</w:t>
             </w:r>
           </w:p>
         </w:tc>
         <w:tc>
           <w:tcPr>
-            <w:tcW w:w="1120" w:type="dxa"/>
+            <w:tcW w:w="1042" w:type="dxa"/>
+            <w:vAlign w:val="center"/>
             <w:hideMark/>
           </w:tcPr>
           <w:p>
             <w:pPr>
-              <w:pStyle w:val="Paragraf"/>
-              <w:ind w:firstLine="0"/>
-              <w:jc w:val="left"/>
+              <w:jc w:val="center"/>
+              <w:cnfStyle w:val="000000100000" w:firstRow="0" w:lastRow="0" w:firstColumn="0" w:lastColumn="0" w:oddVBand="0" w:evenVBand="0" w:oddHBand="1" w:evenHBand="0" w:firstRowFirstColumn="0" w:firstRowLastColumn="0" w:lastRowFirstColumn="0" w:lastRowLastColumn="0"/>
+              <w:rPr>
+                <w:color w:val="000000"/>
+                <w:lang w:val="bs-Latn-BA" w:eastAsia="bs-Latn-BA"/>
+              </w:rPr>
             </w:pPr>
             <w:r>
+              <w:rPr>
+                <w:color w:val="000000"/>
+                <w:lang w:val="bs-Latn-BA" w:eastAsia="bs-Latn-BA"/>
+              </w:rPr>
               <w:t>93,21%</w:t>
             </w:r>
           </w:p>
         </w:tc>
         <w:tc>
           <w:tcPr>
-            <w:tcW w:w="1120" w:type="dxa"/>
+            <w:tcW w:w="1042" w:type="dxa"/>
             <w:noWrap/>
+            <w:vAlign w:val="center"/>
             <w:hideMark/>
           </w:tcPr>
           <w:p>
             <w:pPr>
-              <w:pStyle w:val="Paragraf"/>
-              <w:ind w:firstLine="0"/>
-              <w:jc w:val="left"/>
+              <w:keepNext/>
+              <w:jc w:val="center"/>
+              <w:cnfStyle w:val="000000100000" w:firstRow="0" w:lastRow="0" w:firstColumn="0" w:lastColumn="0" w:oddVBand="0" w:evenVBand="0" w:oddHBand="1" w:evenHBand="0" w:firstRowFirstColumn="0" w:firstRowLastColumn="0" w:lastRowFirstColumn="0" w:lastRowLastColumn="0"/>
+              <w:rPr>
+                <w:rFonts w:ascii="Calibri" w:hAnsi="Calibri" w:cs="Calibri"/>
+                <w:color w:val="000000"/>
+                <w:lang w:val="bs-Latn-BA" w:eastAsia="bs-Latn-BA"/>
+              </w:rPr>
             </w:pPr>
             <w:r>
+              <w:rPr>
+                <w:rFonts w:ascii="Calibri" w:hAnsi="Calibri" w:cs="Calibri"/>
+                <w:color w:val="000000"/>
+                <w:lang w:val="bs-Latn-BA" w:eastAsia="bs-Latn-BA"/>
+              </w:rPr>
               <w:t>92,18 ± 0,92</w:t>
             </w:r>
           </w:p>
@@ -23946,6 +24540,45 @@
     </w:tbl>
     <w:p>
       <w:pPr>
+        <w:pStyle w:val="Caption"/>
+      </w:pPr>
+    </w:p>
+    <w:p>
+      <w:pPr>
+        <w:pStyle w:val="Caption"/>
+        <w:rPr>
+          <w:rFonts w:asciiTheme="minorHAnsi" w:hAnsiTheme="minorHAnsi"/>
+          <w:sz w:val="22"/>
+          <w:lang w:val="en-US"/>
+        </w:rPr>
+      </w:pPr>
+      <w:r>
+        <w:t xml:space="preserve">Tablica </w:t>
+      </w:r>
+      <w:r>
+        <w:fldChar w:fldCharType="begin"/>
+      </w:r>
+      <w:r>
+        <w:instrText xml:space="preserve"> SEQ Tablica \* ARABIC </w:instrText>
+      </w:r>
+      <w:r>
+        <w:fldChar w:fldCharType="separate"/>
+      </w:r>
+      <w:r>
+        <w:rPr>
+          <w:noProof/>
+        </w:rPr>
+        <w:t>2</w:t>
+      </w:r>
+      <w:r>
+        <w:fldChar w:fldCharType="end"/>
+      </w:r>
+      <w:r>
+        <w:t xml:space="preserve"> Glavne metrike modela</w:t>
+      </w:r>
+    </w:p>
+    <w:p>
+      <w:pPr>
         <w:pStyle w:val="Paragraf"/>
         <w:ind w:firstLine="0"/>
         <w:rPr>
@@ -23954,44 +24587,1903 @@
           <w:lang w:val="en-US"/>
         </w:rPr>
       </w:pPr>
-      <w:r>
-        <w:rPr>
-          <w:lang w:val="bs-Latn-BA"/>
-        </w:rPr>
-        <w:fldChar w:fldCharType="end"/>
-      </w:r>
-      <w:r>
-        <w:rPr>
-          <w:lang w:val="bs-Latn-BA"/>
-        </w:rPr>
-        <w:fldChar w:fldCharType="begin"/>
-      </w:r>
-      <w:r>
-        <w:rPr>
-          <w:lang w:val="bs-Latn-BA"/>
-        </w:rPr>
-        <w:instrText xml:space="preserve"> LINK Excel.Sheet.12 "C:\\Users\\Administrator\\source\\repos\\omarkurtovic\\ml-dotnet-vs-python\\Word\\rezultati.xlsx" "Sheet1!R1C1:R8C9" \a \f 5 \h </w:instrText>
-      </w:r>
-      <w:r>
-        <w:rPr>
-          <w:lang w:val="bs-Latn-BA"/>
-        </w:rPr>
-        <w:fldChar w:fldCharType="separate"/>
-      </w:r>
+    </w:p>
+    <w:p>
+      <w:pPr>
+        <w:pStyle w:val="Heading2"/>
+        <w:rPr>
+          <w:lang w:val="en-US"/>
+        </w:rPr>
+      </w:pPr>
+      <w:proofErr w:type="spellStart"/>
+      <w:r>
+        <w:rPr>
+          <w:lang w:val="en-US"/>
+        </w:rPr>
+        <w:lastRenderedPageBreak/>
+        <w:t>Dodani</w:t>
+      </w:r>
+      <w:proofErr w:type="spellEnd"/>
+      <w:r>
+        <w:rPr>
+          <w:lang w:val="en-US"/>
+        </w:rPr>
+        <w:t xml:space="preserve"> </w:t>
+      </w:r>
+      <w:proofErr w:type="spellStart"/>
+      <w:r>
+        <w:rPr>
+          <w:lang w:val="en-US"/>
+        </w:rPr>
+        <w:t>rezultati</w:t>
+      </w:r>
+      <w:proofErr w:type="spellEnd"/>
+    </w:p>
+    <w:p>
+      <w:pPr>
+        <w:rPr>
+          <w:lang w:val="en-US"/>
+        </w:rPr>
+      </w:pPr>
     </w:p>
     <w:p>
       <w:pPr>
         <w:pStyle w:val="Paragraf"/>
         <w:ind w:firstLine="0"/>
         <w:rPr>
+          <w:rFonts w:asciiTheme="minorHAnsi" w:hAnsiTheme="minorHAnsi"/>
+          <w:sz w:val="22"/>
+          <w:lang w:val="en-US"/>
+        </w:rPr>
+      </w:pPr>
+      <w:proofErr w:type="spellStart"/>
+      <w:r>
+        <w:rPr>
+          <w:rFonts w:asciiTheme="minorHAnsi" w:hAnsiTheme="minorHAnsi"/>
+          <w:sz w:val="22"/>
+          <w:lang w:val="en-US"/>
+        </w:rPr>
+        <w:t>Osim</w:t>
+      </w:r>
+      <w:proofErr w:type="spellEnd"/>
+      <w:r>
+        <w:rPr>
+          <w:rFonts w:asciiTheme="minorHAnsi" w:hAnsiTheme="minorHAnsi"/>
+          <w:sz w:val="22"/>
+          <w:lang w:val="en-US"/>
+        </w:rPr>
+        <w:t xml:space="preserve"> </w:t>
+      </w:r>
+      <w:proofErr w:type="spellStart"/>
+      <w:r>
+        <w:rPr>
+          <w:rFonts w:asciiTheme="minorHAnsi" w:hAnsiTheme="minorHAnsi"/>
+          <w:sz w:val="22"/>
+          <w:lang w:val="en-US"/>
+        </w:rPr>
+        <w:t>datih</w:t>
+      </w:r>
+      <w:proofErr w:type="spellEnd"/>
+      <w:r>
+        <w:rPr>
+          <w:rFonts w:asciiTheme="minorHAnsi" w:hAnsiTheme="minorHAnsi"/>
+          <w:sz w:val="22"/>
+          <w:lang w:val="en-US"/>
+        </w:rPr>
+        <w:t xml:space="preserve"> </w:t>
+      </w:r>
+      <w:proofErr w:type="spellStart"/>
+      <w:r>
+        <w:rPr>
+          <w:rFonts w:asciiTheme="minorHAnsi" w:hAnsiTheme="minorHAnsi"/>
+          <w:sz w:val="22"/>
+          <w:lang w:val="en-US"/>
+        </w:rPr>
+        <w:t>metrika</w:t>
+      </w:r>
+      <w:proofErr w:type="spellEnd"/>
+      <w:r>
+        <w:rPr>
+          <w:rFonts w:asciiTheme="minorHAnsi" w:hAnsiTheme="minorHAnsi"/>
+          <w:sz w:val="22"/>
+          <w:lang w:val="en-US"/>
+        </w:rPr>
+        <w:t xml:space="preserve"> </w:t>
+      </w:r>
+      <w:proofErr w:type="spellStart"/>
+      <w:r>
+        <w:rPr>
+          <w:rFonts w:asciiTheme="minorHAnsi" w:hAnsiTheme="minorHAnsi"/>
+          <w:sz w:val="22"/>
+          <w:lang w:val="en-US"/>
+        </w:rPr>
+        <w:t>također</w:t>
+      </w:r>
+      <w:proofErr w:type="spellEnd"/>
+      <w:r>
+        <w:rPr>
+          <w:rFonts w:asciiTheme="minorHAnsi" w:hAnsiTheme="minorHAnsi"/>
+          <w:sz w:val="22"/>
+          <w:lang w:val="en-US"/>
+        </w:rPr>
+        <w:t xml:space="preserve"> </w:t>
+      </w:r>
+      <w:proofErr w:type="spellStart"/>
+      <w:r>
+        <w:rPr>
+          <w:rFonts w:asciiTheme="minorHAnsi" w:hAnsiTheme="minorHAnsi"/>
+          <w:sz w:val="22"/>
+          <w:lang w:val="en-US"/>
+        </w:rPr>
+        <w:t>možemo</w:t>
+      </w:r>
+      <w:proofErr w:type="spellEnd"/>
+      <w:r>
+        <w:rPr>
+          <w:rFonts w:asciiTheme="minorHAnsi" w:hAnsiTheme="minorHAnsi"/>
+          <w:sz w:val="22"/>
+          <w:lang w:val="en-US"/>
+        </w:rPr>
+        <w:t xml:space="preserve"> </w:t>
+      </w:r>
+      <w:proofErr w:type="spellStart"/>
+      <w:r>
+        <w:rPr>
+          <w:rFonts w:asciiTheme="minorHAnsi" w:hAnsiTheme="minorHAnsi"/>
+          <w:sz w:val="22"/>
+          <w:lang w:val="en-US"/>
+        </w:rPr>
+        <w:t>pogledati</w:t>
+      </w:r>
+      <w:proofErr w:type="spellEnd"/>
+      <w:r>
+        <w:rPr>
+          <w:rFonts w:asciiTheme="minorHAnsi" w:hAnsiTheme="minorHAnsi"/>
+          <w:sz w:val="22"/>
+          <w:lang w:val="en-US"/>
+        </w:rPr>
+        <w:t xml:space="preserve"> </w:t>
+      </w:r>
+      <w:proofErr w:type="spellStart"/>
+      <w:r>
+        <w:rPr>
+          <w:rFonts w:asciiTheme="minorHAnsi" w:hAnsiTheme="minorHAnsi"/>
+          <w:sz w:val="22"/>
+          <w:lang w:val="en-US"/>
+        </w:rPr>
+        <w:t>i</w:t>
+      </w:r>
+      <w:proofErr w:type="spellEnd"/>
+      <w:r>
+        <w:rPr>
+          <w:rFonts w:asciiTheme="minorHAnsi" w:hAnsiTheme="minorHAnsi"/>
+          <w:sz w:val="22"/>
+          <w:lang w:val="en-US"/>
+        </w:rPr>
+        <w:t xml:space="preserve"> </w:t>
+      </w:r>
+      <w:proofErr w:type="spellStart"/>
+      <w:r>
+        <w:rPr>
+          <w:rFonts w:asciiTheme="minorHAnsi" w:hAnsiTheme="minorHAnsi"/>
+          <w:sz w:val="22"/>
+          <w:lang w:val="en-US"/>
+        </w:rPr>
+        <w:t>metrike</w:t>
+      </w:r>
+      <w:proofErr w:type="spellEnd"/>
+      <w:r>
+        <w:rPr>
+          <w:rFonts w:asciiTheme="minorHAnsi" w:hAnsiTheme="minorHAnsi"/>
+          <w:sz w:val="22"/>
+          <w:lang w:val="en-US"/>
+        </w:rPr>
+        <w:t xml:space="preserve"> </w:t>
+      </w:r>
+      <w:proofErr w:type="spellStart"/>
+      <w:r>
+        <w:rPr>
+          <w:rFonts w:asciiTheme="minorHAnsi" w:hAnsiTheme="minorHAnsi"/>
+          <w:sz w:val="22"/>
+          <w:lang w:val="en-US"/>
+        </w:rPr>
+        <w:t>poput</w:t>
+      </w:r>
+      <w:proofErr w:type="spellEnd"/>
+      <w:r>
+        <w:rPr>
+          <w:rFonts w:asciiTheme="minorHAnsi" w:hAnsiTheme="minorHAnsi"/>
+          <w:sz w:val="22"/>
+          <w:lang w:val="en-US"/>
+        </w:rPr>
+        <w:t xml:space="preserve"> </w:t>
+      </w:r>
+      <w:proofErr w:type="spellStart"/>
+      <w:r>
+        <w:rPr>
+          <w:rFonts w:asciiTheme="minorHAnsi" w:hAnsiTheme="minorHAnsi"/>
+          <w:sz w:val="22"/>
+          <w:lang w:val="en-US"/>
+        </w:rPr>
+        <w:t>odziva</w:t>
+      </w:r>
+      <w:proofErr w:type="spellEnd"/>
+      <w:r>
+        <w:rPr>
+          <w:rFonts w:asciiTheme="minorHAnsi" w:hAnsiTheme="minorHAnsi"/>
+          <w:sz w:val="22"/>
+          <w:lang w:val="en-US"/>
+        </w:rPr>
+        <w:t xml:space="preserve">, </w:t>
+      </w:r>
+      <w:proofErr w:type="spellStart"/>
+      <w:r>
+        <w:rPr>
+          <w:rFonts w:asciiTheme="minorHAnsi" w:hAnsiTheme="minorHAnsi"/>
+          <w:sz w:val="22"/>
+          <w:lang w:val="en-US"/>
+        </w:rPr>
+        <w:t>preciznost</w:t>
+      </w:r>
+      <w:proofErr w:type="spellEnd"/>
+      <w:r>
+        <w:rPr>
+          <w:rFonts w:asciiTheme="minorHAnsi" w:hAnsiTheme="minorHAnsi"/>
+          <w:sz w:val="22"/>
+          <w:lang w:val="en-US"/>
+        </w:rPr>
+        <w:t xml:space="preserve">, F1 </w:t>
+      </w:r>
+      <w:proofErr w:type="spellStart"/>
+      <w:r>
+        <w:rPr>
+          <w:rFonts w:asciiTheme="minorHAnsi" w:hAnsiTheme="minorHAnsi"/>
+          <w:sz w:val="22"/>
+          <w:lang w:val="en-US"/>
+        </w:rPr>
+        <w:t>skor</w:t>
+      </w:r>
+      <w:proofErr w:type="spellEnd"/>
+      <w:r>
+        <w:rPr>
+          <w:rFonts w:asciiTheme="minorHAnsi" w:hAnsiTheme="minorHAnsi"/>
+          <w:sz w:val="22"/>
+          <w:lang w:val="en-US"/>
+        </w:rPr>
+        <w:t xml:space="preserve"> </w:t>
+      </w:r>
+      <w:proofErr w:type="spellStart"/>
+      <w:r>
+        <w:rPr>
+          <w:rFonts w:asciiTheme="minorHAnsi" w:hAnsiTheme="minorHAnsi"/>
+          <w:sz w:val="22"/>
+          <w:lang w:val="en-US"/>
+        </w:rPr>
+        <w:t>i</w:t>
+      </w:r>
+      <w:proofErr w:type="spellEnd"/>
+      <w:r>
+        <w:rPr>
+          <w:rFonts w:asciiTheme="minorHAnsi" w:hAnsiTheme="minorHAnsi"/>
+          <w:sz w:val="22"/>
+          <w:lang w:val="en-US"/>
+        </w:rPr>
+        <w:t xml:space="preserve"> AUC za </w:t>
+      </w:r>
+      <w:proofErr w:type="spellStart"/>
+      <w:r>
+        <w:rPr>
+          <w:rFonts w:asciiTheme="minorHAnsi" w:hAnsiTheme="minorHAnsi"/>
+          <w:sz w:val="22"/>
+          <w:lang w:val="en-US"/>
+        </w:rPr>
+        <w:t>svaku</w:t>
+      </w:r>
+      <w:proofErr w:type="spellEnd"/>
+      <w:r>
+        <w:rPr>
+          <w:rFonts w:asciiTheme="minorHAnsi" w:hAnsiTheme="minorHAnsi"/>
+          <w:sz w:val="22"/>
+          <w:lang w:val="en-US"/>
+        </w:rPr>
+        <w:t xml:space="preserve"> </w:t>
+      </w:r>
+      <w:proofErr w:type="spellStart"/>
+      <w:r>
+        <w:rPr>
+          <w:rFonts w:asciiTheme="minorHAnsi" w:hAnsiTheme="minorHAnsi"/>
+          <w:sz w:val="22"/>
+          <w:lang w:val="en-US"/>
+        </w:rPr>
+        <w:t>pojedinačnu</w:t>
+      </w:r>
+      <w:proofErr w:type="spellEnd"/>
+      <w:r>
+        <w:rPr>
+          <w:rFonts w:asciiTheme="minorHAnsi" w:hAnsiTheme="minorHAnsi"/>
+          <w:sz w:val="22"/>
+          <w:lang w:val="en-US"/>
+        </w:rPr>
+        <w:t xml:space="preserve"> </w:t>
+      </w:r>
+      <w:proofErr w:type="spellStart"/>
+      <w:r>
+        <w:rPr>
+          <w:rFonts w:asciiTheme="minorHAnsi" w:hAnsiTheme="minorHAnsi"/>
+          <w:sz w:val="22"/>
+          <w:lang w:val="en-US"/>
+        </w:rPr>
+        <w:t>klasu</w:t>
+      </w:r>
+      <w:proofErr w:type="spellEnd"/>
+      <w:r>
+        <w:rPr>
+          <w:rFonts w:asciiTheme="minorHAnsi" w:hAnsiTheme="minorHAnsi"/>
+          <w:sz w:val="22"/>
+          <w:lang w:val="en-US"/>
+        </w:rPr>
+        <w:t xml:space="preserve">. U </w:t>
+      </w:r>
+      <w:proofErr w:type="spellStart"/>
+      <w:r>
+        <w:rPr>
+          <w:rFonts w:asciiTheme="minorHAnsi" w:hAnsiTheme="minorHAnsi"/>
+          <w:sz w:val="22"/>
+          <w:lang w:val="en-US"/>
+        </w:rPr>
+        <w:t>tabeli</w:t>
+      </w:r>
+      <w:proofErr w:type="spellEnd"/>
+      <w:r>
+        <w:rPr>
+          <w:rFonts w:asciiTheme="minorHAnsi" w:hAnsiTheme="minorHAnsi"/>
+          <w:sz w:val="22"/>
+          <w:lang w:val="en-US"/>
+        </w:rPr>
+        <w:t xml:space="preserve"> </w:t>
+      </w:r>
+      <w:proofErr w:type="spellStart"/>
+      <w:r>
+        <w:rPr>
+          <w:rFonts w:asciiTheme="minorHAnsi" w:hAnsiTheme="minorHAnsi"/>
+          <w:sz w:val="22"/>
+          <w:lang w:val="en-US"/>
+        </w:rPr>
+        <w:t>su</w:t>
+      </w:r>
+      <w:proofErr w:type="spellEnd"/>
+      <w:r>
+        <w:rPr>
+          <w:rFonts w:asciiTheme="minorHAnsi" w:hAnsiTheme="minorHAnsi"/>
+          <w:sz w:val="22"/>
+          <w:lang w:val="en-US"/>
+        </w:rPr>
+        <w:t xml:space="preserve"> </w:t>
+      </w:r>
+      <w:proofErr w:type="spellStart"/>
+      <w:r>
+        <w:rPr>
+          <w:rFonts w:asciiTheme="minorHAnsi" w:hAnsiTheme="minorHAnsi"/>
+          <w:sz w:val="22"/>
+          <w:lang w:val="en-US"/>
+        </w:rPr>
+        <w:t>ispod</w:t>
+      </w:r>
+      <w:proofErr w:type="spellEnd"/>
+      <w:r>
+        <w:rPr>
+          <w:rFonts w:asciiTheme="minorHAnsi" w:hAnsiTheme="minorHAnsi"/>
+          <w:sz w:val="22"/>
+          <w:lang w:val="en-US"/>
+        </w:rPr>
+        <w:t xml:space="preserve"> </w:t>
+      </w:r>
+      <w:proofErr w:type="spellStart"/>
+      <w:r>
+        <w:rPr>
+          <w:rFonts w:asciiTheme="minorHAnsi" w:hAnsiTheme="minorHAnsi"/>
+          <w:sz w:val="22"/>
+          <w:lang w:val="en-US"/>
+        </w:rPr>
+        <w:t>su</w:t>
+      </w:r>
+      <w:proofErr w:type="spellEnd"/>
+      <w:r>
+        <w:rPr>
+          <w:rFonts w:asciiTheme="minorHAnsi" w:hAnsiTheme="minorHAnsi"/>
+          <w:sz w:val="22"/>
+          <w:lang w:val="en-US"/>
+        </w:rPr>
+        <w:t xml:space="preserve"> </w:t>
+      </w:r>
+      <w:proofErr w:type="spellStart"/>
+      <w:r>
+        <w:rPr>
+          <w:rFonts w:asciiTheme="minorHAnsi" w:hAnsiTheme="minorHAnsi"/>
+          <w:sz w:val="22"/>
+          <w:lang w:val="en-US"/>
+        </w:rPr>
+        <w:t>prikazane</w:t>
+      </w:r>
+      <w:proofErr w:type="spellEnd"/>
+      <w:r>
+        <w:rPr>
+          <w:rFonts w:asciiTheme="minorHAnsi" w:hAnsiTheme="minorHAnsi"/>
+          <w:sz w:val="22"/>
+          <w:lang w:val="en-US"/>
+        </w:rPr>
+        <w:t xml:space="preserve"> </w:t>
+      </w:r>
+      <w:proofErr w:type="spellStart"/>
+      <w:r>
+        <w:rPr>
+          <w:rFonts w:asciiTheme="minorHAnsi" w:hAnsiTheme="minorHAnsi"/>
+          <w:sz w:val="22"/>
+          <w:lang w:val="en-US"/>
+        </w:rPr>
+        <w:t>prosječne</w:t>
+      </w:r>
+      <w:proofErr w:type="spellEnd"/>
+      <w:r>
+        <w:rPr>
+          <w:rFonts w:asciiTheme="minorHAnsi" w:hAnsiTheme="minorHAnsi"/>
+          <w:sz w:val="22"/>
+          <w:lang w:val="en-US"/>
+        </w:rPr>
+        <w:t xml:space="preserve"> </w:t>
+      </w:r>
+      <w:proofErr w:type="spellStart"/>
+      <w:r>
+        <w:rPr>
+          <w:rFonts w:asciiTheme="minorHAnsi" w:hAnsiTheme="minorHAnsi"/>
+          <w:sz w:val="22"/>
+          <w:lang w:val="en-US"/>
+        </w:rPr>
+        <w:t>vrijednosti</w:t>
+      </w:r>
+      <w:proofErr w:type="spellEnd"/>
+      <w:r>
+        <w:rPr>
+          <w:rFonts w:asciiTheme="minorHAnsi" w:hAnsiTheme="minorHAnsi"/>
+          <w:sz w:val="22"/>
+          <w:lang w:val="en-US"/>
+        </w:rPr>
+        <w:t xml:space="preserve"> </w:t>
+      </w:r>
+      <w:proofErr w:type="spellStart"/>
+      <w:r>
+        <w:rPr>
+          <w:rFonts w:asciiTheme="minorHAnsi" w:hAnsiTheme="minorHAnsi"/>
+          <w:sz w:val="22"/>
+          <w:lang w:val="en-US"/>
+        </w:rPr>
+        <w:t>i</w:t>
+      </w:r>
+      <w:proofErr w:type="spellEnd"/>
+      <w:r>
+        <w:rPr>
+          <w:rFonts w:asciiTheme="minorHAnsi" w:hAnsiTheme="minorHAnsi"/>
+          <w:sz w:val="22"/>
+          <w:lang w:val="en-US"/>
+        </w:rPr>
+        <w:t xml:space="preserve"> </w:t>
+      </w:r>
+      <w:proofErr w:type="spellStart"/>
+      <w:r>
+        <w:rPr>
+          <w:rFonts w:asciiTheme="minorHAnsi" w:hAnsiTheme="minorHAnsi"/>
+          <w:sz w:val="22"/>
+          <w:lang w:val="en-US"/>
+        </w:rPr>
+        <w:t>standardna</w:t>
+      </w:r>
+      <w:proofErr w:type="spellEnd"/>
+      <w:r>
+        <w:rPr>
+          <w:rFonts w:asciiTheme="minorHAnsi" w:hAnsiTheme="minorHAnsi"/>
+          <w:sz w:val="22"/>
+          <w:lang w:val="en-US"/>
+        </w:rPr>
+        <w:t xml:space="preserve"> </w:t>
+      </w:r>
+      <w:proofErr w:type="spellStart"/>
+      <w:r>
+        <w:rPr>
+          <w:rFonts w:asciiTheme="minorHAnsi" w:hAnsiTheme="minorHAnsi"/>
+          <w:sz w:val="22"/>
+          <w:lang w:val="en-US"/>
+        </w:rPr>
+        <w:t>devijacija</w:t>
+      </w:r>
+      <w:proofErr w:type="spellEnd"/>
+      <w:r>
+        <w:rPr>
+          <w:rFonts w:asciiTheme="minorHAnsi" w:hAnsiTheme="minorHAnsi"/>
+          <w:sz w:val="22"/>
+          <w:lang w:val="en-US"/>
+        </w:rPr>
+        <w:t xml:space="preserve"> za C# </w:t>
+      </w:r>
+      <w:proofErr w:type="spellStart"/>
+      <w:r>
+        <w:rPr>
+          <w:rFonts w:asciiTheme="minorHAnsi" w:hAnsiTheme="minorHAnsi"/>
+          <w:sz w:val="22"/>
+          <w:lang w:val="en-US"/>
+        </w:rPr>
+        <w:t>i</w:t>
+      </w:r>
+      <w:proofErr w:type="spellEnd"/>
+      <w:r>
+        <w:rPr>
+          <w:rFonts w:asciiTheme="minorHAnsi" w:hAnsiTheme="minorHAnsi"/>
+          <w:sz w:val="22"/>
+          <w:lang w:val="en-US"/>
+        </w:rPr>
+        <w:t xml:space="preserve"> Python </w:t>
+      </w:r>
+      <w:proofErr w:type="spellStart"/>
+      <w:r>
+        <w:rPr>
+          <w:rFonts w:asciiTheme="minorHAnsi" w:hAnsiTheme="minorHAnsi"/>
+          <w:sz w:val="22"/>
+          <w:lang w:val="en-US"/>
+        </w:rPr>
+        <w:t>modele</w:t>
+      </w:r>
+      <w:proofErr w:type="spellEnd"/>
+      <w:r>
+        <w:rPr>
+          <w:rFonts w:asciiTheme="minorHAnsi" w:hAnsiTheme="minorHAnsi"/>
+          <w:sz w:val="22"/>
+          <w:lang w:val="en-US"/>
+        </w:rPr>
+        <w:t xml:space="preserve"> (B – </w:t>
+      </w:r>
+      <w:proofErr w:type="spellStart"/>
+      <w:r>
+        <w:rPr>
+          <w:rFonts w:asciiTheme="minorHAnsi" w:hAnsiTheme="minorHAnsi"/>
+          <w:sz w:val="22"/>
+          <w:lang w:val="en-US"/>
+        </w:rPr>
+        <w:t>benigna</w:t>
+      </w:r>
+      <w:proofErr w:type="spellEnd"/>
+      <w:r>
+        <w:rPr>
+          <w:rFonts w:asciiTheme="minorHAnsi" w:hAnsiTheme="minorHAnsi"/>
+          <w:sz w:val="22"/>
+          <w:lang w:val="en-US"/>
+        </w:rPr>
+        <w:t xml:space="preserve"> </w:t>
+      </w:r>
+      <w:proofErr w:type="spellStart"/>
+      <w:r>
+        <w:rPr>
+          <w:rFonts w:asciiTheme="minorHAnsi" w:hAnsiTheme="minorHAnsi"/>
+          <w:sz w:val="22"/>
+          <w:lang w:val="en-US"/>
+        </w:rPr>
+        <w:t>klasa</w:t>
+      </w:r>
+      <w:proofErr w:type="spellEnd"/>
+      <w:r>
+        <w:rPr>
+          <w:rFonts w:asciiTheme="minorHAnsi" w:hAnsiTheme="minorHAnsi"/>
+          <w:sz w:val="22"/>
+          <w:lang w:val="en-US"/>
+        </w:rPr>
+        <w:t xml:space="preserve">, M – </w:t>
+      </w:r>
+      <w:proofErr w:type="spellStart"/>
+      <w:r>
+        <w:rPr>
+          <w:rFonts w:asciiTheme="minorHAnsi" w:hAnsiTheme="minorHAnsi"/>
+          <w:sz w:val="22"/>
+          <w:lang w:val="en-US"/>
+        </w:rPr>
+        <w:t>maligna</w:t>
+      </w:r>
+      <w:proofErr w:type="spellEnd"/>
+      <w:r>
+        <w:rPr>
+          <w:rFonts w:asciiTheme="minorHAnsi" w:hAnsiTheme="minorHAnsi"/>
+          <w:sz w:val="22"/>
+          <w:lang w:val="en-US"/>
+        </w:rPr>
+        <w:t xml:space="preserve"> </w:t>
+      </w:r>
+      <w:proofErr w:type="spellStart"/>
+      <w:r>
+        <w:rPr>
+          <w:rFonts w:asciiTheme="minorHAnsi" w:hAnsiTheme="minorHAnsi"/>
+          <w:sz w:val="22"/>
+          <w:lang w:val="en-US"/>
+        </w:rPr>
+        <w:t>klasa</w:t>
+      </w:r>
+      <w:proofErr w:type="spellEnd"/>
+      <w:r>
+        <w:rPr>
+          <w:rFonts w:asciiTheme="minorHAnsi" w:hAnsiTheme="minorHAnsi"/>
+          <w:sz w:val="22"/>
+          <w:lang w:val="en-US"/>
+        </w:rPr>
+        <w:t xml:space="preserve">, N – </w:t>
+      </w:r>
+      <w:proofErr w:type="spellStart"/>
+      <w:r>
+        <w:rPr>
+          <w:rFonts w:asciiTheme="minorHAnsi" w:hAnsiTheme="minorHAnsi"/>
+          <w:sz w:val="22"/>
+          <w:lang w:val="en-US"/>
+        </w:rPr>
+        <w:t>normalana</w:t>
+      </w:r>
+      <w:proofErr w:type="spellEnd"/>
+      <w:r>
+        <w:rPr>
+          <w:rFonts w:asciiTheme="minorHAnsi" w:hAnsiTheme="minorHAnsi"/>
+          <w:sz w:val="22"/>
+          <w:lang w:val="en-US"/>
+        </w:rPr>
+        <w:t xml:space="preserve"> </w:t>
+      </w:r>
+      <w:proofErr w:type="spellStart"/>
+      <w:r>
+        <w:rPr>
+          <w:rFonts w:asciiTheme="minorHAnsi" w:hAnsiTheme="minorHAnsi"/>
+          <w:sz w:val="22"/>
+          <w:lang w:val="en-US"/>
+        </w:rPr>
+        <w:t>klasa</w:t>
+      </w:r>
+      <w:proofErr w:type="spellEnd"/>
+      <w:r>
+        <w:rPr>
+          <w:rFonts w:asciiTheme="minorHAnsi" w:hAnsiTheme="minorHAnsi"/>
+          <w:sz w:val="22"/>
+          <w:lang w:val="en-US"/>
+        </w:rPr>
+        <w:t>).</w:t>
+      </w:r>
+    </w:p>
+    <w:tbl>
+      <w:tblPr>
+        <w:tblStyle w:val="PlainTable1"/>
+        <w:tblW w:w="0" w:type="auto"/>
+        <w:tblLayout w:type="fixed"/>
+        <w:tblLook w:val="04A0" w:firstRow="1" w:lastRow="0" w:firstColumn="1" w:lastColumn="0" w:noHBand="0" w:noVBand="1"/>
+      </w:tblPr>
+      <w:tblGrid>
+        <w:gridCol w:w="1806"/>
+        <w:gridCol w:w="1806"/>
+        <w:gridCol w:w="2166"/>
+      </w:tblGrid>
+      <w:tr>
+        <w:trPr>
+          <w:cnfStyle w:val="100000000000" w:firstRow="1" w:lastRow="0" w:firstColumn="0" w:lastColumn="0" w:oddVBand="0" w:evenVBand="0" w:oddHBand="0" w:evenHBand="0" w:firstRowFirstColumn="0" w:firstRowLastColumn="0" w:lastRowFirstColumn="0" w:lastRowLastColumn="0"/>
+          <w:trHeight w:val="490"/>
+        </w:trPr>
+        <w:tc>
+          <w:tcPr>
+            <w:cnfStyle w:val="001000000000" w:firstRow="0" w:lastRow="0" w:firstColumn="1" w:lastColumn="0" w:oddVBand="0" w:evenVBand="0" w:oddHBand="0" w:evenHBand="0" w:firstRowFirstColumn="0" w:firstRowLastColumn="0" w:lastRowFirstColumn="0" w:lastRowLastColumn="0"/>
+            <w:tcW w:w="1806" w:type="dxa"/>
+            <w:vAlign w:val="center"/>
+            <w:hideMark/>
+          </w:tcPr>
+          <w:p>
+            <w:pPr>
+              <w:jc w:val="center"/>
+              <w:rPr>
+                <w:rFonts w:cs="Times New Roman"/>
+                <w:lang w:val="bs-Latn-BA" w:eastAsia="bs-Latn-BA"/>
+              </w:rPr>
+            </w:pPr>
+            <w:r>
+              <w:rPr>
+                <w:rFonts w:cs="Times New Roman"/>
+                <w:lang w:val="bs-Latn-BA" w:eastAsia="bs-Latn-BA"/>
+              </w:rPr>
+              <w:t>Metrike</w:t>
+            </w:r>
+          </w:p>
+        </w:tc>
+        <w:tc>
+          <w:tcPr>
+            <w:tcW w:w="1806" w:type="dxa"/>
+            <w:vAlign w:val="center"/>
+            <w:hideMark/>
+          </w:tcPr>
+          <w:p>
+            <w:pPr>
+              <w:jc w:val="center"/>
+              <w:cnfStyle w:val="100000000000" w:firstRow="1" w:lastRow="0" w:firstColumn="0" w:lastColumn="0" w:oddVBand="0" w:evenVBand="0" w:oddHBand="0" w:evenHBand="0" w:firstRowFirstColumn="0" w:firstRowLastColumn="0" w:lastRowFirstColumn="0" w:lastRowLastColumn="0"/>
+              <w:rPr>
+                <w:rFonts w:cs="Times New Roman"/>
+                <w:lang w:val="bs-Latn-BA" w:eastAsia="bs-Latn-BA"/>
+              </w:rPr>
+            </w:pPr>
+            <w:r>
+              <w:rPr>
+                <w:rFonts w:cs="Times New Roman"/>
+                <w:lang w:val="bs-Latn-BA" w:eastAsia="bs-Latn-BA"/>
+              </w:rPr>
+              <w:t xml:space="preserve">C# </w:t>
+            </w:r>
+            <w:r>
+              <w:rPr>
+                <w:rFonts w:cs="Times New Roman"/>
+                <w:lang w:val="bs-Latn-BA" w:eastAsia="bs-Latn-BA"/>
+              </w:rPr>
+              <w:t>Prosjek  ± SD</w:t>
+            </w:r>
+          </w:p>
+        </w:tc>
+        <w:tc>
+          <w:tcPr>
+            <w:tcW w:w="2166" w:type="dxa"/>
+            <w:vAlign w:val="center"/>
+            <w:hideMark/>
+          </w:tcPr>
+          <w:p>
+            <w:pPr>
+              <w:jc w:val="center"/>
+              <w:cnfStyle w:val="100000000000" w:firstRow="1" w:lastRow="0" w:firstColumn="0" w:lastColumn="0" w:oddVBand="0" w:evenVBand="0" w:oddHBand="0" w:evenHBand="0" w:firstRowFirstColumn="0" w:firstRowLastColumn="0" w:lastRowFirstColumn="0" w:lastRowLastColumn="0"/>
+              <w:rPr>
+                <w:rFonts w:cs="Times New Roman"/>
+                <w:lang w:val="bs-Latn-BA" w:eastAsia="bs-Latn-BA"/>
+              </w:rPr>
+            </w:pPr>
+            <w:proofErr w:type="spellStart"/>
+            <w:r>
+              <w:rPr>
+                <w:rFonts w:cs="Times New Roman"/>
+                <w:lang w:val="bs-Latn-BA" w:eastAsia="bs-Latn-BA"/>
+              </w:rPr>
+              <w:t>Python</w:t>
+            </w:r>
+            <w:proofErr w:type="spellEnd"/>
+            <w:r>
+              <w:rPr>
+                <w:rFonts w:cs="Times New Roman"/>
+                <w:lang w:val="bs-Latn-BA" w:eastAsia="bs-Latn-BA"/>
+              </w:rPr>
+              <w:t xml:space="preserve"> </w:t>
+            </w:r>
+            <w:r>
+              <w:rPr>
+                <w:rFonts w:cs="Times New Roman"/>
+                <w:lang w:val="bs-Latn-BA" w:eastAsia="bs-Latn-BA"/>
+              </w:rPr>
+              <w:t>Prosjek ± SD</w:t>
+            </w:r>
+          </w:p>
+        </w:tc>
+      </w:tr>
+      <w:tr>
+        <w:trPr>
+          <w:cnfStyle w:val="000000100000" w:firstRow="0" w:lastRow="0" w:firstColumn="0" w:lastColumn="0" w:oddVBand="0" w:evenVBand="0" w:oddHBand="1" w:evenHBand="0" w:firstRowFirstColumn="0" w:firstRowLastColumn="0" w:lastRowFirstColumn="0" w:lastRowLastColumn="0"/>
+          <w:trHeight w:val="490"/>
+        </w:trPr>
+        <w:tc>
+          <w:tcPr>
+            <w:cnfStyle w:val="001000000000" w:firstRow="0" w:lastRow="0" w:firstColumn="1" w:lastColumn="0" w:oddVBand="0" w:evenVBand="0" w:oddHBand="0" w:evenHBand="0" w:firstRowFirstColumn="0" w:firstRowLastColumn="0" w:lastRowFirstColumn="0" w:lastRowLastColumn="0"/>
+            <w:tcW w:w="1806" w:type="dxa"/>
+            <w:vAlign w:val="center"/>
+            <w:hideMark/>
+          </w:tcPr>
+          <w:p>
+            <w:pPr>
+              <w:jc w:val="center"/>
+              <w:rPr>
+                <w:rFonts w:eastAsia="Times New Roman" w:cs="Times New Roman"/>
+                <w:color w:val="000000"/>
+                <w:szCs w:val="24"/>
+                <w:lang w:val="bs-Latn-BA" w:eastAsia="bs-Latn-BA"/>
+              </w:rPr>
+            </w:pPr>
+            <w:r>
+              <w:rPr>
+                <w:rFonts w:eastAsia="Times New Roman" w:cs="Times New Roman"/>
+                <w:color w:val="000000"/>
+                <w:szCs w:val="24"/>
+                <w:lang w:val="bs-Latn-BA" w:eastAsia="bs-Latn-BA"/>
+              </w:rPr>
+              <w:t>Odziv B</w:t>
+            </w:r>
+          </w:p>
+        </w:tc>
+        <w:tc>
+          <w:tcPr>
+            <w:tcW w:w="1806" w:type="dxa"/>
+            <w:vAlign w:val="center"/>
+            <w:hideMark/>
+          </w:tcPr>
+          <w:p>
+            <w:pPr>
+              <w:jc w:val="center"/>
+              <w:cnfStyle w:val="000000100000" w:firstRow="0" w:lastRow="0" w:firstColumn="0" w:lastColumn="0" w:oddVBand="0" w:evenVBand="0" w:oddHBand="1" w:evenHBand="0" w:firstRowFirstColumn="0" w:firstRowLastColumn="0" w:lastRowFirstColumn="0" w:lastRowLastColumn="0"/>
+              <w:rPr>
+                <w:rFonts w:eastAsia="Times New Roman" w:cs="Times New Roman"/>
+                <w:color w:val="000000"/>
+                <w:szCs w:val="24"/>
+                <w:lang w:val="bs-Latn-BA" w:eastAsia="bs-Latn-BA"/>
+              </w:rPr>
+            </w:pPr>
+            <w:r>
+              <w:rPr>
+                <w:rFonts w:eastAsia="Times New Roman" w:cs="Times New Roman"/>
+                <w:color w:val="000000"/>
+                <w:szCs w:val="24"/>
+                <w:lang w:val="bs-Latn-BA" w:eastAsia="bs-Latn-BA"/>
+              </w:rPr>
+              <w:t>55,56 ± 21,43</w:t>
+            </w:r>
+          </w:p>
+        </w:tc>
+        <w:tc>
+          <w:tcPr>
+            <w:tcW w:w="2166" w:type="dxa"/>
+            <w:noWrap/>
+            <w:vAlign w:val="center"/>
+            <w:hideMark/>
+          </w:tcPr>
+          <w:p>
+            <w:pPr>
+              <w:jc w:val="center"/>
+              <w:cnfStyle w:val="000000100000" w:firstRow="0" w:lastRow="0" w:firstColumn="0" w:lastColumn="0" w:oddVBand="0" w:evenVBand="0" w:oddHBand="1" w:evenHBand="0" w:firstRowFirstColumn="0" w:firstRowLastColumn="0" w:lastRowFirstColumn="0" w:lastRowLastColumn="0"/>
+              <w:rPr>
+                <w:rFonts w:eastAsia="Times New Roman" w:cs="Times New Roman"/>
+                <w:color w:val="000000"/>
+                <w:szCs w:val="24"/>
+                <w:lang w:val="bs-Latn-BA" w:eastAsia="bs-Latn-BA"/>
+              </w:rPr>
+            </w:pPr>
+            <w:r>
+              <w:rPr>
+                <w:rFonts w:eastAsia="Times New Roman" w:cs="Times New Roman"/>
+                <w:color w:val="000000"/>
+                <w:szCs w:val="24"/>
+                <w:lang w:val="bs-Latn-BA" w:eastAsia="bs-Latn-BA"/>
+              </w:rPr>
+              <w:t>34,44 ± 22,20</w:t>
+            </w:r>
+          </w:p>
+        </w:tc>
+      </w:tr>
+      <w:tr>
+        <w:trPr>
+          <w:trHeight w:val="490"/>
+        </w:trPr>
+        <w:tc>
+          <w:tcPr>
+            <w:cnfStyle w:val="001000000000" w:firstRow="0" w:lastRow="0" w:firstColumn="1" w:lastColumn="0" w:oddVBand="0" w:evenVBand="0" w:oddHBand="0" w:evenHBand="0" w:firstRowFirstColumn="0" w:firstRowLastColumn="0" w:lastRowFirstColumn="0" w:lastRowLastColumn="0"/>
+            <w:tcW w:w="1806" w:type="dxa"/>
+            <w:vAlign w:val="center"/>
+            <w:hideMark/>
+          </w:tcPr>
+          <w:p>
+            <w:pPr>
+              <w:jc w:val="center"/>
+              <w:rPr>
+                <w:rFonts w:eastAsia="Times New Roman" w:cs="Times New Roman"/>
+                <w:color w:val="000000"/>
+                <w:szCs w:val="24"/>
+                <w:lang w:val="bs-Latn-BA" w:eastAsia="bs-Latn-BA"/>
+              </w:rPr>
+            </w:pPr>
+            <w:r>
+              <w:rPr>
+                <w:rFonts w:eastAsia="Times New Roman" w:cs="Times New Roman"/>
+                <w:color w:val="000000"/>
+                <w:szCs w:val="24"/>
+                <w:lang w:val="bs-Latn-BA" w:eastAsia="bs-Latn-BA"/>
+              </w:rPr>
+              <w:t>Preciznost B</w:t>
+            </w:r>
+          </w:p>
+        </w:tc>
+        <w:tc>
+          <w:tcPr>
+            <w:tcW w:w="1806" w:type="dxa"/>
+            <w:vAlign w:val="center"/>
+            <w:hideMark/>
+          </w:tcPr>
+          <w:p>
+            <w:pPr>
+              <w:jc w:val="center"/>
+              <w:cnfStyle w:val="000000000000" w:firstRow="0" w:lastRow="0" w:firstColumn="0" w:lastColumn="0" w:oddVBand="0" w:evenVBand="0" w:oddHBand="0" w:evenHBand="0" w:firstRowFirstColumn="0" w:firstRowLastColumn="0" w:lastRowFirstColumn="0" w:lastRowLastColumn="0"/>
+              <w:rPr>
+                <w:rFonts w:eastAsia="Times New Roman" w:cs="Times New Roman"/>
+                <w:color w:val="000000"/>
+                <w:szCs w:val="24"/>
+                <w:lang w:val="bs-Latn-BA" w:eastAsia="bs-Latn-BA"/>
+              </w:rPr>
+            </w:pPr>
+            <w:r>
+              <w:rPr>
+                <w:rFonts w:eastAsia="Times New Roman" w:cs="Times New Roman"/>
+                <w:color w:val="000000"/>
+                <w:szCs w:val="24"/>
+                <w:lang w:val="bs-Latn-BA" w:eastAsia="bs-Latn-BA"/>
+              </w:rPr>
+              <w:t>33,88 ± 7,26</w:t>
+            </w:r>
+          </w:p>
+        </w:tc>
+        <w:tc>
+          <w:tcPr>
+            <w:tcW w:w="2166" w:type="dxa"/>
+            <w:noWrap/>
+            <w:vAlign w:val="center"/>
+            <w:hideMark/>
+          </w:tcPr>
+          <w:p>
+            <w:pPr>
+              <w:jc w:val="center"/>
+              <w:cnfStyle w:val="000000000000" w:firstRow="0" w:lastRow="0" w:firstColumn="0" w:lastColumn="0" w:oddVBand="0" w:evenVBand="0" w:oddHBand="0" w:evenHBand="0" w:firstRowFirstColumn="0" w:firstRowLastColumn="0" w:lastRowFirstColumn="0" w:lastRowLastColumn="0"/>
+              <w:rPr>
+                <w:rFonts w:eastAsia="Times New Roman" w:cs="Times New Roman"/>
+                <w:color w:val="000000"/>
+                <w:szCs w:val="24"/>
+                <w:lang w:val="bs-Latn-BA" w:eastAsia="bs-Latn-BA"/>
+              </w:rPr>
+            </w:pPr>
+            <w:r>
+              <w:rPr>
+                <w:rFonts w:eastAsia="Times New Roman" w:cs="Times New Roman"/>
+                <w:color w:val="000000"/>
+                <w:szCs w:val="24"/>
+                <w:lang w:val="bs-Latn-BA" w:eastAsia="bs-Latn-BA"/>
+              </w:rPr>
+              <w:t>36,48 ± 12,97</w:t>
+            </w:r>
+          </w:p>
+        </w:tc>
+      </w:tr>
+      <w:tr>
+        <w:trPr>
+          <w:cnfStyle w:val="000000100000" w:firstRow="0" w:lastRow="0" w:firstColumn="0" w:lastColumn="0" w:oddVBand="0" w:evenVBand="0" w:oddHBand="1" w:evenHBand="0" w:firstRowFirstColumn="0" w:firstRowLastColumn="0" w:lastRowFirstColumn="0" w:lastRowLastColumn="0"/>
+          <w:trHeight w:val="490"/>
+        </w:trPr>
+        <w:tc>
+          <w:tcPr>
+            <w:cnfStyle w:val="001000000000" w:firstRow="0" w:lastRow="0" w:firstColumn="1" w:lastColumn="0" w:oddVBand="0" w:evenVBand="0" w:oddHBand="0" w:evenHBand="0" w:firstRowFirstColumn="0" w:firstRowLastColumn="0" w:lastRowFirstColumn="0" w:lastRowLastColumn="0"/>
+            <w:tcW w:w="1806" w:type="dxa"/>
+            <w:vAlign w:val="center"/>
+            <w:hideMark/>
+          </w:tcPr>
+          <w:p>
+            <w:pPr>
+              <w:jc w:val="center"/>
+              <w:rPr>
+                <w:rFonts w:eastAsia="Times New Roman" w:cs="Times New Roman"/>
+                <w:color w:val="000000"/>
+                <w:szCs w:val="24"/>
+                <w:lang w:val="bs-Latn-BA" w:eastAsia="bs-Latn-BA"/>
+              </w:rPr>
+            </w:pPr>
+            <w:r>
+              <w:rPr>
+                <w:rFonts w:eastAsia="Times New Roman" w:cs="Times New Roman"/>
+                <w:color w:val="000000"/>
+                <w:szCs w:val="24"/>
+                <w:lang w:val="bs-Latn-BA" w:eastAsia="bs-Latn-BA"/>
+              </w:rPr>
+              <w:t>F1 skor B</w:t>
+            </w:r>
+          </w:p>
+        </w:tc>
+        <w:tc>
+          <w:tcPr>
+            <w:tcW w:w="1806" w:type="dxa"/>
+            <w:vAlign w:val="center"/>
+            <w:hideMark/>
+          </w:tcPr>
+          <w:p>
+            <w:pPr>
+              <w:jc w:val="center"/>
+              <w:cnfStyle w:val="000000100000" w:firstRow="0" w:lastRow="0" w:firstColumn="0" w:lastColumn="0" w:oddVBand="0" w:evenVBand="0" w:oddHBand="1" w:evenHBand="0" w:firstRowFirstColumn="0" w:firstRowLastColumn="0" w:lastRowFirstColumn="0" w:lastRowLastColumn="0"/>
+              <w:rPr>
+                <w:rFonts w:eastAsia="Times New Roman" w:cs="Times New Roman"/>
+                <w:color w:val="000000"/>
+                <w:szCs w:val="24"/>
+                <w:lang w:val="bs-Latn-BA" w:eastAsia="bs-Latn-BA"/>
+              </w:rPr>
+            </w:pPr>
+            <w:r>
+              <w:rPr>
+                <w:rFonts w:eastAsia="Times New Roman" w:cs="Times New Roman"/>
+                <w:color w:val="000000"/>
+                <w:szCs w:val="24"/>
+                <w:lang w:val="bs-Latn-BA" w:eastAsia="bs-Latn-BA"/>
+              </w:rPr>
+              <w:t>41,09 ± 8,09</w:t>
+            </w:r>
+          </w:p>
+        </w:tc>
+        <w:tc>
+          <w:tcPr>
+            <w:tcW w:w="2166" w:type="dxa"/>
+            <w:noWrap/>
+            <w:vAlign w:val="center"/>
+            <w:hideMark/>
+          </w:tcPr>
+          <w:p>
+            <w:pPr>
+              <w:jc w:val="center"/>
+              <w:cnfStyle w:val="000000100000" w:firstRow="0" w:lastRow="0" w:firstColumn="0" w:lastColumn="0" w:oddVBand="0" w:evenVBand="0" w:oddHBand="1" w:evenHBand="0" w:firstRowFirstColumn="0" w:firstRowLastColumn="0" w:lastRowFirstColumn="0" w:lastRowLastColumn="0"/>
+              <w:rPr>
+                <w:rFonts w:eastAsia="Times New Roman" w:cs="Times New Roman"/>
+                <w:color w:val="000000"/>
+                <w:szCs w:val="24"/>
+                <w:lang w:val="bs-Latn-BA" w:eastAsia="bs-Latn-BA"/>
+              </w:rPr>
+            </w:pPr>
+            <w:r>
+              <w:rPr>
+                <w:rFonts w:eastAsia="Times New Roman" w:cs="Times New Roman"/>
+                <w:color w:val="000000"/>
+                <w:szCs w:val="24"/>
+                <w:lang w:val="bs-Latn-BA" w:eastAsia="bs-Latn-BA"/>
+              </w:rPr>
+              <w:t>32,25 ± 10,83</w:t>
+            </w:r>
+          </w:p>
+        </w:tc>
+      </w:tr>
+      <w:tr>
+        <w:trPr>
+          <w:trHeight w:val="490"/>
+        </w:trPr>
+        <w:tc>
+          <w:tcPr>
+            <w:cnfStyle w:val="001000000000" w:firstRow="0" w:lastRow="0" w:firstColumn="1" w:lastColumn="0" w:oddVBand="0" w:evenVBand="0" w:oddHBand="0" w:evenHBand="0" w:firstRowFirstColumn="0" w:firstRowLastColumn="0" w:lastRowFirstColumn="0" w:lastRowLastColumn="0"/>
+            <w:tcW w:w="1806" w:type="dxa"/>
+            <w:vAlign w:val="center"/>
+            <w:hideMark/>
+          </w:tcPr>
+          <w:p>
+            <w:pPr>
+              <w:jc w:val="center"/>
+              <w:rPr>
+                <w:rFonts w:eastAsia="Times New Roman" w:cs="Times New Roman"/>
+                <w:color w:val="000000"/>
+                <w:szCs w:val="24"/>
+                <w:lang w:val="bs-Latn-BA" w:eastAsia="bs-Latn-BA"/>
+              </w:rPr>
+            </w:pPr>
+            <w:r>
+              <w:rPr>
+                <w:rFonts w:eastAsia="Times New Roman" w:cs="Times New Roman"/>
+                <w:color w:val="000000"/>
+                <w:szCs w:val="24"/>
+                <w:lang w:val="bs-Latn-BA" w:eastAsia="bs-Latn-BA"/>
+              </w:rPr>
+              <w:t>Odziv M</w:t>
+            </w:r>
+          </w:p>
+        </w:tc>
+        <w:tc>
+          <w:tcPr>
+            <w:tcW w:w="1806" w:type="dxa"/>
+            <w:vAlign w:val="center"/>
+            <w:hideMark/>
+          </w:tcPr>
+          <w:p>
+            <w:pPr>
+              <w:jc w:val="center"/>
+              <w:cnfStyle w:val="000000000000" w:firstRow="0" w:lastRow="0" w:firstColumn="0" w:lastColumn="0" w:oddVBand="0" w:evenVBand="0" w:oddHBand="0" w:evenHBand="0" w:firstRowFirstColumn="0" w:firstRowLastColumn="0" w:lastRowFirstColumn="0" w:lastRowLastColumn="0"/>
+              <w:rPr>
+                <w:rFonts w:eastAsia="Times New Roman" w:cs="Times New Roman"/>
+                <w:color w:val="000000"/>
+                <w:szCs w:val="24"/>
+                <w:lang w:val="bs-Latn-BA" w:eastAsia="bs-Latn-BA"/>
+              </w:rPr>
+            </w:pPr>
+            <w:r>
+              <w:rPr>
+                <w:rFonts w:eastAsia="Times New Roman" w:cs="Times New Roman"/>
+                <w:color w:val="000000"/>
+                <w:szCs w:val="24"/>
+                <w:lang w:val="bs-Latn-BA" w:eastAsia="bs-Latn-BA"/>
+              </w:rPr>
+              <w:t>100,00 ± 0,00</w:t>
+            </w:r>
+          </w:p>
+        </w:tc>
+        <w:tc>
+          <w:tcPr>
+            <w:tcW w:w="2166" w:type="dxa"/>
+            <w:noWrap/>
+            <w:vAlign w:val="center"/>
+            <w:hideMark/>
+          </w:tcPr>
+          <w:p>
+            <w:pPr>
+              <w:jc w:val="center"/>
+              <w:cnfStyle w:val="000000000000" w:firstRow="0" w:lastRow="0" w:firstColumn="0" w:lastColumn="0" w:oddVBand="0" w:evenVBand="0" w:oddHBand="0" w:evenHBand="0" w:firstRowFirstColumn="0" w:firstRowLastColumn="0" w:lastRowFirstColumn="0" w:lastRowLastColumn="0"/>
+              <w:rPr>
+                <w:rFonts w:eastAsia="Times New Roman" w:cs="Times New Roman"/>
+                <w:color w:val="000000"/>
+                <w:szCs w:val="24"/>
+                <w:lang w:val="bs-Latn-BA" w:eastAsia="bs-Latn-BA"/>
+              </w:rPr>
+            </w:pPr>
+            <w:r>
+              <w:rPr>
+                <w:rFonts w:eastAsia="Times New Roman" w:cs="Times New Roman"/>
+                <w:color w:val="000000"/>
+                <w:szCs w:val="24"/>
+                <w:lang w:val="bs-Latn-BA" w:eastAsia="bs-Latn-BA"/>
+              </w:rPr>
+              <w:t>100,00 ± 0,00</w:t>
+            </w:r>
+          </w:p>
+        </w:tc>
+      </w:tr>
+      <w:tr>
+        <w:trPr>
+          <w:cnfStyle w:val="000000100000" w:firstRow="0" w:lastRow="0" w:firstColumn="0" w:lastColumn="0" w:oddVBand="0" w:evenVBand="0" w:oddHBand="1" w:evenHBand="0" w:firstRowFirstColumn="0" w:firstRowLastColumn="0" w:lastRowFirstColumn="0" w:lastRowLastColumn="0"/>
+          <w:trHeight w:val="490"/>
+        </w:trPr>
+        <w:tc>
+          <w:tcPr>
+            <w:cnfStyle w:val="001000000000" w:firstRow="0" w:lastRow="0" w:firstColumn="1" w:lastColumn="0" w:oddVBand="0" w:evenVBand="0" w:oddHBand="0" w:evenHBand="0" w:firstRowFirstColumn="0" w:firstRowLastColumn="0" w:lastRowFirstColumn="0" w:lastRowLastColumn="0"/>
+            <w:tcW w:w="1806" w:type="dxa"/>
+            <w:vAlign w:val="center"/>
+            <w:hideMark/>
+          </w:tcPr>
+          <w:p>
+            <w:pPr>
+              <w:jc w:val="center"/>
+              <w:rPr>
+                <w:rFonts w:eastAsia="Times New Roman" w:cs="Times New Roman"/>
+                <w:color w:val="000000"/>
+                <w:szCs w:val="24"/>
+                <w:lang w:val="bs-Latn-BA" w:eastAsia="bs-Latn-BA"/>
+              </w:rPr>
+            </w:pPr>
+            <w:r>
+              <w:rPr>
+                <w:rFonts w:eastAsia="Times New Roman" w:cs="Times New Roman"/>
+                <w:color w:val="000000"/>
+                <w:szCs w:val="24"/>
+                <w:lang w:val="bs-Latn-BA" w:eastAsia="bs-Latn-BA"/>
+              </w:rPr>
+              <w:t>Preciznost M</w:t>
+            </w:r>
+          </w:p>
+        </w:tc>
+        <w:tc>
+          <w:tcPr>
+            <w:tcW w:w="1806" w:type="dxa"/>
+            <w:vAlign w:val="center"/>
+            <w:hideMark/>
+          </w:tcPr>
+          <w:p>
+            <w:pPr>
+              <w:jc w:val="center"/>
+              <w:cnfStyle w:val="000000100000" w:firstRow="0" w:lastRow="0" w:firstColumn="0" w:lastColumn="0" w:oddVBand="0" w:evenVBand="0" w:oddHBand="1" w:evenHBand="0" w:firstRowFirstColumn="0" w:firstRowLastColumn="0" w:lastRowFirstColumn="0" w:lastRowLastColumn="0"/>
+              <w:rPr>
+                <w:rFonts w:eastAsia="Times New Roman" w:cs="Times New Roman"/>
+                <w:color w:val="000000"/>
+                <w:szCs w:val="24"/>
+                <w:lang w:val="bs-Latn-BA" w:eastAsia="bs-Latn-BA"/>
+              </w:rPr>
+            </w:pPr>
+            <w:r>
+              <w:rPr>
+                <w:rFonts w:eastAsia="Times New Roman" w:cs="Times New Roman"/>
+                <w:color w:val="000000"/>
+                <w:szCs w:val="24"/>
+                <w:lang w:val="bs-Latn-BA" w:eastAsia="bs-Latn-BA"/>
+              </w:rPr>
+              <w:t>100,00 ± 0,00</w:t>
+            </w:r>
+          </w:p>
+        </w:tc>
+        <w:tc>
+          <w:tcPr>
+            <w:tcW w:w="2166" w:type="dxa"/>
+            <w:noWrap/>
+            <w:vAlign w:val="center"/>
+            <w:hideMark/>
+          </w:tcPr>
+          <w:p>
+            <w:pPr>
+              <w:jc w:val="center"/>
+              <w:cnfStyle w:val="000000100000" w:firstRow="0" w:lastRow="0" w:firstColumn="0" w:lastColumn="0" w:oddVBand="0" w:evenVBand="0" w:oddHBand="1" w:evenHBand="0" w:firstRowFirstColumn="0" w:firstRowLastColumn="0" w:lastRowFirstColumn="0" w:lastRowLastColumn="0"/>
+              <w:rPr>
+                <w:rFonts w:eastAsia="Times New Roman" w:cs="Times New Roman"/>
+                <w:color w:val="000000"/>
+                <w:szCs w:val="24"/>
+                <w:lang w:val="bs-Latn-BA" w:eastAsia="bs-Latn-BA"/>
+              </w:rPr>
+            </w:pPr>
+            <w:r>
+              <w:rPr>
+                <w:rFonts w:eastAsia="Times New Roman" w:cs="Times New Roman"/>
+                <w:color w:val="000000"/>
+                <w:szCs w:val="24"/>
+                <w:lang w:val="bs-Latn-BA" w:eastAsia="bs-Latn-BA"/>
+              </w:rPr>
+              <w:t>96,03 ± 4,01</w:t>
+            </w:r>
+          </w:p>
+        </w:tc>
+      </w:tr>
+      <w:tr>
+        <w:trPr>
+          <w:trHeight w:val="490"/>
+        </w:trPr>
+        <w:tc>
+          <w:tcPr>
+            <w:cnfStyle w:val="001000000000" w:firstRow="0" w:lastRow="0" w:firstColumn="1" w:lastColumn="0" w:oddVBand="0" w:evenVBand="0" w:oddHBand="0" w:evenHBand="0" w:firstRowFirstColumn="0" w:firstRowLastColumn="0" w:lastRowFirstColumn="0" w:lastRowLastColumn="0"/>
+            <w:tcW w:w="1806" w:type="dxa"/>
+            <w:vAlign w:val="center"/>
+            <w:hideMark/>
+          </w:tcPr>
+          <w:p>
+            <w:pPr>
+              <w:jc w:val="center"/>
+              <w:rPr>
+                <w:rFonts w:eastAsia="Times New Roman" w:cs="Times New Roman"/>
+                <w:color w:val="000000"/>
+                <w:szCs w:val="24"/>
+                <w:lang w:val="bs-Latn-BA" w:eastAsia="bs-Latn-BA"/>
+              </w:rPr>
+            </w:pPr>
+            <w:r>
+              <w:rPr>
+                <w:rFonts w:eastAsia="Times New Roman" w:cs="Times New Roman"/>
+                <w:color w:val="000000"/>
+                <w:szCs w:val="24"/>
+                <w:lang w:val="bs-Latn-BA" w:eastAsia="bs-Latn-BA"/>
+              </w:rPr>
+              <w:t>F1 skor M</w:t>
+            </w:r>
+          </w:p>
+        </w:tc>
+        <w:tc>
+          <w:tcPr>
+            <w:tcW w:w="1806" w:type="dxa"/>
+            <w:vAlign w:val="center"/>
+            <w:hideMark/>
+          </w:tcPr>
+          <w:p>
+            <w:pPr>
+              <w:jc w:val="center"/>
+              <w:cnfStyle w:val="000000000000" w:firstRow="0" w:lastRow="0" w:firstColumn="0" w:lastColumn="0" w:oddVBand="0" w:evenVBand="0" w:oddHBand="0" w:evenHBand="0" w:firstRowFirstColumn="0" w:firstRowLastColumn="0" w:lastRowFirstColumn="0" w:lastRowLastColumn="0"/>
+              <w:rPr>
+                <w:rFonts w:eastAsia="Times New Roman" w:cs="Times New Roman"/>
+                <w:color w:val="000000"/>
+                <w:szCs w:val="24"/>
+                <w:lang w:val="bs-Latn-BA" w:eastAsia="bs-Latn-BA"/>
+              </w:rPr>
+            </w:pPr>
+            <w:r>
+              <w:rPr>
+                <w:rFonts w:eastAsia="Times New Roman" w:cs="Times New Roman"/>
+                <w:color w:val="000000"/>
+                <w:szCs w:val="24"/>
+                <w:lang w:val="bs-Latn-BA" w:eastAsia="bs-Latn-BA"/>
+              </w:rPr>
+              <w:t>100,00 ± 0,00</w:t>
+            </w:r>
+          </w:p>
+        </w:tc>
+        <w:tc>
+          <w:tcPr>
+            <w:tcW w:w="2166" w:type="dxa"/>
+            <w:noWrap/>
+            <w:vAlign w:val="center"/>
+            <w:hideMark/>
+          </w:tcPr>
+          <w:p>
+            <w:pPr>
+              <w:jc w:val="center"/>
+              <w:cnfStyle w:val="000000000000" w:firstRow="0" w:lastRow="0" w:firstColumn="0" w:lastColumn="0" w:oddVBand="0" w:evenVBand="0" w:oddHBand="0" w:evenHBand="0" w:firstRowFirstColumn="0" w:firstRowLastColumn="0" w:lastRowFirstColumn="0" w:lastRowLastColumn="0"/>
+              <w:rPr>
+                <w:rFonts w:eastAsia="Times New Roman" w:cs="Times New Roman"/>
+                <w:color w:val="000000"/>
+                <w:szCs w:val="24"/>
+                <w:lang w:val="bs-Latn-BA" w:eastAsia="bs-Latn-BA"/>
+              </w:rPr>
+            </w:pPr>
+            <w:r>
+              <w:rPr>
+                <w:rFonts w:eastAsia="Times New Roman" w:cs="Times New Roman"/>
+                <w:color w:val="000000"/>
+                <w:szCs w:val="24"/>
+                <w:lang w:val="bs-Latn-BA" w:eastAsia="bs-Latn-BA"/>
+              </w:rPr>
+              <w:t>97,95 ± 2,11</w:t>
+            </w:r>
+          </w:p>
+        </w:tc>
+      </w:tr>
+      <w:tr>
+        <w:trPr>
+          <w:cnfStyle w:val="000000100000" w:firstRow="0" w:lastRow="0" w:firstColumn="0" w:lastColumn="0" w:oddVBand="0" w:evenVBand="0" w:oddHBand="1" w:evenHBand="0" w:firstRowFirstColumn="0" w:firstRowLastColumn="0" w:lastRowFirstColumn="0" w:lastRowLastColumn="0"/>
+          <w:trHeight w:val="490"/>
+        </w:trPr>
+        <w:tc>
+          <w:tcPr>
+            <w:cnfStyle w:val="001000000000" w:firstRow="0" w:lastRow="0" w:firstColumn="1" w:lastColumn="0" w:oddVBand="0" w:evenVBand="0" w:oddHBand="0" w:evenHBand="0" w:firstRowFirstColumn="0" w:firstRowLastColumn="0" w:lastRowFirstColumn="0" w:lastRowLastColumn="0"/>
+            <w:tcW w:w="1806" w:type="dxa"/>
+            <w:vAlign w:val="center"/>
+            <w:hideMark/>
+          </w:tcPr>
+          <w:p>
+            <w:pPr>
+              <w:jc w:val="center"/>
+              <w:rPr>
+                <w:rFonts w:eastAsia="Times New Roman" w:cs="Times New Roman"/>
+                <w:color w:val="000000"/>
+                <w:szCs w:val="24"/>
+                <w:lang w:val="bs-Latn-BA" w:eastAsia="bs-Latn-BA"/>
+              </w:rPr>
+            </w:pPr>
+            <w:r>
+              <w:rPr>
+                <w:rFonts w:eastAsia="Times New Roman" w:cs="Times New Roman"/>
+                <w:color w:val="000000"/>
+                <w:szCs w:val="24"/>
+                <w:lang w:val="bs-Latn-BA" w:eastAsia="bs-Latn-BA"/>
+              </w:rPr>
+              <w:t>Odziv N</w:t>
+            </w:r>
+          </w:p>
+        </w:tc>
+        <w:tc>
+          <w:tcPr>
+            <w:tcW w:w="1806" w:type="dxa"/>
+            <w:vAlign w:val="center"/>
+            <w:hideMark/>
+          </w:tcPr>
+          <w:p>
+            <w:pPr>
+              <w:jc w:val="center"/>
+              <w:cnfStyle w:val="000000100000" w:firstRow="0" w:lastRow="0" w:firstColumn="0" w:lastColumn="0" w:oddVBand="0" w:evenVBand="0" w:oddHBand="1" w:evenHBand="0" w:firstRowFirstColumn="0" w:firstRowLastColumn="0" w:lastRowFirstColumn="0" w:lastRowLastColumn="0"/>
+              <w:rPr>
+                <w:rFonts w:eastAsia="Times New Roman" w:cs="Times New Roman"/>
+                <w:color w:val="000000"/>
+                <w:szCs w:val="24"/>
+                <w:lang w:val="bs-Latn-BA" w:eastAsia="bs-Latn-BA"/>
+              </w:rPr>
+            </w:pPr>
+            <w:r>
+              <w:rPr>
+                <w:rFonts w:eastAsia="Times New Roman" w:cs="Times New Roman"/>
+                <w:color w:val="000000"/>
+                <w:szCs w:val="24"/>
+                <w:lang w:val="bs-Latn-BA" w:eastAsia="bs-Latn-BA"/>
+              </w:rPr>
+              <w:t>67,95 ± 12,98</w:t>
+            </w:r>
+          </w:p>
+        </w:tc>
+        <w:tc>
+          <w:tcPr>
+            <w:tcW w:w="2166" w:type="dxa"/>
+            <w:noWrap/>
+            <w:vAlign w:val="center"/>
+            <w:hideMark/>
+          </w:tcPr>
+          <w:p>
+            <w:pPr>
+              <w:jc w:val="center"/>
+              <w:cnfStyle w:val="000000100000" w:firstRow="0" w:lastRow="0" w:firstColumn="0" w:lastColumn="0" w:oddVBand="0" w:evenVBand="0" w:oddHBand="1" w:evenHBand="0" w:firstRowFirstColumn="0" w:firstRowLastColumn="0" w:lastRowFirstColumn="0" w:lastRowLastColumn="0"/>
+              <w:rPr>
+                <w:rFonts w:eastAsia="Times New Roman" w:cs="Times New Roman"/>
+                <w:color w:val="000000"/>
+                <w:szCs w:val="24"/>
+                <w:lang w:val="bs-Latn-BA" w:eastAsia="bs-Latn-BA"/>
+              </w:rPr>
+            </w:pPr>
+            <w:r>
+              <w:rPr>
+                <w:rFonts w:eastAsia="Times New Roman" w:cs="Times New Roman"/>
+                <w:color w:val="000000"/>
+                <w:szCs w:val="24"/>
+                <w:lang w:val="bs-Latn-BA" w:eastAsia="bs-Latn-BA"/>
+              </w:rPr>
+              <w:t>76,28 ± 15,09</w:t>
+            </w:r>
+          </w:p>
+        </w:tc>
+      </w:tr>
+      <w:tr>
+        <w:trPr>
+          <w:trHeight w:val="490"/>
+        </w:trPr>
+        <w:tc>
+          <w:tcPr>
+            <w:cnfStyle w:val="001000000000" w:firstRow="0" w:lastRow="0" w:firstColumn="1" w:lastColumn="0" w:oddVBand="0" w:evenVBand="0" w:oddHBand="0" w:evenHBand="0" w:firstRowFirstColumn="0" w:firstRowLastColumn="0" w:lastRowFirstColumn="0" w:lastRowLastColumn="0"/>
+            <w:tcW w:w="1806" w:type="dxa"/>
+            <w:vAlign w:val="center"/>
+            <w:hideMark/>
+          </w:tcPr>
+          <w:p>
+            <w:pPr>
+              <w:jc w:val="center"/>
+              <w:rPr>
+                <w:rFonts w:eastAsia="Times New Roman" w:cs="Times New Roman"/>
+                <w:color w:val="000000"/>
+                <w:szCs w:val="24"/>
+                <w:lang w:val="bs-Latn-BA" w:eastAsia="bs-Latn-BA"/>
+              </w:rPr>
+            </w:pPr>
+            <w:r>
+              <w:rPr>
+                <w:rFonts w:eastAsia="Times New Roman" w:cs="Times New Roman"/>
+                <w:color w:val="000000"/>
+                <w:szCs w:val="24"/>
+                <w:lang w:val="bs-Latn-BA" w:eastAsia="bs-Latn-BA"/>
+              </w:rPr>
+              <w:t>Preciznost N</w:t>
+            </w:r>
+          </w:p>
+        </w:tc>
+        <w:tc>
+          <w:tcPr>
+            <w:tcW w:w="1806" w:type="dxa"/>
+            <w:vAlign w:val="center"/>
+            <w:hideMark/>
+          </w:tcPr>
+          <w:p>
+            <w:pPr>
+              <w:jc w:val="center"/>
+              <w:cnfStyle w:val="000000000000" w:firstRow="0" w:lastRow="0" w:firstColumn="0" w:lastColumn="0" w:oddVBand="0" w:evenVBand="0" w:oddHBand="0" w:evenHBand="0" w:firstRowFirstColumn="0" w:firstRowLastColumn="0" w:lastRowFirstColumn="0" w:lastRowLastColumn="0"/>
+              <w:rPr>
+                <w:rFonts w:eastAsia="Times New Roman" w:cs="Times New Roman"/>
+                <w:color w:val="000000"/>
+                <w:szCs w:val="24"/>
+                <w:lang w:val="bs-Latn-BA" w:eastAsia="bs-Latn-BA"/>
+              </w:rPr>
+            </w:pPr>
+            <w:r>
+              <w:rPr>
+                <w:rFonts w:eastAsia="Times New Roman" w:cs="Times New Roman"/>
+                <w:color w:val="000000"/>
+                <w:szCs w:val="24"/>
+                <w:lang w:val="bs-Latn-BA" w:eastAsia="bs-Latn-BA"/>
+              </w:rPr>
+              <w:t>84,75 ± 5,39</w:t>
+            </w:r>
+          </w:p>
+        </w:tc>
+        <w:tc>
+          <w:tcPr>
+            <w:tcW w:w="2166" w:type="dxa"/>
+            <w:noWrap/>
+            <w:vAlign w:val="center"/>
+            <w:hideMark/>
+          </w:tcPr>
+          <w:p>
+            <w:pPr>
+              <w:jc w:val="center"/>
+              <w:cnfStyle w:val="000000000000" w:firstRow="0" w:lastRow="0" w:firstColumn="0" w:lastColumn="0" w:oddVBand="0" w:evenVBand="0" w:oddHBand="0" w:evenHBand="0" w:firstRowFirstColumn="0" w:firstRowLastColumn="0" w:lastRowFirstColumn="0" w:lastRowLastColumn="0"/>
+              <w:rPr>
+                <w:rFonts w:eastAsia="Times New Roman" w:cs="Times New Roman"/>
+                <w:color w:val="000000"/>
+                <w:szCs w:val="24"/>
+                <w:lang w:val="bs-Latn-BA" w:eastAsia="bs-Latn-BA"/>
+              </w:rPr>
+            </w:pPr>
+            <w:r>
+              <w:rPr>
+                <w:rFonts w:eastAsia="Times New Roman" w:cs="Times New Roman"/>
+                <w:color w:val="000000"/>
+                <w:szCs w:val="24"/>
+                <w:lang w:val="bs-Latn-BA" w:eastAsia="bs-Latn-BA"/>
+              </w:rPr>
+              <w:t>81,80 ± 2,61</w:t>
+            </w:r>
+          </w:p>
+        </w:tc>
+      </w:tr>
+      <w:tr>
+        <w:trPr>
+          <w:cnfStyle w:val="000000100000" w:firstRow="0" w:lastRow="0" w:firstColumn="0" w:lastColumn="0" w:oddVBand="0" w:evenVBand="0" w:oddHBand="1" w:evenHBand="0" w:firstRowFirstColumn="0" w:firstRowLastColumn="0" w:lastRowFirstColumn="0" w:lastRowLastColumn="0"/>
+          <w:trHeight w:val="490"/>
+        </w:trPr>
+        <w:tc>
+          <w:tcPr>
+            <w:cnfStyle w:val="001000000000" w:firstRow="0" w:lastRow="0" w:firstColumn="1" w:lastColumn="0" w:oddVBand="0" w:evenVBand="0" w:oddHBand="0" w:evenHBand="0" w:firstRowFirstColumn="0" w:firstRowLastColumn="0" w:lastRowFirstColumn="0" w:lastRowLastColumn="0"/>
+            <w:tcW w:w="1806" w:type="dxa"/>
+            <w:vAlign w:val="center"/>
+            <w:hideMark/>
+          </w:tcPr>
+          <w:p>
+            <w:pPr>
+              <w:jc w:val="center"/>
+              <w:rPr>
+                <w:rFonts w:eastAsia="Times New Roman" w:cs="Times New Roman"/>
+                <w:color w:val="000000"/>
+                <w:szCs w:val="24"/>
+                <w:lang w:val="bs-Latn-BA" w:eastAsia="bs-Latn-BA"/>
+              </w:rPr>
+            </w:pPr>
+            <w:r>
+              <w:rPr>
+                <w:rFonts w:eastAsia="Times New Roman" w:cs="Times New Roman"/>
+                <w:color w:val="000000"/>
+                <w:szCs w:val="24"/>
+                <w:lang w:val="bs-Latn-BA" w:eastAsia="bs-Latn-BA"/>
+              </w:rPr>
+              <w:t>F1 skor N</w:t>
+            </w:r>
+          </w:p>
+        </w:tc>
+        <w:tc>
+          <w:tcPr>
+            <w:tcW w:w="1806" w:type="dxa"/>
+            <w:vAlign w:val="center"/>
+            <w:hideMark/>
+          </w:tcPr>
+          <w:p>
+            <w:pPr>
+              <w:jc w:val="center"/>
+              <w:cnfStyle w:val="000000100000" w:firstRow="0" w:lastRow="0" w:firstColumn="0" w:lastColumn="0" w:oddVBand="0" w:evenVBand="0" w:oddHBand="1" w:evenHBand="0" w:firstRowFirstColumn="0" w:firstRowLastColumn="0" w:lastRowFirstColumn="0" w:lastRowLastColumn="0"/>
+              <w:rPr>
+                <w:rFonts w:eastAsia="Times New Roman" w:cs="Times New Roman"/>
+                <w:color w:val="000000"/>
+                <w:szCs w:val="24"/>
+                <w:lang w:val="bs-Latn-BA" w:eastAsia="bs-Latn-BA"/>
+              </w:rPr>
+            </w:pPr>
+            <w:r>
+              <w:rPr>
+                <w:rFonts w:eastAsia="Times New Roman" w:cs="Times New Roman"/>
+                <w:color w:val="000000"/>
+                <w:szCs w:val="24"/>
+                <w:lang w:val="bs-Latn-BA" w:eastAsia="bs-Latn-BA"/>
+              </w:rPr>
+              <w:t>74,73 ± 7,12</w:t>
+            </w:r>
+          </w:p>
+        </w:tc>
+        <w:tc>
+          <w:tcPr>
+            <w:tcW w:w="2166" w:type="dxa"/>
+            <w:noWrap/>
+            <w:vAlign w:val="center"/>
+            <w:hideMark/>
+          </w:tcPr>
+          <w:p>
+            <w:pPr>
+              <w:jc w:val="center"/>
+              <w:cnfStyle w:val="000000100000" w:firstRow="0" w:lastRow="0" w:firstColumn="0" w:lastColumn="0" w:oddVBand="0" w:evenVBand="0" w:oddHBand="1" w:evenHBand="0" w:firstRowFirstColumn="0" w:firstRowLastColumn="0" w:lastRowFirstColumn="0" w:lastRowLastColumn="0"/>
+              <w:rPr>
+                <w:rFonts w:eastAsia="Times New Roman" w:cs="Times New Roman"/>
+                <w:color w:val="000000"/>
+                <w:szCs w:val="24"/>
+                <w:lang w:val="bs-Latn-BA" w:eastAsia="bs-Latn-BA"/>
+              </w:rPr>
+            </w:pPr>
+            <w:r>
+              <w:rPr>
+                <w:rFonts w:eastAsia="Times New Roman" w:cs="Times New Roman"/>
+                <w:color w:val="000000"/>
+                <w:szCs w:val="24"/>
+                <w:lang w:val="bs-Latn-BA" w:eastAsia="bs-Latn-BA"/>
+              </w:rPr>
+              <w:t>78,32 ± 6,94</w:t>
+            </w:r>
+          </w:p>
+        </w:tc>
+      </w:tr>
+      <w:tr>
+        <w:trPr>
+          <w:trHeight w:val="490"/>
+        </w:trPr>
+        <w:tc>
+          <w:tcPr>
+            <w:cnfStyle w:val="001000000000" w:firstRow="0" w:lastRow="0" w:firstColumn="1" w:lastColumn="0" w:oddVBand="0" w:evenVBand="0" w:oddHBand="0" w:evenHBand="0" w:firstRowFirstColumn="0" w:firstRowLastColumn="0" w:lastRowFirstColumn="0" w:lastRowLastColumn="0"/>
+            <w:tcW w:w="1806" w:type="dxa"/>
+            <w:vAlign w:val="center"/>
+            <w:hideMark/>
+          </w:tcPr>
+          <w:p>
+            <w:pPr>
+              <w:jc w:val="center"/>
+              <w:rPr>
+                <w:rFonts w:eastAsia="Times New Roman" w:cs="Times New Roman"/>
+                <w:color w:val="000000"/>
+                <w:szCs w:val="24"/>
+                <w:lang w:val="bs-Latn-BA" w:eastAsia="bs-Latn-BA"/>
+              </w:rPr>
+            </w:pPr>
+            <w:r>
+              <w:rPr>
+                <w:rFonts w:eastAsia="Times New Roman" w:cs="Times New Roman"/>
+                <w:color w:val="000000"/>
+                <w:szCs w:val="24"/>
+                <w:lang w:val="bs-Latn-BA" w:eastAsia="bs-Latn-BA"/>
+              </w:rPr>
+              <w:t>AUC B</w:t>
+            </w:r>
+          </w:p>
+        </w:tc>
+        <w:tc>
+          <w:tcPr>
+            <w:tcW w:w="1806" w:type="dxa"/>
+            <w:vAlign w:val="center"/>
+            <w:hideMark/>
+          </w:tcPr>
+          <w:p>
+            <w:pPr>
+              <w:jc w:val="center"/>
+              <w:cnfStyle w:val="000000000000" w:firstRow="0" w:lastRow="0" w:firstColumn="0" w:lastColumn="0" w:oddVBand="0" w:evenVBand="0" w:oddHBand="0" w:evenHBand="0" w:firstRowFirstColumn="0" w:firstRowLastColumn="0" w:lastRowFirstColumn="0" w:lastRowLastColumn="0"/>
+              <w:rPr>
+                <w:rFonts w:eastAsia="Times New Roman" w:cs="Times New Roman"/>
+                <w:color w:val="000000"/>
+                <w:szCs w:val="24"/>
+                <w:lang w:val="bs-Latn-BA" w:eastAsia="bs-Latn-BA"/>
+              </w:rPr>
+            </w:pPr>
+            <w:r>
+              <w:rPr>
+                <w:rFonts w:eastAsia="Times New Roman" w:cs="Times New Roman"/>
+                <w:color w:val="000000"/>
+                <w:szCs w:val="24"/>
+                <w:lang w:val="bs-Latn-BA" w:eastAsia="bs-Latn-BA"/>
+              </w:rPr>
+              <w:t>85,69 ± 3,68</w:t>
+            </w:r>
+          </w:p>
+        </w:tc>
+        <w:tc>
+          <w:tcPr>
+            <w:tcW w:w="2166" w:type="dxa"/>
+            <w:noWrap/>
+            <w:vAlign w:val="center"/>
+            <w:hideMark/>
+          </w:tcPr>
+          <w:p>
+            <w:pPr>
+              <w:jc w:val="center"/>
+              <w:cnfStyle w:val="000000000000" w:firstRow="0" w:lastRow="0" w:firstColumn="0" w:lastColumn="0" w:oddVBand="0" w:evenVBand="0" w:oddHBand="0" w:evenHBand="0" w:firstRowFirstColumn="0" w:firstRowLastColumn="0" w:lastRowFirstColumn="0" w:lastRowLastColumn="0"/>
+              <w:rPr>
+                <w:rFonts w:eastAsia="Times New Roman" w:cs="Times New Roman"/>
+                <w:color w:val="000000"/>
+                <w:szCs w:val="24"/>
+                <w:lang w:val="bs-Latn-BA" w:eastAsia="bs-Latn-BA"/>
+              </w:rPr>
+            </w:pPr>
+            <w:r>
+              <w:rPr>
+                <w:rFonts w:eastAsia="Times New Roman" w:cs="Times New Roman"/>
+                <w:color w:val="000000"/>
+                <w:szCs w:val="24"/>
+                <w:lang w:val="bs-Latn-BA" w:eastAsia="bs-Latn-BA"/>
+              </w:rPr>
+              <w:t>82,37 ± 2,48</w:t>
+            </w:r>
+          </w:p>
+        </w:tc>
+      </w:tr>
+      <w:tr>
+        <w:trPr>
+          <w:cnfStyle w:val="000000100000" w:firstRow="0" w:lastRow="0" w:firstColumn="0" w:lastColumn="0" w:oddVBand="0" w:evenVBand="0" w:oddHBand="1" w:evenHBand="0" w:firstRowFirstColumn="0" w:firstRowLastColumn="0" w:lastRowFirstColumn="0" w:lastRowLastColumn="0"/>
+          <w:trHeight w:val="490"/>
+        </w:trPr>
+        <w:tc>
+          <w:tcPr>
+            <w:cnfStyle w:val="001000000000" w:firstRow="0" w:lastRow="0" w:firstColumn="1" w:lastColumn="0" w:oddVBand="0" w:evenVBand="0" w:oddHBand="0" w:evenHBand="0" w:firstRowFirstColumn="0" w:firstRowLastColumn="0" w:lastRowFirstColumn="0" w:lastRowLastColumn="0"/>
+            <w:tcW w:w="1806" w:type="dxa"/>
+            <w:vAlign w:val="center"/>
+            <w:hideMark/>
+          </w:tcPr>
+          <w:p>
+            <w:pPr>
+              <w:jc w:val="center"/>
+              <w:rPr>
+                <w:rFonts w:eastAsia="Times New Roman" w:cs="Times New Roman"/>
+                <w:color w:val="000000"/>
+                <w:szCs w:val="24"/>
+                <w:lang w:val="bs-Latn-BA" w:eastAsia="bs-Latn-BA"/>
+              </w:rPr>
+            </w:pPr>
+            <w:r>
+              <w:rPr>
+                <w:rFonts w:eastAsia="Times New Roman" w:cs="Times New Roman"/>
+                <w:color w:val="000000"/>
+                <w:szCs w:val="24"/>
+                <w:lang w:val="bs-Latn-BA" w:eastAsia="bs-Latn-BA"/>
+              </w:rPr>
+              <w:t>AUC M</w:t>
+            </w:r>
+          </w:p>
+        </w:tc>
+        <w:tc>
+          <w:tcPr>
+            <w:tcW w:w="1806" w:type="dxa"/>
+            <w:vAlign w:val="center"/>
+            <w:hideMark/>
+          </w:tcPr>
+          <w:p>
+            <w:pPr>
+              <w:jc w:val="center"/>
+              <w:cnfStyle w:val="000000100000" w:firstRow="0" w:lastRow="0" w:firstColumn="0" w:lastColumn="0" w:oddVBand="0" w:evenVBand="0" w:oddHBand="1" w:evenHBand="0" w:firstRowFirstColumn="0" w:firstRowLastColumn="0" w:lastRowFirstColumn="0" w:lastRowLastColumn="0"/>
+              <w:rPr>
+                <w:rFonts w:eastAsia="Times New Roman" w:cs="Times New Roman"/>
+                <w:color w:val="000000"/>
+                <w:szCs w:val="24"/>
+                <w:lang w:val="bs-Latn-BA" w:eastAsia="bs-Latn-BA"/>
+              </w:rPr>
+            </w:pPr>
+            <w:r>
+              <w:rPr>
+                <w:rFonts w:eastAsia="Times New Roman" w:cs="Times New Roman"/>
+                <w:color w:val="000000"/>
+                <w:szCs w:val="24"/>
+                <w:lang w:val="bs-Latn-BA" w:eastAsia="bs-Latn-BA"/>
+              </w:rPr>
+              <w:t>100,00 ± 0,00</w:t>
+            </w:r>
+          </w:p>
+        </w:tc>
+        <w:tc>
+          <w:tcPr>
+            <w:tcW w:w="2166" w:type="dxa"/>
+            <w:noWrap/>
+            <w:vAlign w:val="center"/>
+            <w:hideMark/>
+          </w:tcPr>
+          <w:p>
+            <w:pPr>
+              <w:jc w:val="center"/>
+              <w:cnfStyle w:val="000000100000" w:firstRow="0" w:lastRow="0" w:firstColumn="0" w:lastColumn="0" w:oddVBand="0" w:evenVBand="0" w:oddHBand="1" w:evenHBand="0" w:firstRowFirstColumn="0" w:firstRowLastColumn="0" w:lastRowFirstColumn="0" w:lastRowLastColumn="0"/>
+              <w:rPr>
+                <w:rFonts w:eastAsia="Times New Roman" w:cs="Times New Roman"/>
+                <w:color w:val="000000"/>
+                <w:szCs w:val="24"/>
+                <w:lang w:val="bs-Latn-BA" w:eastAsia="bs-Latn-BA"/>
+              </w:rPr>
+            </w:pPr>
+            <w:r>
+              <w:rPr>
+                <w:rFonts w:eastAsia="Times New Roman" w:cs="Times New Roman"/>
+                <w:color w:val="000000"/>
+                <w:szCs w:val="24"/>
+                <w:lang w:val="bs-Latn-BA" w:eastAsia="bs-Latn-BA"/>
+              </w:rPr>
+              <w:t>100,00 ± 0,00</w:t>
+            </w:r>
+          </w:p>
+        </w:tc>
+      </w:tr>
+      <w:tr>
+        <w:trPr>
+          <w:trHeight w:val="490"/>
+        </w:trPr>
+        <w:tc>
+          <w:tcPr>
+            <w:cnfStyle w:val="001000000000" w:firstRow="0" w:lastRow="0" w:firstColumn="1" w:lastColumn="0" w:oddVBand="0" w:evenVBand="0" w:oddHBand="0" w:evenHBand="0" w:firstRowFirstColumn="0" w:firstRowLastColumn="0" w:lastRowFirstColumn="0" w:lastRowLastColumn="0"/>
+            <w:tcW w:w="1806" w:type="dxa"/>
+            <w:vAlign w:val="center"/>
+            <w:hideMark/>
+          </w:tcPr>
+          <w:p>
+            <w:pPr>
+              <w:jc w:val="center"/>
+              <w:rPr>
+                <w:rFonts w:eastAsia="Times New Roman" w:cs="Times New Roman"/>
+                <w:color w:val="000000"/>
+                <w:szCs w:val="24"/>
+                <w:lang w:val="bs-Latn-BA" w:eastAsia="bs-Latn-BA"/>
+              </w:rPr>
+            </w:pPr>
+            <w:r>
+              <w:rPr>
+                <w:rFonts w:eastAsia="Times New Roman" w:cs="Times New Roman"/>
+                <w:color w:val="000000"/>
+                <w:szCs w:val="24"/>
+                <w:lang w:val="bs-Latn-BA" w:eastAsia="bs-Latn-BA"/>
+              </w:rPr>
+              <w:t>AUC N</w:t>
+            </w:r>
+          </w:p>
+        </w:tc>
+        <w:tc>
+          <w:tcPr>
+            <w:tcW w:w="1806" w:type="dxa"/>
+            <w:vAlign w:val="center"/>
+            <w:hideMark/>
+          </w:tcPr>
+          <w:p>
+            <w:pPr>
+              <w:jc w:val="center"/>
+              <w:cnfStyle w:val="000000000000" w:firstRow="0" w:lastRow="0" w:firstColumn="0" w:lastColumn="0" w:oddVBand="0" w:evenVBand="0" w:oddHBand="0" w:evenHBand="0" w:firstRowFirstColumn="0" w:firstRowLastColumn="0" w:lastRowFirstColumn="0" w:lastRowLastColumn="0"/>
+              <w:rPr>
+                <w:rFonts w:eastAsia="Times New Roman" w:cs="Times New Roman"/>
+                <w:color w:val="000000"/>
+                <w:szCs w:val="24"/>
+                <w:lang w:val="bs-Latn-BA" w:eastAsia="bs-Latn-BA"/>
+              </w:rPr>
+            </w:pPr>
+            <w:r>
+              <w:rPr>
+                <w:rFonts w:eastAsia="Times New Roman" w:cs="Times New Roman"/>
+                <w:color w:val="000000"/>
+                <w:szCs w:val="24"/>
+                <w:lang w:val="bs-Latn-BA" w:eastAsia="bs-Latn-BA"/>
+              </w:rPr>
+              <w:t>94,18 ± 1,45</w:t>
+            </w:r>
+          </w:p>
+        </w:tc>
+        <w:tc>
+          <w:tcPr>
+            <w:tcW w:w="2166" w:type="dxa"/>
+            <w:noWrap/>
+            <w:vAlign w:val="center"/>
+            <w:hideMark/>
+          </w:tcPr>
+          <w:p>
+            <w:pPr>
+              <w:jc w:val="center"/>
+              <w:cnfStyle w:val="000000000000" w:firstRow="0" w:lastRow="0" w:firstColumn="0" w:lastColumn="0" w:oddVBand="0" w:evenVBand="0" w:oddHBand="0" w:evenHBand="0" w:firstRowFirstColumn="0" w:firstRowLastColumn="0" w:lastRowFirstColumn="0" w:lastRowLastColumn="0"/>
+              <w:rPr>
+                <w:rFonts w:eastAsia="Times New Roman" w:cs="Times New Roman"/>
+                <w:color w:val="000000"/>
+                <w:szCs w:val="24"/>
+                <w:lang w:val="bs-Latn-BA" w:eastAsia="bs-Latn-BA"/>
+              </w:rPr>
+            </w:pPr>
+            <w:r>
+              <w:rPr>
+                <w:rFonts w:eastAsia="Times New Roman" w:cs="Times New Roman"/>
+                <w:color w:val="000000"/>
+                <w:szCs w:val="24"/>
+                <w:lang w:val="bs-Latn-BA" w:eastAsia="bs-Latn-BA"/>
+              </w:rPr>
+              <w:t>94,18 ± 0,48</w:t>
+            </w:r>
+          </w:p>
+        </w:tc>
+      </w:tr>
+    </w:tbl>
+    <w:p>
+      <w:pPr>
+        <w:pStyle w:val="Caption"/>
+      </w:pPr>
+    </w:p>
+    <w:p>
+      <w:pPr>
+        <w:pStyle w:val="Caption"/>
+        <w:rPr>
           <w:lang w:val="bs-Latn-BA"/>
         </w:rPr>
       </w:pPr>
       <w:r>
-        <w:rPr>
-          <w:lang w:val="bs-Latn-BA"/>
-        </w:rPr>
+        <w:t xml:space="preserve">Tablica </w:t>
+      </w:r>
+      <w:r>
+        <w:fldChar w:fldCharType="begin"/>
+      </w:r>
+      <w:r>
+        <w:instrText xml:space="preserve"> SEQ Tablica \* ARABIC </w:instrText>
+      </w:r>
+      <w:r>
+        <w:fldChar w:fldCharType="separate"/>
+      </w:r>
+      <w:r>
+        <w:rPr>
+          <w:noProof/>
+        </w:rPr>
+        <w:t>3</w:t>
+      </w:r>
+      <w:r>
         <w:fldChar w:fldCharType="end"/>
+      </w:r>
+      <w:r>
+        <w:t xml:space="preserve"> Dodatne metrike modela</w:t>
       </w:r>
     </w:p>
     <w:p>
@@ -24063,23 +26555,39 @@
         <w:rPr>
           <w:lang w:val="de-DE"/>
         </w:rPr>
-        <w:t>Za prvu C# analizu vrijeme analize iznosi oko 0,2 sekunde. Za prvu Python analizu, vrijeme analize iznosi oko 0,2 sekunde.</w:t>
-      </w:r>
-    </w:p>
-    <w:p>
-      <w:pPr>
-        <w:pStyle w:val="Paragraf"/>
-        <w:ind w:left="340" w:firstLine="0"/>
-      </w:pPr>
-    </w:p>
-    <w:p>
-      <w:pPr>
-        <w:pStyle w:val="Heading2"/>
-      </w:pPr>
-      <w:r>
-        <w:lastRenderedPageBreak/>
-        <w:t>ROC i AUC</w:t>
-      </w:r>
+        <w:t>Za prvu C# analizu vrijeme analize iznosi oko 0,</w:t>
+      </w:r>
+      <w:r>
+        <w:rPr>
+          <w:lang w:val="de-DE"/>
+        </w:rPr>
+        <w:t>4</w:t>
+      </w:r>
+      <w:r>
+        <w:rPr>
+          <w:lang w:val="de-DE"/>
+        </w:rPr>
+        <w:t xml:space="preserve"> sekunde. Za prvu Python analizu, vrijeme analize iznosi oko 0,</w:t>
+      </w:r>
+      <w:r>
+        <w:rPr>
+          <w:lang w:val="de-DE"/>
+        </w:rPr>
+        <w:t>4</w:t>
+      </w:r>
+      <w:r>
+        <w:rPr>
+          <w:lang w:val="de-DE"/>
+        </w:rPr>
+        <w:t xml:space="preserve"> sekunde.</w:t>
+      </w:r>
+    </w:p>
+    <w:p>
+      <w:pPr>
+        <w:rPr>
+          <w:lang w:val="de-DE"/>
+        </w:rPr>
+      </w:pPr>
     </w:p>
     <w:p>
       <w:pPr>
@@ -24089,162 +26597,17 @@
     </w:p>
     <w:p>
       <w:pPr>
+        <w:pStyle w:val="Heading2"/>
+      </w:pPr>
+      <w:bookmarkStart w:id="29" w:name="_Toc236486959"/>
+      <w:r>
+        <w:t>Analiza rezultata</w:t>
+      </w:r>
+      <w:bookmarkEnd w:id="29"/>
+    </w:p>
+    <w:p>
+      <w:pPr>
         <w:pStyle w:val="Paragraf"/>
-        <w:ind w:firstLine="0"/>
-      </w:pPr>
-    </w:p>
-    <w:p>
-      <w:pPr>
-        <w:pStyle w:val="Paragraf"/>
-        <w:ind w:firstLine="0"/>
-      </w:pPr>
-    </w:p>
-    <w:p>
-      <w:pPr>
-        <w:pStyle w:val="Paragraf"/>
-        <w:ind w:firstLine="0"/>
-      </w:pPr>
-    </w:p>
-    <w:p>
-      <w:pPr>
-        <w:pStyle w:val="Paragraf"/>
-        <w:ind w:firstLine="0"/>
-      </w:pPr>
-    </w:p>
-    <w:p>
-      <w:pPr>
-        <w:pStyle w:val="Paragraf"/>
-        <w:ind w:firstLine="0"/>
-      </w:pPr>
-    </w:p>
-    <w:p>
-      <w:pPr>
-        <w:pStyle w:val="Paragraf"/>
-        <w:ind w:firstLine="0"/>
-      </w:pPr>
-    </w:p>
-    <w:p>
-      <w:pPr>
-        <w:pStyle w:val="Paragraf"/>
-        <w:ind w:firstLine="0"/>
-      </w:pPr>
-    </w:p>
-    <w:p>
-      <w:pPr>
-        <w:pStyle w:val="Paragraf"/>
-        <w:ind w:firstLine="0"/>
-      </w:pPr>
-    </w:p>
-    <w:p>
-      <w:pPr>
-        <w:pStyle w:val="Paragraf"/>
-        <w:ind w:firstLine="0"/>
-      </w:pPr>
-    </w:p>
-    <w:p>
-      <w:pPr>
-        <w:pStyle w:val="Paragraf"/>
-        <w:ind w:firstLine="0"/>
-      </w:pPr>
-    </w:p>
-    <w:p>
-      <w:pPr>
-        <w:pStyle w:val="Paragraf"/>
-        <w:ind w:firstLine="0"/>
-      </w:pPr>
-    </w:p>
-    <w:p>
-      <w:pPr>
-        <w:pStyle w:val="Paragraf"/>
-        <w:ind w:firstLine="0"/>
-      </w:pPr>
-    </w:p>
-    <w:p>
-      <w:pPr>
-        <w:pStyle w:val="Paragraf"/>
-        <w:ind w:firstLine="0"/>
-      </w:pPr>
-    </w:p>
-    <w:p>
-      <w:pPr>
-        <w:pStyle w:val="Paragraf"/>
-        <w:ind w:firstLine="0"/>
-      </w:pPr>
-    </w:p>
-    <w:p>
-      <w:pPr>
-        <w:pStyle w:val="Paragraf"/>
-        <w:ind w:firstLine="0"/>
-      </w:pPr>
-    </w:p>
-    <w:p>
-      <w:pPr>
-        <w:pStyle w:val="Paragraf"/>
-        <w:ind w:firstLine="0"/>
-      </w:pPr>
-    </w:p>
-    <w:p>
-      <w:pPr>
-        <w:pStyle w:val="Paragraf"/>
-        <w:ind w:firstLine="0"/>
-      </w:pPr>
-    </w:p>
-    <w:p>
-      <w:pPr>
-        <w:pStyle w:val="Paragraf"/>
-        <w:ind w:firstLine="0"/>
-      </w:pPr>
-    </w:p>
-    <w:p>
-      <w:pPr>
-        <w:pStyle w:val="Paragraf"/>
-        <w:ind w:firstLine="0"/>
-      </w:pPr>
-    </w:p>
-    <w:p>
-      <w:pPr>
-        <w:pStyle w:val="Paragraf"/>
-        <w:ind w:firstLine="0"/>
-      </w:pPr>
-    </w:p>
-    <w:p>
-      <w:pPr>
-        <w:pStyle w:val="Paragraf"/>
-        <w:ind w:firstLine="0"/>
-      </w:pPr>
-    </w:p>
-    <w:p>
-      <w:pPr>
-        <w:pStyle w:val="Paragraf"/>
-        <w:ind w:firstLine="0"/>
-      </w:pPr>
-    </w:p>
-    <w:p>
-      <w:pPr>
-        <w:pStyle w:val="Paragraf"/>
-        <w:ind w:firstLine="0"/>
-      </w:pPr>
-    </w:p>
-    <w:p>
-      <w:pPr>
-        <w:pStyle w:val="Paragraf"/>
-        <w:ind w:firstLine="0"/>
-      </w:pPr>
-    </w:p>
-    <w:p>
-      <w:pPr>
-        <w:pStyle w:val="Heading2"/>
-      </w:pPr>
-      <w:bookmarkStart w:id="29" w:name="_Toc236486959"/>
-      <w:r>
-        <w:lastRenderedPageBreak/>
-        <w:t>Analiza rezultata</w:t>
-      </w:r>
-      <w:bookmarkEnd w:id="29"/>
-    </w:p>
-    <w:p>
-      <w:pPr>
-        <w:pStyle w:val="Paragraf"/>
       </w:pPr>
     </w:p>
     <w:p>
@@ -24307,6 +26670,9 @@
       </w:r>
       <w:r>
         <w:t>LibTorch.</w:t>
+      </w:r>
+      <w:r>
+        <w:t xml:space="preserve"> Jedina stvarna razlika koja se može primjetiti jeste da je treniranje u Python okruženju trajalo duže u odnosu na C#. </w:t>
       </w:r>
     </w:p>
     <w:p>
@@ -30200,6 +32566,7 @@
   <w:style w:type="character" w:default="1" w:styleId="DefaultParagraphFont">
     <w:name w:val="Default Paragraph Font"/>
     <w:uiPriority w:val="1"/>
+    <w:semiHidden/>
     <w:unhideWhenUsed/>
   </w:style>
   <w:style w:type="table" w:default="1" w:styleId="TableNormal">
@@ -30858,6 +33225,69 @@
       <w:lang w:val="bs-Latn-BA" w:eastAsia="bs-Latn-BA"/>
     </w:rPr>
   </w:style>
+  <w:style w:type="table" w:styleId="PlainTable1">
+    <w:name w:val="Plain Table 1"/>
+    <w:basedOn w:val="TableNormal"/>
+    <w:uiPriority w:val="41"/>
+    <w:rsid w:val="006A49E8"/>
+    <w:pPr>
+      <w:spacing w:after="0" w:line="240" w:lineRule="auto"/>
+    </w:pPr>
+    <w:tblPr>
+      <w:tblStyleRowBandSize w:val="1"/>
+      <w:tblStyleColBandSize w:val="1"/>
+      <w:tblBorders>
+        <w:top w:val="single" w:sz="4" w:space="0" w:color="BFBFBF" w:themeColor="background1" w:themeShade="BF"/>
+        <w:left w:val="single" w:sz="4" w:space="0" w:color="BFBFBF" w:themeColor="background1" w:themeShade="BF"/>
+        <w:bottom w:val="single" w:sz="4" w:space="0" w:color="BFBFBF" w:themeColor="background1" w:themeShade="BF"/>
+        <w:right w:val="single" w:sz="4" w:space="0" w:color="BFBFBF" w:themeColor="background1" w:themeShade="BF"/>
+        <w:insideH w:val="single" w:sz="4" w:space="0" w:color="BFBFBF" w:themeColor="background1" w:themeShade="BF"/>
+        <w:insideV w:val="single" w:sz="4" w:space="0" w:color="BFBFBF" w:themeColor="background1" w:themeShade="BF"/>
+      </w:tblBorders>
+    </w:tblPr>
+    <w:tblStylePr w:type="firstRow">
+      <w:rPr>
+        <w:b/>
+        <w:bCs/>
+      </w:rPr>
+    </w:tblStylePr>
+    <w:tblStylePr w:type="lastRow">
+      <w:rPr>
+        <w:b/>
+        <w:bCs/>
+      </w:rPr>
+      <w:tblPr/>
+      <w:tcPr>
+        <w:tcBorders>
+          <w:top w:val="double" w:sz="4" w:space="0" w:color="BFBFBF" w:themeColor="background1" w:themeShade="BF"/>
+        </w:tcBorders>
+      </w:tcPr>
+    </w:tblStylePr>
+    <w:tblStylePr w:type="firstCol">
+      <w:rPr>
+        <w:b/>
+        <w:bCs/>
+      </w:rPr>
+    </w:tblStylePr>
+    <w:tblStylePr w:type="lastCol">
+      <w:rPr>
+        <w:b/>
+        <w:bCs/>
+      </w:rPr>
+    </w:tblStylePr>
+    <w:tblStylePr w:type="band1Vert">
+      <w:tblPr/>
+      <w:tcPr>
+        <w:shd w:val="clear" w:color="auto" w:fill="F2F2F2" w:themeFill="background1" w:themeFillShade="F2"/>
+      </w:tcPr>
+    </w:tblStylePr>
+    <w:tblStylePr w:type="band1Horz">
+      <w:tblPr/>
+      <w:tcPr>
+        <w:shd w:val="clear" w:color="auto" w:fill="F2F2F2" w:themeFill="background1" w:themeFillShade="F2"/>
+      </w:tcPr>
+    </w:tblStylePr>
+  </w:style>
 </w:styles>
 </file>
 

</xml_diff>

<commit_message>
Small fixes inside the document.
</commit_message>
<xml_diff>
--- a/Word/omar_kurtovic_diplomski_rad.docx
+++ b/Word/omar_kurtovic_diplomski_rad.docx
@@ -7713,7 +7713,6 @@
       <w:r>
         <w:t xml:space="preserve"> te</w:t>
       </w:r>
-      <w:proofErr w:type="spellStart"/>
       <w:r>
         <w:rPr>
           <w:rFonts w:ascii="Aptos" w:hAnsi="Aptos" w:cs="Aptos"/>
@@ -7721,11 +7720,7 @@
         <w:t>ž</w:t>
       </w:r>
       <w:r>
-        <w:t>inski</w:t>
-      </w:r>
-      <w:proofErr w:type="spellEnd"/>
-      <w:r>
-        <w:t xml:space="preserve"> parametar, te b pomak. Iz ove formule se može </w:t>
+        <w:t xml:space="preserve">inski parametar, te b pomak. Iz ove formule se može </w:t>
       </w:r>
       <w:proofErr w:type="spellStart"/>
       <w:r>
@@ -12126,21 +12121,15 @@
         <w:t xml:space="preserve">dobija nakon </w:t>
       </w:r>
       <w:r>
-        <w:t>konstrukcije ROC krive i predstavlja površinu ispod nje. R</w:t>
-      </w:r>
-      <w:r>
-        <w:t>ač</w:t>
-      </w:r>
-      <w:r>
-        <w:rPr>
-          <w:u w:val="single"/>
-        </w:rPr>
-        <w:t xml:space="preserve">una se korištenjem </w:t>
-      </w:r>
-      <w:r>
-        <w:rPr>
-          <w:u w:val="single"/>
-        </w:rPr>
+        <w:t xml:space="preserve">konstrukcije ROC krive i predstavlja površinu ispod nje. </w:t>
+      </w:r>
+      <w:r>
+        <w:t>R</w:t>
+      </w:r>
+      <w:r>
+        <w:t xml:space="preserve">ačuna se korištenjem </w:t>
+      </w:r>
+      <w:r>
         <w:t>trapeznog pravila nad susjednim tačkama krive</w:t>
       </w:r>
       <w:r>
@@ -14320,7 +14309,7 @@
     <w:p/>
     <w:tbl>
       <w:tblPr>
-        <w:tblStyle w:val="TableGrid"/>
+        <w:tblStyle w:val="PlainTable1"/>
         <w:tblW w:w="0" w:type="auto"/>
         <w:tblLook w:val="04A0" w:firstRow="1" w:lastRow="0" w:firstColumn="1" w:lastColumn="0" w:noHBand="0" w:noVBand="1"/>
       </w:tblPr>
@@ -14331,8 +14320,12 @@
         <w:gridCol w:w="2394"/>
       </w:tblGrid>
       <w:tr>
+        <w:trPr>
+          <w:cnfStyle w:val="100000000000" w:firstRow="1" w:lastRow="0" w:firstColumn="0" w:lastColumn="0" w:oddVBand="0" w:evenVBand="0" w:oddHBand="0" w:evenHBand="0" w:firstRowFirstColumn="0" w:firstRowLastColumn="0" w:lastRowFirstColumn="0" w:lastRowLastColumn="0"/>
+        </w:trPr>
         <w:tc>
           <w:tcPr>
+            <w:cnfStyle w:val="001000000000" w:firstRow="0" w:lastRow="0" w:firstColumn="1" w:lastColumn="0" w:oddVBand="0" w:evenVBand="0" w:oddHBand="0" w:evenHBand="0" w:firstRowFirstColumn="0" w:firstRowLastColumn="0" w:lastRowFirstColumn="0" w:lastRowLastColumn="0"/>
             <w:tcW w:w="2394" w:type="dxa"/>
           </w:tcPr>
           <w:p>
@@ -14346,6 +14339,9 @@
             <w:tcW w:w="2394" w:type="dxa"/>
           </w:tcPr>
           <w:p>
+            <w:pPr>
+              <w:cnfStyle w:val="100000000000" w:firstRow="1" w:lastRow="0" w:firstColumn="0" w:lastColumn="0" w:oddVBand="0" w:evenVBand="0" w:oddHBand="0" w:evenHBand="0" w:firstRowFirstColumn="0" w:firstRowLastColumn="0" w:lastRowFirstColumn="0" w:lastRowLastColumn="0"/>
+            </w:pPr>
             <w:r>
               <w:t>Izlazne dimenzije</w:t>
             </w:r>
@@ -14356,6 +14352,9 @@
             <w:tcW w:w="2394" w:type="dxa"/>
           </w:tcPr>
           <w:p>
+            <w:pPr>
+              <w:cnfStyle w:val="100000000000" w:firstRow="1" w:lastRow="0" w:firstColumn="0" w:lastColumn="0" w:oddVBand="0" w:evenVBand="0" w:oddHBand="0" w:evenHBand="0" w:firstRowFirstColumn="0" w:firstRowLastColumn="0" w:lastRowFirstColumn="0" w:lastRowLastColumn="0"/>
+            </w:pPr>
             <w:r>
               <w:t>Broj parametara</w:t>
             </w:r>
@@ -14366,6 +14365,9 @@
             <w:tcW w:w="2394" w:type="dxa"/>
           </w:tcPr>
           <w:p>
+            <w:pPr>
+              <w:cnfStyle w:val="100000000000" w:firstRow="1" w:lastRow="0" w:firstColumn="0" w:lastColumn="0" w:oddVBand="0" w:evenVBand="0" w:oddHBand="0" w:evenHBand="0" w:firstRowFirstColumn="0" w:firstRowLastColumn="0" w:lastRowFirstColumn="0" w:lastRowLastColumn="0"/>
+            </w:pPr>
             <w:r>
               <w:t>Postotak parametara</w:t>
             </w:r>
@@ -14373,8 +14375,12 @@
         </w:tc>
       </w:tr>
       <w:tr>
+        <w:trPr>
+          <w:cnfStyle w:val="000000100000" w:firstRow="0" w:lastRow="0" w:firstColumn="0" w:lastColumn="0" w:oddVBand="0" w:evenVBand="0" w:oddHBand="1" w:evenHBand="0" w:firstRowFirstColumn="0" w:firstRowLastColumn="0" w:lastRowFirstColumn="0" w:lastRowLastColumn="0"/>
+        </w:trPr>
         <w:tc>
           <w:tcPr>
+            <w:cnfStyle w:val="001000000000" w:firstRow="0" w:lastRow="0" w:firstColumn="1" w:lastColumn="0" w:oddVBand="0" w:evenVBand="0" w:oddHBand="0" w:evenHBand="0" w:firstRowFirstColumn="0" w:firstRowLastColumn="0" w:lastRowFirstColumn="0" w:lastRowLastColumn="0"/>
             <w:tcW w:w="2394" w:type="dxa"/>
           </w:tcPr>
           <w:p>
@@ -14388,6 +14394,9 @@
             <w:tcW w:w="2394" w:type="dxa"/>
           </w:tcPr>
           <w:p>
+            <w:pPr>
+              <w:cnfStyle w:val="000000100000" w:firstRow="0" w:lastRow="0" w:firstColumn="0" w:lastColumn="0" w:oddVBand="0" w:evenVBand="0" w:oddHBand="1" w:evenHBand="0" w:firstRowFirstColumn="0" w:firstRowLastColumn="0" w:lastRowFirstColumn="0" w:lastRowLastColumn="0"/>
+            </w:pPr>
             <w:r>
               <w:t>[1, 64, 254, 254]</w:t>
             </w:r>
@@ -14398,6 +14407,9 @@
             <w:tcW w:w="2394" w:type="dxa"/>
           </w:tcPr>
           <w:p>
+            <w:pPr>
+              <w:cnfStyle w:val="000000100000" w:firstRow="0" w:lastRow="0" w:firstColumn="0" w:lastColumn="0" w:oddVBand="0" w:evenVBand="0" w:oddHBand="1" w:evenHBand="0" w:firstRowFirstColumn="0" w:firstRowLastColumn="0" w:lastRowFirstColumn="0" w:lastRowLastColumn="0"/>
+            </w:pPr>
             <w:r>
               <w:t>640</w:t>
             </w:r>
@@ -14408,6 +14420,9 @@
             <w:tcW w:w="2394" w:type="dxa"/>
           </w:tcPr>
           <w:p>
+            <w:pPr>
+              <w:cnfStyle w:val="000000100000" w:firstRow="0" w:lastRow="0" w:firstColumn="0" w:lastColumn="0" w:oddVBand="0" w:evenVBand="0" w:oddHBand="1" w:evenHBand="0" w:firstRowFirstColumn="0" w:firstRowLastColumn="0" w:lastRowFirstColumn="0" w:lastRowLastColumn="0"/>
+            </w:pPr>
             <w:r>
               <w:t>0</w:t>
             </w:r>
@@ -14429,6 +14444,7 @@
       <w:tr>
         <w:tc>
           <w:tcPr>
+            <w:cnfStyle w:val="001000000000" w:firstRow="0" w:lastRow="0" w:firstColumn="1" w:lastColumn="0" w:oddVBand="0" w:evenVBand="0" w:oddHBand="0" w:evenHBand="0" w:firstRowFirstColumn="0" w:firstRowLastColumn="0" w:lastRowFirstColumn="0" w:lastRowLastColumn="0"/>
             <w:tcW w:w="2394" w:type="dxa"/>
           </w:tcPr>
           <w:p>
@@ -14444,32 +14460,11 @@
             <w:tcW w:w="2394" w:type="dxa"/>
           </w:tcPr>
           <w:p>
+            <w:pPr>
+              <w:cnfStyle w:val="000000000000" w:firstRow="0" w:lastRow="0" w:firstColumn="0" w:lastColumn="0" w:oddVBand="0" w:evenVBand="0" w:oddHBand="0" w:evenHBand="0" w:firstRowFirstColumn="0" w:firstRowLastColumn="0" w:lastRowFirstColumn="0" w:lastRowLastColumn="0"/>
+            </w:pPr>
             <w:r>
               <w:t>[1, 64, 254, 254]</w:t>
-            </w:r>
-          </w:p>
-        </w:tc>
-        <w:tc>
-          <w:tcPr>
-            <w:tcW w:w="2394" w:type="dxa"/>
-          </w:tcPr>
-          <w:p/>
-        </w:tc>
-        <w:tc>
-          <w:tcPr>
-            <w:tcW w:w="2394" w:type="dxa"/>
-          </w:tcPr>
-          <w:p/>
-        </w:tc>
-      </w:tr>
-      <w:tr>
-        <w:tc>
-          <w:tcPr>
-            <w:tcW w:w="2394" w:type="dxa"/>
-          </w:tcPr>
-          <w:p>
-            <w:r>
-              <w:t>MaxPool2d</w:t>
             </w:r>
           </w:p>
         </w:tc>
@@ -14478,33 +14473,9 @@
             <w:tcW w:w="2394" w:type="dxa"/>
           </w:tcPr>
           <w:p>
-            <w:r>
-              <w:t>[1, 64, 127, 127]</w:t>
-            </w:r>
-          </w:p>
-        </w:tc>
-        <w:tc>
-          <w:tcPr>
-            <w:tcW w:w="2394" w:type="dxa"/>
-          </w:tcPr>
-          <w:p/>
-        </w:tc>
-        <w:tc>
-          <w:tcPr>
-            <w:tcW w:w="2394" w:type="dxa"/>
-          </w:tcPr>
-          <w:p/>
-        </w:tc>
-      </w:tr>
-      <w:tr>
-        <w:tc>
-          <w:tcPr>
-            <w:tcW w:w="2394" w:type="dxa"/>
-          </w:tcPr>
-          <w:p>
-            <w:r>
-              <w:t>Conv2d</w:t>
-            </w:r>
+            <w:pPr>
+              <w:cnfStyle w:val="000000000000" w:firstRow="0" w:lastRow="0" w:firstColumn="0" w:lastColumn="0" w:oddVBand="0" w:evenVBand="0" w:oddHBand="0" w:evenHBand="0" w:firstRowFirstColumn="0" w:firstRowLastColumn="0" w:lastRowFirstColumn="0" w:lastRowLastColumn="0"/>
+            </w:pPr>
           </w:p>
         </w:tc>
         <w:tc>
@@ -14512,8 +14483,24 @@
             <w:tcW w:w="2394" w:type="dxa"/>
           </w:tcPr>
           <w:p>
-            <w:r>
-              <w:t>[1, 64, 125, 125]</w:t>
+            <w:pPr>
+              <w:cnfStyle w:val="000000000000" w:firstRow="0" w:lastRow="0" w:firstColumn="0" w:lastColumn="0" w:oddVBand="0" w:evenVBand="0" w:oddHBand="0" w:evenHBand="0" w:firstRowFirstColumn="0" w:firstRowLastColumn="0" w:lastRowFirstColumn="0" w:lastRowLastColumn="0"/>
+            </w:pPr>
+          </w:p>
+        </w:tc>
+      </w:tr>
+      <w:tr>
+        <w:trPr>
+          <w:cnfStyle w:val="000000100000" w:firstRow="0" w:lastRow="0" w:firstColumn="0" w:lastColumn="0" w:oddVBand="0" w:evenVBand="0" w:oddHBand="1" w:evenHBand="0" w:firstRowFirstColumn="0" w:firstRowLastColumn="0" w:lastRowFirstColumn="0" w:lastRowLastColumn="0"/>
+        </w:trPr>
+        <w:tc>
+          <w:tcPr>
+            <w:cnfStyle w:val="001000000000" w:firstRow="0" w:lastRow="0" w:firstColumn="1" w:lastColumn="0" w:oddVBand="0" w:evenVBand="0" w:oddHBand="0" w:evenHBand="0" w:firstRowFirstColumn="0" w:firstRowLastColumn="0" w:lastRowFirstColumn="0" w:lastRowLastColumn="0"/>
+            <w:tcW w:w="2394" w:type="dxa"/>
+          </w:tcPr>
+          <w:p>
+            <w:r>
+              <w:t>MaxPool2d</w:t>
             </w:r>
           </w:p>
         </w:tc>
@@ -14522,8 +14509,11 @@
             <w:tcW w:w="2394" w:type="dxa"/>
           </w:tcPr>
           <w:p>
-            <w:r>
-              <w:t>36.928</w:t>
+            <w:pPr>
+              <w:cnfStyle w:val="000000100000" w:firstRow="0" w:lastRow="0" w:firstColumn="0" w:lastColumn="0" w:oddVBand="0" w:evenVBand="0" w:oddHBand="1" w:evenHBand="0" w:firstRowFirstColumn="0" w:firstRowLastColumn="0" w:lastRowFirstColumn="0" w:lastRowLastColumn="0"/>
+            </w:pPr>
+            <w:r>
+              <w:t>[1, 64, 127, 127]</w:t>
             </w:r>
           </w:p>
         </w:tc>
@@ -14532,24 +14522,90 @@
             <w:tcW w:w="2394" w:type="dxa"/>
           </w:tcPr>
           <w:p>
-            <w:r>
-              <w:t>0</w:t>
-            </w:r>
-            <w:r>
-              <w:t>,9</w:t>
-            </w:r>
-            <w:r>
-              <w:t>29</w:t>
-            </w:r>
-            <w:r>
-              <w:t>%</w:t>
-            </w:r>
+            <w:pPr>
+              <w:cnfStyle w:val="000000100000" w:firstRow="0" w:lastRow="0" w:firstColumn="0" w:lastColumn="0" w:oddVBand="0" w:evenVBand="0" w:oddHBand="1" w:evenHBand="0" w:firstRowFirstColumn="0" w:firstRowLastColumn="0" w:lastRowFirstColumn="0" w:lastRowLastColumn="0"/>
+            </w:pPr>
+          </w:p>
+        </w:tc>
+        <w:tc>
+          <w:tcPr>
+            <w:tcW w:w="2394" w:type="dxa"/>
+          </w:tcPr>
+          <w:p>
+            <w:pPr>
+              <w:cnfStyle w:val="000000100000" w:firstRow="0" w:lastRow="0" w:firstColumn="0" w:lastColumn="0" w:oddVBand="0" w:evenVBand="0" w:oddHBand="1" w:evenHBand="0" w:firstRowFirstColumn="0" w:firstRowLastColumn="0" w:lastRowFirstColumn="0" w:lastRowLastColumn="0"/>
+            </w:pPr>
           </w:p>
         </w:tc>
       </w:tr>
       <w:tr>
         <w:tc>
           <w:tcPr>
+            <w:cnfStyle w:val="001000000000" w:firstRow="0" w:lastRow="0" w:firstColumn="1" w:lastColumn="0" w:oddVBand="0" w:evenVBand="0" w:oddHBand="0" w:evenHBand="0" w:firstRowFirstColumn="0" w:firstRowLastColumn="0" w:lastRowFirstColumn="0" w:lastRowLastColumn="0"/>
+            <w:tcW w:w="2394" w:type="dxa"/>
+          </w:tcPr>
+          <w:p>
+            <w:r>
+              <w:t>Conv2d</w:t>
+            </w:r>
+          </w:p>
+        </w:tc>
+        <w:tc>
+          <w:tcPr>
+            <w:tcW w:w="2394" w:type="dxa"/>
+          </w:tcPr>
+          <w:p>
+            <w:pPr>
+              <w:cnfStyle w:val="000000000000" w:firstRow="0" w:lastRow="0" w:firstColumn="0" w:lastColumn="0" w:oddVBand="0" w:evenVBand="0" w:oddHBand="0" w:evenHBand="0" w:firstRowFirstColumn="0" w:firstRowLastColumn="0" w:lastRowFirstColumn="0" w:lastRowLastColumn="0"/>
+            </w:pPr>
+            <w:r>
+              <w:t>[1, 64, 125, 125]</w:t>
+            </w:r>
+          </w:p>
+        </w:tc>
+        <w:tc>
+          <w:tcPr>
+            <w:tcW w:w="2394" w:type="dxa"/>
+          </w:tcPr>
+          <w:p>
+            <w:pPr>
+              <w:cnfStyle w:val="000000000000" w:firstRow="0" w:lastRow="0" w:firstColumn="0" w:lastColumn="0" w:oddVBand="0" w:evenVBand="0" w:oddHBand="0" w:evenHBand="0" w:firstRowFirstColumn="0" w:firstRowLastColumn="0" w:lastRowFirstColumn="0" w:lastRowLastColumn="0"/>
+            </w:pPr>
+            <w:r>
+              <w:t>36.928</w:t>
+            </w:r>
+          </w:p>
+        </w:tc>
+        <w:tc>
+          <w:tcPr>
+            <w:tcW w:w="2394" w:type="dxa"/>
+          </w:tcPr>
+          <w:p>
+            <w:pPr>
+              <w:cnfStyle w:val="000000000000" w:firstRow="0" w:lastRow="0" w:firstColumn="0" w:lastColumn="0" w:oddVBand="0" w:evenVBand="0" w:oddHBand="0" w:evenHBand="0" w:firstRowFirstColumn="0" w:firstRowLastColumn="0" w:lastRowFirstColumn="0" w:lastRowLastColumn="0"/>
+            </w:pPr>
+            <w:r>
+              <w:t>0</w:t>
+            </w:r>
+            <w:r>
+              <w:t>,9</w:t>
+            </w:r>
+            <w:r>
+              <w:t>29</w:t>
+            </w:r>
+            <w:r>
+              <w:t>%</w:t>
+            </w:r>
+          </w:p>
+        </w:tc>
+      </w:tr>
+      <w:tr>
+        <w:trPr>
+          <w:cnfStyle w:val="000000100000" w:firstRow="0" w:lastRow="0" w:firstColumn="0" w:lastColumn="0" w:oddVBand="0" w:evenVBand="0" w:oddHBand="1" w:evenHBand="0" w:firstRowFirstColumn="0" w:firstRowLastColumn="0" w:lastRowFirstColumn="0" w:lastRowLastColumn="0"/>
+        </w:trPr>
+        <w:tc>
+          <w:tcPr>
+            <w:cnfStyle w:val="001000000000" w:firstRow="0" w:lastRow="0" w:firstColumn="1" w:lastColumn="0" w:oddVBand="0" w:evenVBand="0" w:oddHBand="0" w:evenHBand="0" w:firstRowFirstColumn="0" w:firstRowLastColumn="0" w:lastRowFirstColumn="0" w:lastRowLastColumn="0"/>
             <w:tcW w:w="2394" w:type="dxa"/>
           </w:tcPr>
           <w:p>
@@ -14565,32 +14621,11 @@
             <w:tcW w:w="2394" w:type="dxa"/>
           </w:tcPr>
           <w:p>
+            <w:pPr>
+              <w:cnfStyle w:val="000000100000" w:firstRow="0" w:lastRow="0" w:firstColumn="0" w:lastColumn="0" w:oddVBand="0" w:evenVBand="0" w:oddHBand="1" w:evenHBand="0" w:firstRowFirstColumn="0" w:firstRowLastColumn="0" w:lastRowFirstColumn="0" w:lastRowLastColumn="0"/>
+            </w:pPr>
             <w:r>
               <w:t>[1, 64, 125, 125]</w:t>
-            </w:r>
-          </w:p>
-        </w:tc>
-        <w:tc>
-          <w:tcPr>
-            <w:tcW w:w="2394" w:type="dxa"/>
-          </w:tcPr>
-          <w:p/>
-        </w:tc>
-        <w:tc>
-          <w:tcPr>
-            <w:tcW w:w="2394" w:type="dxa"/>
-          </w:tcPr>
-          <w:p/>
-        </w:tc>
-      </w:tr>
-      <w:tr>
-        <w:tc>
-          <w:tcPr>
-            <w:tcW w:w="2394" w:type="dxa"/>
-          </w:tcPr>
-          <w:p>
-            <w:r>
-              <w:t>MaxPool2d</w:t>
             </w:r>
           </w:p>
         </w:tc>
@@ -14599,27 +14634,75 @@
             <w:tcW w:w="2394" w:type="dxa"/>
           </w:tcPr>
           <w:p>
-            <w:r>
-              <w:t>[1, 64, 62, 62]</w:t>
-            </w:r>
+            <w:pPr>
+              <w:cnfStyle w:val="000000100000" w:firstRow="0" w:lastRow="0" w:firstColumn="0" w:lastColumn="0" w:oddVBand="0" w:evenVBand="0" w:oddHBand="1" w:evenHBand="0" w:firstRowFirstColumn="0" w:firstRowLastColumn="0" w:lastRowFirstColumn="0" w:lastRowLastColumn="0"/>
+            </w:pPr>
           </w:p>
         </w:tc>
         <w:tc>
           <w:tcPr>
             <w:tcW w:w="2394" w:type="dxa"/>
           </w:tcPr>
-          <w:p/>
+          <w:p>
+            <w:pPr>
+              <w:cnfStyle w:val="000000100000" w:firstRow="0" w:lastRow="0" w:firstColumn="0" w:lastColumn="0" w:oddVBand="0" w:evenVBand="0" w:oddHBand="1" w:evenHBand="0" w:firstRowFirstColumn="0" w:firstRowLastColumn="0" w:lastRowFirstColumn="0" w:lastRowLastColumn="0"/>
+            </w:pPr>
+          </w:p>
+        </w:tc>
+      </w:tr>
+      <w:tr>
+        <w:tc>
+          <w:tcPr>
+            <w:cnfStyle w:val="001000000000" w:firstRow="0" w:lastRow="0" w:firstColumn="1" w:lastColumn="0" w:oddVBand="0" w:evenVBand="0" w:oddHBand="0" w:evenHBand="0" w:firstRowFirstColumn="0" w:firstRowLastColumn="0" w:lastRowFirstColumn="0" w:lastRowLastColumn="0"/>
+            <w:tcW w:w="2394" w:type="dxa"/>
+          </w:tcPr>
+          <w:p>
+            <w:r>
+              <w:t>MaxPool2d</w:t>
+            </w:r>
+          </w:p>
         </w:tc>
         <w:tc>
           <w:tcPr>
             <w:tcW w:w="2394" w:type="dxa"/>
           </w:tcPr>
-          <w:p/>
+          <w:p>
+            <w:pPr>
+              <w:cnfStyle w:val="000000000000" w:firstRow="0" w:lastRow="0" w:firstColumn="0" w:lastColumn="0" w:oddVBand="0" w:evenVBand="0" w:oddHBand="0" w:evenHBand="0" w:firstRowFirstColumn="0" w:firstRowLastColumn="0" w:lastRowFirstColumn="0" w:lastRowLastColumn="0"/>
+            </w:pPr>
+            <w:r>
+              <w:t>[1, 64, 62, 62]</w:t>
+            </w:r>
+          </w:p>
+        </w:tc>
+        <w:tc>
+          <w:tcPr>
+            <w:tcW w:w="2394" w:type="dxa"/>
+          </w:tcPr>
+          <w:p>
+            <w:pPr>
+              <w:cnfStyle w:val="000000000000" w:firstRow="0" w:lastRow="0" w:firstColumn="0" w:lastColumn="0" w:oddVBand="0" w:evenVBand="0" w:oddHBand="0" w:evenHBand="0" w:firstRowFirstColumn="0" w:firstRowLastColumn="0" w:lastRowFirstColumn="0" w:lastRowLastColumn="0"/>
+            </w:pPr>
+          </w:p>
+        </w:tc>
+        <w:tc>
+          <w:tcPr>
+            <w:tcW w:w="2394" w:type="dxa"/>
+          </w:tcPr>
+          <w:p>
+            <w:pPr>
+              <w:cnfStyle w:val="000000000000" w:firstRow="0" w:lastRow="0" w:firstColumn="0" w:lastColumn="0" w:oddVBand="0" w:evenVBand="0" w:oddHBand="0" w:evenHBand="0" w:firstRowFirstColumn="0" w:firstRowLastColumn="0" w:lastRowFirstColumn="0" w:lastRowLastColumn="0"/>
+            </w:pPr>
+          </w:p>
         </w:tc>
       </w:tr>
       <w:tr>
+        <w:trPr>
+          <w:cnfStyle w:val="000000100000" w:firstRow="0" w:lastRow="0" w:firstColumn="0" w:lastColumn="0" w:oddVBand="0" w:evenVBand="0" w:oddHBand="1" w:evenHBand="0" w:firstRowFirstColumn="0" w:firstRowLastColumn="0" w:lastRowFirstColumn="0" w:lastRowLastColumn="0"/>
+        </w:trPr>
         <w:tc>
           <w:tcPr>
+            <w:cnfStyle w:val="001000000000" w:firstRow="0" w:lastRow="0" w:firstColumn="1" w:lastColumn="0" w:oddVBand="0" w:evenVBand="0" w:oddHBand="0" w:evenHBand="0" w:firstRowFirstColumn="0" w:firstRowLastColumn="0" w:lastRowFirstColumn="0" w:lastRowLastColumn="0"/>
             <w:tcW w:w="2394" w:type="dxa"/>
           </w:tcPr>
           <w:p>
@@ -14635,6 +14718,9 @@
             <w:tcW w:w="2394" w:type="dxa"/>
           </w:tcPr>
           <w:p>
+            <w:pPr>
+              <w:cnfStyle w:val="000000100000" w:firstRow="0" w:lastRow="0" w:firstColumn="0" w:lastColumn="0" w:oddVBand="0" w:evenVBand="0" w:oddHBand="1" w:evenHBand="0" w:firstRowFirstColumn="0" w:firstRowLastColumn="0" w:lastRowFirstColumn="0" w:lastRowLastColumn="0"/>
+            </w:pPr>
             <w:r>
               <w:t>[1, 246</w:t>
             </w:r>
@@ -14650,18 +14736,27 @@
           <w:tcPr>
             <w:tcW w:w="2394" w:type="dxa"/>
           </w:tcPr>
-          <w:p/>
+          <w:p>
+            <w:pPr>
+              <w:cnfStyle w:val="000000100000" w:firstRow="0" w:lastRow="0" w:firstColumn="0" w:lastColumn="0" w:oddVBand="0" w:evenVBand="0" w:oddHBand="1" w:evenHBand="0" w:firstRowFirstColumn="0" w:firstRowLastColumn="0" w:lastRowFirstColumn="0" w:lastRowLastColumn="0"/>
+            </w:pPr>
+          </w:p>
         </w:tc>
         <w:tc>
           <w:tcPr>
             <w:tcW w:w="2394" w:type="dxa"/>
           </w:tcPr>
-          <w:p/>
+          <w:p>
+            <w:pPr>
+              <w:cnfStyle w:val="000000100000" w:firstRow="0" w:lastRow="0" w:firstColumn="0" w:lastColumn="0" w:oddVBand="0" w:evenVBand="0" w:oddHBand="1" w:evenHBand="0" w:firstRowFirstColumn="0" w:firstRowLastColumn="0" w:lastRowFirstColumn="0" w:lastRowLastColumn="0"/>
+            </w:pPr>
+          </w:p>
         </w:tc>
       </w:tr>
       <w:tr>
         <w:tc>
           <w:tcPr>
+            <w:cnfStyle w:val="001000000000" w:firstRow="0" w:lastRow="0" w:firstColumn="1" w:lastColumn="0" w:oddVBand="0" w:evenVBand="0" w:oddHBand="0" w:evenHBand="0" w:firstRowFirstColumn="0" w:firstRowLastColumn="0" w:lastRowFirstColumn="0" w:lastRowLastColumn="0"/>
             <w:tcW w:w="2394" w:type="dxa"/>
           </w:tcPr>
           <w:p>
@@ -14677,6 +14772,9 @@
             <w:tcW w:w="2394" w:type="dxa"/>
           </w:tcPr>
           <w:p>
+            <w:pPr>
+              <w:cnfStyle w:val="000000000000" w:firstRow="0" w:lastRow="0" w:firstColumn="0" w:lastColumn="0" w:oddVBand="0" w:evenVBand="0" w:oddHBand="0" w:evenHBand="0" w:firstRowFirstColumn="0" w:firstRowLastColumn="0" w:lastRowFirstColumn="0" w:lastRowLastColumn="0"/>
+            </w:pPr>
             <w:r>
               <w:t>[1, 16]</w:t>
             </w:r>
@@ -14687,6 +14785,9 @@
             <w:tcW w:w="2394" w:type="dxa"/>
           </w:tcPr>
           <w:p>
+            <w:pPr>
+              <w:cnfStyle w:val="000000000000" w:firstRow="0" w:lastRow="0" w:firstColumn="0" w:lastColumn="0" w:oddVBand="0" w:evenVBand="0" w:oddHBand="0" w:evenHBand="0" w:firstRowFirstColumn="0" w:firstRowLastColumn="0" w:lastRowFirstColumn="0" w:lastRowLastColumn="0"/>
+            </w:pPr>
             <w:r>
               <w:t>3.936.272</w:t>
             </w:r>
@@ -14697,6 +14798,9 @@
             <w:tcW w:w="2394" w:type="dxa"/>
           </w:tcPr>
           <w:p>
+            <w:pPr>
+              <w:cnfStyle w:val="000000000000" w:firstRow="0" w:lastRow="0" w:firstColumn="0" w:lastColumn="0" w:oddVBand="0" w:evenVBand="0" w:oddHBand="0" w:evenHBand="0" w:firstRowFirstColumn="0" w:firstRowLastColumn="0" w:lastRowFirstColumn="0" w:lastRowLastColumn="0"/>
+            </w:pPr>
             <w:r>
               <w:t>99</w:t>
             </w:r>
@@ -14716,8 +14820,12 @@
         </w:tc>
       </w:tr>
       <w:tr>
+        <w:trPr>
+          <w:cnfStyle w:val="000000100000" w:firstRow="0" w:lastRow="0" w:firstColumn="0" w:lastColumn="0" w:oddVBand="0" w:evenVBand="0" w:oddHBand="1" w:evenHBand="0" w:firstRowFirstColumn="0" w:firstRowLastColumn="0" w:lastRowFirstColumn="0" w:lastRowLastColumn="0"/>
+        </w:trPr>
         <w:tc>
           <w:tcPr>
+            <w:cnfStyle w:val="001000000000" w:firstRow="0" w:lastRow="0" w:firstColumn="1" w:lastColumn="0" w:oddVBand="0" w:evenVBand="0" w:oddHBand="0" w:evenHBand="0" w:firstRowFirstColumn="0" w:firstRowLastColumn="0" w:lastRowFirstColumn="0" w:lastRowLastColumn="0"/>
             <w:tcW w:w="2394" w:type="dxa"/>
           </w:tcPr>
           <w:p>
@@ -14733,6 +14841,9 @@
             <w:tcW w:w="2394" w:type="dxa"/>
           </w:tcPr>
           <w:p>
+            <w:pPr>
+              <w:cnfStyle w:val="000000100000" w:firstRow="0" w:lastRow="0" w:firstColumn="0" w:lastColumn="0" w:oddVBand="0" w:evenVBand="0" w:oddHBand="1" w:evenHBand="0" w:firstRowFirstColumn="0" w:firstRowLastColumn="0" w:lastRowFirstColumn="0" w:lastRowLastColumn="0"/>
+            </w:pPr>
             <w:r>
               <w:t>[1, 3]</w:t>
             </w:r>
@@ -14743,6 +14854,9 @@
             <w:tcW w:w="2394" w:type="dxa"/>
           </w:tcPr>
           <w:p>
+            <w:pPr>
+              <w:cnfStyle w:val="000000100000" w:firstRow="0" w:lastRow="0" w:firstColumn="0" w:lastColumn="0" w:oddVBand="0" w:evenVBand="0" w:oddHBand="1" w:evenHBand="0" w:firstRowFirstColumn="0" w:firstRowLastColumn="0" w:lastRowFirstColumn="0" w:lastRowLastColumn="0"/>
+            </w:pPr>
             <w:r>
               <w:t>51</w:t>
             </w:r>
@@ -14755,6 +14869,7 @@
           <w:p>
             <w:pPr>
               <w:keepNext/>
+              <w:cnfStyle w:val="000000100000" w:firstRow="0" w:lastRow="0" w:firstColumn="0" w:lastColumn="0" w:oddVBand="0" w:evenVBand="0" w:oddHBand="1" w:evenHBand="0" w:firstRowFirstColumn="0" w:firstRowLastColumn="0" w:lastRowFirstColumn="0" w:lastRowLastColumn="0"/>
             </w:pPr>
             <w:r>
               <w:t>0</w:t>
@@ -14771,6 +14886,7 @@
       <w:tr>
         <w:tc>
           <w:tcPr>
+            <w:cnfStyle w:val="001000000000" w:firstRow="0" w:lastRow="0" w:firstColumn="1" w:lastColumn="0" w:oddVBand="0" w:evenVBand="0" w:oddHBand="0" w:evenHBand="0" w:firstRowFirstColumn="0" w:firstRowLastColumn="0" w:lastRowFirstColumn="0" w:lastRowLastColumn="0"/>
             <w:tcW w:w="2394" w:type="dxa"/>
           </w:tcPr>
           <w:p>
@@ -14783,13 +14899,20 @@
           <w:tcPr>
             <w:tcW w:w="2394" w:type="dxa"/>
           </w:tcPr>
-          <w:p/>
+          <w:p>
+            <w:pPr>
+              <w:cnfStyle w:val="000000000000" w:firstRow="0" w:lastRow="0" w:firstColumn="0" w:lastColumn="0" w:oddVBand="0" w:evenVBand="0" w:oddHBand="0" w:evenHBand="0" w:firstRowFirstColumn="0" w:firstRowLastColumn="0" w:lastRowFirstColumn="0" w:lastRowLastColumn="0"/>
+            </w:pPr>
+          </w:p>
         </w:tc>
         <w:tc>
           <w:tcPr>
             <w:tcW w:w="2394" w:type="dxa"/>
           </w:tcPr>
           <w:p>
+            <w:pPr>
+              <w:cnfStyle w:val="000000000000" w:firstRow="0" w:lastRow="0" w:firstColumn="0" w:lastColumn="0" w:oddVBand="0" w:evenVBand="0" w:oddHBand="0" w:evenHBand="0" w:firstRowFirstColumn="0" w:firstRowLastColumn="0" w:lastRowFirstColumn="0" w:lastRowLastColumn="0"/>
+            </w:pPr>
             <w:r>
               <w:t>3.973.891</w:t>
             </w:r>
@@ -14802,6 +14925,7 @@
           <w:p>
             <w:pPr>
               <w:keepNext/>
+              <w:cnfStyle w:val="000000000000" w:firstRow="0" w:lastRow="0" w:firstColumn="0" w:lastColumn="0" w:oddVBand="0" w:evenVBand="0" w:oddHBand="0" w:evenHBand="0" w:firstRowFirstColumn="0" w:firstRowLastColumn="0" w:lastRowFirstColumn="0" w:lastRowLastColumn="0"/>
             </w:pPr>
             <w:r>
               <w:t>100%</w:t>
@@ -14815,7 +14939,7 @@
         <w:pStyle w:val="Caption"/>
         <w:jc w:val="center"/>
       </w:pPr>
-      <w:bookmarkStart w:id="17" w:name="_Toc239962142"/>
+      <w:bookmarkStart w:id="17" w:name="_Toc241517393"/>
       <w:r>
         <w:t xml:space="preserve">Tablica </w:t>
       </w:r>
@@ -19316,6 +19440,7 @@
           <w:sz w:val="22"/>
         </w:rPr>
       </w:pPr>
+      <w:bookmarkStart w:id="28" w:name="_Toc241517394"/>
       <w:r>
         <w:t xml:space="preserve">Tablica </w:t>
       </w:r>
@@ -19340,6 +19465,7 @@
       <w:r>
         <w:t xml:space="preserve"> Glavne metrike modela</w:t>
       </w:r>
+      <w:bookmarkEnd w:id="28"/>
     </w:p>
     <w:p>
       <w:pPr>
@@ -19435,23 +19561,7 @@
           <w:rFonts w:asciiTheme="minorHAnsi" w:hAnsiTheme="minorHAnsi"/>
           <w:sz w:val="22"/>
         </w:rPr>
-        <w:t xml:space="preserve"> (B – benigna klasa, M – maligna klasa, N – </w:t>
-      </w:r>
-      <w:proofErr w:type="spellStart"/>
-      <w:r>
-        <w:rPr>
-          <w:rFonts w:asciiTheme="minorHAnsi" w:hAnsiTheme="minorHAnsi"/>
-          <w:sz w:val="22"/>
-        </w:rPr>
-        <w:t>normalana</w:t>
-      </w:r>
-      <w:proofErr w:type="spellEnd"/>
-      <w:r>
-        <w:rPr>
-          <w:rFonts w:asciiTheme="minorHAnsi" w:hAnsiTheme="minorHAnsi"/>
-          <w:sz w:val="22"/>
-        </w:rPr>
-        <w:t xml:space="preserve"> klasa).</w:t>
+        <w:t xml:space="preserve"> (B – benigna klasa, M – maligna klasa, N – normalna klasa).</w:t>
       </w:r>
     </w:p>
     <w:tbl>
@@ -20663,6 +20773,7 @@
       <w:pPr>
         <w:pStyle w:val="Caption"/>
       </w:pPr>
+      <w:bookmarkStart w:id="29" w:name="_Toc241517395"/>
       <w:r>
         <w:t xml:space="preserve">Tablica </w:t>
       </w:r>
@@ -20687,17 +20798,18 @@
       <w:r>
         <w:t xml:space="preserve"> Dodatne metrike modela</w:t>
       </w:r>
+      <w:bookmarkEnd w:id="29"/>
     </w:p>
     <w:p/>
     <w:p>
       <w:pPr>
         <w:pStyle w:val="Heading2"/>
       </w:pPr>
-      <w:bookmarkStart w:id="28" w:name="_Toc236486954"/>
+      <w:bookmarkStart w:id="30" w:name="_Toc236486954"/>
       <w:r>
         <w:t>Vrijeme analize slike</w:t>
       </w:r>
-      <w:bookmarkEnd w:id="28"/>
+      <w:bookmarkEnd w:id="30"/>
     </w:p>
     <w:p>
       <w:pPr>
@@ -20793,6 +20905,9 @@
         <w:keepNext/>
       </w:pPr>
       <w:r>
+        <w:rPr>
+          <w:noProof/>
+        </w:rPr>
         <w:drawing>
           <wp:inline distT="0" distB="0" distL="0" distR="0" wp14:anchorId="4D7AE9EE" wp14:editId="214CBC7F">
             <wp:extent cx="5943600" cy="2279650"/>
@@ -20870,6 +20985,9 @@
         <w:keepNext/>
       </w:pPr>
       <w:r>
+        <w:rPr>
+          <w:noProof/>
+        </w:rPr>
         <w:drawing>
           <wp:inline distT="0" distB="0" distL="0" distR="0" wp14:anchorId="58F520E2" wp14:editId="685B6514">
             <wp:extent cx="5943600" cy="2283460"/>
@@ -20966,12 +21084,12 @@
       <w:pPr>
         <w:pStyle w:val="Heading2"/>
       </w:pPr>
-      <w:bookmarkStart w:id="29" w:name="_Toc236486959"/>
+      <w:bookmarkStart w:id="31" w:name="_Toc236486959"/>
       <w:r>
         <w:lastRenderedPageBreak/>
         <w:t>Analiza rezultata</w:t>
       </w:r>
-      <w:bookmarkEnd w:id="29"/>
+      <w:bookmarkEnd w:id="31"/>
     </w:p>
     <w:p>
       <w:pPr>
@@ -21153,10 +21271,7 @@
         <w:t xml:space="preserve">Par zanimljivih zapažanja se može izvući za date modele. Prva stvar jeste da su modeli izuzetno dobri u klasificiranju maligne klase, kao što se vidi iz metrika i AUC za malignu klasu. </w:t>
       </w:r>
       <w:r>
-        <w:t xml:space="preserve">Ovo se ne može objasniti pretpostavkom da model jednostavno sve primjere obilježava kao maligne, preciznost bi tada znatno opala. </w:t>
-      </w:r>
-      <w:r>
-        <w:t xml:space="preserve">Veći broj malignih primjera (561) tome vjerovatno doprinosi, ali sam po sebi ne </w:t>
+        <w:t xml:space="preserve">Ovo se ne može objasniti pretpostavkom da model jednostavno sve primjere obilježava kao maligne, preciznost bi tada znatno opala. Veći broj malignih primjera (561) tome vjerovatno doprinosi, ali sam po sebi ne </w:t>
       </w:r>
       <w:proofErr w:type="spellStart"/>
       <w:r>
@@ -21164,10 +21279,7 @@
       </w:r>
       <w:proofErr w:type="spellEnd"/>
       <w:r>
-        <w:t xml:space="preserve"> ovako visoke rezultate. Vjerovatnije je da su promjene kod malignih slučajeva vizuelno izraženije i lakše razdvojive od benignih i normalnih.</w:t>
-      </w:r>
-      <w:r>
-        <w:t xml:space="preserve"> Također je primjetno da su modeli najlošije rezultate imali na benignoj klasi vjerovatno kao rezultat malog broja trening podataka (120) i teže razdvojivosti.</w:t>
+        <w:t xml:space="preserve"> ovako visoke rezultate. Vjerovatnije je da su promjene kod malignih slučajeva vizuelno izraženije i lakše razdvojive od benignih i normalnih. Također je primjetno da su modeli najlošije rezultate imali na benignoj klasi vjerovatno kao rezultat malog broja trening podataka (120) i teže razdvojivosti.</w:t>
       </w:r>
     </w:p>
     <w:p>
@@ -21209,7 +21321,7 @@
           <w:lang w:val="bs-Latn-BA"/>
         </w:rPr>
       </w:pPr>
-      <w:bookmarkStart w:id="30" w:name="_Toc236486960"/>
+      <w:bookmarkStart w:id="32" w:name="_Toc236486960"/>
       <w:r>
         <w:rPr>
           <w:lang w:val="bs-Latn-BA"/>
@@ -21217,7 +21329,7 @@
         <w:lastRenderedPageBreak/>
         <w:t>Zaključak</w:t>
       </w:r>
-      <w:bookmarkEnd w:id="30"/>
+      <w:bookmarkEnd w:id="32"/>
     </w:p>
     <w:p>
       <w:pPr>
@@ -21661,51 +21773,6 @@
       <w:r>
         <w:t xml:space="preserve"> dokumentaciju i ručno prevoditi pristup u C#.</w:t>
       </w:r>
-    </w:p>
-    <w:p>
-      <w:r>
-        <w:t xml:space="preserve">Izvoz slika unutar C# </w:t>
-      </w:r>
-      <w:proofErr w:type="spellStart"/>
-      <w:r>
-        <w:t>okruženja</w:t>
-      </w:r>
-      <w:proofErr w:type="spellEnd"/>
-      <w:r>
-        <w:t xml:space="preserve">, nakon augmentacija je dosta teže za implementirati jer C# </w:t>
-      </w:r>
-      <w:proofErr w:type="spellStart"/>
-      <w:r>
-        <w:t>okruženje</w:t>
-      </w:r>
-      <w:proofErr w:type="spellEnd"/>
-      <w:r>
-        <w:t xml:space="preserve"> ne </w:t>
-      </w:r>
-      <w:r>
-        <w:t xml:space="preserve">sadrži </w:t>
-      </w:r>
-      <w:proofErr w:type="spellStart"/>
-      <w:r>
-        <w:t>defaultni</w:t>
-      </w:r>
-      <w:proofErr w:type="spellEnd"/>
-      <w:r>
-        <w:t xml:space="preserve"> </w:t>
-      </w:r>
-      <w:proofErr w:type="spellStart"/>
-      <w:r>
-        <w:t>enkoder</w:t>
-      </w:r>
-      <w:proofErr w:type="spellEnd"/>
-      <w:r>
-        <w:t xml:space="preserve"> za slike, dok je u </w:t>
-      </w:r>
-      <w:proofErr w:type="spellStart"/>
-      <w:r>
-        <w:t>Python</w:t>
-      </w:r>
-      <w:proofErr w:type="spellEnd"/>
       <w:r>
         <w:t xml:space="preserve"> </w:t>
       </w:r>
@@ -21802,6 +21869,7 @@
               <w:rFonts w:asciiTheme="minorHAnsi" w:hAnsiTheme="minorHAnsi"/>
               <w:noProof/>
               <w:sz w:val="22"/>
+              <w:lang w:val="en-US"/>
             </w:rPr>
           </w:pPr>
           <w:r>
@@ -21832,7 +21900,7 @@
           </w:tblGrid>
           <w:tr>
             <w:trPr>
-              <w:divId w:val="2142385046"/>
+              <w:divId w:val="1941137495"/>
               <w:tblCellSpacing w:w="15" w:type="dxa"/>
             </w:trPr>
             <w:tc>
@@ -21846,11 +21914,13 @@
                   <w:rPr>
                     <w:noProof/>
                     <w:szCs w:val="24"/>
+                    <w:lang w:val="en-US"/>
                   </w:rPr>
                 </w:pPr>
                 <w:r>
                   <w:rPr>
                     <w:noProof/>
+                    <w:lang w:val="en-US"/>
                   </w:rPr>
                   <w:t xml:space="preserve">[1] </w:t>
                 </w:r>
@@ -21866,11 +21936,13 @@
                   <w:pStyle w:val="Bibliography"/>
                   <w:rPr>
                     <w:noProof/>
+                    <w:lang w:val="en-US"/>
                   </w:rPr>
                 </w:pPr>
                 <w:r>
                   <w:rPr>
                     <w:noProof/>
+                    <w:lang w:val="en-US"/>
                   </w:rPr>
                   <w:t>PyTorch, "PyTorch GitHub Repository," GitHub, [Online]. Available: https://github.com/pytorch/pytorch.</w:t>
                 </w:r>
@@ -21879,7 +21951,7 @@
           </w:tr>
           <w:tr>
             <w:trPr>
-              <w:divId w:val="2142385046"/>
+              <w:divId w:val="1941137495"/>
               <w:tblCellSpacing w:w="15" w:type="dxa"/>
             </w:trPr>
             <w:tc>
@@ -21892,11 +21964,13 @@
                   <w:pStyle w:val="Bibliography"/>
                   <w:rPr>
                     <w:noProof/>
+                    <w:lang w:val="en-US"/>
                   </w:rPr>
                 </w:pPr>
                 <w:r>
                   <w:rPr>
                     <w:noProof/>
+                    <w:lang w:val="en-US"/>
                   </w:rPr>
                   <w:t xml:space="preserve">[2] </w:t>
                 </w:r>
@@ -21912,11 +21986,13 @@
                   <w:pStyle w:val="Bibliography"/>
                   <w:rPr>
                     <w:noProof/>
+                    <w:lang w:val="en-US"/>
                   </w:rPr>
                 </w:pPr>
                 <w:r>
                   <w:rPr>
                     <w:noProof/>
+                    <w:lang w:val="en-US"/>
                   </w:rPr>
                   <w:t>GitHub, "Octoverse: A new developer joins GitHub every second as AI leads TypeScript to #1," GitHub, 28 October 2025. [Online]. Available: https://github.blog/news-insights/octoverse/octoverse-a-new-developer-joins-github-every-second-as-ai-leads-typescript-to-1/.</w:t>
                 </w:r>
@@ -21925,7 +22001,7 @@
           </w:tr>
           <w:tr>
             <w:trPr>
-              <w:divId w:val="2142385046"/>
+              <w:divId w:val="1941137495"/>
               <w:tblCellSpacing w:w="15" w:type="dxa"/>
             </w:trPr>
             <w:tc>
@@ -21938,11 +22014,13 @@
                   <w:pStyle w:val="Bibliography"/>
                   <w:rPr>
                     <w:noProof/>
+                    <w:lang w:val="en-US"/>
                   </w:rPr>
                 </w:pPr>
                 <w:r>
                   <w:rPr>
                     <w:noProof/>
+                    <w:lang w:val="en-US"/>
                   </w:rPr>
                   <w:t xml:space="preserve">[3] </w:t>
                 </w:r>
@@ -21958,11 +22036,13 @@
                   <w:pStyle w:val="Bibliography"/>
                   <w:rPr>
                     <w:noProof/>
+                    <w:lang w:val="en-US"/>
                   </w:rPr>
                 </w:pPr>
                 <w:r>
                   <w:rPr>
                     <w:noProof/>
+                    <w:lang w:val="en-US"/>
                   </w:rPr>
                   <w:t xml:space="preserve">Paszke, A. et al., "PyTorch: An Imperative Style, High-Performance Deep Learning Library," </w:t>
                 </w:r>
@@ -21971,12 +22051,14 @@
                     <w:i/>
                     <w:iCs/>
                     <w:noProof/>
+                    <w:lang w:val="en-US"/>
                   </w:rPr>
                   <w:t xml:space="preserve">Advances in Neural Information Processing Systems, </w:t>
                 </w:r>
                 <w:r>
                   <w:rPr>
                     <w:noProof/>
+                    <w:lang w:val="en-US"/>
                   </w:rPr>
                   <w:t xml:space="preserve">vol. 32, 2019. </w:t>
                 </w:r>
@@ -21985,7 +22067,7 @@
           </w:tr>
           <w:tr>
             <w:trPr>
-              <w:divId w:val="2142385046"/>
+              <w:divId w:val="1941137495"/>
               <w:tblCellSpacing w:w="15" w:type="dxa"/>
             </w:trPr>
             <w:tc>
@@ -21998,11 +22080,13 @@
                   <w:pStyle w:val="Bibliography"/>
                   <w:rPr>
                     <w:noProof/>
+                    <w:lang w:val="en-US"/>
                   </w:rPr>
                 </w:pPr>
                 <w:r>
                   <w:rPr>
                     <w:noProof/>
+                    <w:lang w:val="en-US"/>
                   </w:rPr>
                   <w:t xml:space="preserve">[4] </w:t>
                 </w:r>
@@ -22018,11 +22102,13 @@
                   <w:pStyle w:val="Bibliography"/>
                   <w:rPr>
                     <w:noProof/>
+                    <w:lang w:val="en-US"/>
                   </w:rPr>
                 </w:pPr>
                 <w:r>
                   <w:rPr>
                     <w:noProof/>
+                    <w:lang w:val="en-US"/>
                   </w:rPr>
                   <w:t>TorchSharp, "TorchSharp Github Repository," GitHub, [Online]. Available: https://github.com/dotnet/torchsharp.</w:t>
                 </w:r>
@@ -22031,7 +22117,7 @@
           </w:tr>
           <w:tr>
             <w:trPr>
-              <w:divId w:val="2142385046"/>
+              <w:divId w:val="1941137495"/>
               <w:tblCellSpacing w:w="15" w:type="dxa"/>
             </w:trPr>
             <w:tc>
@@ -22044,11 +22130,13 @@
                   <w:pStyle w:val="Bibliography"/>
                   <w:rPr>
                     <w:noProof/>
+                    <w:lang w:val="en-US"/>
                   </w:rPr>
                 </w:pPr>
                 <w:r>
                   <w:rPr>
                     <w:noProof/>
+                    <w:lang w:val="en-US"/>
                   </w:rPr>
                   <w:t xml:space="preserve">[5] </w:t>
                 </w:r>
@@ -22064,11 +22152,13 @@
                   <w:pStyle w:val="Bibliography"/>
                   <w:rPr>
                     <w:noProof/>
+                    <w:lang w:val="en-US"/>
                   </w:rPr>
                 </w:pPr>
                 <w:r>
                   <w:rPr>
                     <w:noProof/>
+                    <w:lang w:val="en-US"/>
                   </w:rPr>
                   <w:t xml:space="preserve">D. M. W. Powers, "Evaluation: from precision, recall and F-measure to ROC, informedness, markedness and correlation," </w:t>
                 </w:r>
@@ -22077,12 +22167,14 @@
                     <w:i/>
                     <w:iCs/>
                     <w:noProof/>
+                    <w:lang w:val="en-US"/>
                   </w:rPr>
                   <w:t xml:space="preserve">Journal of Machine Learning Technologies, </w:t>
                 </w:r>
                 <w:r>
                   <w:rPr>
                     <w:noProof/>
+                    <w:lang w:val="en-US"/>
                   </w:rPr>
                   <w:t xml:space="preserve">vol. 2, 2011. </w:t>
                 </w:r>
@@ -22091,7 +22183,7 @@
           </w:tr>
           <w:tr>
             <w:trPr>
-              <w:divId w:val="2142385046"/>
+              <w:divId w:val="1941137495"/>
               <w:tblCellSpacing w:w="15" w:type="dxa"/>
             </w:trPr>
             <w:tc>
@@ -22104,11 +22196,13 @@
                   <w:pStyle w:val="Bibliography"/>
                   <w:rPr>
                     <w:noProof/>
+                    <w:lang w:val="en-US"/>
                   </w:rPr>
                 </w:pPr>
                 <w:r>
                   <w:rPr>
                     <w:noProof/>
+                    <w:lang w:val="en-US"/>
                   </w:rPr>
                   <w:t xml:space="preserve">[6] </w:t>
                 </w:r>
@@ -22124,11 +22218,13 @@
                   <w:pStyle w:val="Bibliography"/>
                   <w:rPr>
                     <w:noProof/>
+                    <w:lang w:val="en-US"/>
                   </w:rPr>
                 </w:pPr>
                 <w:r>
                   <w:rPr>
                     <w:noProof/>
+                    <w:lang w:val="en-US"/>
                   </w:rPr>
                   <w:t xml:space="preserve">H. Al-Yasriy, M. S. Al-Husieny, F. Y. Mohsen, E. A. Khalil and Z. S. Hassan, "Diagnosis of Lung Cancer Based on CT Scans Using CNN," </w:t>
                 </w:r>
@@ -22137,12 +22233,14 @@
                     <w:i/>
                     <w:iCs/>
                     <w:noProof/>
+                    <w:lang w:val="en-US"/>
                   </w:rPr>
                   <w:t xml:space="preserve">IOP Conference Series: Materials Science and Engineering, </w:t>
                 </w:r>
                 <w:r>
                   <w:rPr>
                     <w:noProof/>
+                    <w:lang w:val="en-US"/>
                   </w:rPr>
                   <w:t xml:space="preserve">vol. 928, 2020. </w:t>
                 </w:r>
@@ -22151,7 +22249,7 @@
           </w:tr>
           <w:tr>
             <w:trPr>
-              <w:divId w:val="2142385046"/>
+              <w:divId w:val="1941137495"/>
               <w:tblCellSpacing w:w="15" w:type="dxa"/>
             </w:trPr>
             <w:tc>
@@ -22164,11 +22262,13 @@
                   <w:pStyle w:val="Bibliography"/>
                   <w:rPr>
                     <w:noProof/>
+                    <w:lang w:val="en-US"/>
                   </w:rPr>
                 </w:pPr>
                 <w:r>
                   <w:rPr>
                     <w:noProof/>
+                    <w:lang w:val="en-US"/>
                   </w:rPr>
                   <w:t xml:space="preserve">[7] </w:t>
                 </w:r>
@@ -22184,11 +22284,13 @@
                   <w:pStyle w:val="Bibliography"/>
                   <w:rPr>
                     <w:noProof/>
+                    <w:lang w:val="en-US"/>
                   </w:rPr>
                 </w:pPr>
                 <w:r>
                   <w:rPr>
                     <w:noProof/>
+                    <w:lang w:val="en-US"/>
                   </w:rPr>
                   <w:t xml:space="preserve">H. F. Kareem, M. S. Al-Husieny, F. Y. Mohsen, E. A. Khalil and Z. S. Hassan, "Evaluation of SVM Performance in the Detection of Lung Cancer in Marked CT Scan Dataset," </w:t>
                 </w:r>
@@ -22197,12 +22299,14 @@
                     <w:i/>
                     <w:iCs/>
                     <w:noProof/>
+                    <w:lang w:val="en-US"/>
                   </w:rPr>
                   <w:t xml:space="preserve">Indonesian Journal of Electrical Engineering and Computer Science, </w:t>
                 </w:r>
                 <w:r>
                   <w:rPr>
                     <w:noProof/>
+                    <w:lang w:val="en-US"/>
                   </w:rPr>
                   <w:t xml:space="preserve">vol. 21, 2021. </w:t>
                 </w:r>
@@ -22211,7 +22315,7 @@
           </w:tr>
           <w:tr>
             <w:trPr>
-              <w:divId w:val="2142385046"/>
+              <w:divId w:val="1941137495"/>
               <w:tblCellSpacing w:w="15" w:type="dxa"/>
             </w:trPr>
             <w:tc>
@@ -22224,11 +22328,13 @@
                   <w:pStyle w:val="Bibliography"/>
                   <w:rPr>
                     <w:noProof/>
+                    <w:lang w:val="en-US"/>
                   </w:rPr>
                 </w:pPr>
                 <w:r>
                   <w:rPr>
                     <w:noProof/>
+                    <w:lang w:val="en-US"/>
                   </w:rPr>
                   <w:t xml:space="preserve">[8] </w:t>
                 </w:r>
@@ -22244,11 +22350,13 @@
                   <w:pStyle w:val="Bibliography"/>
                   <w:rPr>
                     <w:noProof/>
+                    <w:lang w:val="en-US"/>
                   </w:rPr>
                 </w:pPr>
                 <w:r>
                   <w:rPr>
                     <w:noProof/>
+                    <w:lang w:val="en-US"/>
                   </w:rPr>
                   <w:t xml:space="preserve">H. Alyasriy and M. Al-Huseiny, "The IQ-OTH/NCCD lung cancer dataset," </w:t>
                 </w:r>
@@ -22257,12 +22365,14 @@
                     <w:i/>
                     <w:iCs/>
                     <w:noProof/>
+                    <w:lang w:val="en-US"/>
                   </w:rPr>
                   <w:t xml:space="preserve">Mendeley Data, </w:t>
                 </w:r>
                 <w:r>
                   <w:rPr>
                     <w:noProof/>
+                    <w:lang w:val="en-US"/>
                   </w:rPr>
                   <w:t xml:space="preserve">vol. 4, 2023. </w:t>
                 </w:r>
@@ -22271,7 +22381,7 @@
           </w:tr>
           <w:tr>
             <w:trPr>
-              <w:divId w:val="2142385046"/>
+              <w:divId w:val="1941137495"/>
               <w:tblCellSpacing w:w="15" w:type="dxa"/>
             </w:trPr>
             <w:tc>
@@ -22284,11 +22394,13 @@
                   <w:pStyle w:val="Bibliography"/>
                   <w:rPr>
                     <w:noProof/>
+                    <w:lang w:val="en-US"/>
                   </w:rPr>
                 </w:pPr>
                 <w:r>
                   <w:rPr>
                     <w:noProof/>
+                    <w:lang w:val="en-US"/>
                   </w:rPr>
                   <w:t xml:space="preserve">[9] </w:t>
                 </w:r>
@@ -22304,11 +22416,13 @@
                   <w:pStyle w:val="Bibliography"/>
                   <w:rPr>
                     <w:noProof/>
+                    <w:lang w:val="en-US"/>
                   </w:rPr>
                 </w:pPr>
                 <w:r>
                   <w:rPr>
                     <w:noProof/>
+                    <w:lang w:val="en-US"/>
                   </w:rPr>
                   <w:t xml:space="preserve">G. E., "Medical image data augmentation: techniques, comparisons and interpretations," </w:t>
                 </w:r>
@@ -22317,12 +22431,14 @@
                     <w:i/>
                     <w:iCs/>
                     <w:noProof/>
+                    <w:lang w:val="en-US"/>
                   </w:rPr>
                   <w:t xml:space="preserve">Artificial Intelligence Review, </w:t>
                 </w:r>
                 <w:r>
                   <w:rPr>
                     <w:noProof/>
+                    <w:lang w:val="en-US"/>
                   </w:rPr>
                   <w:t xml:space="preserve">2023. </w:t>
                 </w:r>
@@ -22331,7 +22447,7 @@
           </w:tr>
           <w:tr>
             <w:trPr>
-              <w:divId w:val="2142385046"/>
+              <w:divId w:val="1941137495"/>
               <w:tblCellSpacing w:w="15" w:type="dxa"/>
             </w:trPr>
             <w:tc>
@@ -22344,11 +22460,13 @@
                   <w:pStyle w:val="Bibliography"/>
                   <w:rPr>
                     <w:noProof/>
+                    <w:lang w:val="en-US"/>
                   </w:rPr>
                 </w:pPr>
                 <w:r>
                   <w:rPr>
                     <w:noProof/>
+                    <w:lang w:val="en-US"/>
                   </w:rPr>
                   <w:t xml:space="preserve">[10] </w:t>
                 </w:r>
@@ -22364,11 +22482,13 @@
                   <w:pStyle w:val="Bibliography"/>
                   <w:rPr>
                     <w:noProof/>
+                    <w:lang w:val="en-US"/>
                   </w:rPr>
                 </w:pPr>
                 <w:r>
                   <w:rPr>
                     <w:noProof/>
+                    <w:lang w:val="en-US"/>
                   </w:rPr>
                   <w:t>A. Mahimkar, "Lung Cancer Prediction on Image Data," Kaggle, 2019. [Online]. Available: https://www.kaggle.com/code/adityamahimkar/lung-cancer-prediction-on-image-data/notebook.</w:t>
                 </w:r>
@@ -22377,7 +22497,7 @@
           </w:tr>
           <w:tr>
             <w:trPr>
-              <w:divId w:val="2142385046"/>
+              <w:divId w:val="1941137495"/>
               <w:tblCellSpacing w:w="15" w:type="dxa"/>
             </w:trPr>
             <w:tc>
@@ -22390,11 +22510,13 @@
                   <w:pStyle w:val="Bibliography"/>
                   <w:rPr>
                     <w:noProof/>
+                    <w:lang w:val="en-US"/>
                   </w:rPr>
                 </w:pPr>
                 <w:r>
                   <w:rPr>
                     <w:noProof/>
+                    <w:lang w:val="en-US"/>
                   </w:rPr>
                   <w:t xml:space="preserve">[11] </w:t>
                 </w:r>
@@ -22410,11 +22532,13 @@
                   <w:pStyle w:val="Bibliography"/>
                   <w:rPr>
                     <w:noProof/>
+                    <w:lang w:val="en-US"/>
                   </w:rPr>
                 </w:pPr>
                 <w:r>
                   <w:rPr>
                     <w:noProof/>
+                    <w:lang w:val="en-US"/>
                   </w:rPr>
                   <w:t xml:space="preserve">D. P. Kingma and J. Ba, "Adam: A Method for Stochastic Optimization," </w:t>
                 </w:r>
@@ -22423,12 +22547,14 @@
                     <w:i/>
                     <w:iCs/>
                     <w:noProof/>
+                    <w:lang w:val="en-US"/>
                   </w:rPr>
                   <w:t xml:space="preserve">3rd International Conference on Learning Representations (ICLR), </w:t>
                 </w:r>
                 <w:r>
                   <w:rPr>
                     <w:noProof/>
+                    <w:lang w:val="en-US"/>
                   </w:rPr>
                   <w:t xml:space="preserve">2015. </w:t>
                 </w:r>
@@ -22438,7 +22564,7 @@
         </w:tbl>
         <w:p>
           <w:pPr>
-            <w:divId w:val="2142385046"/>
+            <w:divId w:val="1941137495"/>
             <w:rPr>
               <w:rFonts w:eastAsia="Times New Roman"/>
               <w:noProof/>
@@ -22509,7 +22635,7 @@
       <w:r>
         <w:fldChar w:fldCharType="separate"/>
       </w:r>
-      <w:hyperlink w:anchor="_Toc239962142" w:history="1">
+      <w:hyperlink w:anchor="_Toc241517393" w:history="1">
         <w:r>
           <w:rPr>
             <w:rStyle w:val="Hyperlink"/>
@@ -22536,7 +22662,7 @@
             <w:noProof/>
             <w:webHidden/>
           </w:rPr>
-          <w:instrText xml:space="preserve"> PAGEREF _Toc239962142 \h </w:instrText>
+          <w:instrText xml:space="preserve"> PAGEREF _Toc241517393 \h </w:instrText>
         </w:r>
         <w:r>
           <w:rPr>
@@ -22556,7 +22682,149 @@
             <w:noProof/>
             <w:webHidden/>
           </w:rPr>
-          <w:t>3</w:t>
+          <w:t>24</w:t>
+        </w:r>
+        <w:r>
+          <w:rPr>
+            <w:noProof/>
+            <w:webHidden/>
+          </w:rPr>
+          <w:fldChar w:fldCharType="end"/>
+        </w:r>
+      </w:hyperlink>
+    </w:p>
+    <w:p>
+      <w:pPr>
+        <w:pStyle w:val="TableofFigures"/>
+        <w:tabs>
+          <w:tab w:val="right" w:leader="dot" w:pos="9350"/>
+        </w:tabs>
+        <w:rPr>
+          <w:rFonts w:asciiTheme="minorHAnsi" w:eastAsiaTheme="minorEastAsia" w:hAnsiTheme="minorHAnsi"/>
+          <w:noProof/>
+          <w:sz w:val="22"/>
+          <w:lang w:eastAsia="bs-Latn-BA"/>
+        </w:rPr>
+      </w:pPr>
+      <w:hyperlink w:anchor="_Toc241517394" w:history="1">
+        <w:r>
+          <w:rPr>
+            <w:rStyle w:val="Hyperlink"/>
+            <w:noProof/>
+          </w:rPr>
+          <w:t>Tablica 2 Glavne metrike modela</w:t>
+        </w:r>
+        <w:r>
+          <w:rPr>
+            <w:noProof/>
+            <w:webHidden/>
+          </w:rPr>
+          <w:tab/>
+        </w:r>
+        <w:r>
+          <w:rPr>
+            <w:noProof/>
+            <w:webHidden/>
+          </w:rPr>
+          <w:fldChar w:fldCharType="begin"/>
+        </w:r>
+        <w:r>
+          <w:rPr>
+            <w:noProof/>
+            <w:webHidden/>
+          </w:rPr>
+          <w:instrText xml:space="preserve"> PAGEREF _Toc241517394 \h </w:instrText>
+        </w:r>
+        <w:r>
+          <w:rPr>
+            <w:noProof/>
+            <w:webHidden/>
+          </w:rPr>
+        </w:r>
+        <w:r>
+          <w:rPr>
+            <w:noProof/>
+            <w:webHidden/>
+          </w:rPr>
+          <w:fldChar w:fldCharType="separate"/>
+        </w:r>
+        <w:r>
+          <w:rPr>
+            <w:noProof/>
+            <w:webHidden/>
+          </w:rPr>
+          <w:t>33</w:t>
+        </w:r>
+        <w:r>
+          <w:rPr>
+            <w:noProof/>
+            <w:webHidden/>
+          </w:rPr>
+          <w:fldChar w:fldCharType="end"/>
+        </w:r>
+      </w:hyperlink>
+    </w:p>
+    <w:p>
+      <w:pPr>
+        <w:pStyle w:val="TableofFigures"/>
+        <w:tabs>
+          <w:tab w:val="right" w:leader="dot" w:pos="9350"/>
+        </w:tabs>
+        <w:rPr>
+          <w:rFonts w:asciiTheme="minorHAnsi" w:eastAsiaTheme="minorEastAsia" w:hAnsiTheme="minorHAnsi"/>
+          <w:noProof/>
+          <w:sz w:val="22"/>
+          <w:lang w:eastAsia="bs-Latn-BA"/>
+        </w:rPr>
+      </w:pPr>
+      <w:hyperlink w:anchor="_Toc241517395" w:history="1">
+        <w:r>
+          <w:rPr>
+            <w:rStyle w:val="Hyperlink"/>
+            <w:noProof/>
+          </w:rPr>
+          <w:t>Tablica 3 Dodatne metrike modela</w:t>
+        </w:r>
+        <w:r>
+          <w:rPr>
+            <w:noProof/>
+            <w:webHidden/>
+          </w:rPr>
+          <w:tab/>
+        </w:r>
+        <w:r>
+          <w:rPr>
+            <w:noProof/>
+            <w:webHidden/>
+          </w:rPr>
+          <w:fldChar w:fldCharType="begin"/>
+        </w:r>
+        <w:r>
+          <w:rPr>
+            <w:noProof/>
+            <w:webHidden/>
+          </w:rPr>
+          <w:instrText xml:space="preserve"> PAGEREF _Toc241517395 \h </w:instrText>
+        </w:r>
+        <w:r>
+          <w:rPr>
+            <w:noProof/>
+            <w:webHidden/>
+          </w:rPr>
+        </w:r>
+        <w:r>
+          <w:rPr>
+            <w:noProof/>
+            <w:webHidden/>
+          </w:rPr>
+          <w:fldChar w:fldCharType="separate"/>
+        </w:r>
+        <w:r>
+          <w:rPr>
+            <w:noProof/>
+            <w:webHidden/>
+          </w:rPr>
+          <w:t>34</w:t>
         </w:r>
         <w:r>
           <w:rPr>

</xml_diff>